<commit_message>
docs: them chuong 1 business understanding va dien thong tin trang bia whitepaper
- Business_Understanding.docx: chuong 1 whitepaper (boi canh nghiep vu Home Credit,
  vai tro AI, phat bieu bai toan, y nghia TARGET, ly do la phan loai nhi phan)
- 2. Mau tai lieu.docx: dien tieu de va danh sach thanh vien vao trang bia
</commit_message>
<xml_diff>
--- a/docs/2. Mau tai lieu.docx
+++ b/docs/2. Mau tai lieu.docx
@@ -396,7 +396,7 @@
               </wp:anchor>
             </w:drawing>
           </mc:Choice>
-          <mc:Fallback xmlns:w16sdtfl="http://schemas.microsoft.com/office/word/2024/wordml/sdtformatlock" xmlns:w16du="http://schemas.microsoft.com/office/word/2023/wordml/word16du">
+          <mc:Fallback xmlns:w16du="http://schemas.microsoft.com/office/word/2023/wordml/word16du" xmlns:w16sdtfl="http://schemas.microsoft.com/office/word/2024/wordml/sdtformatlock">
             <w:pict>
               <v:group w14:anchorId="7B3222B4" id="Group 26" o:spid="_x0000_s1026" style="position:absolute;margin-left:0;margin-top:-9.4pt;width:507.45pt;height:747pt;z-index:251668992;mso-position-horizontal:left;mso-position-horizontal-relative:margin;mso-width-relative:margin" coordsize="58635,94869" o:gfxdata="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">
                 <v:shape id="FreeForm 22" o:spid="_x0000_s1027" style="position:absolute;left:-47203;top:47203;width:94869;height:463;rotation:-90;visibility:visible;mso-wrap-style:square;v-text-anchor:top" coordsize="8662,111" o:gfxdata="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" path="m48,111l,,8662,r-40,111l48,111xe" fillcolor="#b0b0b0" strokeweight="1.5pt">
@@ -676,7 +676,7 @@
               </wp:anchor>
             </w:drawing>
           </mc:Choice>
-          <mc:Fallback xmlns:w16sdtfl="http://schemas.microsoft.com/office/word/2024/wordml/sdtformatlock" xmlns:w16du="http://schemas.microsoft.com/office/word/2023/wordml/word16du">
+          <mc:Fallback xmlns:w16du="http://schemas.microsoft.com/office/word/2023/wordml/word16du" xmlns:w16sdtfl="http://schemas.microsoft.com/office/word/2024/wordml/sdtformatlock">
             <w:pict>
               <v:shape w14:anchorId="04DAE31C" id="FreeForm 21" o:spid="_x0000_s1026" style="position:absolute;margin-left:428.35pt;margin-top:3.75pt;width:22.65pt;height:20.2pt;rotation:-90;z-index:251654656;visibility:visible;mso-wrap-style:square;mso-width-percent:0;mso-height-percent:0;mso-wrap-distance-left:9pt;mso-wrap-distance-top:0;mso-wrap-distance-right:9pt;mso-wrap-distance-bottom:0;mso-position-horizontal:absolute;mso-position-horizontal-relative:text;mso-position-vertical:absolute;mso-position-vertical-relative:text;mso-width-percent:0;mso-height-percent:0;mso-width-relative:page;mso-height-relative:page;v-text-anchor:top" coordsize="263,613" o:gfxdata="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" path="m,19l16,56r32,74l128,316r79,186l239,576r16,37l263,594r,-37l239,390r,-74l247,260r,-18l239,242,191,223,136,167,72,93,24,19,,,,19xe" strokecolor="white" strokeweight="1.5pt">
                 <v:path arrowok="t" o:connecttype="custom" o:connectlocs="0,3327487;19140542,9807947;57421625,22768448;153123241,55344843;247629393,87921238;285910476,100881739;305051018,107361781;314621289,104034294;314621289,97553834;285910476,68305344;285910476,55344843;295480747,45536896;295480747,42384342;285910476,42384342;228488851,39056436;162693512,29248489;86132438,16287988;28710813,3327487;0,0;0,3327487" o:connectangles="0,0,0,0,0,0,0,0,0,0,0,0,0,0,0,0,0,0,0,0"/>
@@ -896,7 +896,7 @@
               </wp:anchor>
             </w:drawing>
           </mc:Choice>
-          <mc:Fallback xmlns:w16sdtfl="http://schemas.microsoft.com/office/word/2024/wordml/sdtformatlock" xmlns:w16du="http://schemas.microsoft.com/office/word/2023/wordml/word16du">
+          <mc:Fallback xmlns:w16du="http://schemas.microsoft.com/office/word/2023/wordml/word16du" xmlns:w16sdtfl="http://schemas.microsoft.com/office/word/2024/wordml/sdtformatlock">
             <w:pict>
               <v:shape w14:anchorId="62480848" id="FreeForm 20" o:spid="_x0000_s1026" style="position:absolute;margin-left:421.35pt;margin-top:7.6pt;width:14.45pt;height:3.05pt;rotation:-90;z-index:251653632;visibility:visible;mso-wrap-style:square;mso-width-percent:0;mso-height-percent:0;mso-wrap-distance-left:9pt;mso-wrap-distance-top:0;mso-wrap-distance-right:9pt;mso-wrap-distance-bottom:0;mso-position-horizontal:absolute;mso-position-horizontal-relative:text;mso-position-vertical:absolute;mso-position-vertical-relative:text;mso-width-percent:0;mso-height-percent:0;mso-width-relative:page;mso-height-relative:page;v-text-anchor:top" coordsize="167,93" o:gfxdata="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" path="m8,56r32,l71,18,87,r16,l159,74r8,l151,93,103,56r-16,l56,93,16,74,,56r8,xe" strokecolor="white" strokeweight="1.5pt">
                 <v:path arrowok="t" o:connecttype="custom" o:connectlocs="9660361,9714571;48302906,9714571;85736670,3122541;105058491,0;124379214,0;192002843,12837112;201663205,12837112;182342482,16133336;124379214,9714571;105058491,9714571;67623629,16133336;19320723,12837112;0,9714571;0,9714571;9660361,9714571" o:connectangles="0,0,0,0,0,0,0,0,0,0,0,0,0,0,0"/>
@@ -1164,7 +1164,7 @@
               </wp:anchor>
             </w:drawing>
           </mc:Choice>
-          <mc:Fallback xmlns:w16sdtfl="http://schemas.microsoft.com/office/word/2024/wordml/sdtformatlock" xmlns:w16du="http://schemas.microsoft.com/office/word/2023/wordml/word16du">
+          <mc:Fallback xmlns:w16du="http://schemas.microsoft.com/office/word/2023/wordml/word16du" xmlns:w16sdtfl="http://schemas.microsoft.com/office/word/2024/wordml/sdtformatlock">
             <w:pict>
               <v:shape w14:anchorId="151C1FF4" id="FreeForm 19" o:spid="_x0000_s1026" style="position:absolute;margin-left:10.25pt;margin-top:3.85pt;width:22.65pt;height:20.25pt;rotation:-90;z-index:251647488;visibility:visible;mso-wrap-style:square;mso-width-percent:0;mso-height-percent:0;mso-wrap-distance-left:9pt;mso-wrap-distance-top:0;mso-wrap-distance-right:9pt;mso-wrap-distance-bottom:0;mso-position-horizontal:absolute;mso-position-horizontal-relative:text;mso-position-vertical:absolute;mso-position-vertical-relative:text;mso-width-percent:0;mso-height-percent:0;mso-width-relative:page;mso-height-relative:page;v-text-anchor:top" coordsize="263,613" o:gfxdata="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" path="m,595l16,576,48,502,128,316,207,112,239,38,255,r8,19l263,75,239,223r,75l247,372r,18l239,390r-48,l136,446,72,520,24,595,,613,,595xe" strokecolor="white" strokeweight="1.5pt">
                 <v:path arrowok="t" o:connecttype="custom" o:connectlocs="0,104725604;19140542,101381490;57421625,88357023;153123241,55619023;247629393,19713114;285910476,6688228;305051018,0;314621289,3344114;314621289,13200671;285910476,39250023;285910476,52450694;295480747,65475580;295480747,68643909;285910476,68643909;228488851,68643909;162693512,78500466;86132438,91524933;28710813,104725604;0,107893933;0,104725604" o:connectangles="0,0,0,0,0,0,0,0,0,0,0,0,0,0,0,0,0,0,0,0"/>
@@ -1387,7 +1387,7 @@
               </wp:anchor>
             </w:drawing>
           </mc:Choice>
-          <mc:Fallback xmlns:w16sdtfl="http://schemas.microsoft.com/office/word/2024/wordml/sdtformatlock" xmlns:w16du="http://schemas.microsoft.com/office/word/2023/wordml/word16du">
+          <mc:Fallback xmlns:w16du="http://schemas.microsoft.com/office/word/2023/wordml/word16du" xmlns:w16sdtfl="http://schemas.microsoft.com/office/word/2024/wordml/sdtformatlock">
             <w:pict>
               <v:shape w14:anchorId="4BD2B0F0" id="FreeForm 18" o:spid="_x0000_s1026" style="position:absolute;margin-left:26pt;margin-top:7.6pt;width:14.45pt;height:3.05pt;rotation:-90;z-index:251646464;visibility:visible;mso-wrap-style:square;mso-width-percent:0;mso-height-percent:0;mso-wrap-distance-left:9pt;mso-wrap-distance-top:0;mso-wrap-distance-right:9pt;mso-wrap-distance-bottom:0;mso-position-horizontal:absolute;mso-position-horizontal-relative:text;mso-position-vertical:absolute;mso-position-vertical-relative:text;mso-width-percent:0;mso-height-percent:0;mso-width-relative:page;mso-height-relative:page;v-text-anchor:top" coordsize="167,93" o:gfxdata="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" path="m8,19r32,l71,75,87,93,103,75,159,19,167,,151,,103,19r-16,l56,,16,,,19,,37,8,19xe" strokecolor="white" strokeweight="1.5pt">
                 <v:path arrowok="t" o:connecttype="custom" o:connectlocs="9660361,3296224;48302906,3296224;85736670,13010795;105058491,16133336;124379214,13010795;192002843,3296224;201663205,0;182342482,0;124379214,3296224;105058491,3296224;67623629,0;19320723,0;0,3296224;0,6418764;9660361,3296224" o:connectangles="0,0,0,0,0,0,0,0,0,0,0,0,0,0,0"/>
@@ -1613,7 +1613,7 @@
               </wp:anchor>
             </w:drawing>
           </mc:Choice>
-          <mc:Fallback xmlns:w16sdtfl="http://schemas.microsoft.com/office/word/2024/wordml/sdtformatlock" xmlns:w16du="http://schemas.microsoft.com/office/word/2023/wordml/word16du">
+          <mc:Fallback xmlns:w16du="http://schemas.microsoft.com/office/word/2023/wordml/word16du" xmlns:w16sdtfl="http://schemas.microsoft.com/office/word/2024/wordml/sdtformatlock">
             <w:pict>
               <v:shape w14:anchorId="5EC44B68" id="FreeForm 17" o:spid="_x0000_s1026" style="position:absolute;margin-left:444.15pt;margin-top:9.1pt;width:4.1pt;height:14.05pt;rotation:-90;z-index:251655680;visibility:visible;mso-wrap-style:square;mso-width-percent:0;mso-height-percent:0;mso-wrap-distance-left:9pt;mso-wrap-distance-top:0;mso-wrap-distance-right:9pt;mso-wrap-distance-bottom:0;mso-position-horizontal:absolute;mso-position-horizontal-relative:text;mso-position-vertical:absolute;mso-position-vertical-relative:text;mso-width-percent:0;mso-height-percent:0;mso-width-relative:page;mso-height-relative:page;v-text-anchor:top" coordsize="48,427" o:gfxdata="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" path="m16,409l,335,,297,8,260r8,-93l16,56,8,19,16,r8,19l40,112r8,111l40,335,24,427,16,409xe" strokecolor="white" strokeweight="1.5pt">
                 <v:path arrowok="t" o:connecttype="custom" o:connectlocs="18828729,71421221;0,58499100;0,51863574;9413822,45402305;18828729,29162213;18828729,9778823;9413822,3317972;18828729,0;18828729,0;28242551,3317972;47071280,19558064;56485102,38941036;47071280,58499100;28242551,74564518;28242551,74564518;18828729,71421221" o:connectangles="0,0,0,0,0,0,0,0,0,0,0,0,0,0,0,0"/>
@@ -1845,7 +1845,7 @@
               </wp:anchor>
             </w:drawing>
           </mc:Choice>
-          <mc:Fallback xmlns:w16sdtfl="http://schemas.microsoft.com/office/word/2024/wordml/sdtformatlock" xmlns:w16du="http://schemas.microsoft.com/office/word/2023/wordml/word16du">
+          <mc:Fallback xmlns:w16du="http://schemas.microsoft.com/office/word/2023/wordml/word16du" xmlns:w16sdtfl="http://schemas.microsoft.com/office/word/2024/wordml/sdtformatlock">
             <w:pict>
               <v:shape w14:anchorId="2784E679" id="FreeForm 16" o:spid="_x0000_s1026" style="position:absolute;margin-left:388.35pt;margin-top:13.35pt;width:17.95pt;height:6.75pt;rotation:-90;z-index:251652608;visibility:visible;mso-wrap-style:square;mso-width-percent:0;mso-height-percent:0;mso-wrap-distance-left:9pt;mso-wrap-distance-top:0;mso-wrap-distance-right:9pt;mso-wrap-distance-bottom:0;mso-position-horizontal:absolute;mso-position-horizontal-relative:text;mso-position-vertical:absolute;mso-position-vertical-relative:text;mso-width-percent:0;mso-height-percent:0;mso-width-relative:page;mso-height-relative:page;v-text-anchor:top" coordsize="208,204" o:gfxdata="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" path="m16,93l48,37,96,r48,l192,37r16,37l208,93r-8,l184,93r-72,18l72,130,40,186,24,204,8,186,,149,16,93xe" strokecolor="white" strokeweight="1.5pt">
                 <v:path arrowok="t" o:connecttype="custom" o:connectlocs="19219203,16422641;57656513,6533590;115314122,0;172970636,0;230627149,6533590;249846352,13067179;249846352,16422641;240236751,16422641;221017547,16422641;134532230,19600769;86485318,22956231;48046912,32844861;28828805,36023410;9609602,32844861;0,26311272;19219203,16422641" o:connectangles="0,0,0,0,0,0,0,0,0,0,0,0,0,0,0,0"/>
@@ -2071,7 +2071,7 @@
               </wp:anchor>
             </w:drawing>
           </mc:Choice>
-          <mc:Fallback xmlns:w16sdtfl="http://schemas.microsoft.com/office/word/2024/wordml/sdtformatlock" xmlns:w16du="http://schemas.microsoft.com/office/word/2023/wordml/word16du">
+          <mc:Fallback xmlns:w16du="http://schemas.microsoft.com/office/word/2023/wordml/word16du" xmlns:w16sdtfl="http://schemas.microsoft.com/office/word/2024/wordml/sdtformatlock">
             <w:pict>
               <v:shape w14:anchorId="2722CD0D" id="FreeForm 15" o:spid="_x0000_s1026" style="position:absolute;margin-left:13pt;margin-top:8.8pt;width:4.1pt;height:14.65pt;rotation:-90;z-index:251648512;visibility:visible;mso-wrap-style:square;mso-width-percent:0;mso-height-percent:0;mso-wrap-distance-left:9pt;mso-wrap-distance-top:0;mso-wrap-distance-right:9pt;mso-wrap-distance-bottom:0;mso-position-horizontal:absolute;mso-position-horizontal-relative:text;mso-position-vertical:absolute;mso-position-vertical-relative:text;mso-width-percent:0;mso-height-percent:0;mso-width-relative:page;mso-height-relative:page;v-text-anchor:top" coordsize="48,446" o:gfxdata="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" path="m16,19l,111r,38l8,186r8,74l16,390,8,427r8,19l24,427,40,334,48,223,40,111,24,,16,19xe" strokecolor="white" strokeweight="1.5pt">
                 <v:path arrowok="t" o:connecttype="custom" o:connectlocs="18828729,3306439;0,19316764;0,25929643;9413822,32368564;18828729,45246824;18828729,67870027;9413822,74308949;18828729,77615388;18828729,77615388;28242551,74308949;47071280,58124667;56485102,38807903;47071280,19316764;28242551,0;28242551,0;18828729,3306439" o:connectangles="0,0,0,0,0,0,0,0,0,0,0,0,0,0,0,0"/>
@@ -2303,7 +2303,7 @@
               </wp:anchor>
             </w:drawing>
           </mc:Choice>
-          <mc:Fallback xmlns:w16sdtfl="http://schemas.microsoft.com/office/word/2024/wordml/sdtformatlock" xmlns:w16du="http://schemas.microsoft.com/office/word/2023/wordml/word16du">
+          <mc:Fallback xmlns:w16du="http://schemas.microsoft.com/office/word/2023/wordml/word16du" xmlns:w16sdtfl="http://schemas.microsoft.com/office/word/2024/wordml/sdtformatlock">
             <w:pict>
               <v:shape w14:anchorId="27C0B3DC" id="FreeForm 14" o:spid="_x0000_s1026" style="position:absolute;margin-left:54.9pt;margin-top:13.35pt;width:17.95pt;height:6.75pt;rotation:-90;z-index:251645440;visibility:visible;mso-wrap-style:square;mso-width-percent:0;mso-height-percent:0;mso-wrap-distance-left:9pt;mso-wrap-distance-top:0;mso-wrap-distance-right:9pt;mso-wrap-distance-bottom:0;mso-position-horizontal:absolute;mso-position-horizontal-relative:text;mso-position-vertical:absolute;mso-position-vertical-relative:text;mso-width-percent:0;mso-height-percent:0;mso-width-relative:page;mso-height-relative:page;v-text-anchor:top" coordsize="208,204" o:gfxdata="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" path="m16,130r32,56l96,204r48,l192,167r16,-18l208,130r-8,l184,130,112,112,72,74,40,19,24,,8,37,,74r16,56xe" strokecolor="white" strokeweight="1.5pt">
                 <v:path arrowok="t" o:connecttype="custom" o:connectlocs="19219203,22956231;57656513,32844861;115314122,36023410;172970636,36023410;230627149,29489820;249846352,26311272;249846352,22956231;240236751,22956231;221017547,22956231;134532230,19777682;86485318,13067179;48046912,3355041;28828805,0;9609602,6533590;0,13067179;19219203,22956231" o:connectangles="0,0,0,0,0,0,0,0,0,0,0,0,0,0,0,0"/>
@@ -2540,6 +2540,14 @@
         </w:rPr>
         <w:t>Xây dựng Mô hình Phân loại</w:t>
       </w:r>
+      <w:r>
+        <w:rPr>
+          <w:b/>
+          <w:sz w:val="38"/>
+          <w:szCs w:val="34"/>
+        </w:rPr>
+        <w:t xml:space="preserve"> nhị phân</w:t>
+      </w:r>
     </w:p>
     <w:p>
       <w:pPr>
@@ -2550,7 +2558,8 @@
         <w:jc w:val="center"/>
         <w:rPr>
           <w:b/>
-          <w:sz w:val="30"/>
+          <w:sz w:val="38"/>
+          <w:szCs w:val="34"/>
         </w:rPr>
       </w:pPr>
       <w:r>
@@ -2559,7 +2568,7 @@
           <w:sz w:val="38"/>
           <w:szCs w:val="34"/>
         </w:rPr>
-        <w:t>và Dự báo Rủi ro Khách hàng Vay vốn</w:t>
+        <w:t xml:space="preserve"> Dự báo Rủi ro Khách hàng Vay vốn</w:t>
       </w:r>
     </w:p>
     <w:tbl>
@@ -2717,13 +2726,78 @@
               <w:rPr>
                 <w:szCs w:val="22"/>
               </w:rPr>
-              <w:t xml:space="preserve"> Họ và tên, Mã s</w:t>
+              <w:t xml:space="preserve"> </w:t>
             </w:r>
             <w:r>
               <w:rPr>
                 <w:szCs w:val="22"/>
               </w:rPr>
-              <w:t>v</w:t>
+              <w:t>Nguyễn Thành Hưng</w:t>
+            </w:r>
+            <w:r>
+              <w:rPr>
+                <w:szCs w:val="22"/>
+              </w:rPr>
+              <w:t xml:space="preserve">, </w:t>
+            </w:r>
+            <w:r>
+              <w:rPr>
+                <w:szCs w:val="22"/>
+              </w:rPr>
+              <w:t>PS47270</w:t>
+            </w:r>
+            <w:r>
+              <w:rPr>
+                <w:szCs w:val="22"/>
+              </w:rPr>
+              <w:t xml:space="preserve">, </w:t>
+            </w:r>
+            <w:r>
+              <w:rPr>
+                <w:szCs w:val="22"/>
+              </w:rPr>
+              <w:t>Trưởng nhóm</w:t>
+            </w:r>
+          </w:p>
+          <w:p>
+            <w:pPr>
+              <w:tabs>
+                <w:tab w:val="left" w:pos="2860"/>
+                <w:tab w:val="left" w:pos="5590"/>
+              </w:tabs>
+              <w:rPr>
+                <w:szCs w:val="22"/>
+              </w:rPr>
+            </w:pPr>
+            <w:r>
+              <w:rPr>
+                <w:szCs w:val="22"/>
+              </w:rPr>
+              <w:t>-</w:t>
+            </w:r>
+            <w:r>
+              <w:rPr>
+                <w:szCs w:val="22"/>
+              </w:rPr>
+              <w:t xml:space="preserve"> </w:t>
+            </w:r>
+            <w:r>
+              <w:rPr>
+                <w:szCs w:val="22"/>
+              </w:rPr>
+              <w:t>Nguyễn Bá Gia Huy</w:t>
+            </w:r>
+            <w:r>
+              <w:rPr>
+                <w:szCs w:val="22"/>
+              </w:rPr>
+              <w:t xml:space="preserve">, </w:t>
+            </w:r>
+            <w:r>
+              <w:rPr>
+                <w:szCs w:val="22"/>
+              </w:rPr>
+              <w:t>PS48224</w:t>
             </w:r>
             <w:r>
               <w:rPr>
@@ -2752,13 +2826,25 @@
               <w:rPr>
                 <w:szCs w:val="22"/>
               </w:rPr>
-              <w:t xml:space="preserve"> Họ và tên, Mã s</w:t>
+              <w:t xml:space="preserve"> </w:t>
             </w:r>
             <w:r>
               <w:rPr>
                 <w:szCs w:val="22"/>
               </w:rPr>
-              <w:t>v</w:t>
+              <w:t>Đỗ Trọng Thái</w:t>
+            </w:r>
+            <w:r>
+              <w:rPr>
+                <w:szCs w:val="22"/>
+              </w:rPr>
+              <w:t xml:space="preserve">, </w:t>
+            </w:r>
+            <w:r>
+              <w:rPr>
+                <w:szCs w:val="22"/>
+              </w:rPr>
+              <w:t>PS47694</w:t>
             </w:r>
             <w:r>
               <w:rPr>
@@ -2787,61 +2873,44 @@
               <w:rPr>
                 <w:szCs w:val="22"/>
               </w:rPr>
-              <w:t xml:space="preserve"> Họ và tên, Mã s</w:t>
+              <w:t xml:space="preserve"> </w:t>
             </w:r>
             <w:r>
               <w:rPr>
                 <w:szCs w:val="22"/>
               </w:rPr>
-              <w:t>v</w:t>
+              <w:t>Đặng Trịnh Qui Anh</w:t>
             </w:r>
             <w:r>
               <w:rPr>
                 <w:szCs w:val="22"/>
               </w:rPr>
-              <w:t>, Vai trò</w:t>
+              <w:t xml:space="preserve">, </w:t>
+            </w:r>
+            <w:r>
+              <w:rPr>
+                <w:szCs w:val="22"/>
+              </w:rPr>
+              <w:t>PS48165</w:t>
+            </w:r>
+            <w:r>
+              <w:rPr>
+                <w:szCs w:val="22"/>
+              </w:rPr>
+              <w:t xml:space="preserve">, </w:t>
+            </w:r>
+            <w:r>
+              <w:rPr>
+                <w:szCs w:val="22"/>
+              </w:rPr>
+              <w:t>Vai trò</w:t>
             </w:r>
           </w:p>
           <w:p>
             <w:pPr>
               <w:tabs>
                 <w:tab w:val="left" w:pos="2860"/>
-                <w:tab w:val="left" w:pos="5590"/>
-              </w:tabs>
-              <w:rPr>
-                <w:szCs w:val="22"/>
-              </w:rPr>
-            </w:pPr>
-            <w:r>
-              <w:rPr>
-                <w:szCs w:val="22"/>
-              </w:rPr>
-              <w:t>-</w:t>
-            </w:r>
-            <w:r>
-              <w:rPr>
-                <w:szCs w:val="22"/>
-              </w:rPr>
-              <w:t xml:space="preserve"> Họ và tên, Mã s</w:t>
-            </w:r>
-            <w:r>
-              <w:rPr>
-                <w:szCs w:val="22"/>
-              </w:rPr>
-              <w:t>v</w:t>
-            </w:r>
-            <w:r>
-              <w:rPr>
-                <w:szCs w:val="22"/>
-              </w:rPr>
-              <w:t>, Vai trò</w:t>
-            </w:r>
-          </w:p>
-          <w:p>
-            <w:pPr>
-              <w:tabs>
-                <w:tab w:val="left" w:pos="2860"/>
-                <w:tab w:val="left" w:pos="5590"/>
+                <w:tab w:val="left" w:pos="4056"/>
               </w:tabs>
               <w:rPr>
                 <w:sz w:val="30"/>
@@ -2857,7 +2926,31 @@
               <w:rPr>
                 <w:szCs w:val="22"/>
               </w:rPr>
-              <w:t>…</w:t>
+              <w:t>Phạm Đức Thắng</w:t>
+            </w:r>
+            <w:r>
+              <w:rPr>
+                <w:szCs w:val="22"/>
+              </w:rPr>
+              <w:t xml:space="preserve">, </w:t>
+            </w:r>
+            <w:r>
+              <w:rPr>
+                <w:szCs w:val="22"/>
+              </w:rPr>
+              <w:t>PS48172</w:t>
+            </w:r>
+            <w:r>
+              <w:rPr>
+                <w:szCs w:val="22"/>
+              </w:rPr>
+              <w:t xml:space="preserve">, </w:t>
+            </w:r>
+            <w:r>
+              <w:rPr>
+                <w:szCs w:val="22"/>
+              </w:rPr>
+              <w:t>Vai trò</w:t>
             </w:r>
           </w:p>
         </w:tc>
@@ -3109,7 +3202,7 @@
               </wp:anchor>
             </w:drawing>
           </mc:Choice>
-          <mc:Fallback xmlns:w16sdtfl="http://schemas.microsoft.com/office/word/2024/wordml/sdtformatlock" xmlns:w16du="http://schemas.microsoft.com/office/word/2023/wordml/word16du">
+          <mc:Fallback xmlns:w16du="http://schemas.microsoft.com/office/word/2023/wordml/word16du" xmlns:w16sdtfl="http://schemas.microsoft.com/office/word/2024/wordml/sdtformatlock">
             <w:pict>
               <v:shape w14:anchorId="1FCF3E9A" id="FreeForm 13" o:spid="_x0000_s1026" style="position:absolute;margin-left:432.55pt;margin-top:7.25pt;width:6.95pt;height:14.1pt;rotation:-90;z-index:251663872;visibility:visible;mso-wrap-style:square;mso-width-percent:0;mso-height-percent:0;mso-wrap-distance-left:9pt;mso-wrap-distance-top:0;mso-wrap-distance-right:9pt;mso-wrap-distance-bottom:0;mso-position-horizontal:absolute;mso-position-horizontal-relative:text;mso-position-vertical:absolute;mso-position-vertical-relative:text;mso-width-percent:0;mso-height-percent:0;mso-width-relative:page;mso-height-relative:page;v-text-anchor:top" coordsize="80,427" o:gfxdata="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" path="m8,l24,,56,55r16,56l80,204r-8,93l40,408,24,427r-8,l16,408r8,-37l32,297r,-56l16,148,,74,8,xe" strokecolor="white" strokeweight="1.5pt">
                 <v:path arrowok="t" o:connecttype="custom" o:connectlocs="9738939,0;29215715,0;68169266,9672716;87646042,19521566;97383878,35877325;87646042,52233083;48692491,71754649;29215715,75096171;19476776,75096171;19476776,71754649;29215715,65247321;38953551,52233083;38953551,42384653;19476776,26028475;0,13014237;9738939,0" o:connectangles="0,0,0,0,0,0,0,0,0,0,0,0,0,0,0,0"/>
@@ -3402,7 +3495,7 @@
               </wp:anchor>
             </w:drawing>
           </mc:Choice>
-          <mc:Fallback xmlns:w16sdtfl="http://schemas.microsoft.com/office/word/2024/wordml/sdtformatlock" xmlns:w16du="http://schemas.microsoft.com/office/word/2023/wordml/word16du">
+          <mc:Fallback xmlns:w16du="http://schemas.microsoft.com/office/word/2023/wordml/word16du" xmlns:w16sdtfl="http://schemas.microsoft.com/office/word/2024/wordml/sdtformatlock">
             <w:pict>
               <v:shape w14:anchorId="701594E3" id="FreeForm 12" o:spid="_x0000_s1026" style="position:absolute;margin-left:395.8pt;margin-top:12.85pt;width:23.35pt;height:20.8pt;rotation:-90;z-index:251656704;visibility:visible;mso-wrap-style:square;mso-width-percent:0;mso-height-percent:0;mso-wrap-distance-left:9pt;mso-wrap-distance-top:0;mso-wrap-distance-right:9pt;mso-wrap-distance-bottom:0;mso-position-horizontal:absolute;mso-position-horizontal-relative:text;mso-position-vertical:absolute;mso-position-vertical-relative:text;mso-width-percent:0;mso-height-percent:0;mso-width-relative:page;mso-height-relative:page;v-text-anchor:top" coordsize="271,631" o:gfxdata="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" path="m120,56l80,37r-32,l48,93,64,204,56,371,40,483,8,594,,631r8,l24,594,56,520,144,334,231,130,255,56,271,18,271,r-8,l223,18,183,37,144,74r-8,l120,56xe" strokecolor="white" strokeweight="1.5pt">
                 <v:path arrowok="t" o:connecttype="custom" o:connectlocs="143688637,9814528;95792789,6484688;57476111,6484688;57476111,16298798;76634450,35752444;67055281,65020200;47895847,84649256;9579169,104102484;0,110587172;9579169,110587172;28737508,104102484;67055281,91133525;172427239,58535930;276602075,22783486;305339584,9814528;324497923,3154430;324497923,0;314918753,0;267021811,3154430;219125964,6484688;172427239,12968958;162848070,12968958;143688637,9814528" o:connectangles="0,0,0,0,0,0,0,0,0,0,0,0,0,0,0,0,0,0,0,0,0,0,0"/>
@@ -3632,7 +3725,7 @@
               </wp:anchor>
             </w:drawing>
           </mc:Choice>
-          <mc:Fallback xmlns:w16sdtfl="http://schemas.microsoft.com/office/word/2024/wordml/sdtformatlock" xmlns:w16du="http://schemas.microsoft.com/office/word/2023/wordml/word16du">
+          <mc:Fallback xmlns:w16du="http://schemas.microsoft.com/office/word/2023/wordml/word16du" xmlns:w16sdtfl="http://schemas.microsoft.com/office/word/2024/wordml/sdtformatlock">
             <w:pict>
               <v:shape w14:anchorId="405E6262" id="FreeForm 11" o:spid="_x0000_s1026" style="position:absolute;margin-left:21.85pt;margin-top:7.25pt;width:6.95pt;height:14.1pt;rotation:-90;z-index:251651584;visibility:visible;mso-wrap-style:square;mso-width-percent:0;mso-height-percent:0;mso-wrap-distance-left:9pt;mso-wrap-distance-top:0;mso-wrap-distance-right:9pt;mso-wrap-distance-bottom:0;mso-position-horizontal:absolute;mso-position-horizontal-relative:text;mso-position-vertical:absolute;mso-position-vertical-relative:text;mso-width-percent:0;mso-height-percent:0;mso-width-relative:page;mso-height-relative:page;v-text-anchor:top" coordsize="80,427" o:gfxdata="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" path="m8,427r16,l56,390,72,315r8,-74l72,148,40,37,24,,16,r,18l24,74r8,56l32,185,16,297,,371r8,56xe" strokecolor="white" strokeweight="1.5pt">
                 <v:path arrowok="t" o:connecttype="custom" o:connectlocs="9738939,75096171;29215715,75096171;68169266,68588842;87646042,55398890;97383878,42384653;87646042,26028475;48692491,6507328;29215715,0;19476776,0;19476776,3165807;29215715,13014237;38953551,22863087;38953551,32535803;19476776,52233083;0,65247321;9738939,75096171" o:connectangles="0,0,0,0,0,0,0,0,0,0,0,0,0,0,0,0"/>
@@ -3963,7 +4056,7 @@
               </wp:anchor>
             </w:drawing>
           </mc:Choice>
-          <mc:Fallback xmlns:w16sdtfl="http://schemas.microsoft.com/office/word/2024/wordml/sdtformatlock" xmlns:w16du="http://schemas.microsoft.com/office/word/2023/wordml/word16du">
+          <mc:Fallback xmlns:w16du="http://schemas.microsoft.com/office/word/2023/wordml/word16du" xmlns:w16sdtfl="http://schemas.microsoft.com/office/word/2024/wordml/sdtformatlock">
             <w:pict>
               <v:shape w14:anchorId="41CF14AA" id="FreeForm 10" o:spid="_x0000_s1026" style="position:absolute;margin-left:412.8pt;margin-top:6.55pt;width:19.9pt;height:6.1pt;rotation:-90;z-index:251662848;visibility:visible;mso-wrap-style:square;mso-width-percent:0;mso-height-percent:0;mso-wrap-distance-left:9pt;mso-wrap-distance-top:0;mso-wrap-distance-right:9pt;mso-wrap-distance-bottom:0;mso-position-horizontal:absolute;mso-position-horizontal-relative:text;mso-position-vertical:absolute;mso-position-vertical-relative:text;mso-width-percent:0;mso-height-percent:0;mso-width-relative:page;mso-height-relative:page;v-text-anchor:top" coordsize="231,186" o:gfxdata="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" path="m,167l48,93,112,19,175,r24,l223,37r8,37l223,111r-8,19l207,111,160,74,104,93,48,130,8,186r-8,l,167xe" strokecolor="white" strokeweight="1.5pt">
                 <v:path arrowok="t" o:connecttype="custom" o:connectlocs="0,28970448;57455047,16133336;134062871,3296224;209472689,0;238200760,0;266927737,6418764;276504125,12837112;266927737,19255877;257352443,22552100;247776054,19255877;191517919,12837112;124486483,16133336;57455047,22552100;9576388,32266672;0,32266672;0,28970448" o:connectangles="0,0,0,0,0,0,0,0,0,0,0,0,0,0,0,0"/>
@@ -4195,7 +4288,7 @@
               </wp:anchor>
             </w:drawing>
           </mc:Choice>
-          <mc:Fallback xmlns:w16sdtfl="http://schemas.microsoft.com/office/word/2024/wordml/sdtformatlock" xmlns:w16du="http://schemas.microsoft.com/office/word/2023/wordml/word16du">
+          <mc:Fallback xmlns:w16du="http://schemas.microsoft.com/office/word/2023/wordml/word16du" xmlns:w16sdtfl="http://schemas.microsoft.com/office/word/2024/wordml/sdtformatlock">
             <w:pict>
               <v:shape w14:anchorId="2DDF7FF9" id="FreeForm 9" o:spid="_x0000_s1026" style="position:absolute;margin-left:444.6pt;margin-top:8.55pt;width:3.45pt;height:14.05pt;rotation:-90;z-index:251661824;visibility:visible;mso-wrap-style:square;mso-width-percent:0;mso-height-percent:0;mso-wrap-distance-left:9pt;mso-wrap-distance-top:0;mso-wrap-distance-right:9pt;mso-wrap-distance-bottom:0;mso-position-horizontal:absolute;mso-position-horizontal-relative:text;mso-position-vertical:absolute;mso-position-vertical-relative:text;mso-width-percent:0;mso-height-percent:0;mso-width-relative:page;mso-height-relative:page;v-text-anchor:top" coordsize="40,427" o:gfxdata="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" path="m24,409l40,335r,-38l32,260,24,167,32,56r,-37l32,,24,,16,19,,112,,223,,335r16,92l24,427r,-18xe" strokecolor="white" strokeweight="1.5pt">
                 <v:path arrowok="t" o:connecttype="custom" o:connectlocs="28796313,71421221;47993856,58499100;47993856,51863574;38395085,45402305;28796313,29162213;38395085,9778823;38395085,3317972;38395085,0;28796313,0;19197542,3317972;0,19558064;0,38941036;0,58499100;19197542,74564518;28796313,74564518;28796313,71421221" o:connectangles="0,0,0,0,0,0,0,0,0,0,0,0,0,0,0,0"/>
@@ -4463,7 +4556,7 @@
               </wp:anchor>
             </w:drawing>
           </mc:Choice>
-          <mc:Fallback xmlns:w16sdtfl="http://schemas.microsoft.com/office/word/2024/wordml/sdtformatlock" xmlns:w16du="http://schemas.microsoft.com/office/word/2023/wordml/word16du">
+          <mc:Fallback xmlns:w16du="http://schemas.microsoft.com/office/word/2023/wordml/word16du" xmlns:w16sdtfl="http://schemas.microsoft.com/office/word/2024/wordml/sdtformatlock">
             <w:pict>
               <v:shape w14:anchorId="332B4940" id="FreeForm 8" o:spid="_x0000_s1026" style="position:absolute;margin-left:428.6pt;margin-top:16.75pt;width:22pt;height:20.2pt;rotation:-90;z-index:251660800;visibility:visible;mso-wrap-style:square;mso-width-percent:0;mso-height-percent:0;mso-wrap-distance-left:9pt;mso-wrap-distance-top:0;mso-wrap-distance-right:9pt;mso-wrap-distance-bottom:0;mso-position-horizontal:absolute;mso-position-horizontal-relative:text;mso-position-vertical:absolute;mso-position-vertical-relative:text;mso-width-percent:0;mso-height-percent:0;mso-width-relative:page;mso-height-relative:page;v-text-anchor:top" coordsize="255,613" o:gfxdata="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" path="m255,19r-8,37l215,130,135,316,48,502,16,576,,613,,594,,557,16,390r,-74l8,260r,-18l16,242,64,223r63,-56l191,93,231,19,255,r,19xe" strokecolor="white" strokeweight="1.5pt">
                 <v:path arrowok="t" o:connecttype="custom" o:connectlocs="306134745,3327487;296531055,9807947;258114103,22768448;162071722,55344843;57625428,87921238;19208476,100881739;0,107361781;0,104034294;0,97553834;19208476,68305344;19208476,55344843;9603690,45536896;9603690,42384342;19208476,42384342;76833904,39056436;152466936,29248489;229300841,16287988;277322579,3327487;306134745,0;306134745,3327487" o:connectangles="0,0,0,0,0,0,0,0,0,0,0,0,0,0,0,0,0,0,0,0"/>
@@ -4683,7 +4776,7 @@
               </wp:anchor>
             </w:drawing>
           </mc:Choice>
-          <mc:Fallback xmlns:w16sdtfl="http://schemas.microsoft.com/office/word/2024/wordml/sdtformatlock" xmlns:w16du="http://schemas.microsoft.com/office/word/2023/wordml/word16du">
+          <mc:Fallback xmlns:w16du="http://schemas.microsoft.com/office/word/2023/wordml/word16du" xmlns:w16sdtfl="http://schemas.microsoft.com/office/word/2024/wordml/sdtformatlock">
             <w:pict>
               <v:shape w14:anchorId="2BF9838A" id="FreeForm 7" o:spid="_x0000_s1026" style="position:absolute;margin-left:421.4pt;margin-top:29.8pt;width:14.35pt;height:3.05pt;rotation:-90;z-index:251659776;visibility:visible;mso-wrap-style:square;mso-width-percent:0;mso-height-percent:0;mso-wrap-distance-left:9pt;mso-wrap-distance-top:0;mso-wrap-distance-right:9pt;mso-wrap-distance-bottom:0;mso-position-horizontal:absolute;mso-position-horizontal-relative:text;mso-position-vertical:absolute;mso-position-vertical-relative:text;mso-width-percent:0;mso-height-percent:0;mso-width-relative:page;mso-height-relative:page;v-text-anchor:top" coordsize="167,93" o:gfxdata="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" path="m151,56r-32,l88,18,72,,56,,,74,8,93,64,56r16,l111,93,151,74r8,-18l167,56r-16,xe" strokecolor="white" strokeweight="1.5pt">
                 <v:path arrowok="t" o:connecttype="custom" o:connectlocs="179826707,9714571;141717859,9714571;104799605,3122541;85745727,0;66690757,0;0,12837112;0,12837112;9526939,16133336;76217696,9714571;95272666,9714571;132190920,16133336;179826707,12837112;189354738,9714571;198881677,9714571;179826707,9714571" o:connectangles="0,0,0,0,0,0,0,0,0,0,0,0,0,0,0"/>
@@ -4915,7 +5008,7 @@
               </wp:anchor>
             </w:drawing>
           </mc:Choice>
-          <mc:Fallback xmlns:w16sdtfl="http://schemas.microsoft.com/office/word/2024/wordml/sdtformatlock" xmlns:w16du="http://schemas.microsoft.com/office/word/2023/wordml/word16du">
+          <mc:Fallback xmlns:w16du="http://schemas.microsoft.com/office/word/2023/wordml/word16du" xmlns:w16sdtfl="http://schemas.microsoft.com/office/word/2024/wordml/sdtformatlock">
             <w:pict>
               <v:shape w14:anchorId="40CEFC85" id="FreeForm 6" o:spid="_x0000_s1026" style="position:absolute;margin-left:388.4pt;margin-top:11.85pt;width:17.95pt;height:6.75pt;rotation:-90;z-index:251658752;visibility:visible;mso-wrap-style:square;mso-width-percent:0;mso-height-percent:0;mso-wrap-distance-left:9pt;mso-wrap-distance-top:0;mso-wrap-distance-right:9pt;mso-wrap-distance-bottom:0;mso-position-horizontal:absolute;mso-position-horizontal-relative:text;mso-position-vertical:absolute;mso-position-vertical-relative:text;mso-width-percent:0;mso-height-percent:0;mso-width-relative:page;mso-height-relative:page;v-text-anchor:top" coordsize="208,204" o:gfxdata="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" path="m200,93l160,37,112,,64,,16,37,,74,,93r8,l32,93r72,18l136,130r32,56l184,204r16,-18l208,149,200,93xe" strokecolor="white" strokeweight="1.5pt">
                 <v:path arrowok="t" o:connecttype="custom" o:connectlocs="240236751,16422641;192189839,6533590;134532230,0;76875716,0;19219203,6533590;0,13067179;0,16422641;9609602,16422641;38438406,16422641;124923724,19600769;163361034,22956231;201799440,32844861;221017547,36023410;240236751,32844861;249846352,26311272;240236751,16422641" o:connectangles="0,0,0,0,0,0,0,0,0,0,0,0,0,0,0,0"/>
@@ -5138,7 +5231,7 @@
               </wp:anchor>
             </w:drawing>
           </mc:Choice>
-          <mc:Fallback xmlns:w16sdtfl="http://schemas.microsoft.com/office/word/2024/wordml/sdtformatlock" xmlns:w16du="http://schemas.microsoft.com/office/word/2023/wordml/word16du">
+          <mc:Fallback xmlns:w16du="http://schemas.microsoft.com/office/word/2023/wordml/word16du" xmlns:w16sdtfl="http://schemas.microsoft.com/office/word/2024/wordml/sdtformatlock">
             <w:pict>
               <v:shape w14:anchorId="0498CD70" id="FreeForm 5" o:spid="_x0000_s1026" style="position:absolute;margin-left:409.3pt;margin-top:2.1pt;width:6.2pt;height:15.9pt;rotation:-90;z-index:251657728;visibility:visible;mso-wrap-style:square;mso-width-percent:0;mso-height-percent:0;mso-wrap-distance-left:9pt;mso-wrap-distance-top:0;mso-wrap-distance-right:9pt;mso-wrap-distance-bottom:0;mso-position-horizontal:absolute;mso-position-horizontal-relative:text;mso-position-vertical:absolute;mso-position-vertical-relative:text;mso-width-percent:0;mso-height-percent:0;mso-width-relative:page;mso-height-relative:page;v-text-anchor:top" coordsize="72,483" o:gfxdata="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" path="m16,483l56,353,72,223,72,93,48,,32,,8,18,,55,,93r24,92l40,297r-8,93l8,464r,19l16,483xe" strokecolor="white" strokeweight="1.5pt">
                 <v:path arrowok="t" o:connecttype="custom" o:connectlocs="19136007,84421791;66974932,61699440;86110939,38977507;86110939,16255156;57406928,0;38272014,0;9568004,3146011;0,9613206;0,16255156;28704011,32335557;47838924,51911479;38272014,68166635;9568004,81101025;9568004,84421791;19136007,84421791" o:connectangles="0,0,0,0,0,0,0,0,0,0,0,0,0,0,0"/>
@@ -5370,7 +5463,7 @@
               </wp:anchor>
             </w:drawing>
           </mc:Choice>
-          <mc:Fallback xmlns:w16sdtfl="http://schemas.microsoft.com/office/word/2024/wordml/sdtformatlock" xmlns:w16du="http://schemas.microsoft.com/office/word/2023/wordml/word16du">
+          <mc:Fallback xmlns:w16du="http://schemas.microsoft.com/office/word/2023/wordml/word16du" xmlns:w16sdtfl="http://schemas.microsoft.com/office/word/2024/wordml/sdtformatlock">
             <w:pict>
               <v:shape w14:anchorId="4C649850" id="FreeForm 4" o:spid="_x0000_s1026" style="position:absolute;margin-left:13.45pt;margin-top:8.25pt;width:3.45pt;height:14.65pt;rotation:-90;z-index:251650560;visibility:visible;mso-wrap-style:square;mso-width-percent:0;mso-height-percent:0;mso-wrap-distance-left:9pt;mso-wrap-distance-top:0;mso-wrap-distance-right:9pt;mso-wrap-distance-bottom:0;mso-position-horizontal:absolute;mso-position-horizontal-relative:text;mso-position-vertical:absolute;mso-position-vertical-relative:text;mso-width-percent:0;mso-height-percent:0;mso-width-relative:page;mso-height-relative:page;v-text-anchor:top" coordsize="40,446" o:gfxdata="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" path="m24,19r16,92l40,149r-8,37l24,260r8,130l32,427r,19l24,446,16,427,,334,,223,,111,16,r8,l24,19xe" strokecolor="white" strokeweight="1.5pt">
                 <v:path arrowok="t" o:connecttype="custom" o:connectlocs="28796313,3306439;47993856,19316764;47993856,25929643;38395085,32368564;28796313,45246824;38395085,67870027;38395085,74308949;38395085,77615388;28796313,77615388;19197542,74308949;0,58124667;0,38807903;0,19316764;19197542,0;28796313,0;28796313,3306439" o:connectangles="0,0,0,0,0,0,0,0,0,0,0,0,0,0,0,0"/>
@@ -5593,7 +5686,7 @@
               </wp:anchor>
             </w:drawing>
           </mc:Choice>
-          <mc:Fallback xmlns:w16sdtfl="http://schemas.microsoft.com/office/word/2024/wordml/sdtformatlock" xmlns:w16du="http://schemas.microsoft.com/office/word/2023/wordml/word16du">
+          <mc:Fallback xmlns:w16du="http://schemas.microsoft.com/office/word/2023/wordml/word16du" xmlns:w16sdtfl="http://schemas.microsoft.com/office/word/2024/wordml/sdtformatlock">
             <w:pict>
               <v:shape w14:anchorId="238A198E" id="FreeForm 3" o:spid="_x0000_s1026" style="position:absolute;margin-left:26.05pt;margin-top:29.8pt;width:14.35pt;height:3.05pt;rotation:-90;z-index:251649536;visibility:visible;mso-wrap-style:square;mso-width-percent:0;mso-height-percent:0;mso-wrap-distance-left:9pt;mso-wrap-distance-top:0;mso-wrap-distance-right:9pt;mso-wrap-distance-bottom:0;mso-position-horizontal:absolute;mso-position-horizontal-relative:text;mso-position-vertical:absolute;mso-position-vertical-relative:text;mso-width-percent:0;mso-height-percent:0;mso-width-relative:page;mso-height-relative:page;v-text-anchor:top" coordsize="167,93" o:gfxdata="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" path="m151,19r-32,l88,75,72,93,56,75,,19,,,8,,64,19r16,l111,r40,l159,19r8,18l151,19xe" strokecolor="white" strokeweight="1.5pt">
                 <v:path arrowok="t" o:connecttype="custom" o:connectlocs="179826707,3296224;141717859,3296224;104799605,13010795;85745727,16133336;66690757,13010795;0,3296224;0,0;9526939,0;76217696,3296224;95272666,3296224;132190920,0;179826707,0;189354738,3296224;198881677,6418764;179826707,3296224" o:connectangles="0,0,0,0,0,0,0,0,0,0,0,0,0,0,0"/>

</xml_diff>

<commit_message>
docs: luu checklist nb02 va cap nhat bao cao
</commit_message>
<xml_diff>
--- a/docs/2. Mau tai lieu.docx
+++ b/docs/2. Mau tai lieu.docx
@@ -396,7 +396,7 @@
               </wp:anchor>
             </w:drawing>
           </mc:Choice>
-          <mc:Fallback xmlns:w16du="http://schemas.microsoft.com/office/word/2023/wordml/word16du" xmlns:w16sdtfl="http://schemas.microsoft.com/office/word/2024/wordml/sdtformatlock">
+          <mc:Fallback xmlns:w16sdtfl="http://schemas.microsoft.com/office/word/2024/wordml/sdtformatlock" xmlns:w16du="http://schemas.microsoft.com/office/word/2023/wordml/word16du">
             <w:pict>
               <v:group w14:anchorId="7B3222B4" id="Group 26" o:spid="_x0000_s1026" style="position:absolute;margin-left:0;margin-top:-9.4pt;width:507.45pt;height:747pt;z-index:251668992;mso-position-horizontal:left;mso-position-horizontal-relative:margin;mso-width-relative:margin" coordsize="58635,94869" o:gfxdata="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">
                 <v:shape id="FreeForm 22" o:spid="_x0000_s1027" style="position:absolute;left:-47203;top:47203;width:94869;height:463;rotation:-90;visibility:visible;mso-wrap-style:square;v-text-anchor:top" coordsize="8662,111" o:gfxdata="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" path="m48,111l,,8662,r-40,111l48,111xe" fillcolor="#b0b0b0" strokeweight="1.5pt">
@@ -676,7 +676,7 @@
               </wp:anchor>
             </w:drawing>
           </mc:Choice>
-          <mc:Fallback xmlns:w16du="http://schemas.microsoft.com/office/word/2023/wordml/word16du" xmlns:w16sdtfl="http://schemas.microsoft.com/office/word/2024/wordml/sdtformatlock">
+          <mc:Fallback xmlns:w16sdtfl="http://schemas.microsoft.com/office/word/2024/wordml/sdtformatlock" xmlns:w16du="http://schemas.microsoft.com/office/word/2023/wordml/word16du">
             <w:pict>
               <v:shape w14:anchorId="04DAE31C" id="FreeForm 21" o:spid="_x0000_s1026" style="position:absolute;margin-left:428.35pt;margin-top:3.75pt;width:22.65pt;height:20.2pt;rotation:-90;z-index:251654656;visibility:visible;mso-wrap-style:square;mso-width-percent:0;mso-height-percent:0;mso-wrap-distance-left:9pt;mso-wrap-distance-top:0;mso-wrap-distance-right:9pt;mso-wrap-distance-bottom:0;mso-position-horizontal:absolute;mso-position-horizontal-relative:text;mso-position-vertical:absolute;mso-position-vertical-relative:text;mso-width-percent:0;mso-height-percent:0;mso-width-relative:page;mso-height-relative:page;v-text-anchor:top" coordsize="263,613" o:gfxdata="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" path="m,19l16,56r32,74l128,316r79,186l239,576r16,37l263,594r,-37l239,390r,-74l247,260r,-18l239,242,191,223,136,167,72,93,24,19,,,,19xe" strokecolor="white" strokeweight="1.5pt">
                 <v:path arrowok="t" o:connecttype="custom" o:connectlocs="0,3327487;19140542,9807947;57421625,22768448;153123241,55344843;247629393,87921238;285910476,100881739;305051018,107361781;314621289,104034294;314621289,97553834;285910476,68305344;285910476,55344843;295480747,45536896;295480747,42384342;285910476,42384342;228488851,39056436;162693512,29248489;86132438,16287988;28710813,3327487;0,0;0,3327487" o:connectangles="0,0,0,0,0,0,0,0,0,0,0,0,0,0,0,0,0,0,0,0"/>
@@ -896,7 +896,7 @@
               </wp:anchor>
             </w:drawing>
           </mc:Choice>
-          <mc:Fallback xmlns:w16du="http://schemas.microsoft.com/office/word/2023/wordml/word16du" xmlns:w16sdtfl="http://schemas.microsoft.com/office/word/2024/wordml/sdtformatlock">
+          <mc:Fallback xmlns:w16sdtfl="http://schemas.microsoft.com/office/word/2024/wordml/sdtformatlock" xmlns:w16du="http://schemas.microsoft.com/office/word/2023/wordml/word16du">
             <w:pict>
               <v:shape w14:anchorId="62480848" id="FreeForm 20" o:spid="_x0000_s1026" style="position:absolute;margin-left:421.35pt;margin-top:7.6pt;width:14.45pt;height:3.05pt;rotation:-90;z-index:251653632;visibility:visible;mso-wrap-style:square;mso-width-percent:0;mso-height-percent:0;mso-wrap-distance-left:9pt;mso-wrap-distance-top:0;mso-wrap-distance-right:9pt;mso-wrap-distance-bottom:0;mso-position-horizontal:absolute;mso-position-horizontal-relative:text;mso-position-vertical:absolute;mso-position-vertical-relative:text;mso-width-percent:0;mso-height-percent:0;mso-width-relative:page;mso-height-relative:page;v-text-anchor:top" coordsize="167,93" o:gfxdata="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" path="m8,56r32,l71,18,87,r16,l159,74r8,l151,93,103,56r-16,l56,93,16,74,,56r8,xe" strokecolor="white" strokeweight="1.5pt">
                 <v:path arrowok="t" o:connecttype="custom" o:connectlocs="9660361,9714571;48302906,9714571;85736670,3122541;105058491,0;124379214,0;192002843,12837112;201663205,12837112;182342482,16133336;124379214,9714571;105058491,9714571;67623629,16133336;19320723,12837112;0,9714571;0,9714571;9660361,9714571" o:connectangles="0,0,0,0,0,0,0,0,0,0,0,0,0,0,0"/>
@@ -1164,7 +1164,7 @@
               </wp:anchor>
             </w:drawing>
           </mc:Choice>
-          <mc:Fallback xmlns:w16du="http://schemas.microsoft.com/office/word/2023/wordml/word16du" xmlns:w16sdtfl="http://schemas.microsoft.com/office/word/2024/wordml/sdtformatlock">
+          <mc:Fallback xmlns:w16sdtfl="http://schemas.microsoft.com/office/word/2024/wordml/sdtformatlock" xmlns:w16du="http://schemas.microsoft.com/office/word/2023/wordml/word16du">
             <w:pict>
               <v:shape w14:anchorId="151C1FF4" id="FreeForm 19" o:spid="_x0000_s1026" style="position:absolute;margin-left:10.25pt;margin-top:3.85pt;width:22.65pt;height:20.25pt;rotation:-90;z-index:251647488;visibility:visible;mso-wrap-style:square;mso-width-percent:0;mso-height-percent:0;mso-wrap-distance-left:9pt;mso-wrap-distance-top:0;mso-wrap-distance-right:9pt;mso-wrap-distance-bottom:0;mso-position-horizontal:absolute;mso-position-horizontal-relative:text;mso-position-vertical:absolute;mso-position-vertical-relative:text;mso-width-percent:0;mso-height-percent:0;mso-width-relative:page;mso-height-relative:page;v-text-anchor:top" coordsize="263,613" o:gfxdata="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" path="m,595l16,576,48,502,128,316,207,112,239,38,255,r8,19l263,75,239,223r,75l247,372r,18l239,390r-48,l136,446,72,520,24,595,,613,,595xe" strokecolor="white" strokeweight="1.5pt">
                 <v:path arrowok="t" o:connecttype="custom" o:connectlocs="0,104725604;19140542,101381490;57421625,88357023;153123241,55619023;247629393,19713114;285910476,6688228;305051018,0;314621289,3344114;314621289,13200671;285910476,39250023;285910476,52450694;295480747,65475580;295480747,68643909;285910476,68643909;228488851,68643909;162693512,78500466;86132438,91524933;28710813,104725604;0,107893933;0,104725604" o:connectangles="0,0,0,0,0,0,0,0,0,0,0,0,0,0,0,0,0,0,0,0"/>
@@ -1387,7 +1387,7 @@
               </wp:anchor>
             </w:drawing>
           </mc:Choice>
-          <mc:Fallback xmlns:w16du="http://schemas.microsoft.com/office/word/2023/wordml/word16du" xmlns:w16sdtfl="http://schemas.microsoft.com/office/word/2024/wordml/sdtformatlock">
+          <mc:Fallback xmlns:w16sdtfl="http://schemas.microsoft.com/office/word/2024/wordml/sdtformatlock" xmlns:w16du="http://schemas.microsoft.com/office/word/2023/wordml/word16du">
             <w:pict>
               <v:shape w14:anchorId="4BD2B0F0" id="FreeForm 18" o:spid="_x0000_s1026" style="position:absolute;margin-left:26pt;margin-top:7.6pt;width:14.45pt;height:3.05pt;rotation:-90;z-index:251646464;visibility:visible;mso-wrap-style:square;mso-width-percent:0;mso-height-percent:0;mso-wrap-distance-left:9pt;mso-wrap-distance-top:0;mso-wrap-distance-right:9pt;mso-wrap-distance-bottom:0;mso-position-horizontal:absolute;mso-position-horizontal-relative:text;mso-position-vertical:absolute;mso-position-vertical-relative:text;mso-width-percent:0;mso-height-percent:0;mso-width-relative:page;mso-height-relative:page;v-text-anchor:top" coordsize="167,93" o:gfxdata="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" path="m8,19r32,l71,75,87,93,103,75,159,19,167,,151,,103,19r-16,l56,,16,,,19,,37,8,19xe" strokecolor="white" strokeweight="1.5pt">
                 <v:path arrowok="t" o:connecttype="custom" o:connectlocs="9660361,3296224;48302906,3296224;85736670,13010795;105058491,16133336;124379214,13010795;192002843,3296224;201663205,0;182342482,0;124379214,3296224;105058491,3296224;67623629,0;19320723,0;0,3296224;0,6418764;9660361,3296224" o:connectangles="0,0,0,0,0,0,0,0,0,0,0,0,0,0,0"/>
@@ -1613,7 +1613,7 @@
               </wp:anchor>
             </w:drawing>
           </mc:Choice>
-          <mc:Fallback xmlns:w16du="http://schemas.microsoft.com/office/word/2023/wordml/word16du" xmlns:w16sdtfl="http://schemas.microsoft.com/office/word/2024/wordml/sdtformatlock">
+          <mc:Fallback xmlns:w16sdtfl="http://schemas.microsoft.com/office/word/2024/wordml/sdtformatlock" xmlns:w16du="http://schemas.microsoft.com/office/word/2023/wordml/word16du">
             <w:pict>
               <v:shape w14:anchorId="5EC44B68" id="FreeForm 17" o:spid="_x0000_s1026" style="position:absolute;margin-left:444.15pt;margin-top:9.1pt;width:4.1pt;height:14.05pt;rotation:-90;z-index:251655680;visibility:visible;mso-wrap-style:square;mso-width-percent:0;mso-height-percent:0;mso-wrap-distance-left:9pt;mso-wrap-distance-top:0;mso-wrap-distance-right:9pt;mso-wrap-distance-bottom:0;mso-position-horizontal:absolute;mso-position-horizontal-relative:text;mso-position-vertical:absolute;mso-position-vertical-relative:text;mso-width-percent:0;mso-height-percent:0;mso-width-relative:page;mso-height-relative:page;v-text-anchor:top" coordsize="48,427" o:gfxdata="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" path="m16,409l,335,,297,8,260r8,-93l16,56,8,19,16,r8,19l40,112r8,111l40,335,24,427,16,409xe" strokecolor="white" strokeweight="1.5pt">
                 <v:path arrowok="t" o:connecttype="custom" o:connectlocs="18828729,71421221;0,58499100;0,51863574;9413822,45402305;18828729,29162213;18828729,9778823;9413822,3317972;18828729,0;18828729,0;28242551,3317972;47071280,19558064;56485102,38941036;47071280,58499100;28242551,74564518;28242551,74564518;18828729,71421221" o:connectangles="0,0,0,0,0,0,0,0,0,0,0,0,0,0,0,0"/>
@@ -1845,7 +1845,7 @@
               </wp:anchor>
             </w:drawing>
           </mc:Choice>
-          <mc:Fallback xmlns:w16du="http://schemas.microsoft.com/office/word/2023/wordml/word16du" xmlns:w16sdtfl="http://schemas.microsoft.com/office/word/2024/wordml/sdtformatlock">
+          <mc:Fallback xmlns:w16sdtfl="http://schemas.microsoft.com/office/word/2024/wordml/sdtformatlock" xmlns:w16du="http://schemas.microsoft.com/office/word/2023/wordml/word16du">
             <w:pict>
               <v:shape w14:anchorId="2784E679" id="FreeForm 16" o:spid="_x0000_s1026" style="position:absolute;margin-left:388.35pt;margin-top:13.35pt;width:17.95pt;height:6.75pt;rotation:-90;z-index:251652608;visibility:visible;mso-wrap-style:square;mso-width-percent:0;mso-height-percent:0;mso-wrap-distance-left:9pt;mso-wrap-distance-top:0;mso-wrap-distance-right:9pt;mso-wrap-distance-bottom:0;mso-position-horizontal:absolute;mso-position-horizontal-relative:text;mso-position-vertical:absolute;mso-position-vertical-relative:text;mso-width-percent:0;mso-height-percent:0;mso-width-relative:page;mso-height-relative:page;v-text-anchor:top" coordsize="208,204" o:gfxdata="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" path="m16,93l48,37,96,r48,l192,37r16,37l208,93r-8,l184,93r-72,18l72,130,40,186,24,204,8,186,,149,16,93xe" strokecolor="white" strokeweight="1.5pt">
                 <v:path arrowok="t" o:connecttype="custom" o:connectlocs="19219203,16422641;57656513,6533590;115314122,0;172970636,0;230627149,6533590;249846352,13067179;249846352,16422641;240236751,16422641;221017547,16422641;134532230,19600769;86485318,22956231;48046912,32844861;28828805,36023410;9609602,32844861;0,26311272;19219203,16422641" o:connectangles="0,0,0,0,0,0,0,0,0,0,0,0,0,0,0,0"/>
@@ -2071,7 +2071,7 @@
               </wp:anchor>
             </w:drawing>
           </mc:Choice>
-          <mc:Fallback xmlns:w16du="http://schemas.microsoft.com/office/word/2023/wordml/word16du" xmlns:w16sdtfl="http://schemas.microsoft.com/office/word/2024/wordml/sdtformatlock">
+          <mc:Fallback xmlns:w16sdtfl="http://schemas.microsoft.com/office/word/2024/wordml/sdtformatlock" xmlns:w16du="http://schemas.microsoft.com/office/word/2023/wordml/word16du">
             <w:pict>
               <v:shape w14:anchorId="2722CD0D" id="FreeForm 15" o:spid="_x0000_s1026" style="position:absolute;margin-left:13pt;margin-top:8.8pt;width:4.1pt;height:14.65pt;rotation:-90;z-index:251648512;visibility:visible;mso-wrap-style:square;mso-width-percent:0;mso-height-percent:0;mso-wrap-distance-left:9pt;mso-wrap-distance-top:0;mso-wrap-distance-right:9pt;mso-wrap-distance-bottom:0;mso-position-horizontal:absolute;mso-position-horizontal-relative:text;mso-position-vertical:absolute;mso-position-vertical-relative:text;mso-width-percent:0;mso-height-percent:0;mso-width-relative:page;mso-height-relative:page;v-text-anchor:top" coordsize="48,446" o:gfxdata="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" path="m16,19l,111r,38l8,186r8,74l16,390,8,427r8,19l24,427,40,334,48,223,40,111,24,,16,19xe" strokecolor="white" strokeweight="1.5pt">
                 <v:path arrowok="t" o:connecttype="custom" o:connectlocs="18828729,3306439;0,19316764;0,25929643;9413822,32368564;18828729,45246824;18828729,67870027;9413822,74308949;18828729,77615388;18828729,77615388;28242551,74308949;47071280,58124667;56485102,38807903;47071280,19316764;28242551,0;28242551,0;18828729,3306439" o:connectangles="0,0,0,0,0,0,0,0,0,0,0,0,0,0,0,0"/>
@@ -2303,7 +2303,7 @@
               </wp:anchor>
             </w:drawing>
           </mc:Choice>
-          <mc:Fallback xmlns:w16du="http://schemas.microsoft.com/office/word/2023/wordml/word16du" xmlns:w16sdtfl="http://schemas.microsoft.com/office/word/2024/wordml/sdtformatlock">
+          <mc:Fallback xmlns:w16sdtfl="http://schemas.microsoft.com/office/word/2024/wordml/sdtformatlock" xmlns:w16du="http://schemas.microsoft.com/office/word/2023/wordml/word16du">
             <w:pict>
               <v:shape w14:anchorId="27C0B3DC" id="FreeForm 14" o:spid="_x0000_s1026" style="position:absolute;margin-left:54.9pt;margin-top:13.35pt;width:17.95pt;height:6.75pt;rotation:-90;z-index:251645440;visibility:visible;mso-wrap-style:square;mso-width-percent:0;mso-height-percent:0;mso-wrap-distance-left:9pt;mso-wrap-distance-top:0;mso-wrap-distance-right:9pt;mso-wrap-distance-bottom:0;mso-position-horizontal:absolute;mso-position-horizontal-relative:text;mso-position-vertical:absolute;mso-position-vertical-relative:text;mso-width-percent:0;mso-height-percent:0;mso-width-relative:page;mso-height-relative:page;v-text-anchor:top" coordsize="208,204" o:gfxdata="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" path="m16,130r32,56l96,204r48,l192,167r16,-18l208,130r-8,l184,130,112,112,72,74,40,19,24,,8,37,,74r16,56xe" strokecolor="white" strokeweight="1.5pt">
                 <v:path arrowok="t" o:connecttype="custom" o:connectlocs="19219203,22956231;57656513,32844861;115314122,36023410;172970636,36023410;230627149,29489820;249846352,26311272;249846352,22956231;240236751,22956231;221017547,22956231;134532230,19777682;86485318,13067179;48046912,3355041;28828805,0;9609602,6533590;0,13067179;19219203,22956231" o:connectangles="0,0,0,0,0,0,0,0,0,0,0,0,0,0,0,0"/>
@@ -2426,7 +2426,7 @@
                     </pic:cNvPicPr>
                   </pic:nvPicPr>
                   <pic:blipFill>
-                    <a:blip r:embed="rId7">
+                    <a:blip r:embed="rId8">
                       <a:extLst>
                         <a:ext uri="{28A0092B-C50C-407E-A947-70E740481C1C}">
                           <a14:useLocalDpi xmlns:a14="http://schemas.microsoft.com/office/drawing/2010/main" val="0"/>
@@ -3202,7 +3202,7 @@
               </wp:anchor>
             </w:drawing>
           </mc:Choice>
-          <mc:Fallback xmlns:w16du="http://schemas.microsoft.com/office/word/2023/wordml/word16du" xmlns:w16sdtfl="http://schemas.microsoft.com/office/word/2024/wordml/sdtformatlock">
+          <mc:Fallback xmlns:w16sdtfl="http://schemas.microsoft.com/office/word/2024/wordml/sdtformatlock" xmlns:w16du="http://schemas.microsoft.com/office/word/2023/wordml/word16du">
             <w:pict>
               <v:shape w14:anchorId="1FCF3E9A" id="FreeForm 13" o:spid="_x0000_s1026" style="position:absolute;margin-left:432.55pt;margin-top:7.25pt;width:6.95pt;height:14.1pt;rotation:-90;z-index:251663872;visibility:visible;mso-wrap-style:square;mso-width-percent:0;mso-height-percent:0;mso-wrap-distance-left:9pt;mso-wrap-distance-top:0;mso-wrap-distance-right:9pt;mso-wrap-distance-bottom:0;mso-position-horizontal:absolute;mso-position-horizontal-relative:text;mso-position-vertical:absolute;mso-position-vertical-relative:text;mso-width-percent:0;mso-height-percent:0;mso-width-relative:page;mso-height-relative:page;v-text-anchor:top" coordsize="80,427" o:gfxdata="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" path="m8,l24,,56,55r16,56l80,204r-8,93l40,408,24,427r-8,l16,408r8,-37l32,297r,-56l16,148,,74,8,xe" strokecolor="white" strokeweight="1.5pt">
                 <v:path arrowok="t" o:connecttype="custom" o:connectlocs="9738939,0;29215715,0;68169266,9672716;87646042,19521566;97383878,35877325;87646042,52233083;48692491,71754649;29215715,75096171;19476776,75096171;19476776,71754649;29215715,65247321;38953551,52233083;38953551,42384653;19476776,26028475;0,13014237;9738939,0" o:connectangles="0,0,0,0,0,0,0,0,0,0,0,0,0,0,0,0"/>
@@ -3495,7 +3495,7 @@
               </wp:anchor>
             </w:drawing>
           </mc:Choice>
-          <mc:Fallback xmlns:w16du="http://schemas.microsoft.com/office/word/2023/wordml/word16du" xmlns:w16sdtfl="http://schemas.microsoft.com/office/word/2024/wordml/sdtformatlock">
+          <mc:Fallback xmlns:w16sdtfl="http://schemas.microsoft.com/office/word/2024/wordml/sdtformatlock" xmlns:w16du="http://schemas.microsoft.com/office/word/2023/wordml/word16du">
             <w:pict>
               <v:shape w14:anchorId="701594E3" id="FreeForm 12" o:spid="_x0000_s1026" style="position:absolute;margin-left:395.8pt;margin-top:12.85pt;width:23.35pt;height:20.8pt;rotation:-90;z-index:251656704;visibility:visible;mso-wrap-style:square;mso-width-percent:0;mso-height-percent:0;mso-wrap-distance-left:9pt;mso-wrap-distance-top:0;mso-wrap-distance-right:9pt;mso-wrap-distance-bottom:0;mso-position-horizontal:absolute;mso-position-horizontal-relative:text;mso-position-vertical:absolute;mso-position-vertical-relative:text;mso-width-percent:0;mso-height-percent:0;mso-width-relative:page;mso-height-relative:page;v-text-anchor:top" coordsize="271,631" o:gfxdata="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" path="m120,56l80,37r-32,l48,93,64,204,56,371,40,483,8,594,,631r8,l24,594,56,520,144,334,231,130,255,56,271,18,271,r-8,l223,18,183,37,144,74r-8,l120,56xe" strokecolor="white" strokeweight="1.5pt">
                 <v:path arrowok="t" o:connecttype="custom" o:connectlocs="143688637,9814528;95792789,6484688;57476111,6484688;57476111,16298798;76634450,35752444;67055281,65020200;47895847,84649256;9579169,104102484;0,110587172;9579169,110587172;28737508,104102484;67055281,91133525;172427239,58535930;276602075,22783486;305339584,9814528;324497923,3154430;324497923,0;314918753,0;267021811,3154430;219125964,6484688;172427239,12968958;162848070,12968958;143688637,9814528" o:connectangles="0,0,0,0,0,0,0,0,0,0,0,0,0,0,0,0,0,0,0,0,0,0,0"/>
@@ -3725,7 +3725,7 @@
               </wp:anchor>
             </w:drawing>
           </mc:Choice>
-          <mc:Fallback xmlns:w16du="http://schemas.microsoft.com/office/word/2023/wordml/word16du" xmlns:w16sdtfl="http://schemas.microsoft.com/office/word/2024/wordml/sdtformatlock">
+          <mc:Fallback xmlns:w16sdtfl="http://schemas.microsoft.com/office/word/2024/wordml/sdtformatlock" xmlns:w16du="http://schemas.microsoft.com/office/word/2023/wordml/word16du">
             <w:pict>
               <v:shape w14:anchorId="405E6262" id="FreeForm 11" o:spid="_x0000_s1026" style="position:absolute;margin-left:21.85pt;margin-top:7.25pt;width:6.95pt;height:14.1pt;rotation:-90;z-index:251651584;visibility:visible;mso-wrap-style:square;mso-width-percent:0;mso-height-percent:0;mso-wrap-distance-left:9pt;mso-wrap-distance-top:0;mso-wrap-distance-right:9pt;mso-wrap-distance-bottom:0;mso-position-horizontal:absolute;mso-position-horizontal-relative:text;mso-position-vertical:absolute;mso-position-vertical-relative:text;mso-width-percent:0;mso-height-percent:0;mso-width-relative:page;mso-height-relative:page;v-text-anchor:top" coordsize="80,427" o:gfxdata="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" path="m8,427r16,l56,390,72,315r8,-74l72,148,40,37,24,,16,r,18l24,74r8,56l32,185,16,297,,371r8,56xe" strokecolor="white" strokeweight="1.5pt">
                 <v:path arrowok="t" o:connecttype="custom" o:connectlocs="9738939,75096171;29215715,75096171;68169266,68588842;87646042,55398890;97383878,42384653;87646042,26028475;48692491,6507328;29215715,0;19476776,0;19476776,3165807;29215715,13014237;38953551,22863087;38953551,32535803;19476776,52233083;0,65247321;9738939,75096171" o:connectangles="0,0,0,0,0,0,0,0,0,0,0,0,0,0,0,0"/>
@@ -4056,7 +4056,7 @@
               </wp:anchor>
             </w:drawing>
           </mc:Choice>
-          <mc:Fallback xmlns:w16du="http://schemas.microsoft.com/office/word/2023/wordml/word16du" xmlns:w16sdtfl="http://schemas.microsoft.com/office/word/2024/wordml/sdtformatlock">
+          <mc:Fallback xmlns:w16sdtfl="http://schemas.microsoft.com/office/word/2024/wordml/sdtformatlock" xmlns:w16du="http://schemas.microsoft.com/office/word/2023/wordml/word16du">
             <w:pict>
               <v:shape w14:anchorId="41CF14AA" id="FreeForm 10" o:spid="_x0000_s1026" style="position:absolute;margin-left:412.8pt;margin-top:6.55pt;width:19.9pt;height:6.1pt;rotation:-90;z-index:251662848;visibility:visible;mso-wrap-style:square;mso-width-percent:0;mso-height-percent:0;mso-wrap-distance-left:9pt;mso-wrap-distance-top:0;mso-wrap-distance-right:9pt;mso-wrap-distance-bottom:0;mso-position-horizontal:absolute;mso-position-horizontal-relative:text;mso-position-vertical:absolute;mso-position-vertical-relative:text;mso-width-percent:0;mso-height-percent:0;mso-width-relative:page;mso-height-relative:page;v-text-anchor:top" coordsize="231,186" o:gfxdata="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" path="m,167l48,93,112,19,175,r24,l223,37r8,37l223,111r-8,19l207,111,160,74,104,93,48,130,8,186r-8,l,167xe" strokecolor="white" strokeweight="1.5pt">
                 <v:path arrowok="t" o:connecttype="custom" o:connectlocs="0,28970448;57455047,16133336;134062871,3296224;209472689,0;238200760,0;266927737,6418764;276504125,12837112;266927737,19255877;257352443,22552100;247776054,19255877;191517919,12837112;124486483,16133336;57455047,22552100;9576388,32266672;0,32266672;0,28970448" o:connectangles="0,0,0,0,0,0,0,0,0,0,0,0,0,0,0,0"/>
@@ -4288,7 +4288,7 @@
               </wp:anchor>
             </w:drawing>
           </mc:Choice>
-          <mc:Fallback xmlns:w16du="http://schemas.microsoft.com/office/word/2023/wordml/word16du" xmlns:w16sdtfl="http://schemas.microsoft.com/office/word/2024/wordml/sdtformatlock">
+          <mc:Fallback xmlns:w16sdtfl="http://schemas.microsoft.com/office/word/2024/wordml/sdtformatlock" xmlns:w16du="http://schemas.microsoft.com/office/word/2023/wordml/word16du">
             <w:pict>
               <v:shape w14:anchorId="2DDF7FF9" id="FreeForm 9" o:spid="_x0000_s1026" style="position:absolute;margin-left:444.6pt;margin-top:8.55pt;width:3.45pt;height:14.05pt;rotation:-90;z-index:251661824;visibility:visible;mso-wrap-style:square;mso-width-percent:0;mso-height-percent:0;mso-wrap-distance-left:9pt;mso-wrap-distance-top:0;mso-wrap-distance-right:9pt;mso-wrap-distance-bottom:0;mso-position-horizontal:absolute;mso-position-horizontal-relative:text;mso-position-vertical:absolute;mso-position-vertical-relative:text;mso-width-percent:0;mso-height-percent:0;mso-width-relative:page;mso-height-relative:page;v-text-anchor:top" coordsize="40,427" o:gfxdata="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" path="m24,409l40,335r,-38l32,260,24,167,32,56r,-37l32,,24,,16,19,,112,,223,,335r16,92l24,427r,-18xe" strokecolor="white" strokeweight="1.5pt">
                 <v:path arrowok="t" o:connecttype="custom" o:connectlocs="28796313,71421221;47993856,58499100;47993856,51863574;38395085,45402305;28796313,29162213;38395085,9778823;38395085,3317972;38395085,0;28796313,0;19197542,3317972;0,19558064;0,38941036;0,58499100;19197542,74564518;28796313,74564518;28796313,71421221" o:connectangles="0,0,0,0,0,0,0,0,0,0,0,0,0,0,0,0"/>
@@ -4556,7 +4556,7 @@
               </wp:anchor>
             </w:drawing>
           </mc:Choice>
-          <mc:Fallback xmlns:w16du="http://schemas.microsoft.com/office/word/2023/wordml/word16du" xmlns:w16sdtfl="http://schemas.microsoft.com/office/word/2024/wordml/sdtformatlock">
+          <mc:Fallback xmlns:w16sdtfl="http://schemas.microsoft.com/office/word/2024/wordml/sdtformatlock" xmlns:w16du="http://schemas.microsoft.com/office/word/2023/wordml/word16du">
             <w:pict>
               <v:shape w14:anchorId="332B4940" id="FreeForm 8" o:spid="_x0000_s1026" style="position:absolute;margin-left:428.6pt;margin-top:16.75pt;width:22pt;height:20.2pt;rotation:-90;z-index:251660800;visibility:visible;mso-wrap-style:square;mso-width-percent:0;mso-height-percent:0;mso-wrap-distance-left:9pt;mso-wrap-distance-top:0;mso-wrap-distance-right:9pt;mso-wrap-distance-bottom:0;mso-position-horizontal:absolute;mso-position-horizontal-relative:text;mso-position-vertical:absolute;mso-position-vertical-relative:text;mso-width-percent:0;mso-height-percent:0;mso-width-relative:page;mso-height-relative:page;v-text-anchor:top" coordsize="255,613" o:gfxdata="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" path="m255,19r-8,37l215,130,135,316,48,502,16,576,,613,,594,,557,16,390r,-74l8,260r,-18l16,242,64,223r63,-56l191,93,231,19,255,r,19xe" strokecolor="white" strokeweight="1.5pt">
                 <v:path arrowok="t" o:connecttype="custom" o:connectlocs="306134745,3327487;296531055,9807947;258114103,22768448;162071722,55344843;57625428,87921238;19208476,100881739;0,107361781;0,104034294;0,97553834;19208476,68305344;19208476,55344843;9603690,45536896;9603690,42384342;19208476,42384342;76833904,39056436;152466936,29248489;229300841,16287988;277322579,3327487;306134745,0;306134745,3327487" o:connectangles="0,0,0,0,0,0,0,0,0,0,0,0,0,0,0,0,0,0,0,0"/>
@@ -4776,7 +4776,7 @@
               </wp:anchor>
             </w:drawing>
           </mc:Choice>
-          <mc:Fallback xmlns:w16du="http://schemas.microsoft.com/office/word/2023/wordml/word16du" xmlns:w16sdtfl="http://schemas.microsoft.com/office/word/2024/wordml/sdtformatlock">
+          <mc:Fallback xmlns:w16sdtfl="http://schemas.microsoft.com/office/word/2024/wordml/sdtformatlock" xmlns:w16du="http://schemas.microsoft.com/office/word/2023/wordml/word16du">
             <w:pict>
               <v:shape w14:anchorId="2BF9838A" id="FreeForm 7" o:spid="_x0000_s1026" style="position:absolute;margin-left:421.4pt;margin-top:29.8pt;width:14.35pt;height:3.05pt;rotation:-90;z-index:251659776;visibility:visible;mso-wrap-style:square;mso-width-percent:0;mso-height-percent:0;mso-wrap-distance-left:9pt;mso-wrap-distance-top:0;mso-wrap-distance-right:9pt;mso-wrap-distance-bottom:0;mso-position-horizontal:absolute;mso-position-horizontal-relative:text;mso-position-vertical:absolute;mso-position-vertical-relative:text;mso-width-percent:0;mso-height-percent:0;mso-width-relative:page;mso-height-relative:page;v-text-anchor:top" coordsize="167,93" o:gfxdata="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" path="m151,56r-32,l88,18,72,,56,,,74,8,93,64,56r16,l111,93,151,74r8,-18l167,56r-16,xe" strokecolor="white" strokeweight="1.5pt">
                 <v:path arrowok="t" o:connecttype="custom" o:connectlocs="179826707,9714571;141717859,9714571;104799605,3122541;85745727,0;66690757,0;0,12837112;0,12837112;9526939,16133336;76217696,9714571;95272666,9714571;132190920,16133336;179826707,12837112;189354738,9714571;198881677,9714571;179826707,9714571" o:connectangles="0,0,0,0,0,0,0,0,0,0,0,0,0,0,0"/>
@@ -5008,7 +5008,7 @@
               </wp:anchor>
             </w:drawing>
           </mc:Choice>
-          <mc:Fallback xmlns:w16du="http://schemas.microsoft.com/office/word/2023/wordml/word16du" xmlns:w16sdtfl="http://schemas.microsoft.com/office/word/2024/wordml/sdtformatlock">
+          <mc:Fallback xmlns:w16sdtfl="http://schemas.microsoft.com/office/word/2024/wordml/sdtformatlock" xmlns:w16du="http://schemas.microsoft.com/office/word/2023/wordml/word16du">
             <w:pict>
               <v:shape w14:anchorId="40CEFC85" id="FreeForm 6" o:spid="_x0000_s1026" style="position:absolute;margin-left:388.4pt;margin-top:11.85pt;width:17.95pt;height:6.75pt;rotation:-90;z-index:251658752;visibility:visible;mso-wrap-style:square;mso-width-percent:0;mso-height-percent:0;mso-wrap-distance-left:9pt;mso-wrap-distance-top:0;mso-wrap-distance-right:9pt;mso-wrap-distance-bottom:0;mso-position-horizontal:absolute;mso-position-horizontal-relative:text;mso-position-vertical:absolute;mso-position-vertical-relative:text;mso-width-percent:0;mso-height-percent:0;mso-width-relative:page;mso-height-relative:page;v-text-anchor:top" coordsize="208,204" o:gfxdata="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" path="m200,93l160,37,112,,64,,16,37,,74,,93r8,l32,93r72,18l136,130r32,56l184,204r16,-18l208,149,200,93xe" strokecolor="white" strokeweight="1.5pt">
                 <v:path arrowok="t" o:connecttype="custom" o:connectlocs="240236751,16422641;192189839,6533590;134532230,0;76875716,0;19219203,6533590;0,13067179;0,16422641;9609602,16422641;38438406,16422641;124923724,19600769;163361034,22956231;201799440,32844861;221017547,36023410;240236751,32844861;249846352,26311272;240236751,16422641" o:connectangles="0,0,0,0,0,0,0,0,0,0,0,0,0,0,0,0"/>
@@ -5231,7 +5231,7 @@
               </wp:anchor>
             </w:drawing>
           </mc:Choice>
-          <mc:Fallback xmlns:w16du="http://schemas.microsoft.com/office/word/2023/wordml/word16du" xmlns:w16sdtfl="http://schemas.microsoft.com/office/word/2024/wordml/sdtformatlock">
+          <mc:Fallback xmlns:w16sdtfl="http://schemas.microsoft.com/office/word/2024/wordml/sdtformatlock" xmlns:w16du="http://schemas.microsoft.com/office/word/2023/wordml/word16du">
             <w:pict>
               <v:shape w14:anchorId="0498CD70" id="FreeForm 5" o:spid="_x0000_s1026" style="position:absolute;margin-left:409.3pt;margin-top:2.1pt;width:6.2pt;height:15.9pt;rotation:-90;z-index:251657728;visibility:visible;mso-wrap-style:square;mso-width-percent:0;mso-height-percent:0;mso-wrap-distance-left:9pt;mso-wrap-distance-top:0;mso-wrap-distance-right:9pt;mso-wrap-distance-bottom:0;mso-position-horizontal:absolute;mso-position-horizontal-relative:text;mso-position-vertical:absolute;mso-position-vertical-relative:text;mso-width-percent:0;mso-height-percent:0;mso-width-relative:page;mso-height-relative:page;v-text-anchor:top" coordsize="72,483" o:gfxdata="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" path="m16,483l56,353,72,223,72,93,48,,32,,8,18,,55,,93r24,92l40,297r-8,93l8,464r,19l16,483xe" strokecolor="white" strokeweight="1.5pt">
                 <v:path arrowok="t" o:connecttype="custom" o:connectlocs="19136007,84421791;66974932,61699440;86110939,38977507;86110939,16255156;57406928,0;38272014,0;9568004,3146011;0,9613206;0,16255156;28704011,32335557;47838924,51911479;38272014,68166635;9568004,81101025;9568004,84421791;19136007,84421791" o:connectangles="0,0,0,0,0,0,0,0,0,0,0,0,0,0,0"/>
@@ -5463,7 +5463,7 @@
               </wp:anchor>
             </w:drawing>
           </mc:Choice>
-          <mc:Fallback xmlns:w16du="http://schemas.microsoft.com/office/word/2023/wordml/word16du" xmlns:w16sdtfl="http://schemas.microsoft.com/office/word/2024/wordml/sdtformatlock">
+          <mc:Fallback xmlns:w16sdtfl="http://schemas.microsoft.com/office/word/2024/wordml/sdtformatlock" xmlns:w16du="http://schemas.microsoft.com/office/word/2023/wordml/word16du">
             <w:pict>
               <v:shape w14:anchorId="4C649850" id="FreeForm 4" o:spid="_x0000_s1026" style="position:absolute;margin-left:13.45pt;margin-top:8.25pt;width:3.45pt;height:14.65pt;rotation:-90;z-index:251650560;visibility:visible;mso-wrap-style:square;mso-width-percent:0;mso-height-percent:0;mso-wrap-distance-left:9pt;mso-wrap-distance-top:0;mso-wrap-distance-right:9pt;mso-wrap-distance-bottom:0;mso-position-horizontal:absolute;mso-position-horizontal-relative:text;mso-position-vertical:absolute;mso-position-vertical-relative:text;mso-width-percent:0;mso-height-percent:0;mso-width-relative:page;mso-height-relative:page;v-text-anchor:top" coordsize="40,446" o:gfxdata="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" path="m24,19r16,92l40,149r-8,37l24,260r8,130l32,427r,19l24,446,16,427,,334,,223,,111,16,r8,l24,19xe" strokecolor="white" strokeweight="1.5pt">
                 <v:path arrowok="t" o:connecttype="custom" o:connectlocs="28796313,3306439;47993856,19316764;47993856,25929643;38395085,32368564;28796313,45246824;38395085,67870027;38395085,74308949;38395085,77615388;28796313,77615388;19197542,74308949;0,58124667;0,38807903;0,19316764;19197542,0;28796313,0;28796313,3306439" o:connectangles="0,0,0,0,0,0,0,0,0,0,0,0,0,0,0,0"/>
@@ -5686,7 +5686,7 @@
               </wp:anchor>
             </w:drawing>
           </mc:Choice>
-          <mc:Fallback xmlns:w16du="http://schemas.microsoft.com/office/word/2023/wordml/word16du" xmlns:w16sdtfl="http://schemas.microsoft.com/office/word/2024/wordml/sdtformatlock">
+          <mc:Fallback xmlns:w16sdtfl="http://schemas.microsoft.com/office/word/2024/wordml/sdtformatlock" xmlns:w16du="http://schemas.microsoft.com/office/word/2023/wordml/word16du">
             <w:pict>
               <v:shape w14:anchorId="238A198E" id="FreeForm 3" o:spid="_x0000_s1026" style="position:absolute;margin-left:26.05pt;margin-top:29.8pt;width:14.35pt;height:3.05pt;rotation:-90;z-index:251649536;visibility:visible;mso-wrap-style:square;mso-width-percent:0;mso-height-percent:0;mso-wrap-distance-left:9pt;mso-wrap-distance-top:0;mso-wrap-distance-right:9pt;mso-wrap-distance-bottom:0;mso-position-horizontal:absolute;mso-position-horizontal-relative:text;mso-position-vertical:absolute;mso-position-vertical-relative:text;mso-width-percent:0;mso-height-percent:0;mso-width-relative:page;mso-height-relative:page;v-text-anchor:top" coordsize="167,93" o:gfxdata="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" path="m151,19r-32,l88,75,72,93,56,75,,19,,,8,,64,19r16,l111,r40,l159,19r8,18l151,19xe" strokecolor="white" strokeweight="1.5pt">
                 <v:path arrowok="t" o:connecttype="custom" o:connectlocs="179826707,3296224;141717859,3296224;104799605,13010795;85745727,16133336;66690757,13010795;0,3296224;0,0;9526939,0;76217696,3296224;95272666,3296224;132190920,0;179826707,0;189354738,3296224;198881677,6418764;179826707,3296224" o:connectangles="0,0,0,0,0,0,0,0,0,0,0,0,0,0,0"/>
@@ -5719,11 +5719,889 @@
         <w:pStyle w:val="Heading1"/>
         <w:jc w:val="center"/>
       </w:pPr>
+      <w:bookmarkStart w:id="0" w:name="_Toc235477020"/>
       <w:r>
         <w:lastRenderedPageBreak/>
         <w:t>MỤC LỤC</w:t>
       </w:r>
-    </w:p>
+      <w:bookmarkEnd w:id="0"/>
+    </w:p>
+    <w:sdt>
+      <w:sdtPr>
+        <w:id w:val="1092441269"/>
+        <w:docPartObj>
+          <w:docPartGallery w:val="Table of Contents"/>
+          <w:docPartUnique/>
+        </w:docPartObj>
+      </w:sdtPr>
+      <w:sdtEndPr>
+        <w:rPr>
+          <w:rFonts w:ascii="Times New Roman" w:eastAsia="SimSun" w:hAnsi="Times New Roman" w:cs="Times New Roman"/>
+          <w:b/>
+          <w:bCs/>
+          <w:noProof/>
+          <w:color w:val="auto"/>
+          <w:sz w:val="28"/>
+          <w:szCs w:val="24"/>
+        </w:rPr>
+      </w:sdtEndPr>
+      <w:sdtContent>
+        <w:p>
+          <w:pPr>
+            <w:pStyle w:val="TOCHeading"/>
+          </w:pPr>
+        </w:p>
+        <w:p>
+          <w:pPr>
+            <w:pStyle w:val="TOC1"/>
+            <w:tabs>
+              <w:tab w:val="right" w:leader="dot" w:pos="10169"/>
+            </w:tabs>
+            <w:rPr>
+              <w:noProof/>
+            </w:rPr>
+          </w:pPr>
+          <w:r>
+            <w:fldChar w:fldCharType="begin"/>
+          </w:r>
+          <w:r>
+            <w:instrText xml:space="preserve"> TOC \o "1-3" \h \z \u </w:instrText>
+          </w:r>
+          <w:r>
+            <w:fldChar w:fldCharType="separate"/>
+          </w:r>
+          <w:hyperlink w:anchor="_Toc235477020" w:history="1">
+            <w:r>
+              <w:rPr>
+                <w:rStyle w:val="Hyperlink"/>
+                <w:noProof/>
+              </w:rPr>
+              <w:t>MỤC LỤC</w:t>
+            </w:r>
+            <w:r>
+              <w:rPr>
+                <w:noProof/>
+                <w:webHidden/>
+              </w:rPr>
+              <w:tab/>
+            </w:r>
+            <w:r>
+              <w:rPr>
+                <w:noProof/>
+                <w:webHidden/>
+              </w:rPr>
+              <w:fldChar w:fldCharType="begin"/>
+            </w:r>
+            <w:r>
+              <w:rPr>
+                <w:noProof/>
+                <w:webHidden/>
+              </w:rPr>
+              <w:instrText xml:space="preserve"> PAGEREF _Toc235477020 \h </w:instrText>
+            </w:r>
+            <w:r>
+              <w:rPr>
+                <w:noProof/>
+                <w:webHidden/>
+              </w:rPr>
+            </w:r>
+            <w:r>
+              <w:rPr>
+                <w:noProof/>
+                <w:webHidden/>
+              </w:rPr>
+              <w:fldChar w:fldCharType="separate"/>
+            </w:r>
+            <w:r>
+              <w:rPr>
+                <w:noProof/>
+                <w:webHidden/>
+              </w:rPr>
+              <w:t>2</w:t>
+            </w:r>
+            <w:r>
+              <w:rPr>
+                <w:noProof/>
+                <w:webHidden/>
+              </w:rPr>
+              <w:fldChar w:fldCharType="end"/>
+            </w:r>
+          </w:hyperlink>
+        </w:p>
+        <w:p>
+          <w:pPr>
+            <w:pStyle w:val="TOC1"/>
+            <w:tabs>
+              <w:tab w:val="right" w:leader="dot" w:pos="10169"/>
+            </w:tabs>
+            <w:rPr>
+              <w:noProof/>
+            </w:rPr>
+          </w:pPr>
+          <w:hyperlink w:anchor="_Toc235477021" w:history="1">
+            <w:r>
+              <w:rPr>
+                <w:rStyle w:val="Hyperlink"/>
+                <w:noProof/>
+              </w:rPr>
+              <w:t>LỜI MỞ ĐẦU</w:t>
+            </w:r>
+            <w:r>
+              <w:rPr>
+                <w:noProof/>
+                <w:webHidden/>
+              </w:rPr>
+              <w:tab/>
+            </w:r>
+            <w:r>
+              <w:rPr>
+                <w:noProof/>
+                <w:webHidden/>
+              </w:rPr>
+              <w:fldChar w:fldCharType="begin"/>
+            </w:r>
+            <w:r>
+              <w:rPr>
+                <w:noProof/>
+                <w:webHidden/>
+              </w:rPr>
+              <w:instrText xml:space="preserve"> PAGEREF _Toc235477021 \h </w:instrText>
+            </w:r>
+            <w:r>
+              <w:rPr>
+                <w:noProof/>
+                <w:webHidden/>
+              </w:rPr>
+            </w:r>
+            <w:r>
+              <w:rPr>
+                <w:noProof/>
+                <w:webHidden/>
+              </w:rPr>
+              <w:fldChar w:fldCharType="separate"/>
+            </w:r>
+            <w:r>
+              <w:rPr>
+                <w:noProof/>
+                <w:webHidden/>
+              </w:rPr>
+              <w:t>3</w:t>
+            </w:r>
+            <w:r>
+              <w:rPr>
+                <w:noProof/>
+                <w:webHidden/>
+              </w:rPr>
+              <w:fldChar w:fldCharType="end"/>
+            </w:r>
+          </w:hyperlink>
+        </w:p>
+        <w:p>
+          <w:pPr>
+            <w:pStyle w:val="TOC1"/>
+            <w:tabs>
+              <w:tab w:val="right" w:leader="dot" w:pos="10169"/>
+            </w:tabs>
+            <w:rPr>
+              <w:noProof/>
+            </w:rPr>
+          </w:pPr>
+          <w:hyperlink w:anchor="_Toc235477022" w:history="1">
+            <w:r>
+              <w:rPr>
+                <w:rStyle w:val="Hyperlink"/>
+                <w:noProof/>
+              </w:rPr>
+              <w:t>Chương 1. Phâ</w:t>
+            </w:r>
+            <w:r>
+              <w:rPr>
+                <w:rStyle w:val="Hyperlink"/>
+                <w:noProof/>
+              </w:rPr>
+              <w:t>n</w:t>
+            </w:r>
+            <w:r>
+              <w:rPr>
+                <w:rStyle w:val="Hyperlink"/>
+                <w:noProof/>
+              </w:rPr>
+              <w:t xml:space="preserve"> tích ý tưởng và bài toán nghiên cứu</w:t>
+            </w:r>
+            <w:r>
+              <w:rPr>
+                <w:noProof/>
+                <w:webHidden/>
+              </w:rPr>
+              <w:tab/>
+            </w:r>
+            <w:r>
+              <w:rPr>
+                <w:noProof/>
+                <w:webHidden/>
+              </w:rPr>
+              <w:fldChar w:fldCharType="begin"/>
+            </w:r>
+            <w:r>
+              <w:rPr>
+                <w:noProof/>
+                <w:webHidden/>
+              </w:rPr>
+              <w:instrText xml:space="preserve"> PAGEREF _Toc235477022 \h </w:instrText>
+            </w:r>
+            <w:r>
+              <w:rPr>
+                <w:noProof/>
+                <w:webHidden/>
+              </w:rPr>
+            </w:r>
+            <w:r>
+              <w:rPr>
+                <w:noProof/>
+                <w:webHidden/>
+              </w:rPr>
+              <w:fldChar w:fldCharType="separate"/>
+            </w:r>
+            <w:r>
+              <w:rPr>
+                <w:noProof/>
+                <w:webHidden/>
+              </w:rPr>
+              <w:t>6</w:t>
+            </w:r>
+            <w:r>
+              <w:rPr>
+                <w:noProof/>
+                <w:webHidden/>
+              </w:rPr>
+              <w:fldChar w:fldCharType="end"/>
+            </w:r>
+          </w:hyperlink>
+        </w:p>
+        <w:p>
+          <w:pPr>
+            <w:pStyle w:val="TOC1"/>
+            <w:tabs>
+              <w:tab w:val="right" w:leader="dot" w:pos="10169"/>
+            </w:tabs>
+            <w:rPr>
+              <w:noProof/>
+            </w:rPr>
+          </w:pPr>
+          <w:hyperlink w:anchor="_Toc235477023" w:history="1">
+            <w:r>
+              <w:rPr>
+                <w:rStyle w:val="Hyperlink"/>
+                <w:noProof/>
+              </w:rPr>
+              <w:t>Chương 2. Xây dựng pipeline và tiền xử lý dữ liệu</w:t>
+            </w:r>
+            <w:r>
+              <w:rPr>
+                <w:noProof/>
+                <w:webHidden/>
+              </w:rPr>
+              <w:tab/>
+            </w:r>
+            <w:r>
+              <w:rPr>
+                <w:noProof/>
+                <w:webHidden/>
+              </w:rPr>
+              <w:fldChar w:fldCharType="begin"/>
+            </w:r>
+            <w:r>
+              <w:rPr>
+                <w:noProof/>
+                <w:webHidden/>
+              </w:rPr>
+              <w:instrText xml:space="preserve"> PAGEREF _Toc235477023 \h </w:instrText>
+            </w:r>
+            <w:r>
+              <w:rPr>
+                <w:noProof/>
+                <w:webHidden/>
+              </w:rPr>
+            </w:r>
+            <w:r>
+              <w:rPr>
+                <w:noProof/>
+                <w:webHidden/>
+              </w:rPr>
+              <w:fldChar w:fldCharType="separate"/>
+            </w:r>
+            <w:r>
+              <w:rPr>
+                <w:noProof/>
+                <w:webHidden/>
+              </w:rPr>
+              <w:t>6</w:t>
+            </w:r>
+            <w:r>
+              <w:rPr>
+                <w:noProof/>
+                <w:webHidden/>
+              </w:rPr>
+              <w:fldChar w:fldCharType="end"/>
+            </w:r>
+          </w:hyperlink>
+        </w:p>
+        <w:p>
+          <w:pPr>
+            <w:pStyle w:val="TOC1"/>
+            <w:tabs>
+              <w:tab w:val="right" w:leader="dot" w:pos="10169"/>
+            </w:tabs>
+            <w:rPr>
+              <w:noProof/>
+            </w:rPr>
+          </w:pPr>
+          <w:hyperlink w:anchor="_Toc235477024" w:history="1">
+            <w:r>
+              <w:rPr>
+                <w:rStyle w:val="Hyperlink"/>
+                <w:noProof/>
+              </w:rPr>
+              <w:t>Chương 3. Khai phá tri thức và kỹ thuật tính năng</w:t>
+            </w:r>
+            <w:r>
+              <w:rPr>
+                <w:noProof/>
+                <w:webHidden/>
+              </w:rPr>
+              <w:tab/>
+            </w:r>
+            <w:r>
+              <w:rPr>
+                <w:noProof/>
+                <w:webHidden/>
+              </w:rPr>
+              <w:fldChar w:fldCharType="begin"/>
+            </w:r>
+            <w:r>
+              <w:rPr>
+                <w:noProof/>
+                <w:webHidden/>
+              </w:rPr>
+              <w:instrText xml:space="preserve"> PAGEREF _Toc235477024 \h </w:instrText>
+            </w:r>
+            <w:r>
+              <w:rPr>
+                <w:noProof/>
+                <w:webHidden/>
+              </w:rPr>
+            </w:r>
+            <w:r>
+              <w:rPr>
+                <w:noProof/>
+                <w:webHidden/>
+              </w:rPr>
+              <w:fldChar w:fldCharType="separate"/>
+            </w:r>
+            <w:r>
+              <w:rPr>
+                <w:noProof/>
+                <w:webHidden/>
+              </w:rPr>
+              <w:t>6</w:t>
+            </w:r>
+            <w:r>
+              <w:rPr>
+                <w:noProof/>
+                <w:webHidden/>
+              </w:rPr>
+              <w:fldChar w:fldCharType="end"/>
+            </w:r>
+          </w:hyperlink>
+        </w:p>
+        <w:p>
+          <w:pPr>
+            <w:pStyle w:val="TOC1"/>
+            <w:tabs>
+              <w:tab w:val="right" w:leader="dot" w:pos="10169"/>
+            </w:tabs>
+            <w:rPr>
+              <w:noProof/>
+            </w:rPr>
+          </w:pPr>
+          <w:hyperlink w:anchor="_Toc235477025" w:history="1">
+            <w:r>
+              <w:rPr>
+                <w:rStyle w:val="Hyperlink"/>
+                <w:noProof/>
+              </w:rPr>
+              <w:t>Chương 4. Mô hình hóa và dự báo</w:t>
+            </w:r>
+            <w:r>
+              <w:rPr>
+                <w:noProof/>
+                <w:webHidden/>
+              </w:rPr>
+              <w:tab/>
+            </w:r>
+            <w:r>
+              <w:rPr>
+                <w:noProof/>
+                <w:webHidden/>
+              </w:rPr>
+              <w:fldChar w:fldCharType="begin"/>
+            </w:r>
+            <w:r>
+              <w:rPr>
+                <w:noProof/>
+                <w:webHidden/>
+              </w:rPr>
+              <w:instrText xml:space="preserve"> PAGEREF _Toc235477025 \h </w:instrText>
+            </w:r>
+            <w:r>
+              <w:rPr>
+                <w:noProof/>
+                <w:webHidden/>
+              </w:rPr>
+            </w:r>
+            <w:r>
+              <w:rPr>
+                <w:noProof/>
+                <w:webHidden/>
+              </w:rPr>
+              <w:fldChar w:fldCharType="separate"/>
+            </w:r>
+            <w:r>
+              <w:rPr>
+                <w:noProof/>
+                <w:webHidden/>
+              </w:rPr>
+              <w:t>7</w:t>
+            </w:r>
+            <w:r>
+              <w:rPr>
+                <w:noProof/>
+                <w:webHidden/>
+              </w:rPr>
+              <w:fldChar w:fldCharType="end"/>
+            </w:r>
+          </w:hyperlink>
+        </w:p>
+        <w:p>
+          <w:pPr>
+            <w:pStyle w:val="TOC1"/>
+            <w:tabs>
+              <w:tab w:val="right" w:leader="dot" w:pos="10169"/>
+            </w:tabs>
+            <w:rPr>
+              <w:noProof/>
+            </w:rPr>
+          </w:pPr>
+          <w:hyperlink w:anchor="_Toc235477026" w:history="1">
+            <w:r>
+              <w:rPr>
+                <w:rStyle w:val="Hyperlink"/>
+                <w:noProof/>
+              </w:rPr>
+              <w:t>Chương 5. Quản trị dự án và phối hợp nhóm</w:t>
+            </w:r>
+            <w:r>
+              <w:rPr>
+                <w:noProof/>
+                <w:webHidden/>
+              </w:rPr>
+              <w:tab/>
+            </w:r>
+            <w:r>
+              <w:rPr>
+                <w:noProof/>
+                <w:webHidden/>
+              </w:rPr>
+              <w:fldChar w:fldCharType="begin"/>
+            </w:r>
+            <w:r>
+              <w:rPr>
+                <w:noProof/>
+                <w:webHidden/>
+              </w:rPr>
+              <w:instrText xml:space="preserve"> PAGEREF _Toc235477026 \h </w:instrText>
+            </w:r>
+            <w:r>
+              <w:rPr>
+                <w:noProof/>
+                <w:webHidden/>
+              </w:rPr>
+            </w:r>
+            <w:r>
+              <w:rPr>
+                <w:noProof/>
+                <w:webHidden/>
+              </w:rPr>
+              <w:fldChar w:fldCharType="separate"/>
+            </w:r>
+            <w:r>
+              <w:rPr>
+                <w:noProof/>
+                <w:webHidden/>
+              </w:rPr>
+              <w:t>7</w:t>
+            </w:r>
+            <w:r>
+              <w:rPr>
+                <w:noProof/>
+                <w:webHidden/>
+              </w:rPr>
+              <w:fldChar w:fldCharType="end"/>
+            </w:r>
+          </w:hyperlink>
+        </w:p>
+        <w:p>
+          <w:pPr>
+            <w:pStyle w:val="TOC2"/>
+            <w:tabs>
+              <w:tab w:val="right" w:leader="dot" w:pos="10169"/>
+            </w:tabs>
+            <w:rPr>
+              <w:noProof/>
+            </w:rPr>
+          </w:pPr>
+          <w:hyperlink w:anchor="_Toc235477027" w:history="1">
+            <w:r>
+              <w:rPr>
+                <w:rStyle w:val="Hyperlink"/>
+                <w:noProof/>
+              </w:rPr>
+              <w:t>5.1. Phân chia vai trò và nhiệm vụ (Team roles &amp; Responsibilities)</w:t>
+            </w:r>
+            <w:r>
+              <w:rPr>
+                <w:noProof/>
+                <w:webHidden/>
+              </w:rPr>
+              <w:tab/>
+            </w:r>
+            <w:r>
+              <w:rPr>
+                <w:noProof/>
+                <w:webHidden/>
+              </w:rPr>
+              <w:fldChar w:fldCharType="begin"/>
+            </w:r>
+            <w:r>
+              <w:rPr>
+                <w:noProof/>
+                <w:webHidden/>
+              </w:rPr>
+              <w:instrText xml:space="preserve"> PAGEREF _Toc235477027 \h </w:instrText>
+            </w:r>
+            <w:r>
+              <w:rPr>
+                <w:noProof/>
+                <w:webHidden/>
+              </w:rPr>
+            </w:r>
+            <w:r>
+              <w:rPr>
+                <w:noProof/>
+                <w:webHidden/>
+              </w:rPr>
+              <w:fldChar w:fldCharType="separate"/>
+            </w:r>
+            <w:r>
+              <w:rPr>
+                <w:noProof/>
+                <w:webHidden/>
+              </w:rPr>
+              <w:t>7</w:t>
+            </w:r>
+            <w:r>
+              <w:rPr>
+                <w:noProof/>
+                <w:webHidden/>
+              </w:rPr>
+              <w:fldChar w:fldCharType="end"/>
+            </w:r>
+          </w:hyperlink>
+        </w:p>
+        <w:p>
+          <w:pPr>
+            <w:pStyle w:val="TOC2"/>
+            <w:tabs>
+              <w:tab w:val="right" w:leader="dot" w:pos="10169"/>
+            </w:tabs>
+            <w:rPr>
+              <w:noProof/>
+            </w:rPr>
+          </w:pPr>
+          <w:hyperlink w:anchor="_Toc235477028" w:history="1">
+            <w:r>
+              <w:rPr>
+                <w:rStyle w:val="Hyperlink"/>
+                <w:noProof/>
+              </w:rPr>
+              <w:t>5.2. Kế hoạch và tiến độ triển khai (Project timeline)</w:t>
+            </w:r>
+            <w:r>
+              <w:rPr>
+                <w:noProof/>
+                <w:webHidden/>
+              </w:rPr>
+              <w:tab/>
+            </w:r>
+            <w:r>
+              <w:rPr>
+                <w:noProof/>
+                <w:webHidden/>
+              </w:rPr>
+              <w:fldChar w:fldCharType="begin"/>
+            </w:r>
+            <w:r>
+              <w:rPr>
+                <w:noProof/>
+                <w:webHidden/>
+              </w:rPr>
+              <w:instrText xml:space="preserve"> PAGEREF _Toc235477028 \h </w:instrText>
+            </w:r>
+            <w:r>
+              <w:rPr>
+                <w:noProof/>
+                <w:webHidden/>
+              </w:rPr>
+            </w:r>
+            <w:r>
+              <w:rPr>
+                <w:noProof/>
+                <w:webHidden/>
+              </w:rPr>
+              <w:fldChar w:fldCharType="separate"/>
+            </w:r>
+            <w:r>
+              <w:rPr>
+                <w:noProof/>
+                <w:webHidden/>
+              </w:rPr>
+              <w:t>7</w:t>
+            </w:r>
+            <w:r>
+              <w:rPr>
+                <w:noProof/>
+                <w:webHidden/>
+              </w:rPr>
+              <w:fldChar w:fldCharType="end"/>
+            </w:r>
+          </w:hyperlink>
+        </w:p>
+        <w:p>
+          <w:pPr>
+            <w:pStyle w:val="TOC2"/>
+            <w:tabs>
+              <w:tab w:val="right" w:leader="dot" w:pos="10169"/>
+            </w:tabs>
+            <w:rPr>
+              <w:noProof/>
+            </w:rPr>
+          </w:pPr>
+          <w:hyperlink w:anchor="_Toc235477029" w:history="1">
+            <w:r>
+              <w:rPr>
+                <w:rStyle w:val="Hyperlink"/>
+                <w:noProof/>
+              </w:rPr>
+              <w:t>5.3. Quản lý mã nguồn và phiên bản trên Git/GitHub</w:t>
+            </w:r>
+            <w:r>
+              <w:rPr>
+                <w:noProof/>
+                <w:webHidden/>
+              </w:rPr>
+              <w:tab/>
+            </w:r>
+            <w:r>
+              <w:rPr>
+                <w:noProof/>
+                <w:webHidden/>
+              </w:rPr>
+              <w:fldChar w:fldCharType="begin"/>
+            </w:r>
+            <w:r>
+              <w:rPr>
+                <w:noProof/>
+                <w:webHidden/>
+              </w:rPr>
+              <w:instrText xml:space="preserve"> PAGEREF _Toc235477029 \h </w:instrText>
+            </w:r>
+            <w:r>
+              <w:rPr>
+                <w:noProof/>
+                <w:webHidden/>
+              </w:rPr>
+            </w:r>
+            <w:r>
+              <w:rPr>
+                <w:noProof/>
+                <w:webHidden/>
+              </w:rPr>
+              <w:fldChar w:fldCharType="separate"/>
+            </w:r>
+            <w:r>
+              <w:rPr>
+                <w:noProof/>
+                <w:webHidden/>
+              </w:rPr>
+              <w:t>8</w:t>
+            </w:r>
+            <w:r>
+              <w:rPr>
+                <w:noProof/>
+                <w:webHidden/>
+              </w:rPr>
+              <w:fldChar w:fldCharType="end"/>
+            </w:r>
+          </w:hyperlink>
+        </w:p>
+        <w:p>
+          <w:pPr>
+            <w:pStyle w:val="TOC2"/>
+            <w:tabs>
+              <w:tab w:val="right" w:leader="dot" w:pos="10169"/>
+            </w:tabs>
+            <w:rPr>
+              <w:noProof/>
+            </w:rPr>
+          </w:pPr>
+          <w:hyperlink w:anchor="_Toc235477030" w:history="1">
+            <w:r>
+              <w:rPr>
+                <w:rStyle w:val="Hyperlink"/>
+                <w:noProof/>
+              </w:rPr>
+              <w:t>5.4. Quy tắc cộng tác và đạo đức nghề nghiệp</w:t>
+            </w:r>
+            <w:r>
+              <w:rPr>
+                <w:noProof/>
+                <w:webHidden/>
+              </w:rPr>
+              <w:tab/>
+            </w:r>
+            <w:r>
+              <w:rPr>
+                <w:noProof/>
+                <w:webHidden/>
+              </w:rPr>
+              <w:fldChar w:fldCharType="begin"/>
+            </w:r>
+            <w:r>
+              <w:rPr>
+                <w:noProof/>
+                <w:webHidden/>
+              </w:rPr>
+              <w:instrText xml:space="preserve"> PAGEREF _Toc235477030 \h </w:instrText>
+            </w:r>
+            <w:r>
+              <w:rPr>
+                <w:noProof/>
+                <w:webHidden/>
+              </w:rPr>
+            </w:r>
+            <w:r>
+              <w:rPr>
+                <w:noProof/>
+                <w:webHidden/>
+              </w:rPr>
+              <w:fldChar w:fldCharType="separate"/>
+            </w:r>
+            <w:r>
+              <w:rPr>
+                <w:noProof/>
+                <w:webHidden/>
+              </w:rPr>
+              <w:t>8</w:t>
+            </w:r>
+            <w:r>
+              <w:rPr>
+                <w:noProof/>
+                <w:webHidden/>
+              </w:rPr>
+              <w:fldChar w:fldCharType="end"/>
+            </w:r>
+          </w:hyperlink>
+        </w:p>
+        <w:p>
+          <w:pPr>
+            <w:pStyle w:val="TOC1"/>
+            <w:tabs>
+              <w:tab w:val="right" w:leader="dot" w:pos="10169"/>
+            </w:tabs>
+            <w:rPr>
+              <w:noProof/>
+            </w:rPr>
+          </w:pPr>
+          <w:hyperlink w:anchor="_Toc235477031" w:history="1">
+            <w:r>
+              <w:rPr>
+                <w:rStyle w:val="Hyperlink"/>
+                <w:noProof/>
+              </w:rPr>
+              <w:t>Chương 6. Tổng kết và triển khai dự án</w:t>
+            </w:r>
+            <w:r>
+              <w:rPr>
+                <w:noProof/>
+                <w:webHidden/>
+              </w:rPr>
+              <w:tab/>
+            </w:r>
+            <w:r>
+              <w:rPr>
+                <w:noProof/>
+                <w:webHidden/>
+              </w:rPr>
+              <w:fldChar w:fldCharType="begin"/>
+            </w:r>
+            <w:r>
+              <w:rPr>
+                <w:noProof/>
+                <w:webHidden/>
+              </w:rPr>
+              <w:instrText xml:space="preserve"> PAGEREF _Toc235477031 \h </w:instrText>
+            </w:r>
+            <w:r>
+              <w:rPr>
+                <w:noProof/>
+                <w:webHidden/>
+              </w:rPr>
+            </w:r>
+            <w:r>
+              <w:rPr>
+                <w:noProof/>
+                <w:webHidden/>
+              </w:rPr>
+              <w:fldChar w:fldCharType="separate"/>
+            </w:r>
+            <w:r>
+              <w:rPr>
+                <w:noProof/>
+                <w:webHidden/>
+              </w:rPr>
+              <w:t>8</w:t>
+            </w:r>
+            <w:r>
+              <w:rPr>
+                <w:noProof/>
+                <w:webHidden/>
+              </w:rPr>
+              <w:fldChar w:fldCharType="end"/>
+            </w:r>
+          </w:hyperlink>
+        </w:p>
+        <w:p>
+          <w:r>
+            <w:rPr>
+              <w:b/>
+              <w:bCs/>
+              <w:noProof/>
+            </w:rPr>
+            <w:fldChar w:fldCharType="end"/>
+          </w:r>
+        </w:p>
+      </w:sdtContent>
+    </w:sdt>
     <w:p>
       <w:pPr>
         <w:tabs>
@@ -5771,10 +6649,12 @@
         <w:pStyle w:val="Heading1"/>
         <w:jc w:val="center"/>
       </w:pPr>
+      <w:bookmarkStart w:id="1" w:name="_Toc235477021"/>
       <w:r>
         <w:lastRenderedPageBreak/>
         <w:t>LỜI MỞ ĐẦU</w:t>
       </w:r>
+      <w:bookmarkEnd w:id="1"/>
     </w:p>
     <w:p>
       <w:pPr>
@@ -6261,10 +7141,652 @@
         </w:rPr>
         <w:br w:type="page"/>
       </w:r>
+      <w:bookmarkStart w:id="2" w:name="_Toc235477022"/>
       <w:r>
         <w:lastRenderedPageBreak/>
         <w:t>Chương 1. Phân tích ý tưởng và bài toán nghiên cứu</w:t>
       </w:r>
+      <w:bookmarkEnd w:id="2"/>
+    </w:p>
+    <w:p>
+      <w:pPr>
+        <w:spacing w:after="120" w:line="276" w:lineRule="auto"/>
+        <w:jc w:val="both"/>
+      </w:pPr>
+      <w:r>
+        <w:rPr>
+          <w:rFonts w:ascii="Times New Roman" w:hAnsi="Times New Roman"/>
+          <w:sz w:val="26"/>
+        </w:rPr>
+        <w:t>Chương này trình bày nền tảng ban đầu của dự án: bối cảnh nghiệp vụ, lý do lựa chọn bộ dữ liệu Home Credit, mục tiêu nghiên cứu, phạm vi dữ liệu và công nghệ sử dụng. Nội dung được tổng hợp từ giai đoạn Business Understanding và Data Understanding để làm cơ sở cho các bước tiền xử lý, khai phá dữ liệu và xây dựng mô hình.</w:t>
+      </w:r>
+    </w:p>
+    <w:p>
+      <w:pPr>
+        <w:pStyle w:val="Heading2"/>
+        <w:spacing w:before="160" w:after="80"/>
+      </w:pPr>
+      <w:r>
+        <w:rPr>
+          <w:rFonts w:ascii="Times New Roman" w:hAnsi="Times New Roman"/>
+          <w:b/>
+          <w:sz w:val="28"/>
+        </w:rPr>
+        <w:t>1.1. Bối cảnh dự án</w:t>
+      </w:r>
+    </w:p>
+    <w:p>
+      <w:pPr>
+        <w:spacing w:after="120" w:line="276" w:lineRule="auto"/>
+        <w:jc w:val="both"/>
+      </w:pPr>
+      <w:r>
+        <w:rPr>
+          <w:rFonts w:ascii="Times New Roman" w:hAnsi="Times New Roman"/>
+          <w:sz w:val="26"/>
+        </w:rPr>
+        <w:t>Trong lĩnh vực tài chính tiêu dùng, quyết định cho vay cần cân bằng giữa hai mục tiêu: mở rộng khả năng tiếp cận vốn cho khách hàng và kiểm soát rủi ro không trả được nợ. Với số lượng hồ sơ lớn, nhiều nguồn thông tin khác nhau và thời gian xử lý hạn chế, việc đánh giá thủ công dễ thiếu nhất quán và khó mở rộng.</w:t>
+      </w:r>
+    </w:p>
+    <w:p>
+      <w:pPr>
+        <w:spacing w:after="120" w:line="276" w:lineRule="auto"/>
+        <w:jc w:val="both"/>
+      </w:pPr>
+      <w:r>
+        <w:rPr>
+          <w:rFonts w:ascii="Times New Roman" w:hAnsi="Times New Roman"/>
+          <w:sz w:val="26"/>
+        </w:rPr>
+        <w:t>Dự án lựa chọn bài toán dự báo rủi ro tín dụng của khách hàng vay vốn. Đây là bài toán có ý nghĩa thực tế cao vì kết quả dự báo có thể hỗ trợ tổ chức tài chính phân loại hồ sơ, ưu tiên kiểm tra các trường hợp rủi ro và đưa ra quyết định dựa trên dữ liệu thay vì chỉ dựa vào kinh nghiệm.</w:t>
+      </w:r>
+    </w:p>
+    <w:p>
+      <w:pPr>
+        <w:pStyle w:val="Heading2"/>
+        <w:spacing w:before="160" w:after="80"/>
+      </w:pPr>
+      <w:r>
+        <w:rPr>
+          <w:rFonts w:ascii="Times New Roman" w:hAnsi="Times New Roman"/>
+          <w:b/>
+          <w:sz w:val="28"/>
+        </w:rPr>
+        <w:t>1.2. Lý do lựa chọn bộ dữ liệu Home Credit</w:t>
+      </w:r>
+    </w:p>
+    <w:p>
+      <w:pPr>
+        <w:spacing w:after="120" w:line="276" w:lineRule="auto"/>
+        <w:jc w:val="both"/>
+      </w:pPr>
+      <w:r>
+        <w:rPr>
+          <w:rFonts w:ascii="Times New Roman" w:hAnsi="Times New Roman"/>
+          <w:sz w:val="26"/>
+        </w:rPr>
+        <w:t>Bộ dữ liệu Home Credit Default Risk phù hợp với mục tiêu của môn Dự án 1 vì vừa có bài toán nghiệp vụ rõ ràng, vừa có cấu trúc dữ liệu đủ phức tạp để thực hành quy trình AI từ đầu đến cuối.</w:t>
+      </w:r>
+    </w:p>
+    <w:p>
+      <w:pPr>
+        <w:pStyle w:val="ListParagraph"/>
+        <w:spacing w:after="60" w:line="276" w:lineRule="auto"/>
+        <w:ind w:left="480" w:hanging="240"/>
+      </w:pPr>
+      <w:r>
+        <w:rPr>
+          <w:rFonts w:ascii="Times New Roman" w:hAnsi="Times New Roman"/>
+          <w:sz w:val="26"/>
+        </w:rPr>
+        <w:t>• Bài toán có biến mục tiêu rõ ràng: cột TARGET cho biết khách hàng có gặp khó khăn trong việc thanh toán hay không, phù hợp với bài toán phân loại nhị phân.</w:t>
+      </w:r>
+    </w:p>
+    <w:p>
+      <w:pPr>
+        <w:pStyle w:val="ListParagraph"/>
+        <w:spacing w:after="60" w:line="276" w:lineRule="auto"/>
+        <w:ind w:left="480" w:hanging="240"/>
+      </w:pPr>
+      <w:r>
+        <w:rPr>
+          <w:rFonts w:ascii="Times New Roman" w:hAnsi="Times New Roman"/>
+          <w:sz w:val="26"/>
+        </w:rPr>
+        <w:t>• Dữ liệu có nhiều nhóm thông tin: hồ sơ hiện tại, lịch sử tín dụng, giao dịch POS, thẻ tín dụng, khoản vay trước đó và lịch thanh toán.</w:t>
+      </w:r>
+    </w:p>
+    <w:p>
+      <w:pPr>
+        <w:pStyle w:val="ListParagraph"/>
+        <w:spacing w:after="60" w:line="276" w:lineRule="auto"/>
+        <w:ind w:left="480" w:hanging="240"/>
+      </w:pPr>
+      <w:r>
+        <w:rPr>
+          <w:rFonts w:ascii="Times New Roman" w:hAnsi="Times New Roman"/>
+          <w:sz w:val="26"/>
+        </w:rPr>
+        <w:t>• Dữ liệu có tính thực tế: tồn tại missing value, outlier, giá trị đặc biệt và quan hệ một-nhiều giữa các bảng, giúp nhóm rèn luyện kỹ năng xử lý dữ liệu thật.</w:t>
+      </w:r>
+    </w:p>
+    <w:p>
+      <w:pPr>
+        <w:pStyle w:val="ListParagraph"/>
+        <w:spacing w:after="60" w:line="276" w:lineRule="auto"/>
+        <w:ind w:left="480" w:hanging="240"/>
+      </w:pPr>
+      <w:r>
+        <w:rPr>
+          <w:rFonts w:ascii="Times New Roman" w:hAnsi="Times New Roman"/>
+          <w:sz w:val="26"/>
+        </w:rPr>
+        <w:t>• Dữ liệu hỗ trợ nhiều giai đoạn của dự án: khám phá dữ liệu, tiền xử lý, feature engineering, huấn luyện mô hình, đánh giá và triển khai ứng dụng minh họa.</w:t>
+      </w:r>
+    </w:p>
+    <w:p>
+      <w:pPr>
+        <w:pStyle w:val="Heading2"/>
+        <w:spacing w:before="160" w:after="80"/>
+      </w:pPr>
+      <w:r>
+        <w:rPr>
+          <w:rFonts w:ascii="Times New Roman" w:hAnsi="Times New Roman"/>
+          <w:b/>
+          <w:sz w:val="28"/>
+        </w:rPr>
+        <w:t>1.3. Tầm quan trọng của việc giải quyết bài toán trong ngành AI</w:t>
+      </w:r>
+    </w:p>
+    <w:p>
+      <w:pPr>
+        <w:spacing w:after="120" w:line="276" w:lineRule="auto"/>
+        <w:jc w:val="both"/>
+      </w:pPr>
+      <w:r>
+        <w:rPr>
+          <w:rFonts w:ascii="Times New Roman" w:hAnsi="Times New Roman"/>
+          <w:sz w:val="26"/>
+        </w:rPr>
+        <w:t>AI có thể giúp chuẩn hóa quá trình đánh giá rủi ro tín dụng bằng cách học từ dữ liệu lịch sử và phát hiện các mẫu quan hệ khó quan sát bằng cách thủ công. Trong bối cảnh tài chính, mô hình dự báo không chỉ tạo ra nhãn dự đoán mà còn hỗ trợ phân nhóm rủi ro, tối ưu ngưỡng ra quyết định và giải thích các yếu tố liên quan đến khả năng vỡ nợ.</w:t>
+      </w:r>
+    </w:p>
+    <w:p>
+      <w:pPr>
+        <w:spacing w:after="120" w:line="276" w:lineRule="auto"/>
+        <w:jc w:val="both"/>
+      </w:pPr>
+      <w:r>
+        <w:rPr>
+          <w:rFonts w:ascii="Times New Roman" w:hAnsi="Times New Roman"/>
+          <w:sz w:val="26"/>
+        </w:rPr>
+        <w:t>Tuy nhiên, đây cũng là bài toán nhạy cảm vì kết quả mô hình có thể ảnh hưởng trực tiếp đến cơ hội tiếp cận vốn của khách hàng. Vì vậy, dự án cần chú trọng chất lượng dữ liệu, tránh rò rỉ dữ liệu, đánh giá bằng chỉ số phù hợp với dữ liệu mất cân bằng và diễn giải kết quả một cách thận trọng.</w:t>
+      </w:r>
+    </w:p>
+    <w:p>
+      <w:pPr>
+        <w:pStyle w:val="Heading2"/>
+        <w:spacing w:before="160" w:after="80"/>
+      </w:pPr>
+      <w:r>
+        <w:rPr>
+          <w:rFonts w:ascii="Times New Roman" w:hAnsi="Times New Roman"/>
+          <w:b/>
+          <w:sz w:val="28"/>
+        </w:rPr>
+        <w:t>1.4. Phân tích mô hình SWOT</w:t>
+      </w:r>
+    </w:p>
+    <w:p>
+      <w:pPr>
+        <w:spacing w:after="120" w:line="276" w:lineRule="auto"/>
+        <w:jc w:val="both"/>
+      </w:pPr>
+      <w:r>
+        <w:rPr>
+          <w:rFonts w:ascii="Times New Roman" w:hAnsi="Times New Roman"/>
+          <w:sz w:val="26"/>
+        </w:rPr>
+        <w:t>Phân tích SWOT giúp nhóm nhìn rõ thuận lợi, hạn chế và rủi ro khi triển khai dự án trên bộ dữ liệu Home Credit.</w:t>
+      </w:r>
+    </w:p>
+    <w:p>
+      <w:pPr>
+        <w:pStyle w:val="ListParagraph"/>
+        <w:spacing w:after="60" w:line="276" w:lineRule="auto"/>
+        <w:ind w:left="480" w:hanging="240"/>
+      </w:pPr>
+      <w:r>
+        <w:rPr>
+          <w:rFonts w:ascii="Times New Roman" w:hAnsi="Times New Roman"/>
+          <w:sz w:val="26"/>
+        </w:rPr>
+        <w:t>• Điểm mạnh: bộ dữ liệu lớn, nhiều bảng và nhiều biến mô tả khách hàng, khoản vay, lịch sử tín dụng và hành vi thanh toán; biến mục tiêu rõ ràng, phù hợp để xây dựng mô hình phân loại.</w:t>
+      </w:r>
+    </w:p>
+    <w:p>
+      <w:pPr>
+        <w:pStyle w:val="ListParagraph"/>
+        <w:spacing w:after="60" w:line="276" w:lineRule="auto"/>
+        <w:ind w:left="480" w:hanging="240"/>
+      </w:pPr>
+      <w:r>
+        <w:rPr>
+          <w:rFonts w:ascii="Times New Roman" w:hAnsi="Times New Roman"/>
+          <w:sz w:val="26"/>
+        </w:rPr>
+        <w:t>• Điểm yếu: dữ liệu có nhiều giá trị thiếu, biến lệch phân phối, outlier và mã đặc biệt như DAYS_EMPLOYED = 365243 hoặc CODE_GENDER = XNA; một số bảng phụ có quan hệ một-nhiều nên cần tổng hợp cẩn thận trước khi nối.</w:t>
+      </w:r>
+    </w:p>
+    <w:p>
+      <w:pPr>
+        <w:pStyle w:val="ListParagraph"/>
+        <w:spacing w:after="60" w:line="276" w:lineRule="auto"/>
+        <w:ind w:left="480" w:hanging="240"/>
+      </w:pPr>
+      <w:r>
+        <w:rPr>
+          <w:rFonts w:ascii="Times New Roman" w:hAnsi="Times New Roman"/>
+          <w:sz w:val="26"/>
+        </w:rPr>
+        <w:t>• Cơ hội: mô hình có thể hỗ trợ nhận diện nhóm khách hàng rủi ro cao, tìm hiểu các yếu tố liên quan đến rủi ro tín dụng và xây dựng ứng dụng minh họa để người dùng nhập thông tin và nhận dự báo.</w:t>
+      </w:r>
+    </w:p>
+    <w:p>
+      <w:pPr>
+        <w:pStyle w:val="ListParagraph"/>
+        <w:spacing w:after="60" w:line="276" w:lineRule="auto"/>
+        <w:ind w:left="480" w:hanging="240"/>
+      </w:pPr>
+      <w:r>
+        <w:rPr>
+          <w:rFonts w:ascii="Times New Roman" w:hAnsi="Times New Roman"/>
+          <w:sz w:val="26"/>
+        </w:rPr>
+        <w:t>• Thách thức: cần tránh join sai làm tăng số dòng, tránh data leakage, xử lý mất cân bằng lớp và đảm bảo mô hình có khả năng giải thích thay vì chỉ tối ưu điểm số.</w:t>
+      </w:r>
+    </w:p>
+    <w:p>
+      <w:pPr>
+        <w:pStyle w:val="Heading2"/>
+        <w:spacing w:before="160" w:after="80"/>
+      </w:pPr>
+      <w:r>
+        <w:rPr>
+          <w:rFonts w:ascii="Times New Roman" w:hAnsi="Times New Roman"/>
+          <w:b/>
+          <w:sz w:val="28"/>
+        </w:rPr>
+        <w:t>1.5. Mục tiêu nghiên cứu</w:t>
+      </w:r>
+    </w:p>
+    <w:p>
+      <w:pPr>
+        <w:spacing w:after="120" w:line="276" w:lineRule="auto"/>
+        <w:jc w:val="both"/>
+      </w:pPr>
+      <w:r>
+        <w:rPr>
+          <w:rFonts w:ascii="Times New Roman" w:hAnsi="Times New Roman"/>
+          <w:sz w:val="26"/>
+        </w:rPr>
+        <w:t>Mục tiêu tổng quát của dự án là xây dựng một pipeline AI có khả năng dự báo rủi ro khách hàng vay vốn dựa trên dữ liệu Home Credit, đồng thời trình bày rõ quy trình xử lý dữ liệu, lựa chọn biến, huấn luyện mô hình và đánh giá kết quả.</w:t>
+      </w:r>
+    </w:p>
+    <w:p>
+      <w:pPr>
+        <w:spacing w:after="120" w:line="276" w:lineRule="auto"/>
+        <w:jc w:val="both"/>
+      </w:pPr>
+      <w:r>
+        <w:rPr>
+          <w:rFonts w:ascii="Times New Roman" w:hAnsi="Times New Roman"/>
+          <w:sz w:val="26"/>
+        </w:rPr>
+        <w:t>Các câu hỏi nghiên cứu chính gồm:</w:t>
+      </w:r>
+    </w:p>
+    <w:p>
+      <w:pPr>
+        <w:pStyle w:val="ListParagraph"/>
+        <w:spacing w:after="60" w:line="276" w:lineRule="auto"/>
+        <w:ind w:left="480" w:hanging="240"/>
+      </w:pPr>
+      <w:r>
+        <w:rPr>
+          <w:rFonts w:ascii="Times New Roman" w:hAnsi="Times New Roman"/>
+          <w:sz w:val="26"/>
+        </w:rPr>
+        <w:t>• Những nhóm thông tin nào trong hồ sơ khách hàng có khả năng liên quan đến rủi ro tín dụng?</w:t>
+      </w:r>
+    </w:p>
+    <w:p>
+      <w:pPr>
+        <w:pStyle w:val="ListParagraph"/>
+        <w:spacing w:after="60" w:line="276" w:lineRule="auto"/>
+        <w:ind w:left="480" w:hanging="240"/>
+      </w:pPr>
+      <w:r>
+        <w:rPr>
+          <w:rFonts w:ascii="Times New Roman" w:hAnsi="Times New Roman"/>
+          <w:sz w:val="26"/>
+        </w:rPr>
+        <w:t>• Các biến tài chính, nhân khẩu học, lịch sử tín dụng và điểm EXT_SOURCE có mối quan hệ như thế nào với TARGET?</w:t>
+      </w:r>
+    </w:p>
+    <w:p>
+      <w:pPr>
+        <w:pStyle w:val="ListParagraph"/>
+        <w:spacing w:after="60" w:line="276" w:lineRule="auto"/>
+        <w:ind w:left="480" w:hanging="240"/>
+      </w:pPr>
+      <w:r>
+        <w:rPr>
+          <w:rFonts w:ascii="Times New Roman" w:hAnsi="Times New Roman"/>
+          <w:sz w:val="26"/>
+        </w:rPr>
+        <w:t>• Cần xử lý missing value, outlier và các giá trị đặc biệt ra sao để dữ liệu sẵn sàng cho mô hình?</w:t>
+      </w:r>
+    </w:p>
+    <w:p>
+      <w:pPr>
+        <w:pStyle w:val="ListParagraph"/>
+        <w:spacing w:after="60" w:line="276" w:lineRule="auto"/>
+        <w:ind w:left="480" w:hanging="240"/>
+      </w:pPr>
+      <w:r>
+        <w:rPr>
+          <w:rFonts w:ascii="Times New Roman" w:hAnsi="Times New Roman"/>
+          <w:sz w:val="26"/>
+        </w:rPr>
+        <w:t>• Mô hình phân loại nào phù hợp để dự báo khách hàng có rủi ro cao trong bối cảnh dữ liệu mất cân bằng?</w:t>
+      </w:r>
+    </w:p>
+    <w:p>
+      <w:pPr>
+        <w:pStyle w:val="ListParagraph"/>
+        <w:spacing w:after="60" w:line="276" w:lineRule="auto"/>
+        <w:ind w:left="480" w:hanging="240"/>
+      </w:pPr>
+      <w:r>
+        <w:rPr>
+          <w:rFonts w:ascii="Times New Roman" w:hAnsi="Times New Roman"/>
+          <w:sz w:val="26"/>
+        </w:rPr>
+        <w:t>• Kết quả mô hình có thể được trình bày và ứng dụng như thế nào để hỗ trợ quyết định nghiệp vụ?</w:t>
+      </w:r>
+    </w:p>
+    <w:p>
+      <w:pPr>
+        <w:pStyle w:val="Heading2"/>
+        <w:spacing w:before="160" w:after="80"/>
+      </w:pPr>
+      <w:r>
+        <w:rPr>
+          <w:rFonts w:ascii="Times New Roman" w:hAnsi="Times New Roman"/>
+          <w:b/>
+          <w:sz w:val="28"/>
+        </w:rPr>
+        <w:t>1.6. Giới thiệu dataset</w:t>
+      </w:r>
+    </w:p>
+    <w:p>
+      <w:pPr>
+        <w:spacing w:after="120" w:line="276" w:lineRule="auto"/>
+        <w:jc w:val="both"/>
+      </w:pPr>
+      <w:r>
+        <w:rPr>
+          <w:rFonts w:ascii="Times New Roman" w:hAnsi="Times New Roman"/>
+          <w:sz w:val="26"/>
+        </w:rPr>
+        <w:t>Dataset chính của dự án là Home Credit Default Risk, trong đó bảng application_train.csv chứa hồ sơ vay hiện tại của khách hàng và biến mục tiêu TARGET. Giá trị TARGET = 1 thể hiện khách hàng gặp khó khăn trong thanh toán, còn TARGET = 0 thể hiện khách hàng không gặp khó khăn theo định nghĩa của bộ dữ liệu.</w:t>
+      </w:r>
+    </w:p>
+    <w:p>
+      <w:pPr>
+        <w:spacing w:after="120" w:line="276" w:lineRule="auto"/>
+        <w:jc w:val="both"/>
+      </w:pPr>
+      <w:r>
+        <w:rPr>
+          <w:rFonts w:ascii="Times New Roman" w:hAnsi="Times New Roman"/>
+          <w:sz w:val="26"/>
+        </w:rPr>
+        <w:t>Ngoài bảng chính, dataset còn có nhiều bảng phụ mô tả lịch sử tín dụng và hành vi thanh toán của khách hàng. Trong giai đoạn Data Understanding, nhóm đã xác định khóa nối quan trọng là SK_ID_CURR và SK_ID_PREV, đồng thời ghi nhận rủi ro row explosion khi nối trực tiếp các bảng quan hệ một-nhiều.</w:t>
+      </w:r>
+    </w:p>
+    <w:p>
+      <w:pPr>
+        <w:pStyle w:val="ListParagraph"/>
+        <w:spacing w:after="60" w:line="276" w:lineRule="auto"/>
+        <w:ind w:left="480" w:hanging="240"/>
+      </w:pPr>
+      <w:r>
+        <w:rPr>
+          <w:rFonts w:ascii="Times New Roman" w:hAnsi="Times New Roman"/>
+          <w:sz w:val="26"/>
+        </w:rPr>
+        <w:t>• application_train.csv và application_test.csv: thông tin hồ sơ vay hiện tại, thông tin cá nhân, tài chính, hợp đồng và các điểm EXT_SOURCE.</w:t>
+      </w:r>
+    </w:p>
+    <w:p>
+      <w:pPr>
+        <w:pStyle w:val="ListParagraph"/>
+        <w:spacing w:after="60" w:line="276" w:lineRule="auto"/>
+        <w:ind w:left="480" w:hanging="240"/>
+      </w:pPr>
+      <w:r>
+        <w:rPr>
+          <w:rFonts w:ascii="Times New Roman" w:hAnsi="Times New Roman"/>
+          <w:sz w:val="26"/>
+        </w:rPr>
+        <w:t>• bureau.csv và bureau_balance.csv: lịch sử tín dụng của khách hàng tại các tổ chức khác và trạng thái theo từng tháng.</w:t>
+      </w:r>
+    </w:p>
+    <w:p>
+      <w:pPr>
+        <w:pStyle w:val="ListParagraph"/>
+        <w:spacing w:after="60" w:line="276" w:lineRule="auto"/>
+        <w:ind w:left="480" w:hanging="240"/>
+      </w:pPr>
+      <w:r>
+        <w:rPr>
+          <w:rFonts w:ascii="Times New Roman" w:hAnsi="Times New Roman"/>
+          <w:sz w:val="26"/>
+        </w:rPr>
+        <w:t>• previous_application.csv: thông tin các hồ sơ vay trước đó tại Home Credit.</w:t>
+      </w:r>
+    </w:p>
+    <w:p>
+      <w:pPr>
+        <w:pStyle w:val="ListParagraph"/>
+        <w:spacing w:after="60" w:line="276" w:lineRule="auto"/>
+        <w:ind w:left="480" w:hanging="240"/>
+      </w:pPr>
+      <w:r>
+        <w:rPr>
+          <w:rFonts w:ascii="Times New Roman" w:hAnsi="Times New Roman"/>
+          <w:sz w:val="26"/>
+        </w:rPr>
+        <w:t>• POS_CASH_balance.csv, credit_card_balance.csv và installments_payments.csv: dữ liệu hành vi thanh toán, dư nợ, giao dịch POS/CASH và trả góp.</w:t>
+      </w:r>
+    </w:p>
+    <w:p>
+      <w:pPr>
+        <w:spacing w:after="120" w:line="276" w:lineRule="auto"/>
+        <w:jc w:val="both"/>
+      </w:pPr>
+      <w:r>
+        <w:rPr>
+          <w:rFonts w:ascii="Times New Roman" w:hAnsi="Times New Roman"/>
+          <w:sz w:val="26"/>
+        </w:rPr>
+        <w:t>Kết quả khám phá ban đầu cho thấy dữ liệu có nhiều đặc điểm cần chú ý ở các giai đoạn sau: tỷ lệ TARGET mất cân bằng, nhiều cột có missing value cao, một số biến numeric có outlier, và các biến EXT_SOURCE có tương quan đáng chú ý với TARGET.</w:t>
+      </w:r>
+    </w:p>
+    <w:p>
+      <w:pPr>
+        <w:pStyle w:val="Heading2"/>
+        <w:spacing w:before="160" w:after="80"/>
+      </w:pPr>
+      <w:r>
+        <w:rPr>
+          <w:rFonts w:ascii="Times New Roman" w:hAnsi="Times New Roman"/>
+          <w:b/>
+          <w:sz w:val="28"/>
+        </w:rPr>
+        <w:t>1.7. Giới thiệu công nghệ</w:t>
+      </w:r>
+    </w:p>
+    <w:p>
+      <w:pPr>
+        <w:spacing w:after="120" w:line="276" w:lineRule="auto"/>
+        <w:jc w:val="both"/>
+      </w:pPr>
+      <w:r>
+        <w:rPr>
+          <w:rFonts w:ascii="Times New Roman" w:hAnsi="Times New Roman"/>
+          <w:sz w:val="26"/>
+        </w:rPr>
+        <w:t>Dự án sử dụng các công nghệ quen thuộc trong quy trình AI để đảm bảo có thể xử lý dữ liệu, trực quan hóa, huấn luyện mô hình và triển khai sản phẩm minh họa.</w:t>
+      </w:r>
+    </w:p>
+    <w:p>
+      <w:pPr>
+        <w:pStyle w:val="ListParagraph"/>
+        <w:spacing w:after="60" w:line="276" w:lineRule="auto"/>
+        <w:ind w:left="480" w:hanging="240"/>
+      </w:pPr>
+      <w:r>
+        <w:rPr>
+          <w:rFonts w:ascii="Times New Roman" w:hAnsi="Times New Roman"/>
+          <w:sz w:val="26"/>
+        </w:rPr>
+        <w:t>• PostgreSQL: lưu trữ dữ liệu dạng bảng, hỗ trợ truy vấn SQL, kiểm tra khóa và chuẩn bị dữ liệu trước khi phân tích.</w:t>
+      </w:r>
+    </w:p>
+    <w:p>
+      <w:pPr>
+        <w:pStyle w:val="ListParagraph"/>
+        <w:spacing w:after="60" w:line="276" w:lineRule="auto"/>
+        <w:ind w:left="480" w:hanging="240"/>
+      </w:pPr>
+      <w:r>
+        <w:rPr>
+          <w:rFonts w:ascii="Times New Roman" w:hAnsi="Times New Roman"/>
+          <w:sz w:val="26"/>
+        </w:rPr>
+        <w:t>• Python: ngôn ngữ chính để xử lý dữ liệu, phân tích, xây dựng mô hình và tự động hóa quy trình.</w:t>
+      </w:r>
+    </w:p>
+    <w:p>
+      <w:pPr>
+        <w:pStyle w:val="ListParagraph"/>
+        <w:spacing w:after="60" w:line="276" w:lineRule="auto"/>
+        <w:ind w:left="480" w:hanging="240"/>
+      </w:pPr>
+      <w:r>
+        <w:rPr>
+          <w:rFonts w:ascii="Times New Roman" w:hAnsi="Times New Roman"/>
+          <w:sz w:val="26"/>
+        </w:rPr>
+        <w:t>• pandas và NumPy: đọc dữ liệu, thống kê mô tả, xử lý bảng, tính toán biến và chuẩn bị dữ liệu đầu vào cho mô hình.</w:t>
+      </w:r>
+    </w:p>
+    <w:p>
+      <w:pPr>
+        <w:pStyle w:val="ListParagraph"/>
+        <w:spacing w:after="60" w:line="276" w:lineRule="auto"/>
+        <w:ind w:left="480" w:hanging="240"/>
+      </w:pPr>
+      <w:r>
+        <w:rPr>
+          <w:rFonts w:ascii="Times New Roman" w:hAnsi="Times New Roman"/>
+          <w:sz w:val="26"/>
+        </w:rPr>
+        <w:t>• matplotlib và seaborn: trực quan hóa phân phối, tỷ lệ missing, tương quan và các mối quan hệ giữa biến đầu vào với TARGET.</w:t>
+      </w:r>
+    </w:p>
+    <w:p>
+      <w:pPr>
+        <w:pStyle w:val="ListParagraph"/>
+        <w:spacing w:after="60" w:line="276" w:lineRule="auto"/>
+        <w:ind w:left="480" w:hanging="240"/>
+      </w:pPr>
+      <w:r>
+        <w:rPr>
+          <w:rFonts w:ascii="Times New Roman" w:hAnsi="Times New Roman"/>
+          <w:sz w:val="26"/>
+        </w:rPr>
+        <w:t>• scikit-learn: chia dữ liệu, xây dựng pipeline tiền xử lý, huấn luyện mô hình phân loại và đánh giá bằng các chỉ số phù hợp.</w:t>
+      </w:r>
+    </w:p>
+    <w:p>
+      <w:pPr>
+        <w:pStyle w:val="ListParagraph"/>
+        <w:spacing w:after="60" w:line="276" w:lineRule="auto"/>
+        <w:ind w:left="480" w:hanging="240"/>
+      </w:pPr>
+      <w:r>
+        <w:rPr>
+          <w:rFonts w:ascii="Times New Roman" w:hAnsi="Times New Roman"/>
+          <w:sz w:val="26"/>
+        </w:rPr>
+        <w:t>• Streamlit: xây dựng giao diện demo để nhập thông tin khách hàng và hiển thị kết quả dự báo rủi ro.</w:t>
+      </w:r>
+    </w:p>
+    <w:p>
+      <w:pPr>
+        <w:pStyle w:val="ListParagraph"/>
+        <w:spacing w:after="60" w:line="276" w:lineRule="auto"/>
+        <w:ind w:left="480" w:hanging="240"/>
+      </w:pPr>
+      <w:r>
+        <w:rPr>
+          <w:rFonts w:ascii="Times New Roman" w:hAnsi="Times New Roman"/>
+          <w:sz w:val="26"/>
+        </w:rPr>
+        <w:t>• Git và GitHub: quản lý phiên bản, chia nhánh theo từng giai đoạn, tạo Pull Request và phối hợp nhóm.</w:t>
+      </w:r>
+    </w:p>
+    <w:p>
+      <w:pPr>
+        <w:pStyle w:val="Heading2"/>
+        <w:spacing w:before="160" w:after="80"/>
+      </w:pPr>
+      <w:r>
+        <w:rPr>
+          <w:rFonts w:ascii="Times New Roman" w:hAnsi="Times New Roman"/>
+          <w:b/>
+          <w:sz w:val="28"/>
+        </w:rPr>
+        <w:t>1.8. Kết luận chương</w:t>
+      </w:r>
+    </w:p>
+    <w:p>
+      <w:pPr>
+        <w:spacing w:after="120" w:line="276" w:lineRule="auto"/>
+        <w:jc w:val="both"/>
+      </w:pPr>
+      <w:r>
+        <w:rPr>
+          <w:rFonts w:ascii="Times New Roman" w:hAnsi="Times New Roman"/>
+          <w:sz w:val="26"/>
+        </w:rPr>
+        <w:t>Chương 1 đã xác định rõ bài toán nghiên cứu, giá trị thực tế của dự án và nền tảng dữ liệu/công nghệ sẽ sử dụng. Từ các kết quả Business Understanding và Data Understanding, nhóm có cơ sở để bước sang các chương tiếp theo: xây dựng pipeline, làm sạch dữ liệu, khai phá tri thức, tạo đặc trưng và huấn luyện mô hình dự báo rủi ro tín dụng.</w:t>
+      </w:r>
+    </w:p>
+    <w:p>
+      <w:pPr>
+        <w:pStyle w:val="Heading1"/>
+      </w:pPr>
+      <w:bookmarkStart w:id="3" w:name="_Toc235477023"/>
+      <w:r>
+        <w:t>Chương 2. Xây dựng pipeline và tiền xử lý dữ liệu</w:t>
+      </w:r>
+      <w:bookmarkEnd w:id="3"/>
     </w:p>
     <w:p>
       <w:pPr>
@@ -6279,7 +7801,7 @@
           <w:bCs/>
           <w:szCs w:val="26"/>
         </w:rPr>
-        <w:t>Chương này giúp sinh viên xác định rõ giá trị của dự án đối với thực tế doanh nghiệp.</w:t>
+        <w:t>Đây là chương trọng tâm thể hiện kỹ năng “xử lý thô” và tối ưu hóa hệ thống.</w:t>
       </w:r>
     </w:p>
     <w:p>
@@ -6302,53 +7824,7 @@
           <w:bCs/>
           <w:szCs w:val="26"/>
         </w:rPr>
-        <w:t xml:space="preserve">Bối cảnh dự án: </w:t>
-      </w:r>
-    </w:p>
-    <w:p>
-      <w:pPr>
-        <w:numPr>
-          <w:ilvl w:val="0"/>
-          <w:numId w:val="2"/>
-        </w:numPr>
-        <w:tabs>
-          <w:tab w:val="clear" w:pos="840"/>
-        </w:tabs>
-        <w:ind w:right="-285"/>
-        <w:rPr>
-          <w:bCs/>
-          <w:szCs w:val="26"/>
-        </w:rPr>
-      </w:pPr>
-      <w:r>
-        <w:rPr>
-          <w:bCs/>
-          <w:szCs w:val="26"/>
-        </w:rPr>
-        <w:t>Lý do lựa chọn bộ Dataset (ví dụ: Home Credit, Olist...)</w:t>
-      </w:r>
-    </w:p>
-    <w:p>
-      <w:pPr>
-        <w:numPr>
-          <w:ilvl w:val="0"/>
-          <w:numId w:val="2"/>
-        </w:numPr>
-        <w:tabs>
-          <w:tab w:val="clear" w:pos="840"/>
-        </w:tabs>
-        <w:ind w:right="-285"/>
-        <w:rPr>
-          <w:bCs/>
-          <w:szCs w:val="26"/>
-        </w:rPr>
-      </w:pPr>
-      <w:r>
-        <w:rPr>
-          <w:bCs/>
-          <w:szCs w:val="26"/>
-        </w:rPr>
-        <w:t>Tầm quan trọng của việc giải quyết bài toán này trong ngành AI.</w:t>
+        <w:t xml:space="preserve">Quy trình tích hợp: Mô tả kỹ thuật Merge/Join các bảng; cách giải quyết xung đột khóa và tối ưu bộ nhớ khi xử lý hàng triệu dòng. </w:t>
       </w:r>
     </w:p>
     <w:p>
@@ -6371,99 +7847,7 @@
           <w:bCs/>
           <w:szCs w:val="26"/>
         </w:rPr>
-        <w:t xml:space="preserve">Phân tích mô hình SWOT: </w:t>
-      </w:r>
-    </w:p>
-    <w:p>
-      <w:pPr>
-        <w:numPr>
-          <w:ilvl w:val="0"/>
-          <w:numId w:val="2"/>
-        </w:numPr>
-        <w:tabs>
-          <w:tab w:val="clear" w:pos="840"/>
-        </w:tabs>
-        <w:ind w:right="-285"/>
-        <w:rPr>
-          <w:bCs/>
-          <w:szCs w:val="26"/>
-        </w:rPr>
-      </w:pPr>
-      <w:r>
-        <w:rPr>
-          <w:bCs/>
-          <w:szCs w:val="26"/>
-        </w:rPr>
-        <w:t>Điểm mạnh (Nguồn dữ liệu lớn, đa dạng biến).</w:t>
-      </w:r>
-    </w:p>
-    <w:p>
-      <w:pPr>
-        <w:numPr>
-          <w:ilvl w:val="0"/>
-          <w:numId w:val="2"/>
-        </w:numPr>
-        <w:tabs>
-          <w:tab w:val="clear" w:pos="840"/>
-        </w:tabs>
-        <w:ind w:right="-285"/>
-        <w:rPr>
-          <w:bCs/>
-          <w:szCs w:val="26"/>
-        </w:rPr>
-      </w:pPr>
-      <w:r>
-        <w:rPr>
-          <w:bCs/>
-          <w:szCs w:val="26"/>
-        </w:rPr>
-        <w:t>Điểm yếu (Dữ liệu nhiễu, tỉ lệ khuyết thiếu cao).</w:t>
-      </w:r>
-    </w:p>
-    <w:p>
-      <w:pPr>
-        <w:numPr>
-          <w:ilvl w:val="0"/>
-          <w:numId w:val="2"/>
-        </w:numPr>
-        <w:tabs>
-          <w:tab w:val="clear" w:pos="840"/>
-        </w:tabs>
-        <w:ind w:right="-285"/>
-        <w:rPr>
-          <w:bCs/>
-          <w:szCs w:val="26"/>
-        </w:rPr>
-      </w:pPr>
-      <w:r>
-        <w:rPr>
-          <w:bCs/>
-          <w:szCs w:val="26"/>
-        </w:rPr>
-        <w:t>Cơ hội (Tìm ra quy luật mua sắm, dự báo rủi ro tín dụng).</w:t>
-      </w:r>
-    </w:p>
-    <w:p>
-      <w:pPr>
-        <w:numPr>
-          <w:ilvl w:val="0"/>
-          <w:numId w:val="2"/>
-        </w:numPr>
-        <w:tabs>
-          <w:tab w:val="clear" w:pos="840"/>
-        </w:tabs>
-        <w:ind w:right="-285"/>
-        <w:rPr>
-          <w:bCs/>
-          <w:szCs w:val="26"/>
-        </w:rPr>
-      </w:pPr>
-      <w:r>
-        <w:rPr>
-          <w:bCs/>
-          <w:szCs w:val="26"/>
-        </w:rPr>
-        <w:t xml:space="preserve">Thách thức (Xử lý hiệu năng khi Joining bảng lớn). </w:t>
+        <w:t>Làm sạch dữ liệu chuyên sâu: Quy trình xử lý Outliers và Imputation cho dữ liệu khuyết thiếu.</w:t>
       </w:r>
     </w:p>
     <w:p>
@@ -6486,8 +7870,18 @@
           <w:bCs/>
           <w:szCs w:val="26"/>
         </w:rPr>
-        <w:t>Mục tiêu nghiên cứu: Đưa ra các câu hỏi nghiên cứu cụ thể mà dự án cần trả lời.</w:t>
-      </w:r>
+        <w:t>Kịch bản kiểm thử dữ liệu: Các bước Unit test để đảm bảo dữ liệu sau khi Join không bị sai lệch số liệu gốc.</w:t>
+      </w:r>
+    </w:p>
+    <w:p>
+      <w:pPr>
+        <w:pStyle w:val="Heading1"/>
+      </w:pPr>
+      <w:bookmarkStart w:id="4" w:name="_Toc235477024"/>
+      <w:r>
+        <w:t>Chương 3. Khai phá tri thức và kỹ thuật tính năng</w:t>
+      </w:r>
+      <w:bookmarkEnd w:id="4"/>
     </w:p>
     <w:p>
       <w:pPr>
@@ -6509,7 +7903,7 @@
           <w:bCs/>
           <w:szCs w:val="26"/>
         </w:rPr>
-        <w:t>Giới thiệu dataset</w:t>
+        <w:t xml:space="preserve">Phân tích khám phá (EDA): Sử dụng biểu đồ để tìm ra các tương quan ẩn; chứng minh các giả thuyết bằng thống kê. </w:t>
       </w:r>
     </w:p>
     <w:p>
@@ -6532,31 +7926,7 @@
           <w:bCs/>
           <w:szCs w:val="26"/>
         </w:rPr>
-        <w:t>Giới thiệu công nghệ</w:t>
-      </w:r>
-    </w:p>
-    <w:p>
-      <w:pPr>
-        <w:pStyle w:val="Heading1"/>
-      </w:pPr>
-      <w:r>
-        <w:t>Chương 2. Xây dựng pipeline và tiền xử lý dữ liệu</w:t>
-      </w:r>
-    </w:p>
-    <w:p>
-      <w:pPr>
-        <w:ind w:right="-285"/>
-        <w:rPr>
-          <w:bCs/>
-          <w:szCs w:val="26"/>
-        </w:rPr>
-      </w:pPr>
-      <w:r>
-        <w:rPr>
-          <w:bCs/>
-          <w:szCs w:val="26"/>
-        </w:rPr>
-        <w:t>Đây là chương trọng tâm thể hiện kỹ năng “xử lý thô” và tối ưu hóa hệ thống.</w:t>
+        <w:t xml:space="preserve">Xây dựng biến phái sinh (Feature engineering): Mô tả cách tạo ra ít nhất 10 biến mới từ các bảng quan hệ (ví dụ: Tính tổng chi tiêu của khách hàng từ bảng lịch sử giao dịch). </w:t>
       </w:r>
     </w:p>
     <w:p>
@@ -6579,7 +7949,34 @@
           <w:bCs/>
           <w:szCs w:val="26"/>
         </w:rPr>
-        <w:t xml:space="preserve">Quy trình tích hợp: Mô tả kỹ thuật Merge/Join các bảng; cách giải quyết xung đột khóa và tối ưu bộ nhớ khi xử lý hàng triệu dòng. </w:t>
+        <w:t>Trực quan hóa Insights: Trình bày các phát hiện quan trọng nhất có tác động đến quyết định kinh doanh.</w:t>
+      </w:r>
+    </w:p>
+    <w:p>
+      <w:pPr>
+        <w:pStyle w:val="Heading1"/>
+      </w:pPr>
+      <w:bookmarkStart w:id="5" w:name="_Toc235477025"/>
+      <w:r>
+        <w:lastRenderedPageBreak/>
+        <w:t>Chương 4. Mô hình hóa và dự báo</w:t>
+      </w:r>
+      <w:bookmarkEnd w:id="5"/>
+    </w:p>
+    <w:p>
+      <w:pPr>
+        <w:ind w:right="-285"/>
+        <w:rPr>
+          <w:bCs/>
+          <w:szCs w:val="26"/>
+        </w:rPr>
+      </w:pPr>
+      <w:r>
+        <w:rPr>
+          <w:bCs/>
+          <w:szCs w:val="26"/>
+        </w:rPr>
+        <w:t>Sinh viên phải đưa ra được các kết quả dự báo cụ thể.</w:t>
       </w:r>
     </w:p>
     <w:p>
@@ -6602,7 +7999,7 @@
           <w:bCs/>
           <w:szCs w:val="26"/>
         </w:rPr>
-        <w:t>Làm sạch dữ liệu chuyên sâu: Quy trình xử lý Outliers và Imputation cho dữ liệu khuyết thiếu.</w:t>
+        <w:t xml:space="preserve">Xây dựng mô hình: Mô tả thuật toán sử dụng (Clustering, Regression, Classification...) để giải quyết thách thức của Dataset. </w:t>
       </w:r>
     </w:p>
     <w:p>
@@ -6625,15 +8022,7 @@
           <w:bCs/>
           <w:szCs w:val="26"/>
         </w:rPr>
-        <w:t>Kịch bản kiểm thử dữ liệu: Các bước Unit test để đảm bảo dữ liệu sau khi Join không bị sai lệch số liệu gốc.</w:t>
-      </w:r>
-    </w:p>
-    <w:p>
-      <w:pPr>
-        <w:pStyle w:val="Heading1"/>
-      </w:pPr>
-      <w:r>
-        <w:t>Chương 3. Khai phá tri thức và kỹ thuật tính năng</w:t>
+        <w:t xml:space="preserve">Đánh giá hiệu suất: Sử dụng các chỉ số (Accuracy, F1-score, RMSE...) để chứng minh độ tin cậy của dự báo. </w:t>
       </w:r>
     </w:p>
     <w:p>
@@ -6656,7 +8045,62 @@
           <w:bCs/>
           <w:szCs w:val="26"/>
         </w:rPr>
-        <w:t xml:space="preserve">Phân tích khám phá (EDA): Sử dụng biểu đồ để tìm ra các tương quan ẩn; chứng minh các giả thuyết bằng thống kê. </w:t>
+        <w:t>Phân tích kết quả dự báo: Đưa ra các gợi ý hành động dựa trên kết quả của mô hình AI.</w:t>
+      </w:r>
+    </w:p>
+    <w:p>
+      <w:pPr>
+        <w:pStyle w:val="Heading1"/>
+        <w:rPr>
+          <w:bCs/>
+        </w:rPr>
+      </w:pPr>
+      <w:bookmarkStart w:id="6" w:name="_Toc235477026"/>
+      <w:r>
+        <w:t>Chương 5. Quản trị dự án và phối hợp nhóm</w:t>
+      </w:r>
+      <w:bookmarkEnd w:id="6"/>
+    </w:p>
+    <w:p>
+      <w:pPr>
+        <w:ind w:right="-285"/>
+        <w:rPr>
+          <w:bCs/>
+          <w:szCs w:val="26"/>
+        </w:rPr>
+      </w:pPr>
+      <w:r>
+        <w:rPr>
+          <w:bCs/>
+          <w:szCs w:val="26"/>
+        </w:rPr>
+        <w:t>Chương này trình bày cách thức tổ chức đội ngũ và quy trình vận hành dự án để đảm bảo sản phẩm được hoàn thiện đúng hạn và đạt chất lượng cao nhất.</w:t>
+      </w:r>
+    </w:p>
+    <w:p>
+      <w:pPr>
+        <w:pStyle w:val="Heading2"/>
+      </w:pPr>
+      <w:bookmarkStart w:id="7" w:name="_Toc235477027"/>
+      <w:r>
+        <w:t>5.1. Phân chia vai trò và nhiệm vụ (Team roles &amp; Responsibilities)</w:t>
+      </w:r>
+      <w:bookmarkEnd w:id="7"/>
+    </w:p>
+    <w:p>
+      <w:pPr>
+        <w:ind w:right="-285"/>
+        <w:rPr>
+          <w:bCs/>
+          <w:szCs w:val="26"/>
+        </w:rPr>
+      </w:pPr>
+      <w:r>
+        <w:rPr>
+          <w:bCs/>
+          <w:szCs w:val="26"/>
+        </w:rPr>
+        <w:t>Để dự án vận hành trơn tru, nhóm cần phân định rõ trách nhiệm dựa trên thế mạnh của từng thành viên:</w:t>
       </w:r>
     </w:p>
     <w:p>
@@ -6679,7 +8123,7 @@
           <w:bCs/>
           <w:szCs w:val="26"/>
         </w:rPr>
-        <w:t xml:space="preserve">Xây dựng biến phái sinh (Feature engineering): Mô tả cách tạo ra ít nhất 10 biến mới từ các bảng quan hệ (ví dụ: Tính tổng chi tiêu của khách hàng từ bảng lịch sử giao dịch). </w:t>
+        <w:t>Project Manager (Trưởng nhóm): Chịu trách nhiệm lập kế hoạch, điều phối công việc và kiểm soát tiến độ chung trên Jira/Trello.</w:t>
       </w:r>
     </w:p>
     <w:p>
@@ -6702,32 +8146,7 @@
           <w:bCs/>
           <w:szCs w:val="26"/>
         </w:rPr>
-        <w:t>Trực quan hóa Insights: Trình bày các phát hiện quan trọng nhất có tác động đến quyết định kinh doanh.</w:t>
-      </w:r>
-    </w:p>
-    <w:p>
-      <w:pPr>
-        <w:pStyle w:val="Heading1"/>
-      </w:pPr>
-      <w:r>
-        <w:lastRenderedPageBreak/>
-        <w:t>Chương 4. Mô hình hóa và dự báo</w:t>
-      </w:r>
-    </w:p>
-    <w:p>
-      <w:pPr>
-        <w:ind w:right="-285"/>
-        <w:rPr>
-          <w:bCs/>
-          <w:szCs w:val="26"/>
-        </w:rPr>
-      </w:pPr>
-      <w:r>
-        <w:rPr>
-          <w:bCs/>
-          <w:szCs w:val="26"/>
-        </w:rPr>
-        <w:t>Sinh viên phải đưa ra được các kết quả dự báo cụ thể.</w:t>
+        <w:t>Data Engineer: Tập trung vào các tác vụ thu thập, kết nối dữ liệu từ nhiều nguồn và xây dựng quy trình Joining dữ liệu phức tạp.</w:t>
       </w:r>
     </w:p>
     <w:p>
@@ -6750,7 +8169,7 @@
           <w:bCs/>
           <w:szCs w:val="26"/>
         </w:rPr>
-        <w:t xml:space="preserve">Xây dựng mô hình: Mô tả thuật toán sử dụng (Clustering, Regression, Classification...) để giải quyết thách thức của Dataset. </w:t>
+        <w:t>Data Analyst: Chịu trách nhiệm chính trong việc thực hiện EDA, xử lý thống kê và trực quan hóa các Insight từ dữ liệu.</w:t>
       </w:r>
     </w:p>
     <w:p>
@@ -6773,7 +8192,33 @@
           <w:bCs/>
           <w:szCs w:val="26"/>
         </w:rPr>
-        <w:t xml:space="preserve">Đánh giá hiệu suất: Sử dụng các chỉ số (Accuracy, F1-score, RMSE...) để chứng minh độ tin cậy của dự báo. </w:t>
+        <w:t>AI/Machine Learning Researcher: Nghiên cứu và hiện thực hóa các mô hình dự báo, tối ưu hóa thuật toán dựa trên mục tiêu nghiên cứu.</w:t>
+      </w:r>
+    </w:p>
+    <w:p>
+      <w:pPr>
+        <w:pStyle w:val="Heading2"/>
+      </w:pPr>
+      <w:bookmarkStart w:id="8" w:name="_Toc235477028"/>
+      <w:r>
+        <w:t>5.2. Kế hoạch và tiến độ triển khai (Project timeline)</w:t>
+      </w:r>
+      <w:bookmarkEnd w:id="8"/>
+    </w:p>
+    <w:p>
+      <w:pPr>
+        <w:ind w:right="-285"/>
+        <w:rPr>
+          <w:bCs/>
+          <w:szCs w:val="26"/>
+        </w:rPr>
+      </w:pPr>
+      <w:r>
+        <w:rPr>
+          <w:bCs/>
+          <w:szCs w:val="26"/>
+        </w:rPr>
+        <w:t>Sử dụng mô hình Agile/Scrum để quản lý các giai đoạn phát triển:</w:t>
       </w:r>
     </w:p>
     <w:p>
@@ -6796,58 +8241,7 @@
           <w:bCs/>
           <w:szCs w:val="26"/>
         </w:rPr>
-        <w:t>Phân tích kết quả dự báo: Đưa ra các gợi ý hành động dựa trên kết quả của mô hình AI.</w:t>
-      </w:r>
-    </w:p>
-    <w:p>
-      <w:pPr>
-        <w:pStyle w:val="Heading1"/>
-        <w:rPr>
-          <w:bCs/>
-        </w:rPr>
-      </w:pPr>
-      <w:r>
-        <w:t>Chương 5. Quản trị dự án và phối hợp nhóm</w:t>
-      </w:r>
-    </w:p>
-    <w:p>
-      <w:pPr>
-        <w:ind w:right="-285"/>
-        <w:rPr>
-          <w:bCs/>
-          <w:szCs w:val="26"/>
-        </w:rPr>
-      </w:pPr>
-      <w:r>
-        <w:rPr>
-          <w:bCs/>
-          <w:szCs w:val="26"/>
-        </w:rPr>
-        <w:t>Chương này trình bày cách thức tổ chức đội ngũ và quy trình vận hành dự án để đảm bảo sản phẩm được hoàn thiện đúng hạn và đạt chất lượng cao nhất.</w:t>
-      </w:r>
-    </w:p>
-    <w:p>
-      <w:pPr>
-        <w:pStyle w:val="Heading2"/>
-      </w:pPr>
-      <w:r>
-        <w:t>5.1. Phân chia vai trò và nhiệm vụ (Team roles &amp; Responsibilities)</w:t>
-      </w:r>
-    </w:p>
-    <w:p>
-      <w:pPr>
-        <w:ind w:right="-285"/>
-        <w:rPr>
-          <w:bCs/>
-          <w:szCs w:val="26"/>
-        </w:rPr>
-      </w:pPr>
-      <w:r>
-        <w:rPr>
-          <w:bCs/>
-          <w:szCs w:val="26"/>
-        </w:rPr>
-        <w:t>Để dự án vận hành trơn tru, nhóm cần phân định rõ trách nhiệm dựa trên thế mạnh của từng thành viên:</w:t>
+        <w:t>Bảng tiến độ (Gantt Chart/Sprint Plan): Liệt kê các đầu việc cụ thể theo từng tuần, đi kèm người phụ trách và thời hạn hoàn thành rõ ràng.</w:t>
       </w:r>
     </w:p>
     <w:p>
@@ -6870,7 +8264,7 @@
           <w:bCs/>
           <w:szCs w:val="26"/>
         </w:rPr>
-        <w:t>Project Manager (Trưởng nhóm): Chịu trách nhiệm lập kế hoạch, điều phối công việc và kiểm soát tiến độ chung trên Jira/Trello.</w:t>
+        <w:t>Quản lý công việc trên Jira/Trello: Sử dụng bảng Kanban với các cột: To Do, In Progress, Review, Done để theo dõi trạng thái công việc trong thời gian thực.</w:t>
       </w:r>
     </w:p>
     <w:p>
@@ -6893,7 +8287,34 @@
           <w:bCs/>
           <w:szCs w:val="26"/>
         </w:rPr>
-        <w:t>Data Engineer: Tập trung vào các tác vụ thu thập, kết nối dữ liệu từ nhiều nguồn và xây dựng quy trình Joining dữ liệu phức tạp.</w:t>
+        <w:lastRenderedPageBreak/>
+        <w:t>Báo cáo tiến độ định kỳ: Ghi chép nhật ký thực hiện dự án, các khó khăn phát sinh và giải pháp đã áp dụng để vượt qua các "nút thắt" kỹ thuật.</w:t>
+      </w:r>
+    </w:p>
+    <w:p>
+      <w:pPr>
+        <w:pStyle w:val="Heading2"/>
+      </w:pPr>
+      <w:bookmarkStart w:id="9" w:name="_Toc235477029"/>
+      <w:r>
+        <w:t>5.3. Quản lý mã nguồn và phiên bản trên Git/GitHub</w:t>
+      </w:r>
+      <w:bookmarkEnd w:id="9"/>
+    </w:p>
+    <w:p>
+      <w:pPr>
+        <w:ind w:right="-285"/>
+        <w:rPr>
+          <w:bCs/>
+          <w:szCs w:val="26"/>
+        </w:rPr>
+      </w:pPr>
+      <w:r>
+        <w:rPr>
+          <w:bCs/>
+          <w:szCs w:val="26"/>
+        </w:rPr>
+        <w:t>Việc quản lý mã nguồn phải tuân thủ các quy tắc chuyên nghiệp để tránh xung đột dữ liệu:</w:t>
       </w:r>
     </w:p>
     <w:p>
@@ -6916,7 +8337,7 @@
           <w:bCs/>
           <w:szCs w:val="26"/>
         </w:rPr>
-        <w:t>Data Analyst: Chịu trách nhiệm chính trong việc thực hiện EDA, xử lý thống kê và trực quan hóa các Insight từ dữ liệu.</w:t>
+        <w:t>Chiến lược phân nhánh (Branching strategy): Sử dụng nhánh main cho bản ổn định nhất và các nhánh feature/ riêng biệt cho từng chức năng (ví dụ: feature/data-cleaning, feature/eda-analysis).</w:t>
       </w:r>
     </w:p>
     <w:p>
@@ -6939,31 +8360,7 @@
           <w:bCs/>
           <w:szCs w:val="26"/>
         </w:rPr>
-        <w:t>AI/Machine Learning Researcher: Nghiên cứu và hiện thực hóa các mô hình dự báo, tối ưu hóa thuật toán dựa trên mục tiêu nghiên cứu.</w:t>
-      </w:r>
-    </w:p>
-    <w:p>
-      <w:pPr>
-        <w:pStyle w:val="Heading2"/>
-      </w:pPr>
-      <w:r>
-        <w:t>5.2. Kế hoạch và tiến độ triển khai (Project timeline)</w:t>
-      </w:r>
-    </w:p>
-    <w:p>
-      <w:pPr>
-        <w:ind w:right="-285"/>
-        <w:rPr>
-          <w:bCs/>
-          <w:szCs w:val="26"/>
-        </w:rPr>
-      </w:pPr>
-      <w:r>
-        <w:rPr>
-          <w:bCs/>
-          <w:szCs w:val="26"/>
-        </w:rPr>
-        <w:t>Sử dụng mô hình Agile/Scrum để quản lý các giai đoạn phát triển:</w:t>
+        <w:t>Quy trình Commit và Pull Request: Mỗi lần cập nhật code phải có nội dung mô tả rõ ràng (Commit message) và cần được ít nhất một thành viên khác kiểm tra (Review) trước khi gộp (Merge) vào nhánh chính.</w:t>
       </w:r>
     </w:p>
     <w:p>
@@ -6986,8 +8383,18 @@
           <w:bCs/>
           <w:szCs w:val="26"/>
         </w:rPr>
-        <w:t>Bảng tiến độ (Gantt Chart/Sprint Plan): Liệt kê các đầu việc cụ thể theo từng tuần, đi kèm người phụ trách và thời hạn hoàn thành rõ ràng.</w:t>
-      </w:r>
+        <w:t>Tài liệu hướng dẫn (README.md): Viết hướng dẫn ngắn gọn về cách thiết lập môi trường, cách chạy mã nguồn và cấu trúc thư mục dự án.</w:t>
+      </w:r>
+    </w:p>
+    <w:p>
+      <w:pPr>
+        <w:pStyle w:val="Heading2"/>
+      </w:pPr>
+      <w:bookmarkStart w:id="10" w:name="_Toc235477030"/>
+      <w:r>
+        <w:t>5.4. Quy tắc cộng tác và đạo đức nghề nghiệp</w:t>
+      </w:r>
+      <w:bookmarkEnd w:id="10"/>
     </w:p>
     <w:p>
       <w:pPr>
@@ -7009,7 +8416,7 @@
           <w:bCs/>
           <w:szCs w:val="26"/>
         </w:rPr>
-        <w:t>Quản lý công việc trên Jira/Trello: Sử dụng bảng Kanban với các cột: To Do, In Progress, Review, Done để theo dõi trạng thái công việc trong thời gian thực.</w:t>
+        <w:t>Quản lý mã nguồn chung: Nén toàn bộ sản phẩm vào tệp tin đúng định dạng quy định và nộp đúng hạn trên hệ thống.</w:t>
       </w:r>
     </w:p>
     <w:p>
@@ -7032,32 +8439,7 @@
           <w:bCs/>
           <w:szCs w:val="26"/>
         </w:rPr>
-        <w:lastRenderedPageBreak/>
-        <w:t>Báo cáo tiến độ định kỳ: Ghi chép nhật ký thực hiện dự án, các khó khăn phát sinh và giải pháp đã áp dụng để vượt qua các "nút thắt" kỹ thuật.</w:t>
-      </w:r>
-    </w:p>
-    <w:p>
-      <w:pPr>
-        <w:pStyle w:val="Heading2"/>
-      </w:pPr>
-      <w:r>
-        <w:t>5.3. Quản lý mã nguồn và phiên bản trên Git/GitHub</w:t>
-      </w:r>
-    </w:p>
-    <w:p>
-      <w:pPr>
-        <w:ind w:right="-285"/>
-        <w:rPr>
-          <w:bCs/>
-          <w:szCs w:val="26"/>
-        </w:rPr>
-      </w:pPr>
-      <w:r>
-        <w:rPr>
-          <w:bCs/>
-          <w:szCs w:val="26"/>
-        </w:rPr>
-        <w:t>Việc quản lý mã nguồn phải tuân thủ các quy tắc chuyên nghiệp để tránh xung đột dữ liệu:</w:t>
+        <w:t>Minh bạch về nguồn tham khảo: Ghi chú rõ ràng các đoạn mã hoặc ý tưởng tham khảo từ bên ngoài trong phần nhận xét của mã nguồn hoặc tài liệu đính kèm.</w:t>
       </w:r>
     </w:p>
     <w:p>
@@ -7080,8 +8462,21 @@
           <w:bCs/>
           <w:szCs w:val="26"/>
         </w:rPr>
-        <w:t>Chiến lược phân nhánh (Branching strategy): Sử dụng nhánh main cho bản ổn định nhất và các nhánh feature/ riêng biệt cho từng chức năng (ví dụ: feature/data-cleaning, feature/eda-analysis).</w:t>
-      </w:r>
+        <w:t>Kỷ luật nhóm: Duy trì tinh thần đoàn kết, tôn trọng ý kiến phản biện và sẵn sàng hỗ trợ thành viên khác khi gặp khó khăn về mặt kỹ thuật.</w:t>
+      </w:r>
+    </w:p>
+    <w:p>
+      <w:pPr>
+        <w:pStyle w:val="Heading1"/>
+        <w:rPr>
+          <w:bCs/>
+        </w:rPr>
+      </w:pPr>
+      <w:bookmarkStart w:id="11" w:name="_Toc235477031"/>
+      <w:r>
+        <w:t>Chương 6. Tổng kết và triển khai dự án</w:t>
+      </w:r>
+      <w:bookmarkEnd w:id="11"/>
     </w:p>
     <w:p>
       <w:pPr>
@@ -7103,7 +8498,7 @@
           <w:bCs/>
           <w:szCs w:val="26"/>
         </w:rPr>
-        <w:t>Quy trình Commit và Pull Request: Mỗi lần cập nhật code phải có nội dung mô tả rõ ràng (Commit message) và cần được ít nhất một thành viên khác kiểm tra (Review) trước khi gộp (Merge) vào nhánh chính.</w:t>
+        <w:t xml:space="preserve">Hướng dẫn đóng gói: Cách tổ chức Folder dự án, hướng dẫn chạy Notebook trên Kaggle/Colab. </w:t>
       </w:r>
     </w:p>
     <w:p>
@@ -7126,15 +8521,7 @@
           <w:bCs/>
           <w:szCs w:val="26"/>
         </w:rPr>
-        <w:t>Tài liệu hướng dẫn (README.md): Viết hướng dẫn ngắn gọn về cách thiết lập môi trường, cách chạy mã nguồn và cấu trúc thư mục dự án.</w:t>
-      </w:r>
-    </w:p>
-    <w:p>
-      <w:pPr>
-        <w:pStyle w:val="Heading2"/>
-      </w:pPr>
-      <w:r>
-        <w:t>5.4. Quy tắc cộng tác và đạo đức nghề nghiệp</w:t>
+        <w:t>Kết luận: Những gì dự án đã đạt được và những hạn chế còn tồn tại.</w:t>
       </w:r>
     </w:p>
     <w:p>
@@ -7157,139 +8544,13 @@
           <w:bCs/>
           <w:szCs w:val="26"/>
         </w:rPr>
-        <w:t>Quản lý mã nguồn chung: Nén toàn bộ sản phẩm vào tệp tin đúng định dạng quy định và nộp đúng hạn trên hệ thống.</w:t>
-      </w:r>
-    </w:p>
-    <w:p>
-      <w:pPr>
-        <w:numPr>
-          <w:ilvl w:val="0"/>
-          <w:numId w:val="1"/>
-        </w:numPr>
-        <w:tabs>
-          <w:tab w:val="clear" w:pos="420"/>
-        </w:tabs>
-        <w:ind w:right="-285"/>
-        <w:rPr>
-          <w:bCs/>
-          <w:szCs w:val="26"/>
-        </w:rPr>
-      </w:pPr>
-      <w:r>
-        <w:rPr>
-          <w:bCs/>
-          <w:szCs w:val="26"/>
-        </w:rPr>
-        <w:t>Minh bạch về nguồn tham khảo: Ghi chú rõ ràng các đoạn mã hoặc ý tưởng tham khảo từ bên ngoài trong phần nhận xét của mã nguồn hoặc tài liệu đính kèm.</w:t>
-      </w:r>
-    </w:p>
-    <w:p>
-      <w:pPr>
-        <w:numPr>
-          <w:ilvl w:val="0"/>
-          <w:numId w:val="1"/>
-        </w:numPr>
-        <w:tabs>
-          <w:tab w:val="clear" w:pos="420"/>
-        </w:tabs>
-        <w:ind w:right="-285"/>
-        <w:rPr>
-          <w:bCs/>
-          <w:szCs w:val="26"/>
-        </w:rPr>
-      </w:pPr>
-      <w:r>
-        <w:rPr>
-          <w:bCs/>
-          <w:szCs w:val="26"/>
-        </w:rPr>
-        <w:t>Kỷ luật nhóm: Duy trì tinh thần đoàn kết, tôn trọng ý kiến phản biện và sẵn sàng hỗ trợ thành viên khác khi gặp khó khăn về mặt kỹ thuật.</w:t>
-      </w:r>
-    </w:p>
-    <w:p>
-      <w:pPr>
-        <w:pStyle w:val="Heading1"/>
-        <w:rPr>
-          <w:bCs/>
-        </w:rPr>
-      </w:pPr>
-      <w:r>
-        <w:t>Chương 6. Tổng kết và triển khai dự án</w:t>
-      </w:r>
-    </w:p>
-    <w:p>
-      <w:pPr>
-        <w:numPr>
-          <w:ilvl w:val="0"/>
-          <w:numId w:val="1"/>
-        </w:numPr>
-        <w:tabs>
-          <w:tab w:val="clear" w:pos="420"/>
-        </w:tabs>
-        <w:ind w:right="-285"/>
-        <w:rPr>
-          <w:bCs/>
-          <w:szCs w:val="26"/>
-        </w:rPr>
-      </w:pPr>
-      <w:r>
-        <w:rPr>
-          <w:bCs/>
-          <w:szCs w:val="26"/>
-        </w:rPr>
-        <w:t xml:space="preserve">Hướng dẫn đóng gói: Cách tổ chức Folder dự án, hướng dẫn chạy Notebook trên Kaggle/Colab. </w:t>
-      </w:r>
-    </w:p>
-    <w:p>
-      <w:pPr>
-        <w:numPr>
-          <w:ilvl w:val="0"/>
-          <w:numId w:val="1"/>
-        </w:numPr>
-        <w:tabs>
-          <w:tab w:val="clear" w:pos="420"/>
-        </w:tabs>
-        <w:ind w:right="-285"/>
-        <w:rPr>
-          <w:bCs/>
-          <w:szCs w:val="26"/>
-        </w:rPr>
-      </w:pPr>
-      <w:r>
-        <w:rPr>
-          <w:bCs/>
-          <w:szCs w:val="26"/>
-        </w:rPr>
-        <w:t>Kết luận: Những gì dự án đã đạt được và những hạn chế còn tồn tại.</w:t>
-      </w:r>
-    </w:p>
-    <w:p>
-      <w:pPr>
-        <w:numPr>
-          <w:ilvl w:val="0"/>
-          <w:numId w:val="1"/>
-        </w:numPr>
-        <w:tabs>
-          <w:tab w:val="clear" w:pos="420"/>
-        </w:tabs>
-        <w:ind w:right="-285"/>
-        <w:rPr>
-          <w:bCs/>
-          <w:szCs w:val="26"/>
-        </w:rPr>
-      </w:pPr>
-      <w:r>
-        <w:rPr>
-          <w:bCs/>
-          <w:szCs w:val="26"/>
-        </w:rPr>
         <w:t>Hướng phát triển: Đề xuất các kỹ thuật AI nâng cao hơn có thể áp dụng trong tương lai.</w:t>
       </w:r>
     </w:p>
     <w:sectPr>
-      <w:headerReference w:type="default" r:id="rId8"/>
-      <w:footerReference w:type="default" r:id="rId9"/>
-      <w:footerReference w:type="first" r:id="rId10"/>
+      <w:headerReference w:type="default" r:id="rId9"/>
+      <w:footerReference w:type="default" r:id="rId10"/>
+      <w:footerReference w:type="first" r:id="rId11"/>
       <w:pgSz w:w="11907" w:h="16840" w:code="9"/>
       <w:pgMar w:top="864" w:right="720" w:bottom="864" w:left="1008" w:header="576" w:footer="576" w:gutter="0"/>
       <w:pgNumType w:start="1"/>
@@ -7798,12 +9059,15 @@
     <w:lsdException w:name="heading 2" w:qFormat="1"/>
     <w:lsdException w:name="heading 3" w:qFormat="1"/>
     <w:lsdException w:name="heading 4" w:qFormat="1"/>
+    <w:lsdException w:name="toc 1" w:uiPriority="39"/>
+    <w:lsdException w:name="toc 2" w:uiPriority="39"/>
     <w:lsdException w:name="header" w:uiPriority="99"/>
     <w:lsdException w:name="footer" w:uiPriority="99"/>
     <w:lsdException w:name="caption" w:semiHidden="1" w:unhideWhenUsed="1" w:qFormat="1"/>
     <w:lsdException w:name="Title" w:qFormat="1"/>
     <w:lsdException w:name="Default Paragraph Font" w:semiHidden="1"/>
     <w:lsdException w:name="Subtitle" w:qFormat="1"/>
+    <w:lsdException w:name="Hyperlink" w:uiPriority="99"/>
     <w:lsdException w:name="Strong" w:qFormat="1"/>
     <w:lsdException w:name="HTML Top of Form" w:semiHidden="1" w:uiPriority="99" w:unhideWhenUsed="1"/>
     <w:lsdException w:name="HTML Bottom of Form" w:semiHidden="1" w:uiPriority="99" w:unhideWhenUsed="1"/>
@@ -8258,6 +9522,7 @@
   <w:style w:type="character" w:default="1" w:styleId="DefaultParagraphFont">
     <w:name w:val="Default Paragraph Font"/>
     <w:uiPriority w:val="1"/>
+    <w:semiHidden/>
     <w:unhideWhenUsed/>
   </w:style>
   <w:style w:type="table" w:default="1" w:styleId="TableNormal">
@@ -8506,6 +9771,66 @@
       <w:sz w:val="22"/>
       <w:szCs w:val="22"/>
       <w:lang w:eastAsia="ar-SA"/>
+    </w:rPr>
+  </w:style>
+  <w:style w:type="paragraph" w:styleId="TOCHeading">
+    <w:name w:val="TOC Heading"/>
+    <w:basedOn w:val="Heading1"/>
+    <w:next w:val="Normal"/>
+    <w:uiPriority w:val="39"/>
+    <w:unhideWhenUsed/>
+    <w:qFormat/>
+    <w:rsid w:val="00144F8D"/>
+    <w:pPr>
+      <w:keepLines/>
+      <w:tabs>
+        <w:tab w:val="clear" w:pos="1134"/>
+        <w:tab w:val="clear" w:pos="3119"/>
+      </w:tabs>
+      <w:spacing w:line="259" w:lineRule="auto"/>
+      <w:ind w:right="0"/>
+      <w:jc w:val="left"/>
+      <w:outlineLvl w:val="9"/>
+    </w:pPr>
+    <w:rPr>
+      <w:rFonts w:asciiTheme="majorHAnsi" w:eastAsiaTheme="majorEastAsia" w:hAnsiTheme="majorHAnsi" w:cstheme="majorBidi"/>
+      <w:b w:val="0"/>
+      <w:color w:val="2F5496" w:themeColor="accent1" w:themeShade="BF"/>
+      <w:szCs w:val="32"/>
+    </w:rPr>
+  </w:style>
+  <w:style w:type="paragraph" w:styleId="TOC1">
+    <w:name w:val="toc 1"/>
+    <w:basedOn w:val="Normal"/>
+    <w:next w:val="Normal"/>
+    <w:autoRedefine/>
+    <w:uiPriority w:val="39"/>
+    <w:rsid w:val="00144F8D"/>
+    <w:pPr>
+      <w:spacing w:after="100"/>
+    </w:pPr>
+  </w:style>
+  <w:style w:type="paragraph" w:styleId="TOC2">
+    <w:name w:val="toc 2"/>
+    <w:basedOn w:val="Normal"/>
+    <w:next w:val="Normal"/>
+    <w:autoRedefine/>
+    <w:uiPriority w:val="39"/>
+    <w:rsid w:val="00144F8D"/>
+    <w:pPr>
+      <w:spacing w:after="100"/>
+      <w:ind w:left="280"/>
+    </w:pPr>
+  </w:style>
+  <w:style w:type="character" w:styleId="Hyperlink">
+    <w:name w:val="Hyperlink"/>
+    <w:basedOn w:val="DefaultParagraphFont"/>
+    <w:uiPriority w:val="99"/>
+    <w:unhideWhenUsed/>
+    <w:rsid w:val="00144F8D"/>
+    <w:rPr>
+      <w:color w:val="0563C1" w:themeColor="hyperlink"/>
+      <w:u w:val="single"/>
     </w:rPr>
   </w:style>
 </w:styles>
@@ -8804,4 +10129,16 @@
     </a:ext>
   </a:extLst>
 </a:theme>
+</file>
+
+<file path=customXml/item1.xml><?xml version="1.0" encoding="utf-8"?>
+<b:Sources xmlns:b="http://schemas.openxmlformats.org/officeDocument/2006/bibliography" xmlns="http://schemas.openxmlformats.org/officeDocument/2006/bibliography" SelectedStyle="\APASixthEditionOfficeOnline.xsl" StyleName="APA" Version="6"/>
+</file>
+
+<file path=customXml/itemProps1.xml><?xml version="1.0" encoding="utf-8"?>
+<ds:datastoreItem xmlns:ds="http://schemas.openxmlformats.org/officeDocument/2006/customXml" ds:itemID="{4A13876D-25AB-41A9-93D7-12F0B0E9086B}">
+  <ds:schemaRefs>
+    <ds:schemaRef ds:uri="http://schemas.openxmlformats.org/officeDocument/2006/bibliography"/>
+  </ds:schemaRefs>
+</ds:datastoreItem>
 </file>
</xml_diff>

<commit_message>
docs: Thai viet noi dung Chuong 2 - Xay dung pipeline va tien xu ly du lieu
Them noi dung day du cho 2.1 Quy trinh tich hop du lieu (Merge/Join),
2.2 Lam sach du lieu chuyen sau, 2.3 Kich ban kiem thu du lieu va
2.4 Ket luan chuong, dua tren noi dung thuc te cua NB02 va NB03.
</commit_message>
<xml_diff>
--- a/docs/2. Mau tai lieu.docx
+++ b/docs/2. Mau tai lieu.docx
@@ -7789,88 +7789,255 @@
       <w:bookmarkEnd w:id="3"/>
     </w:p>
     <w:p>
-      <w:pPr>
-        <w:ind w:right="-285"/>
-        <w:rPr>
-          <w:bCs/>
-          <w:szCs w:val="26"/>
-        </w:rPr>
-      </w:pPr>
-      <w:r>
-        <w:rPr>
-          <w:bCs/>
-          <w:szCs w:val="26"/>
-        </w:rPr>
-        <w:t>Đây là chương trọng tâm thể hiện kỹ năng “xử lý thô” và tối ưu hóa hệ thống.</w:t>
-      </w:r>
-    </w:p>
-    <w:p>
-      <w:pPr>
-        <w:numPr>
-          <w:ilvl w:val="0"/>
-          <w:numId w:val="1"/>
-        </w:numPr>
-        <w:tabs>
-          <w:tab w:val="clear" w:pos="420"/>
-        </w:tabs>
-        <w:ind w:right="-285"/>
-        <w:rPr>
-          <w:bCs/>
-          <w:szCs w:val="26"/>
-        </w:rPr>
-      </w:pPr>
-      <w:r>
-        <w:rPr>
-          <w:bCs/>
-          <w:szCs w:val="26"/>
-        </w:rPr>
-        <w:t xml:space="preserve">Quy trình tích hợp: Mô tả kỹ thuật Merge/Join các bảng; cách giải quyết xung đột khóa và tối ưu bộ nhớ khi xử lý hàng triệu dòng. </w:t>
-      </w:r>
-    </w:p>
-    <w:p>
-      <w:pPr>
-        <w:numPr>
-          <w:ilvl w:val="0"/>
-          <w:numId w:val="1"/>
-        </w:numPr>
-        <w:tabs>
-          <w:tab w:val="clear" w:pos="420"/>
-        </w:tabs>
-        <w:ind w:right="-285"/>
-        <w:rPr>
-          <w:bCs/>
-          <w:szCs w:val="26"/>
-        </w:rPr>
-      </w:pPr>
-      <w:r>
-        <w:rPr>
-          <w:bCs/>
-          <w:szCs w:val="26"/>
-        </w:rPr>
-        <w:t>Làm sạch dữ liệu chuyên sâu: Quy trình xử lý Outliers và Imputation cho dữ liệu khuyết thiếu.</w:t>
-      </w:r>
-    </w:p>
-    <w:p>
-      <w:pPr>
-        <w:numPr>
-          <w:ilvl w:val="0"/>
-          <w:numId w:val="1"/>
-        </w:numPr>
-        <w:tabs>
-          <w:tab w:val="clear" w:pos="420"/>
-        </w:tabs>
-        <w:ind w:right="-285"/>
-        <w:rPr>
-          <w:bCs/>
-          <w:szCs w:val="26"/>
-        </w:rPr>
-      </w:pPr>
-      <w:r>
-        <w:rPr>
-          <w:bCs/>
-          <w:szCs w:val="26"/>
-        </w:rPr>
-        <w:t>Kịch bản kiểm thử dữ liệu: Các bước Unit test để đảm bảo dữ liệu sau khi Join không bị sai lệch số liệu gốc.</w:t>
+      <w:pPr/>
+      <w:r>
+        <w:rPr>
+          <w:rFonts w:ascii="Times New Roman" w:hAnsi="Times New Roman"/>
+          <w:sz w:val="26"/>
+        </w:rPr>
+        <w:t>Chương này trình bày quy trình đưa dữ liệu Home Credit từ nhiều bảng rời rạc trong PostgreSQL thành một bảng phẳng duy nhất, sau đó làm sạch và kiểm thử để đảm bảo dữ liệu sẵn sàng cho các bước phân tích và huấn luyện mô hình ở các chương sau.</w:t>
+      </w:r>
+    </w:p>
+    <w:p>
+      <w:pPr>
+        <w:pStyle w:val="Heading2"/>
+      </w:pPr>
+      <w:r>
+        <w:rPr>
+          <w:rFonts w:ascii="Times New Roman" w:hAnsi="Times New Roman"/>
+          <w:b/>
+          <w:sz w:val="28"/>
+        </w:rPr>
+        <w:t>2.1. Quy trình tích hợp dữ liệu (Merge/Join)</w:t>
+      </w:r>
+    </w:p>
+    <w:p>
+      <w:pPr/>
+      <w:r>
+        <w:rPr>
+          <w:rFonts w:ascii="Times New Roman" w:hAnsi="Times New Roman"/>
+          <w:sz w:val="26"/>
+        </w:rPr>
+        <w:t>Notebook 02 tổ chức dữ liệu gốc trên PostgreSQL và ghép các bảng phụ vào bảng application_train để tạo thành bảng phẳng application_flat, làm đầu vào cho bước làm sạch dữ liệu.</w:t>
+      </w:r>
+    </w:p>
+    <w:p>
+      <w:pPr/>
+      <w:r>
+        <w:rPr>
+          <w:rFonts w:ascii="Times New Roman" w:hAnsi="Times New Roman"/>
+          <w:sz w:val="26"/>
+        </w:rPr>
+        <w:t>Mỗi khách hàng có nhiều dòng ở các bảng phụ như bureau, previous_application hay credit_card_balance, trong khi application_train chỉ có một dòng cho mỗi khách. Nếu join trực tiếp, một khách hàng có thể bị nhân thành nhiều dòng, làm sai lệch thống kê và kết quả huấn luyện mô hình.</w:t>
+      </w:r>
+    </w:p>
+    <w:p>
+      <w:pPr>
+        <w:pStyle w:val="ListParagraph"/>
+      </w:pPr>
+      <w:r>
+        <w:rPr>
+          <w:rFonts w:ascii="Times New Roman" w:hAnsi="Times New Roman"/>
+          <w:sz w:val="26"/>
+        </w:rPr>
+        <w:t>• Giải pháp row explosion: gom từng bảng phụ về đúng một dòng cho mỗi khách hàng bằng GROUP BY sk_id_curr trước khi join, tạo ra 6 bảng summary trung gian.</w:t>
+      </w:r>
+    </w:p>
+    <w:p>
+      <w:pPr>
+        <w:pStyle w:val="ListParagraph"/>
+      </w:pPr>
+      <w:r>
+        <w:rPr>
+          <w:rFonts w:ascii="Times New Roman" w:hAnsi="Times New Roman"/>
+          <w:sz w:val="26"/>
+        </w:rPr>
+        <w:t>• Khóa nối: sk_id_curr là khóa chính để join vào bảng trung tâm; riêng bureau_balance phải gom theo sk_id_bureau trước, sau đó mới nối tiếp vào bureau để quy về mức khách hàng.</w:t>
+      </w:r>
+    </w:p>
+    <w:p>
+      <w:pPr>
+        <w:pStyle w:val="ListParagraph"/>
+      </w:pPr>
+      <w:r>
+        <w:rPr>
+          <w:rFonts w:ascii="Times New Roman" w:hAnsi="Times New Roman"/>
+          <w:sz w:val="26"/>
+        </w:rPr>
+        <w:t>• Tối ưu bộ nhớ và hiệu năng: toàn bộ thao tác gộp nhóm và join được thực hiện bằng SQL ngay trong PostgreSQL thay vì tải hết dữ liệu vào pandas rồi merge, đồng thời tạo index trên các khóa nối để tăng tốc xử lý trên hàng triệu dòng.</w:t>
+      </w:r>
+    </w:p>
+    <w:p>
+      <w:pPr/>
+      <w:r>
+        <w:rPr>
+          <w:rFonts w:ascii="Times New Roman" w:hAnsi="Times New Roman"/>
+          <w:sz w:val="26"/>
+        </w:rPr>
+        <w:t>Kết quả, bảng application_flat đạt 307.511 dòng và 154 cột, giữ nguyên số dòng của application_train và đảm bảo mỗi khách hàng chỉ có đúng một dòng dữ liệu.</w:t>
+      </w:r>
+    </w:p>
+    <w:p>
+      <w:pPr>
+        <w:pStyle w:val="Heading2"/>
+      </w:pPr>
+      <w:r>
+        <w:rPr>
+          <w:rFonts w:ascii="Times New Roman" w:hAnsi="Times New Roman"/>
+          <w:b/>
+          <w:sz w:val="28"/>
+        </w:rPr>
+        <w:t>2.2. Làm sạch dữ liệu chuyên sâu</w:t>
+      </w:r>
+    </w:p>
+    <w:p>
+      <w:pPr/>
+      <w:r>
+        <w:rPr>
+          <w:rFonts w:ascii="Times New Roman" w:hAnsi="Times New Roman"/>
+          <w:sz w:val="26"/>
+        </w:rPr>
+        <w:t>Notebook 03 làm sạch bảng application_flat qua các bước xử lý outlier và điền giá trị khuyết, nhằm đưa dữ liệu về trạng thái nhất quán trước khi phân tích.</w:t>
+      </w:r>
+    </w:p>
+    <w:p>
+      <w:pPr>
+        <w:pStyle w:val="ListParagraph"/>
+      </w:pPr>
+      <w:r>
+        <w:rPr>
+          <w:rFonts w:ascii="Times New Roman" w:hAnsi="Times New Roman"/>
+          <w:sz w:val="26"/>
+        </w:rPr>
+        <w:t>• Phát hiện outlier: dùng IQR thay vì Z-score, vì IQR dựa trên phân vị nên bền vững hơn khi dữ liệu tài chính bị lệch mạnh.</w:t>
+      </w:r>
+    </w:p>
+    <w:p>
+      <w:pPr>
+        <w:pStyle w:val="ListParagraph"/>
+      </w:pPr>
+      <w:r>
+        <w:rPr>
+          <w:rFonts w:ascii="Times New Roman" w:hAnsi="Times New Roman"/>
+          <w:sz w:val="26"/>
+        </w:rPr>
+        <w:t>• Xử lý outlier: áp dụng capping tại phân vị 99% cho 13 cột tiền tệ, nhưng chỉ chặn ngưỡng trên và giữ nguyên toàn bộ số dòng; việc chỉ chặn ngưỡng trên nhằm tránh che lấp các giá trị âm sai logic đang tồn tại ở bureau_sum_debt và credit_card_avg_balance.</w:t>
+      </w:r>
+    </w:p>
+    <w:p>
+      <w:pPr>
+        <w:pStyle w:val="ListParagraph"/>
+      </w:pPr>
+      <w:r>
+        <w:rPr>
+          <w:rFonts w:ascii="Times New Roman" w:hAnsi="Times New Roman"/>
+          <w:sz w:val="26"/>
+        </w:rPr>
+        <w:t>• Điền giá trị khuyết: xử lý theo từng nhóm cột, gắn cờ business-null cho các nhóm dữ liệu như has_bureau hay has_previous, điền median cho cột số còn thiếu, điền 'Unknown' cho cột chữ, và xóa dòng đối với các cột chỉ thiếu rất ít.</w:t>
+      </w:r>
+    </w:p>
+    <w:p>
+      <w:pPr>
+        <w:pStyle w:val="ListParagraph"/>
+      </w:pPr>
+      <w:r>
+        <w:rPr>
+          <w:rFonts w:ascii="Times New Roman" w:hAnsi="Times New Roman"/>
+          <w:sz w:val="26"/>
+        </w:rPr>
+        <w:t>• Sửa giá trị sai logic: giá trị âm ở bureau_sum_debt và credit_card_avg_balance được điền lại 0, days_employed bằng 365243 được chuyển thành NaN, và các dòng có code_gender bằng XNA bị loại bỏ.</w:t>
+      </w:r>
+    </w:p>
+    <w:p>
+      <w:pPr>
+        <w:pStyle w:val="Heading2"/>
+      </w:pPr>
+      <w:r>
+        <w:rPr>
+          <w:rFonts w:ascii="Times New Roman" w:hAnsi="Times New Roman"/>
+          <w:b/>
+          <w:sz w:val="28"/>
+        </w:rPr>
+        <w:t>2.3. Kịch bản kiểm thử dữ liệu (Unit test sau khi Join)</w:t>
+      </w:r>
+    </w:p>
+    <w:p>
+      <w:pPr/>
+      <w:r>
+        <w:rPr>
+          <w:rFonts w:ascii="Times New Roman" w:hAnsi="Times New Roman"/>
+          <w:sz w:val="26"/>
+        </w:rPr>
+        <w:t>Sau khi join, dữ liệu được kiểm tra lại bằng nhiều phép đối chiếu để đảm bảo không có sai lệch nào phát sinh so với dữ liệu gốc.</w:t>
+      </w:r>
+    </w:p>
+    <w:p>
+      <w:pPr>
+        <w:pStyle w:val="ListParagraph"/>
+      </w:pPr>
+      <w:r>
+        <w:rPr>
+          <w:rFonts w:ascii="Times New Roman" w:hAnsi="Times New Roman"/>
+          <w:sz w:val="26"/>
+        </w:rPr>
+        <w:t>• Kiểm tra số dòng và khóa chính: đối chiếu bảng application_flat vẫn giữ đúng 307.511 dòng và số khách hàng riêng biệt cũng bằng đúng con số này, nghĩa là không khách hàng nào bị mất hoặc bị nhân bản.</w:t>
+      </w:r>
+    </w:p>
+    <w:p>
+      <w:pPr>
+        <w:pStyle w:val="ListParagraph"/>
+      </w:pPr>
+      <w:r>
+        <w:rPr>
+          <w:rFonts w:ascii="Times New Roman" w:hAnsi="Times New Roman"/>
+          <w:sz w:val="26"/>
+        </w:rPr>
+        <w:t>• Kiểm tra phân bố TARGET: so sánh số khách hàng TARGET bằng 1 và TARGET bằng 0 giữa bảng gốc và bảng phẳng, hai kết quả phải khớp tuyệt đối.</w:t>
+      </w:r>
+    </w:p>
+    <w:p>
+      <w:pPr>
+        <w:pStyle w:val="ListParagraph"/>
+      </w:pPr>
+      <w:r>
+        <w:rPr>
+          <w:rFonts w:ascii="Times New Roman" w:hAnsi="Times New Roman"/>
+          <w:sz w:val="26"/>
+        </w:rPr>
+        <w:t>• Kiểm tra dữ liệu thiếu sau join: đối chiếu số dòng NULL ở từng nhóm cột summary với công thức kỳ vọng, tức là lấy tổng số khách hàng trừ đi số khách hàng thực sự có dữ liệu ở nhóm đó.</w:t>
+      </w:r>
+    </w:p>
+    <w:p>
+      <w:pPr/>
+      <w:r>
+        <w:rPr>
+          <w:rFonts w:ascii="Times New Roman" w:hAnsi="Times New Roman"/>
+          <w:sz w:val="26"/>
+        </w:rPr>
+        <w:t>Cả ba phép kiểm tra đều trả về kết quả khớp với kỳ vọng, xác nhận LEFT JOIN không làm mất hay nhân bản khách hàng nào.</w:t>
+      </w:r>
+    </w:p>
+    <w:p>
+      <w:pPr>
+        <w:pStyle w:val="Heading2"/>
+      </w:pPr>
+      <w:r>
+        <w:rPr>
+          <w:rFonts w:ascii="Times New Roman" w:hAnsi="Times New Roman"/>
+          <w:b/>
+          <w:sz w:val="28"/>
+        </w:rPr>
+        <w:t>2.4. Kết luận chương</w:t>
+      </w:r>
+    </w:p>
+    <w:p>
+      <w:pPr/>
+      <w:r>
+        <w:rPr>
+          <w:rFonts w:ascii="Times New Roman" w:hAnsi="Times New Roman"/>
+          <w:sz w:val="26"/>
+        </w:rPr>
+        <w:t>Chương 2 đã đưa dữ liệu Home Credit từ nhiều file CSV rời rạc thành một bảng phẳng sạch, sẵn sàng cho phân tích. Ở bước tích hợp, các bảng phụ được gom về một dòng cho mỗi khách hàng trước khi join, đồng thời toàn bộ thao tác gộp nhóm và nối bảng thực hiện ngay trong PostgreSQL để xử lý hiệu quả hàng triệu dòng. Ở bước làm sạch, capping bất đối xứng (chỉ chặn ngưỡng trên) và điền khuyết theo từng nhóm cột giúp giữ tối đa thông tin gốc mà vẫn loại bỏ giá trị cực đoan và sai logic. Các bước kiểm thử sau join, gồm đối chiếu số dòng, phân bố TARGET và số lượng NULL, xác nhận dữ liệu không bị sai lệch. Kết quả là bảng dữ liệu sạch, đáng tin cậy, làm nền tảng cho Chương 3.</w:t>
       </w:r>
     </w:p>
     <w:p>

</xml_diff>

<commit_message>
docs: Hung update file doc bao cao
</commit_message>
<xml_diff>
--- a/docs/2. Mau tai lieu.docx
+++ b/docs/2. Mau tai lieu.docx
@@ -22,7 +22,7 @@
         <mc:AlternateContent>
           <mc:Choice Requires="wpg">
             <w:drawing>
-              <wp:anchor distT="0" distB="0" distL="114300" distR="114300" simplePos="0" relativeHeight="251668992" behindDoc="0" locked="0" layoutInCell="1" allowOverlap="1" wp14:anchorId="338E77BE" wp14:editId="22D32B73">
+              <wp:anchor distT="0" distB="0" distL="114300" distR="114300" simplePos="0" relativeHeight="251668992" behindDoc="0" locked="0" layoutInCell="1" allowOverlap="1" wp14:anchorId="57AEF6AA" wp14:editId="6E39B09F">
                 <wp:simplePos x="0" y="0"/>
                 <wp:positionH relativeFrom="margin">
                   <wp:align>left</wp:align>
@@ -396,7 +396,7 @@
               </wp:anchor>
             </w:drawing>
           </mc:Choice>
-          <mc:Fallback xmlns:w16sdtfl="http://schemas.microsoft.com/office/word/2024/wordml/sdtformatlock" xmlns:w16du="http://schemas.microsoft.com/office/word/2023/wordml/word16du">
+          <mc:Fallback xmlns:w16du="http://schemas.microsoft.com/office/word/2023/wordml/word16du" xmlns:w16sdtfl="http://schemas.microsoft.com/office/word/2024/wordml/sdtformatlock">
             <w:pict>
               <v:group w14:anchorId="7B3222B4" id="Group 26" o:spid="_x0000_s1026" style="position:absolute;margin-left:0;margin-top:-9.4pt;width:507.45pt;height:747pt;z-index:251668992;mso-position-horizontal:left;mso-position-horizontal-relative:margin;mso-width-relative:margin" coordsize="58635,94869" o:gfxdata="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">
                 <v:shape id="FreeForm 22" o:spid="_x0000_s1027" style="position:absolute;left:-47203;top:47203;width:94869;height:463;rotation:-90;visibility:visible;mso-wrap-style:square;v-text-anchor:top" coordsize="8662,111" o:gfxdata="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" path="m48,111l,,8662,r-40,111l48,111xe" fillcolor="#b0b0b0" strokeweight="1.5pt">
@@ -428,7 +428,7 @@
         <mc:AlternateContent>
           <mc:Choice Requires="wps">
             <w:drawing>
-              <wp:anchor distT="0" distB="0" distL="114300" distR="114300" simplePos="0" relativeHeight="251654656" behindDoc="0" locked="0" layoutInCell="1" allowOverlap="1" wp14:anchorId="0EFC7A22" wp14:editId="36D1B978">
+              <wp:anchor distT="0" distB="0" distL="114300" distR="114300" simplePos="0" relativeHeight="251654656" behindDoc="0" locked="0" layoutInCell="1" allowOverlap="1" wp14:anchorId="3639ADF0" wp14:editId="5DD2927F">
                 <wp:simplePos x="0" y="0"/>
                 <wp:positionH relativeFrom="column">
                   <wp:posOffset>5440045</wp:posOffset>
@@ -676,7 +676,7 @@
               </wp:anchor>
             </w:drawing>
           </mc:Choice>
-          <mc:Fallback xmlns:w16sdtfl="http://schemas.microsoft.com/office/word/2024/wordml/sdtformatlock" xmlns:w16du="http://schemas.microsoft.com/office/word/2023/wordml/word16du">
+          <mc:Fallback xmlns:w16du="http://schemas.microsoft.com/office/word/2023/wordml/word16du" xmlns:w16sdtfl="http://schemas.microsoft.com/office/word/2024/wordml/sdtformatlock">
             <w:pict>
               <v:shape w14:anchorId="04DAE31C" id="FreeForm 21" o:spid="_x0000_s1026" style="position:absolute;margin-left:428.35pt;margin-top:3.75pt;width:22.65pt;height:20.2pt;rotation:-90;z-index:251654656;visibility:visible;mso-wrap-style:square;mso-width-percent:0;mso-height-percent:0;mso-wrap-distance-left:9pt;mso-wrap-distance-top:0;mso-wrap-distance-right:9pt;mso-wrap-distance-bottom:0;mso-position-horizontal:absolute;mso-position-horizontal-relative:text;mso-position-vertical:absolute;mso-position-vertical-relative:text;mso-width-percent:0;mso-height-percent:0;mso-width-relative:page;mso-height-relative:page;v-text-anchor:top" coordsize="263,613" o:gfxdata="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" path="m,19l16,56r32,74l128,316r79,186l239,576r16,37l263,594r,-37l239,390r,-74l247,260r,-18l239,242,191,223,136,167,72,93,24,19,,,,19xe" strokecolor="white" strokeweight="1.5pt">
                 <v:path arrowok="t" o:connecttype="custom" o:connectlocs="0,3327487;19140542,9807947;57421625,22768448;153123241,55344843;247629393,87921238;285910476,100881739;305051018,107361781;314621289,104034294;314621289,97553834;285910476,68305344;285910476,55344843;295480747,45536896;295480747,42384342;285910476,42384342;228488851,39056436;162693512,29248489;86132438,16287988;28710813,3327487;0,0;0,3327487" o:connectangles="0,0,0,0,0,0,0,0,0,0,0,0,0,0,0,0,0,0,0,0"/>
@@ -696,7 +696,7 @@
         <mc:AlternateContent>
           <mc:Choice Requires="wps">
             <w:drawing>
-              <wp:anchor distT="0" distB="0" distL="114300" distR="114300" simplePos="0" relativeHeight="251653632" behindDoc="0" locked="0" layoutInCell="1" allowOverlap="1" wp14:anchorId="06E6325D" wp14:editId="26C4F18F">
+              <wp:anchor distT="0" distB="0" distL="114300" distR="114300" simplePos="0" relativeHeight="251653632" behindDoc="0" locked="0" layoutInCell="1" allowOverlap="1" wp14:anchorId="724B08D2" wp14:editId="439E55B4">
                 <wp:simplePos x="0" y="0"/>
                 <wp:positionH relativeFrom="column">
                   <wp:posOffset>5351145</wp:posOffset>
@@ -896,7 +896,7 @@
               </wp:anchor>
             </w:drawing>
           </mc:Choice>
-          <mc:Fallback xmlns:w16sdtfl="http://schemas.microsoft.com/office/word/2024/wordml/sdtformatlock" xmlns:w16du="http://schemas.microsoft.com/office/word/2023/wordml/word16du">
+          <mc:Fallback xmlns:w16du="http://schemas.microsoft.com/office/word/2023/wordml/word16du" xmlns:w16sdtfl="http://schemas.microsoft.com/office/word/2024/wordml/sdtformatlock">
             <w:pict>
               <v:shape w14:anchorId="62480848" id="FreeForm 20" o:spid="_x0000_s1026" style="position:absolute;margin-left:421.35pt;margin-top:7.6pt;width:14.45pt;height:3.05pt;rotation:-90;z-index:251653632;visibility:visible;mso-wrap-style:square;mso-width-percent:0;mso-height-percent:0;mso-wrap-distance-left:9pt;mso-wrap-distance-top:0;mso-wrap-distance-right:9pt;mso-wrap-distance-bottom:0;mso-position-horizontal:absolute;mso-position-horizontal-relative:text;mso-position-vertical:absolute;mso-position-vertical-relative:text;mso-width-percent:0;mso-height-percent:0;mso-width-relative:page;mso-height-relative:page;v-text-anchor:top" coordsize="167,93" o:gfxdata="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" path="m8,56r32,l71,18,87,r16,l159,74r8,l151,93,103,56r-16,l56,93,16,74,,56r8,xe" strokecolor="white" strokeweight="1.5pt">
                 <v:path arrowok="t" o:connecttype="custom" o:connectlocs="9660361,9714571;48302906,9714571;85736670,3122541;105058491,0;124379214,0;192002843,12837112;201663205,12837112;182342482,16133336;124379214,9714571;105058491,9714571;67623629,16133336;19320723,12837112;0,9714571;0,9714571;9660361,9714571" o:connectangles="0,0,0,0,0,0,0,0,0,0,0,0,0,0,0"/>
@@ -916,7 +916,7 @@
         <mc:AlternateContent>
           <mc:Choice Requires="wps">
             <w:drawing>
-              <wp:anchor distT="0" distB="0" distL="114300" distR="114300" simplePos="0" relativeHeight="251647488" behindDoc="0" locked="0" layoutInCell="1" allowOverlap="1" wp14:anchorId="4826BC41" wp14:editId="6C73C0EE">
+              <wp:anchor distT="0" distB="0" distL="114300" distR="114300" simplePos="0" relativeHeight="251647488" behindDoc="0" locked="0" layoutInCell="1" allowOverlap="1" wp14:anchorId="2C4AA625" wp14:editId="46D4A56B">
                 <wp:simplePos x="0" y="0"/>
                 <wp:positionH relativeFrom="column">
                   <wp:posOffset>130175</wp:posOffset>
@@ -1164,7 +1164,7 @@
               </wp:anchor>
             </w:drawing>
           </mc:Choice>
-          <mc:Fallback xmlns:w16sdtfl="http://schemas.microsoft.com/office/word/2024/wordml/sdtformatlock" xmlns:w16du="http://schemas.microsoft.com/office/word/2023/wordml/word16du">
+          <mc:Fallback xmlns:w16du="http://schemas.microsoft.com/office/word/2023/wordml/word16du" xmlns:w16sdtfl="http://schemas.microsoft.com/office/word/2024/wordml/sdtformatlock">
             <w:pict>
               <v:shape w14:anchorId="151C1FF4" id="FreeForm 19" o:spid="_x0000_s1026" style="position:absolute;margin-left:10.25pt;margin-top:3.85pt;width:22.65pt;height:20.25pt;rotation:-90;z-index:251647488;visibility:visible;mso-wrap-style:square;mso-width-percent:0;mso-height-percent:0;mso-wrap-distance-left:9pt;mso-wrap-distance-top:0;mso-wrap-distance-right:9pt;mso-wrap-distance-bottom:0;mso-position-horizontal:absolute;mso-position-horizontal-relative:text;mso-position-vertical:absolute;mso-position-vertical-relative:text;mso-width-percent:0;mso-height-percent:0;mso-width-relative:page;mso-height-relative:page;v-text-anchor:top" coordsize="263,613" o:gfxdata="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" path="m,595l16,576,48,502,128,316,207,112,239,38,255,r8,19l263,75,239,223r,75l247,372r,18l239,390r-48,l136,446,72,520,24,595,,613,,595xe" strokecolor="white" strokeweight="1.5pt">
                 <v:path arrowok="t" o:connecttype="custom" o:connectlocs="0,104725604;19140542,101381490;57421625,88357023;153123241,55619023;247629393,19713114;285910476,6688228;305051018,0;314621289,3344114;314621289,13200671;285910476,39250023;285910476,52450694;295480747,65475580;295480747,68643909;285910476,68643909;228488851,68643909;162693512,78500466;86132438,91524933;28710813,104725604;0,107893933;0,104725604" o:connectangles="0,0,0,0,0,0,0,0,0,0,0,0,0,0,0,0,0,0,0,0"/>
@@ -1184,7 +1184,7 @@
         <mc:AlternateContent>
           <mc:Choice Requires="wps">
             <w:drawing>
-              <wp:anchor distT="0" distB="0" distL="114300" distR="114300" simplePos="0" relativeHeight="251646464" behindDoc="0" locked="0" layoutInCell="1" allowOverlap="1" wp14:anchorId="1110D25F" wp14:editId="2FBD5D54">
+              <wp:anchor distT="0" distB="0" distL="114300" distR="114300" simplePos="0" relativeHeight="251646464" behindDoc="0" locked="0" layoutInCell="1" allowOverlap="1" wp14:anchorId="66DADAC0" wp14:editId="7506F2A1">
                 <wp:simplePos x="0" y="0"/>
                 <wp:positionH relativeFrom="column">
                   <wp:posOffset>330200</wp:posOffset>
@@ -1387,7 +1387,7 @@
               </wp:anchor>
             </w:drawing>
           </mc:Choice>
-          <mc:Fallback xmlns:w16sdtfl="http://schemas.microsoft.com/office/word/2024/wordml/sdtformatlock" xmlns:w16du="http://schemas.microsoft.com/office/word/2023/wordml/word16du">
+          <mc:Fallback xmlns:w16du="http://schemas.microsoft.com/office/word/2023/wordml/word16du" xmlns:w16sdtfl="http://schemas.microsoft.com/office/word/2024/wordml/sdtformatlock">
             <w:pict>
               <v:shape w14:anchorId="4BD2B0F0" id="FreeForm 18" o:spid="_x0000_s1026" style="position:absolute;margin-left:26pt;margin-top:7.6pt;width:14.45pt;height:3.05pt;rotation:-90;z-index:251646464;visibility:visible;mso-wrap-style:square;mso-width-percent:0;mso-height-percent:0;mso-wrap-distance-left:9pt;mso-wrap-distance-top:0;mso-wrap-distance-right:9pt;mso-wrap-distance-bottom:0;mso-position-horizontal:absolute;mso-position-horizontal-relative:text;mso-position-vertical:absolute;mso-position-vertical-relative:text;mso-width-percent:0;mso-height-percent:0;mso-width-relative:page;mso-height-relative:page;v-text-anchor:top" coordsize="167,93" o:gfxdata="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" path="m8,19r32,l71,75,87,93,103,75,159,19,167,,151,,103,19r-16,l56,,16,,,19,,37,8,19xe" strokecolor="white" strokeweight="1.5pt">
                 <v:path arrowok="t" o:connecttype="custom" o:connectlocs="9660361,3296224;48302906,3296224;85736670,13010795;105058491,16133336;124379214,13010795;192002843,3296224;201663205,0;182342482,0;124379214,3296224;105058491,3296224;67623629,0;19320723,0;0,3296224;0,6418764;9660361,3296224" o:connectangles="0,0,0,0,0,0,0,0,0,0,0,0,0,0,0"/>
@@ -1407,7 +1407,7 @@
         <mc:AlternateContent>
           <mc:Choice Requires="wps">
             <w:drawing>
-              <wp:anchor distT="0" distB="0" distL="114300" distR="114300" simplePos="0" relativeHeight="251655680" behindDoc="0" locked="0" layoutInCell="1" allowOverlap="1" wp14:anchorId="4D63484C" wp14:editId="0EB22487">
+              <wp:anchor distT="0" distB="0" distL="114300" distR="114300" simplePos="0" relativeHeight="251655680" behindDoc="0" locked="0" layoutInCell="1" allowOverlap="1" wp14:anchorId="2697067F" wp14:editId="0AE1014B">
                 <wp:simplePos x="0" y="0"/>
                 <wp:positionH relativeFrom="column">
                   <wp:posOffset>5640705</wp:posOffset>
@@ -1613,7 +1613,7 @@
               </wp:anchor>
             </w:drawing>
           </mc:Choice>
-          <mc:Fallback xmlns:w16sdtfl="http://schemas.microsoft.com/office/word/2024/wordml/sdtformatlock" xmlns:w16du="http://schemas.microsoft.com/office/word/2023/wordml/word16du">
+          <mc:Fallback xmlns:w16du="http://schemas.microsoft.com/office/word/2023/wordml/word16du" xmlns:w16sdtfl="http://schemas.microsoft.com/office/word/2024/wordml/sdtformatlock">
             <w:pict>
               <v:shape w14:anchorId="5EC44B68" id="FreeForm 17" o:spid="_x0000_s1026" style="position:absolute;margin-left:444.15pt;margin-top:9.1pt;width:4.1pt;height:14.05pt;rotation:-90;z-index:251655680;visibility:visible;mso-wrap-style:square;mso-width-percent:0;mso-height-percent:0;mso-wrap-distance-left:9pt;mso-wrap-distance-top:0;mso-wrap-distance-right:9pt;mso-wrap-distance-bottom:0;mso-position-horizontal:absolute;mso-position-horizontal-relative:text;mso-position-vertical:absolute;mso-position-vertical-relative:text;mso-width-percent:0;mso-height-percent:0;mso-width-relative:page;mso-height-relative:page;v-text-anchor:top" coordsize="48,427" o:gfxdata="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" path="m16,409l,335,,297,8,260r8,-93l16,56,8,19,16,r8,19l40,112r8,111l40,335,24,427,16,409xe" strokecolor="white" strokeweight="1.5pt">
                 <v:path arrowok="t" o:connecttype="custom" o:connectlocs="18828729,71421221;0,58499100;0,51863574;9413822,45402305;18828729,29162213;18828729,9778823;9413822,3317972;18828729,0;18828729,0;28242551,3317972;47071280,19558064;56485102,38941036;47071280,58499100;28242551,74564518;28242551,74564518;18828729,71421221" o:connectangles="0,0,0,0,0,0,0,0,0,0,0,0,0,0,0,0"/>
@@ -1633,7 +1633,7 @@
         <mc:AlternateContent>
           <mc:Choice Requires="wps">
             <w:drawing>
-              <wp:anchor distT="0" distB="0" distL="114300" distR="114300" simplePos="0" relativeHeight="251652608" behindDoc="0" locked="0" layoutInCell="1" allowOverlap="1" wp14:anchorId="74D977E1" wp14:editId="63300DAE">
+              <wp:anchor distT="0" distB="0" distL="114300" distR="114300" simplePos="0" relativeHeight="251652608" behindDoc="0" locked="0" layoutInCell="1" allowOverlap="1" wp14:anchorId="74FB54D6" wp14:editId="68F29797">
                 <wp:simplePos x="0" y="0"/>
                 <wp:positionH relativeFrom="column">
                   <wp:posOffset>4932045</wp:posOffset>
@@ -1845,7 +1845,7 @@
               </wp:anchor>
             </w:drawing>
           </mc:Choice>
-          <mc:Fallback xmlns:w16sdtfl="http://schemas.microsoft.com/office/word/2024/wordml/sdtformatlock" xmlns:w16du="http://schemas.microsoft.com/office/word/2023/wordml/word16du">
+          <mc:Fallback xmlns:w16du="http://schemas.microsoft.com/office/word/2023/wordml/word16du" xmlns:w16sdtfl="http://schemas.microsoft.com/office/word/2024/wordml/sdtformatlock">
             <w:pict>
               <v:shape w14:anchorId="2784E679" id="FreeForm 16" o:spid="_x0000_s1026" style="position:absolute;margin-left:388.35pt;margin-top:13.35pt;width:17.95pt;height:6.75pt;rotation:-90;z-index:251652608;visibility:visible;mso-wrap-style:square;mso-width-percent:0;mso-height-percent:0;mso-wrap-distance-left:9pt;mso-wrap-distance-top:0;mso-wrap-distance-right:9pt;mso-wrap-distance-bottom:0;mso-position-horizontal:absolute;mso-position-horizontal-relative:text;mso-position-vertical:absolute;mso-position-vertical-relative:text;mso-width-percent:0;mso-height-percent:0;mso-width-relative:page;mso-height-relative:page;v-text-anchor:top" coordsize="208,204" o:gfxdata="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" path="m16,93l48,37,96,r48,l192,37r16,37l208,93r-8,l184,93r-72,18l72,130,40,186,24,204,8,186,,149,16,93xe" strokecolor="white" strokeweight="1.5pt">
                 <v:path arrowok="t" o:connecttype="custom" o:connectlocs="19219203,16422641;57656513,6533590;115314122,0;172970636,0;230627149,6533590;249846352,13067179;249846352,16422641;240236751,16422641;221017547,16422641;134532230,19600769;86485318,22956231;48046912,32844861;28828805,36023410;9609602,32844861;0,26311272;19219203,16422641" o:connectangles="0,0,0,0,0,0,0,0,0,0,0,0,0,0,0,0"/>
@@ -1865,7 +1865,7 @@
         <mc:AlternateContent>
           <mc:Choice Requires="wps">
             <w:drawing>
-              <wp:anchor distT="0" distB="0" distL="114300" distR="114300" simplePos="0" relativeHeight="251648512" behindDoc="0" locked="0" layoutInCell="1" allowOverlap="1" wp14:anchorId="55D8DEA2" wp14:editId="4589C6B8">
+              <wp:anchor distT="0" distB="0" distL="114300" distR="114300" simplePos="0" relativeHeight="251648512" behindDoc="0" locked="0" layoutInCell="1" allowOverlap="1" wp14:anchorId="3DAE73D1" wp14:editId="689DEB58">
                 <wp:simplePos x="0" y="0"/>
                 <wp:positionH relativeFrom="column">
                   <wp:posOffset>165100</wp:posOffset>
@@ -2071,7 +2071,7 @@
               </wp:anchor>
             </w:drawing>
           </mc:Choice>
-          <mc:Fallback xmlns:w16sdtfl="http://schemas.microsoft.com/office/word/2024/wordml/sdtformatlock" xmlns:w16du="http://schemas.microsoft.com/office/word/2023/wordml/word16du">
+          <mc:Fallback xmlns:w16du="http://schemas.microsoft.com/office/word/2023/wordml/word16du" xmlns:w16sdtfl="http://schemas.microsoft.com/office/word/2024/wordml/sdtformatlock">
             <w:pict>
               <v:shape w14:anchorId="2722CD0D" id="FreeForm 15" o:spid="_x0000_s1026" style="position:absolute;margin-left:13pt;margin-top:8.8pt;width:4.1pt;height:14.65pt;rotation:-90;z-index:251648512;visibility:visible;mso-wrap-style:square;mso-width-percent:0;mso-height-percent:0;mso-wrap-distance-left:9pt;mso-wrap-distance-top:0;mso-wrap-distance-right:9pt;mso-wrap-distance-bottom:0;mso-position-horizontal:absolute;mso-position-horizontal-relative:text;mso-position-vertical:absolute;mso-position-vertical-relative:text;mso-width-percent:0;mso-height-percent:0;mso-width-relative:page;mso-height-relative:page;v-text-anchor:top" coordsize="48,446" o:gfxdata="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" path="m16,19l,111r,38l8,186r8,74l16,390,8,427r8,19l24,427,40,334,48,223,40,111,24,,16,19xe" strokecolor="white" strokeweight="1.5pt">
                 <v:path arrowok="t" o:connecttype="custom" o:connectlocs="18828729,3306439;0,19316764;0,25929643;9413822,32368564;18828729,45246824;18828729,67870027;9413822,74308949;18828729,77615388;18828729,77615388;28242551,74308949;47071280,58124667;56485102,38807903;47071280,19316764;28242551,0;28242551,0;18828729,3306439" o:connectangles="0,0,0,0,0,0,0,0,0,0,0,0,0,0,0,0"/>
@@ -2091,7 +2091,7 @@
         <mc:AlternateContent>
           <mc:Choice Requires="wps">
             <w:drawing>
-              <wp:anchor distT="0" distB="0" distL="114300" distR="114300" simplePos="0" relativeHeight="251645440" behindDoc="0" locked="0" layoutInCell="1" allowOverlap="1" wp14:anchorId="7BE1DC44" wp14:editId="51995A02">
+              <wp:anchor distT="0" distB="0" distL="114300" distR="114300" simplePos="0" relativeHeight="251645440" behindDoc="0" locked="0" layoutInCell="1" allowOverlap="1" wp14:anchorId="0D5A87AF" wp14:editId="6513E996">
                 <wp:simplePos x="0" y="0"/>
                 <wp:positionH relativeFrom="column">
                   <wp:posOffset>697230</wp:posOffset>
@@ -2303,7 +2303,7 @@
               </wp:anchor>
             </w:drawing>
           </mc:Choice>
-          <mc:Fallback xmlns:w16sdtfl="http://schemas.microsoft.com/office/word/2024/wordml/sdtformatlock" xmlns:w16du="http://schemas.microsoft.com/office/word/2023/wordml/word16du">
+          <mc:Fallback xmlns:w16du="http://schemas.microsoft.com/office/word/2023/wordml/word16du" xmlns:w16sdtfl="http://schemas.microsoft.com/office/word/2024/wordml/sdtformatlock">
             <w:pict>
               <v:shape w14:anchorId="27C0B3DC" id="FreeForm 14" o:spid="_x0000_s1026" style="position:absolute;margin-left:54.9pt;margin-top:13.35pt;width:17.95pt;height:6.75pt;rotation:-90;z-index:251645440;visibility:visible;mso-wrap-style:square;mso-width-percent:0;mso-height-percent:0;mso-wrap-distance-left:9pt;mso-wrap-distance-top:0;mso-wrap-distance-right:9pt;mso-wrap-distance-bottom:0;mso-position-horizontal:absolute;mso-position-horizontal-relative:text;mso-position-vertical:absolute;mso-position-vertical-relative:text;mso-width-percent:0;mso-height-percent:0;mso-width-relative:page;mso-height-relative:page;v-text-anchor:top" coordsize="208,204" o:gfxdata="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" path="m16,130r32,56l96,204r48,l192,167r16,-18l208,130r-8,l184,130,112,112,72,74,40,19,24,,8,37,,74r16,56xe" strokecolor="white" strokeweight="1.5pt">
                 <v:path arrowok="t" o:connecttype="custom" o:connectlocs="19219203,22956231;57656513,32844861;115314122,36023410;172970636,36023410;230627149,29489820;249846352,26311272;249846352,22956231;240236751,22956231;221017547,22956231;134532230,19777682;86485318,13067179;48046912,3355041;28828805,0;9609602,6533590;0,13067179;19219203,22956231" o:connectangles="0,0,0,0,0,0,0,0,0,0,0,0,0,0,0,0"/>
@@ -2409,7 +2409,7 @@
           <w:sz w:val="16"/>
         </w:rPr>
         <w:drawing>
-          <wp:inline distT="0" distB="0" distL="0" distR="0" wp14:anchorId="22CC20BB" wp14:editId="031EDE6A">
+          <wp:inline distT="0" distB="0" distL="0" distR="0" wp14:anchorId="47F5155B" wp14:editId="2041132F">
             <wp:extent cx="2057400" cy="714375"/>
             <wp:effectExtent l="0" t="0" r="0" b="0"/>
             <wp:docPr id="1" name="Google Shape;19;p15"/>
@@ -2990,7 +2990,7 @@
         <mc:AlternateContent>
           <mc:Choice Requires="wps">
             <w:drawing>
-              <wp:anchor distT="0" distB="0" distL="114300" distR="114300" simplePos="0" relativeHeight="251663872" behindDoc="0" locked="0" layoutInCell="1" allowOverlap="1" wp14:anchorId="0C105B83" wp14:editId="52473A42">
+              <wp:anchor distT="0" distB="0" distL="114300" distR="114300" simplePos="0" relativeHeight="251663872" behindDoc="0" locked="0" layoutInCell="1" allowOverlap="1" wp14:anchorId="7B89C4B8" wp14:editId="6F4CAE18">
                 <wp:simplePos x="0" y="0"/>
                 <wp:positionH relativeFrom="column">
                   <wp:posOffset>5493385</wp:posOffset>
@@ -3202,7 +3202,7 @@
               </wp:anchor>
             </w:drawing>
           </mc:Choice>
-          <mc:Fallback xmlns:w16sdtfl="http://schemas.microsoft.com/office/word/2024/wordml/sdtformatlock" xmlns:w16du="http://schemas.microsoft.com/office/word/2023/wordml/word16du">
+          <mc:Fallback xmlns:w16du="http://schemas.microsoft.com/office/word/2023/wordml/word16du" xmlns:w16sdtfl="http://schemas.microsoft.com/office/word/2024/wordml/sdtformatlock">
             <w:pict>
               <v:shape w14:anchorId="1FCF3E9A" id="FreeForm 13" o:spid="_x0000_s1026" style="position:absolute;margin-left:432.55pt;margin-top:7.25pt;width:6.95pt;height:14.1pt;rotation:-90;z-index:251663872;visibility:visible;mso-wrap-style:square;mso-width-percent:0;mso-height-percent:0;mso-wrap-distance-left:9pt;mso-wrap-distance-top:0;mso-wrap-distance-right:9pt;mso-wrap-distance-bottom:0;mso-position-horizontal:absolute;mso-position-horizontal-relative:text;mso-position-vertical:absolute;mso-position-vertical-relative:text;mso-width-percent:0;mso-height-percent:0;mso-width-relative:page;mso-height-relative:page;v-text-anchor:top" coordsize="80,427" o:gfxdata="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" path="m8,l24,,56,55r16,56l80,204r-8,93l40,408,24,427r-8,l16,408r8,-37l32,297r,-56l16,148,,74,8,xe" strokecolor="white" strokeweight="1.5pt">
                 <v:path arrowok="t" o:connecttype="custom" o:connectlocs="9738939,0;29215715,0;68169266,9672716;87646042,19521566;97383878,35877325;87646042,52233083;48692491,71754649;29215715,75096171;19476776,75096171;19476776,71754649;29215715,65247321;38953551,52233083;38953551,42384653;19476776,26028475;0,13014237;9738939,0" o:connectangles="0,0,0,0,0,0,0,0,0,0,0,0,0,0,0,0"/>
@@ -3220,7 +3220,7 @@
         <mc:AlternateContent>
           <mc:Choice Requires="wps">
             <w:drawing>
-              <wp:anchor distT="0" distB="0" distL="114300" distR="114300" simplePos="0" relativeHeight="251656704" behindDoc="0" locked="0" layoutInCell="1" allowOverlap="1" wp14:anchorId="6A935F31" wp14:editId="1192E733">
+              <wp:anchor distT="0" distB="0" distL="114300" distR="114300" simplePos="0" relativeHeight="251656704" behindDoc="0" locked="0" layoutInCell="1" allowOverlap="1" wp14:anchorId="6BBFB43F" wp14:editId="3472B386">
                 <wp:simplePos x="0" y="0"/>
                 <wp:positionH relativeFrom="column">
                   <wp:posOffset>5026660</wp:posOffset>
@@ -3495,7 +3495,7 @@
               </wp:anchor>
             </w:drawing>
           </mc:Choice>
-          <mc:Fallback xmlns:w16sdtfl="http://schemas.microsoft.com/office/word/2024/wordml/sdtformatlock" xmlns:w16du="http://schemas.microsoft.com/office/word/2023/wordml/word16du">
+          <mc:Fallback xmlns:w16du="http://schemas.microsoft.com/office/word/2023/wordml/word16du" xmlns:w16sdtfl="http://schemas.microsoft.com/office/word/2024/wordml/sdtformatlock">
             <w:pict>
               <v:shape w14:anchorId="701594E3" id="FreeForm 12" o:spid="_x0000_s1026" style="position:absolute;margin-left:395.8pt;margin-top:12.85pt;width:23.35pt;height:20.8pt;rotation:-90;z-index:251656704;visibility:visible;mso-wrap-style:square;mso-width-percent:0;mso-height-percent:0;mso-wrap-distance-left:9pt;mso-wrap-distance-top:0;mso-wrap-distance-right:9pt;mso-wrap-distance-bottom:0;mso-position-horizontal:absolute;mso-position-horizontal-relative:text;mso-position-vertical:absolute;mso-position-vertical-relative:text;mso-width-percent:0;mso-height-percent:0;mso-width-relative:page;mso-height-relative:page;v-text-anchor:top" coordsize="271,631" o:gfxdata="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" path="m120,56l80,37r-32,l48,93,64,204,56,371,40,483,8,594,,631r8,l24,594,56,520,144,334,231,130,255,56,271,18,271,r-8,l223,18,183,37,144,74r-8,l120,56xe" strokecolor="white" strokeweight="1.5pt">
                 <v:path arrowok="t" o:connecttype="custom" o:connectlocs="143688637,9814528;95792789,6484688;57476111,6484688;57476111,16298798;76634450,35752444;67055281,65020200;47895847,84649256;9579169,104102484;0,110587172;9579169,110587172;28737508,104102484;67055281,91133525;172427239,58535930;276602075,22783486;305339584,9814528;324497923,3154430;324497923,0;314918753,0;267021811,3154430;219125964,6484688;172427239,12968958;162848070,12968958;143688637,9814528" o:connectangles="0,0,0,0,0,0,0,0,0,0,0,0,0,0,0,0,0,0,0,0,0,0,0"/>
@@ -3513,7 +3513,7 @@
         <mc:AlternateContent>
           <mc:Choice Requires="wps">
             <w:drawing>
-              <wp:anchor distT="0" distB="0" distL="114300" distR="114300" simplePos="0" relativeHeight="251651584" behindDoc="0" locked="0" layoutInCell="1" allowOverlap="1" wp14:anchorId="32B7DA41" wp14:editId="0A1BFC47">
+              <wp:anchor distT="0" distB="0" distL="114300" distR="114300" simplePos="0" relativeHeight="251651584" behindDoc="0" locked="0" layoutInCell="1" allowOverlap="1" wp14:anchorId="2F5DDF0B" wp14:editId="3F4267C9">
                 <wp:simplePos x="0" y="0"/>
                 <wp:positionH relativeFrom="column">
                   <wp:posOffset>277495</wp:posOffset>
@@ -3725,7 +3725,7 @@
               </wp:anchor>
             </w:drawing>
           </mc:Choice>
-          <mc:Fallback xmlns:w16sdtfl="http://schemas.microsoft.com/office/word/2024/wordml/sdtformatlock" xmlns:w16du="http://schemas.microsoft.com/office/word/2023/wordml/word16du">
+          <mc:Fallback xmlns:w16du="http://schemas.microsoft.com/office/word/2023/wordml/word16du" xmlns:w16sdtfl="http://schemas.microsoft.com/office/word/2024/wordml/sdtformatlock">
             <w:pict>
               <v:shape w14:anchorId="405E6262" id="FreeForm 11" o:spid="_x0000_s1026" style="position:absolute;margin-left:21.85pt;margin-top:7.25pt;width:6.95pt;height:14.1pt;rotation:-90;z-index:251651584;visibility:visible;mso-wrap-style:square;mso-width-percent:0;mso-height-percent:0;mso-wrap-distance-left:9pt;mso-wrap-distance-top:0;mso-wrap-distance-right:9pt;mso-wrap-distance-bottom:0;mso-position-horizontal:absolute;mso-position-horizontal-relative:text;mso-position-vertical:absolute;mso-position-vertical-relative:text;mso-width-percent:0;mso-height-percent:0;mso-width-relative:page;mso-height-relative:page;v-text-anchor:top" coordsize="80,427" o:gfxdata="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" path="m8,427r16,l56,390,72,315r8,-74l72,148,40,37,24,,16,r,18l24,74r8,56l32,185,16,297,,371r8,56xe" strokecolor="white" strokeweight="1.5pt">
                 <v:path arrowok="t" o:connecttype="custom" o:connectlocs="9738939,75096171;29215715,75096171;68169266,68588842;87646042,55398890;97383878,42384653;87646042,26028475;48692491,6507328;29215715,0;19476776,0;19476776,3165807;29215715,13014237;38953551,22863087;38953551,32535803;19476776,52233083;0,65247321;9738939,75096171" o:connectangles="0,0,0,0,0,0,0,0,0,0,0,0,0,0,0,0"/>
@@ -3844,7 +3844,7 @@
         <mc:AlternateContent>
           <mc:Choice Requires="wps">
             <w:drawing>
-              <wp:anchor distT="0" distB="0" distL="114300" distR="114300" simplePos="0" relativeHeight="251662848" behindDoc="0" locked="0" layoutInCell="1" allowOverlap="1" wp14:anchorId="523CC854" wp14:editId="344E50E5">
+              <wp:anchor distT="0" distB="0" distL="114300" distR="114300" simplePos="0" relativeHeight="251662848" behindDoc="0" locked="0" layoutInCell="1" allowOverlap="1" wp14:anchorId="71946C19" wp14:editId="6603F25E">
                 <wp:simplePos x="0" y="0"/>
                 <wp:positionH relativeFrom="column">
                   <wp:posOffset>5242560</wp:posOffset>
@@ -4056,7 +4056,7 @@
               </wp:anchor>
             </w:drawing>
           </mc:Choice>
-          <mc:Fallback xmlns:w16sdtfl="http://schemas.microsoft.com/office/word/2024/wordml/sdtformatlock" xmlns:w16du="http://schemas.microsoft.com/office/word/2023/wordml/word16du">
+          <mc:Fallback xmlns:w16du="http://schemas.microsoft.com/office/word/2023/wordml/word16du" xmlns:w16sdtfl="http://schemas.microsoft.com/office/word/2024/wordml/sdtformatlock">
             <w:pict>
               <v:shape w14:anchorId="41CF14AA" id="FreeForm 10" o:spid="_x0000_s1026" style="position:absolute;margin-left:412.8pt;margin-top:6.55pt;width:19.9pt;height:6.1pt;rotation:-90;z-index:251662848;visibility:visible;mso-wrap-style:square;mso-width-percent:0;mso-height-percent:0;mso-wrap-distance-left:9pt;mso-wrap-distance-top:0;mso-wrap-distance-right:9pt;mso-wrap-distance-bottom:0;mso-position-horizontal:absolute;mso-position-horizontal-relative:text;mso-position-vertical:absolute;mso-position-vertical-relative:text;mso-width-percent:0;mso-height-percent:0;mso-width-relative:page;mso-height-relative:page;v-text-anchor:top" coordsize="231,186" o:gfxdata="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" path="m,167l48,93,112,19,175,r24,l223,37r8,37l223,111r-8,19l207,111,160,74,104,93,48,130,8,186r-8,l,167xe" strokecolor="white" strokeweight="1.5pt">
                 <v:path arrowok="t" o:connecttype="custom" o:connectlocs="0,28970448;57455047,16133336;134062871,3296224;209472689,0;238200760,0;266927737,6418764;276504125,12837112;266927737,19255877;257352443,22552100;247776054,19255877;191517919,12837112;124486483,16133336;57455047,22552100;9576388,32266672;0,32266672;0,28970448" o:connectangles="0,0,0,0,0,0,0,0,0,0,0,0,0,0,0,0"/>
@@ -4076,7 +4076,7 @@
         <mc:AlternateContent>
           <mc:Choice Requires="wps">
             <w:drawing>
-              <wp:anchor distT="0" distB="0" distL="114300" distR="114300" simplePos="0" relativeHeight="251661824" behindDoc="0" locked="0" layoutInCell="1" allowOverlap="1" wp14:anchorId="00DE1AC2" wp14:editId="37F104B4">
+              <wp:anchor distT="0" distB="0" distL="114300" distR="114300" simplePos="0" relativeHeight="251661824" behindDoc="0" locked="0" layoutInCell="1" allowOverlap="1" wp14:anchorId="4075E095" wp14:editId="05358535">
                 <wp:simplePos x="0" y="0"/>
                 <wp:positionH relativeFrom="column">
                   <wp:posOffset>5646420</wp:posOffset>
@@ -4288,7 +4288,7 @@
               </wp:anchor>
             </w:drawing>
           </mc:Choice>
-          <mc:Fallback xmlns:w16sdtfl="http://schemas.microsoft.com/office/word/2024/wordml/sdtformatlock" xmlns:w16du="http://schemas.microsoft.com/office/word/2023/wordml/word16du">
+          <mc:Fallback xmlns:w16du="http://schemas.microsoft.com/office/word/2023/wordml/word16du" xmlns:w16sdtfl="http://schemas.microsoft.com/office/word/2024/wordml/sdtformatlock">
             <w:pict>
               <v:shape w14:anchorId="2DDF7FF9" id="FreeForm 9" o:spid="_x0000_s1026" style="position:absolute;margin-left:444.6pt;margin-top:8.55pt;width:3.45pt;height:14.05pt;rotation:-90;z-index:251661824;visibility:visible;mso-wrap-style:square;mso-width-percent:0;mso-height-percent:0;mso-wrap-distance-left:9pt;mso-wrap-distance-top:0;mso-wrap-distance-right:9pt;mso-wrap-distance-bottom:0;mso-position-horizontal:absolute;mso-position-horizontal-relative:text;mso-position-vertical:absolute;mso-position-vertical-relative:text;mso-width-percent:0;mso-height-percent:0;mso-width-relative:page;mso-height-relative:page;v-text-anchor:top" coordsize="40,427" o:gfxdata="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" path="m24,409l40,335r,-38l32,260,24,167,32,56r,-37l32,,24,,16,19,,112,,223,,335r16,92l24,427r,-18xe" strokecolor="white" strokeweight="1.5pt">
                 <v:path arrowok="t" o:connecttype="custom" o:connectlocs="28796313,71421221;47993856,58499100;47993856,51863574;38395085,45402305;28796313,29162213;38395085,9778823;38395085,3317972;38395085,0;28796313,0;19197542,3317972;0,19558064;0,38941036;0,58499100;19197542,74564518;28796313,74564518;28796313,71421221" o:connectangles="0,0,0,0,0,0,0,0,0,0,0,0,0,0,0,0"/>
@@ -4308,7 +4308,7 @@
         <mc:AlternateContent>
           <mc:Choice Requires="wps">
             <w:drawing>
-              <wp:anchor distT="0" distB="0" distL="114300" distR="114300" simplePos="0" relativeHeight="251660800" behindDoc="0" locked="0" layoutInCell="1" allowOverlap="1" wp14:anchorId="63B52897" wp14:editId="2398CCAE">
+              <wp:anchor distT="0" distB="0" distL="114300" distR="114300" simplePos="0" relativeHeight="251660800" behindDoc="0" locked="0" layoutInCell="1" allowOverlap="1" wp14:anchorId="7143E3E5" wp14:editId="548AB762">
                 <wp:simplePos x="0" y="0"/>
                 <wp:positionH relativeFrom="column">
                   <wp:posOffset>5443220</wp:posOffset>
@@ -4556,7 +4556,7 @@
               </wp:anchor>
             </w:drawing>
           </mc:Choice>
-          <mc:Fallback xmlns:w16sdtfl="http://schemas.microsoft.com/office/word/2024/wordml/sdtformatlock" xmlns:w16du="http://schemas.microsoft.com/office/word/2023/wordml/word16du">
+          <mc:Fallback xmlns:w16du="http://schemas.microsoft.com/office/word/2023/wordml/word16du" xmlns:w16sdtfl="http://schemas.microsoft.com/office/word/2024/wordml/sdtformatlock">
             <w:pict>
               <v:shape w14:anchorId="332B4940" id="FreeForm 8" o:spid="_x0000_s1026" style="position:absolute;margin-left:428.6pt;margin-top:16.75pt;width:22pt;height:20.2pt;rotation:-90;z-index:251660800;visibility:visible;mso-wrap-style:square;mso-width-percent:0;mso-height-percent:0;mso-wrap-distance-left:9pt;mso-wrap-distance-top:0;mso-wrap-distance-right:9pt;mso-wrap-distance-bottom:0;mso-position-horizontal:absolute;mso-position-horizontal-relative:text;mso-position-vertical:absolute;mso-position-vertical-relative:text;mso-width-percent:0;mso-height-percent:0;mso-width-relative:page;mso-height-relative:page;v-text-anchor:top" coordsize="255,613" o:gfxdata="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" path="m255,19r-8,37l215,130,135,316,48,502,16,576,,613,,594,,557,16,390r,-74l8,260r,-18l16,242,64,223r63,-56l191,93,231,19,255,r,19xe" strokecolor="white" strokeweight="1.5pt">
                 <v:path arrowok="t" o:connecttype="custom" o:connectlocs="306134745,3327487;296531055,9807947;258114103,22768448;162071722,55344843;57625428,87921238;19208476,100881739;0,107361781;0,104034294;0,97553834;19208476,68305344;19208476,55344843;9603690,45536896;9603690,42384342;19208476,42384342;76833904,39056436;152466936,29248489;229300841,16287988;277322579,3327487;306134745,0;306134745,3327487" o:connectangles="0,0,0,0,0,0,0,0,0,0,0,0,0,0,0,0,0,0,0,0"/>
@@ -4576,7 +4576,7 @@
         <mc:AlternateContent>
           <mc:Choice Requires="wps">
             <w:drawing>
-              <wp:anchor distT="0" distB="0" distL="114300" distR="114300" simplePos="0" relativeHeight="251659776" behindDoc="0" locked="0" layoutInCell="1" allowOverlap="1" wp14:anchorId="37E317D4" wp14:editId="23E5025F">
+              <wp:anchor distT="0" distB="0" distL="114300" distR="114300" simplePos="0" relativeHeight="251659776" behindDoc="0" locked="0" layoutInCell="1" allowOverlap="1" wp14:anchorId="68AA19B8" wp14:editId="60A98FFE">
                 <wp:simplePos x="0" y="0"/>
                 <wp:positionH relativeFrom="column">
                   <wp:posOffset>5351780</wp:posOffset>
@@ -4776,7 +4776,7 @@
               </wp:anchor>
             </w:drawing>
           </mc:Choice>
-          <mc:Fallback xmlns:w16sdtfl="http://schemas.microsoft.com/office/word/2024/wordml/sdtformatlock" xmlns:w16du="http://schemas.microsoft.com/office/word/2023/wordml/word16du">
+          <mc:Fallback xmlns:w16du="http://schemas.microsoft.com/office/word/2023/wordml/word16du" xmlns:w16sdtfl="http://schemas.microsoft.com/office/word/2024/wordml/sdtformatlock">
             <w:pict>
               <v:shape w14:anchorId="2BF9838A" id="FreeForm 7" o:spid="_x0000_s1026" style="position:absolute;margin-left:421.4pt;margin-top:29.8pt;width:14.35pt;height:3.05pt;rotation:-90;z-index:251659776;visibility:visible;mso-wrap-style:square;mso-width-percent:0;mso-height-percent:0;mso-wrap-distance-left:9pt;mso-wrap-distance-top:0;mso-wrap-distance-right:9pt;mso-wrap-distance-bottom:0;mso-position-horizontal:absolute;mso-position-horizontal-relative:text;mso-position-vertical:absolute;mso-position-vertical-relative:text;mso-width-percent:0;mso-height-percent:0;mso-width-relative:page;mso-height-relative:page;v-text-anchor:top" coordsize="167,93" o:gfxdata="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" path="m151,56r-32,l88,18,72,,56,,,74,8,93,64,56r16,l111,93,151,74r8,-18l167,56r-16,xe" strokecolor="white" strokeweight="1.5pt">
                 <v:path arrowok="t" o:connecttype="custom" o:connectlocs="179826707,9714571;141717859,9714571;104799605,3122541;85745727,0;66690757,0;0,12837112;0,12837112;9526939,16133336;76217696,9714571;95272666,9714571;132190920,16133336;179826707,12837112;189354738,9714571;198881677,9714571;179826707,9714571" o:connectangles="0,0,0,0,0,0,0,0,0,0,0,0,0,0,0"/>
@@ -4796,7 +4796,7 @@
         <mc:AlternateContent>
           <mc:Choice Requires="wps">
             <w:drawing>
-              <wp:anchor distT="0" distB="0" distL="114300" distR="114300" simplePos="0" relativeHeight="251658752" behindDoc="0" locked="0" layoutInCell="1" allowOverlap="1" wp14:anchorId="1E15DF55" wp14:editId="0738AA2C">
+              <wp:anchor distT="0" distB="0" distL="114300" distR="114300" simplePos="0" relativeHeight="251658752" behindDoc="0" locked="0" layoutInCell="1" allowOverlap="1" wp14:anchorId="6405EF8B" wp14:editId="52C39364">
                 <wp:simplePos x="0" y="0"/>
                 <wp:positionH relativeFrom="column">
                   <wp:posOffset>4932680</wp:posOffset>
@@ -5008,7 +5008,7 @@
               </wp:anchor>
             </w:drawing>
           </mc:Choice>
-          <mc:Fallback xmlns:w16sdtfl="http://schemas.microsoft.com/office/word/2024/wordml/sdtformatlock" xmlns:w16du="http://schemas.microsoft.com/office/word/2023/wordml/word16du">
+          <mc:Fallback xmlns:w16du="http://schemas.microsoft.com/office/word/2023/wordml/word16du" xmlns:w16sdtfl="http://schemas.microsoft.com/office/word/2024/wordml/sdtformatlock">
             <w:pict>
               <v:shape w14:anchorId="40CEFC85" id="FreeForm 6" o:spid="_x0000_s1026" style="position:absolute;margin-left:388.4pt;margin-top:11.85pt;width:17.95pt;height:6.75pt;rotation:-90;z-index:251658752;visibility:visible;mso-wrap-style:square;mso-width-percent:0;mso-height-percent:0;mso-wrap-distance-left:9pt;mso-wrap-distance-top:0;mso-wrap-distance-right:9pt;mso-wrap-distance-bottom:0;mso-position-horizontal:absolute;mso-position-horizontal-relative:text;mso-position-vertical:absolute;mso-position-vertical-relative:text;mso-width-percent:0;mso-height-percent:0;mso-width-relative:page;mso-height-relative:page;v-text-anchor:top" coordsize="208,204" o:gfxdata="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" path="m200,93l160,37,112,,64,,16,37,,74,,93r8,l32,93r72,18l136,130r32,56l184,204r16,-18l208,149,200,93xe" strokecolor="white" strokeweight="1.5pt">
                 <v:path arrowok="t" o:connecttype="custom" o:connectlocs="240236751,16422641;192189839,6533590;134532230,0;76875716,0;19219203,6533590;0,13067179;0,16422641;9609602,16422641;38438406,16422641;124923724,19600769;163361034,22956231;201799440,32844861;221017547,36023410;240236751,32844861;249846352,26311272;240236751,16422641" o:connectangles="0,0,0,0,0,0,0,0,0,0,0,0,0,0,0,0"/>
@@ -5028,7 +5028,7 @@
         <mc:AlternateContent>
           <mc:Choice Requires="wps">
             <w:drawing>
-              <wp:anchor distT="0" distB="0" distL="114300" distR="114300" simplePos="0" relativeHeight="251657728" behindDoc="0" locked="0" layoutInCell="1" allowOverlap="1" wp14:anchorId="48258603" wp14:editId="4F263128">
+              <wp:anchor distT="0" distB="0" distL="114300" distR="114300" simplePos="0" relativeHeight="251657728" behindDoc="0" locked="0" layoutInCell="1" allowOverlap="1" wp14:anchorId="33FA52BF" wp14:editId="2545470D">
                 <wp:simplePos x="0" y="0"/>
                 <wp:positionH relativeFrom="column">
                   <wp:posOffset>5198110</wp:posOffset>
@@ -5231,7 +5231,7 @@
               </wp:anchor>
             </w:drawing>
           </mc:Choice>
-          <mc:Fallback xmlns:w16sdtfl="http://schemas.microsoft.com/office/word/2024/wordml/sdtformatlock" xmlns:w16du="http://schemas.microsoft.com/office/word/2023/wordml/word16du">
+          <mc:Fallback xmlns:w16du="http://schemas.microsoft.com/office/word/2023/wordml/word16du" xmlns:w16sdtfl="http://schemas.microsoft.com/office/word/2024/wordml/sdtformatlock">
             <w:pict>
               <v:shape w14:anchorId="0498CD70" id="FreeForm 5" o:spid="_x0000_s1026" style="position:absolute;margin-left:409.3pt;margin-top:2.1pt;width:6.2pt;height:15.9pt;rotation:-90;z-index:251657728;visibility:visible;mso-wrap-style:square;mso-width-percent:0;mso-height-percent:0;mso-wrap-distance-left:9pt;mso-wrap-distance-top:0;mso-wrap-distance-right:9pt;mso-wrap-distance-bottom:0;mso-position-horizontal:absolute;mso-position-horizontal-relative:text;mso-position-vertical:absolute;mso-position-vertical-relative:text;mso-width-percent:0;mso-height-percent:0;mso-width-relative:page;mso-height-relative:page;v-text-anchor:top" coordsize="72,483" o:gfxdata="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" path="m16,483l56,353,72,223,72,93,48,,32,,8,18,,55,,93r24,92l40,297r-8,93l8,464r,19l16,483xe" strokecolor="white" strokeweight="1.5pt">
                 <v:path arrowok="t" o:connecttype="custom" o:connectlocs="19136007,84421791;66974932,61699440;86110939,38977507;86110939,16255156;57406928,0;38272014,0;9568004,3146011;0,9613206;0,16255156;28704011,32335557;47838924,51911479;38272014,68166635;9568004,81101025;9568004,84421791;19136007,84421791" o:connectangles="0,0,0,0,0,0,0,0,0,0,0,0,0,0,0"/>
@@ -5251,7 +5251,7 @@
         <mc:AlternateContent>
           <mc:Choice Requires="wps">
             <w:drawing>
-              <wp:anchor distT="0" distB="0" distL="114300" distR="114300" simplePos="0" relativeHeight="251650560" behindDoc="0" locked="0" layoutInCell="1" allowOverlap="1" wp14:anchorId="6292FB87" wp14:editId="47E07CAE">
+              <wp:anchor distT="0" distB="0" distL="114300" distR="114300" simplePos="0" relativeHeight="251650560" behindDoc="0" locked="0" layoutInCell="1" allowOverlap="1" wp14:anchorId="6DC37325" wp14:editId="7E253FD5">
                 <wp:simplePos x="0" y="0"/>
                 <wp:positionH relativeFrom="column">
                   <wp:posOffset>170815</wp:posOffset>
@@ -5463,7 +5463,7 @@
               </wp:anchor>
             </w:drawing>
           </mc:Choice>
-          <mc:Fallback xmlns:w16sdtfl="http://schemas.microsoft.com/office/word/2024/wordml/sdtformatlock" xmlns:w16du="http://schemas.microsoft.com/office/word/2023/wordml/word16du">
+          <mc:Fallback xmlns:w16du="http://schemas.microsoft.com/office/word/2023/wordml/word16du" xmlns:w16sdtfl="http://schemas.microsoft.com/office/word/2024/wordml/sdtformatlock">
             <w:pict>
               <v:shape w14:anchorId="4C649850" id="FreeForm 4" o:spid="_x0000_s1026" style="position:absolute;margin-left:13.45pt;margin-top:8.25pt;width:3.45pt;height:14.65pt;rotation:-90;z-index:251650560;visibility:visible;mso-wrap-style:square;mso-width-percent:0;mso-height-percent:0;mso-wrap-distance-left:9pt;mso-wrap-distance-top:0;mso-wrap-distance-right:9pt;mso-wrap-distance-bottom:0;mso-position-horizontal:absolute;mso-position-horizontal-relative:text;mso-position-vertical:absolute;mso-position-vertical-relative:text;mso-width-percent:0;mso-height-percent:0;mso-width-relative:page;mso-height-relative:page;v-text-anchor:top" coordsize="40,446" o:gfxdata="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" path="m24,19r16,92l40,149r-8,37l24,260r8,130l32,427r,19l24,446,16,427,,334,,223,,111,16,r8,l24,19xe" strokecolor="white" strokeweight="1.5pt">
                 <v:path arrowok="t" o:connecttype="custom" o:connectlocs="28796313,3306439;47993856,19316764;47993856,25929643;38395085,32368564;28796313,45246824;38395085,67870027;38395085,74308949;38395085,77615388;28796313,77615388;19197542,74308949;0,58124667;0,38807903;0,19316764;19197542,0;28796313,0;28796313,3306439" o:connectangles="0,0,0,0,0,0,0,0,0,0,0,0,0,0,0,0"/>
@@ -5483,7 +5483,7 @@
         <mc:AlternateContent>
           <mc:Choice Requires="wps">
             <w:drawing>
-              <wp:anchor distT="0" distB="0" distL="114300" distR="114300" simplePos="0" relativeHeight="251649536" behindDoc="0" locked="0" layoutInCell="1" allowOverlap="1" wp14:anchorId="3BC84D19" wp14:editId="4EFC80A8">
+              <wp:anchor distT="0" distB="0" distL="114300" distR="114300" simplePos="0" relativeHeight="251649536" behindDoc="0" locked="0" layoutInCell="1" allowOverlap="1" wp14:anchorId="760ED612" wp14:editId="32376EF2">
                 <wp:simplePos x="0" y="0"/>
                 <wp:positionH relativeFrom="column">
                   <wp:posOffset>330835</wp:posOffset>
@@ -5686,7 +5686,7 @@
               </wp:anchor>
             </w:drawing>
           </mc:Choice>
-          <mc:Fallback xmlns:w16sdtfl="http://schemas.microsoft.com/office/word/2024/wordml/sdtformatlock" xmlns:w16du="http://schemas.microsoft.com/office/word/2023/wordml/word16du">
+          <mc:Fallback xmlns:w16du="http://schemas.microsoft.com/office/word/2023/wordml/word16du" xmlns:w16sdtfl="http://schemas.microsoft.com/office/word/2024/wordml/sdtformatlock">
             <w:pict>
               <v:shape w14:anchorId="238A198E" id="FreeForm 3" o:spid="_x0000_s1026" style="position:absolute;margin-left:26.05pt;margin-top:29.8pt;width:14.35pt;height:3.05pt;rotation:-90;z-index:251649536;visibility:visible;mso-wrap-style:square;mso-width-percent:0;mso-height-percent:0;mso-wrap-distance-left:9pt;mso-wrap-distance-top:0;mso-wrap-distance-right:9pt;mso-wrap-distance-bottom:0;mso-position-horizontal:absolute;mso-position-horizontal-relative:text;mso-position-vertical:absolute;mso-position-vertical-relative:text;mso-width-percent:0;mso-height-percent:0;mso-width-relative:page;mso-height-relative:page;v-text-anchor:top" coordsize="167,93" o:gfxdata="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" path="m151,19r-32,l88,75,72,93,56,75,,19,,,8,,64,19r16,l111,r40,l159,19r8,18l151,19xe" strokecolor="white" strokeweight="1.5pt">
                 <v:path arrowok="t" o:connecttype="custom" o:connectlocs="179826707,3296224;141717859,3296224;104799605,13010795;85745727,16133336;66690757,13010795;0,3296224;0,0;9526939,0;76217696,3296224;95272666,3296224;132190920,0;179826707,0;189354738,3296224;198881677,6418764;179826707,3296224" o:connectangles="0,0,0,0,0,0,0,0,0,0,0,0,0,0,0"/>
@@ -5728,6 +5728,12 @@
     </w:p>
     <w:sdt>
       <w:sdtPr>
+        <w:rPr>
+          <w:rFonts w:ascii="Times New Roman" w:eastAsia="SimSun" w:hAnsi="Times New Roman" w:cs="Times New Roman"/>
+          <w:color w:val="auto"/>
+          <w:sz w:val="28"/>
+          <w:szCs w:val="24"/>
+        </w:rPr>
         <w:id w:val="1092441269"/>
         <w:docPartObj>
           <w:docPartGallery w:val="Table of Contents"/>
@@ -5736,13 +5742,9 @@
       </w:sdtPr>
       <w:sdtEndPr>
         <w:rPr>
-          <w:rFonts w:ascii="Times New Roman" w:eastAsia="SimSun" w:hAnsi="Times New Roman" w:cs="Times New Roman"/>
           <w:b/>
           <w:bCs/>
           <w:noProof/>
-          <w:color w:val="auto"/>
-          <w:sz w:val="28"/>
-          <w:szCs w:val="24"/>
         </w:rPr>
       </w:sdtEndPr>
       <w:sdtContent>
@@ -5912,21 +5914,7 @@
                 <w:rStyle w:val="Hyperlink"/>
                 <w:noProof/>
               </w:rPr>
-              <w:t>Chương 1. Phâ</w:t>
-            </w:r>
-            <w:r>
-              <w:rPr>
-                <w:rStyle w:val="Hyperlink"/>
-                <w:noProof/>
-              </w:rPr>
-              <w:t>n</w:t>
-            </w:r>
-            <w:r>
-              <w:rPr>
-                <w:rStyle w:val="Hyperlink"/>
-                <w:noProof/>
-              </w:rPr>
-              <w:t xml:space="preserve"> tích ý tưởng và bài toán nghiên cứu</w:t>
+              <w:t>Chương 1. Phân tích ý tưởng và bài toán nghiên cứu</w:t>
             </w:r>
             <w:r>
               <w:rPr>
@@ -7151,14 +7139,125 @@
     <w:p>
       <w:pPr>
         <w:spacing w:after="120" w:line="276" w:lineRule="auto"/>
-        <w:jc w:val="both"/>
+      </w:pPr>
+      <w:r>
+        <w:rPr>
+          <w:sz w:val="26"/>
+        </w:rPr>
+        <w:t>Chương này trình bày nền tảng ban đầu của dự án: bối cảnh nghiệp vụ, lý do lựa chọn bộ dữ liệu Home Credit, mục tiêu nghiên cứu, phạm vi dữ liệu và công nghệ sử dụng. Nội dung được tổng hợp từ giai đoạn Business Understanding và Data Understanding để làm cơ sở cho các bước tiền xử lý, khai phá dữ liệu và xây dựng mô hình.</w:t>
+      </w:r>
+    </w:p>
+    <w:p>
+      <w:pPr>
+        <w:pStyle w:val="Heading2"/>
+        <w:spacing w:before="160" w:after="80"/>
+      </w:pPr>
+      <w:r>
+        <w:rPr>
+          <w:sz w:val="28"/>
+        </w:rPr>
+        <w:t>1.1. Bối cảnh dự án</w:t>
+      </w:r>
+    </w:p>
+    <w:p>
+      <w:pPr>
+        <w:spacing w:after="120" w:line="276" w:lineRule="auto"/>
+      </w:pPr>
+      <w:r>
+        <w:rPr>
+          <w:sz w:val="26"/>
+        </w:rPr>
+        <w:t>Trong lĩnh vực tài chính tiêu dùng, quyết định cho vay cần cân bằng giữa hai mục tiêu: mở rộng khả năng tiếp cận vốn cho khách hàng và kiểm soát rủi ro không trả được nợ. Với số lượng hồ sơ lớn, nhiều nguồn thông tin khác nhau và thời gian xử lý hạn chế, việc đánh giá thủ công dễ thiếu nhất quán và khó mở rộng.</w:t>
+      </w:r>
+    </w:p>
+    <w:p>
+      <w:pPr>
+        <w:spacing w:after="120" w:line="276" w:lineRule="auto"/>
+      </w:pPr>
+      <w:r>
+        <w:rPr>
+          <w:sz w:val="26"/>
+        </w:rPr>
+        <w:t>Dự án lựa chọn bài toán dự báo rủi ro tín dụng của khách hàng vay vốn. Đây là bài toán có ý nghĩa thực tế cao vì kết quả dự báo có thể hỗ trợ tổ chức tài chính phân loại hồ sơ, ưu tiên kiểm tra các trường hợp rủi ro và đưa ra quyết định dựa trên dữ liệu thay vì chỉ dựa vào kinh nghiệm.</w:t>
+      </w:r>
+    </w:p>
+    <w:p>
+      <w:pPr>
+        <w:pStyle w:val="Heading2"/>
+        <w:spacing w:before="160" w:after="80"/>
+      </w:pPr>
+      <w:r>
+        <w:rPr>
+          <w:sz w:val="28"/>
+        </w:rPr>
+        <w:t>1.2. Lý do lựa chọn bộ dữ liệu Home Credit</w:t>
+      </w:r>
+    </w:p>
+    <w:p>
+      <w:pPr>
+        <w:spacing w:after="120" w:line="276" w:lineRule="auto"/>
+      </w:pPr>
+      <w:r>
+        <w:rPr>
+          <w:sz w:val="26"/>
+        </w:rPr>
+        <w:t>Bộ dữ liệu Home Credit Default Risk phù hợp với mục tiêu của môn Dự án 1 vì vừa có bài toán nghiệp vụ rõ ràng, vừa có cấu trúc dữ liệu đủ phức tạp để thực hành quy trình AI từ đầu đến cuối.</w:t>
+      </w:r>
+    </w:p>
+    <w:p>
+      <w:pPr>
+        <w:pStyle w:val="ListParagraph"/>
+        <w:spacing w:after="60"/>
+        <w:ind w:left="480" w:hanging="240"/>
       </w:pPr>
       <w:r>
         <w:rPr>
           <w:rFonts w:ascii="Times New Roman" w:hAnsi="Times New Roman"/>
           <w:sz w:val="26"/>
         </w:rPr>
-        <w:t>Chương này trình bày nền tảng ban đầu của dự án: bối cảnh nghiệp vụ, lý do lựa chọn bộ dữ liệu Home Credit, mục tiêu nghiên cứu, phạm vi dữ liệu và công nghệ sử dụng. Nội dung được tổng hợp từ giai đoạn Business Understanding và Data Understanding để làm cơ sở cho các bước tiền xử lý, khai phá dữ liệu và xây dựng mô hình.</w:t>
+        <w:t>• Bài toán có biến mục tiêu rõ ràng: cột TARGET cho biết khách hàng có gặp khó khăn trong việc thanh toán hay không, phù hợp với bài toán phân loại nhị phân.</w:t>
+      </w:r>
+    </w:p>
+    <w:p>
+      <w:pPr>
+        <w:pStyle w:val="ListParagraph"/>
+        <w:spacing w:after="60"/>
+        <w:ind w:left="480" w:hanging="240"/>
+      </w:pPr>
+      <w:r>
+        <w:rPr>
+          <w:rFonts w:ascii="Times New Roman" w:hAnsi="Times New Roman"/>
+          <w:sz w:val="26"/>
+        </w:rPr>
+        <w:t>• Dữ liệu có nhiều nhóm thông tin: hồ sơ hiện tại, lịch sử tín dụng, giao dịch POS, thẻ tín dụng, khoản vay trước đó và lịch thanh toán.</w:t>
+      </w:r>
+    </w:p>
+    <w:p>
+      <w:pPr>
+        <w:pStyle w:val="ListParagraph"/>
+        <w:spacing w:after="60"/>
+        <w:ind w:left="480" w:hanging="240"/>
+      </w:pPr>
+      <w:r>
+        <w:rPr>
+          <w:rFonts w:ascii="Times New Roman" w:hAnsi="Times New Roman"/>
+          <w:sz w:val="26"/>
+        </w:rPr>
+        <w:t>• Dữ liệu có tính thực tế: tồn tại missing value, outlier, giá trị đặc biệt và quan hệ một-nhiều giữa các bảng, giúp nhóm rèn luyện kỹ năng xử lý dữ liệu thật.</w:t>
+      </w:r>
+    </w:p>
+    <w:p>
+      <w:pPr>
+        <w:pStyle w:val="ListParagraph"/>
+        <w:spacing w:after="60"/>
+        <w:ind w:left="480" w:hanging="240"/>
+      </w:pPr>
+      <w:r>
+        <w:rPr>
+          <w:rFonts w:ascii="Times New Roman" w:hAnsi="Times New Roman"/>
+          <w:sz w:val="26"/>
+        </w:rPr>
+        <w:t>• Dữ liệu hỗ trợ nhiều giai đoạn của dự án: khám phá dữ liệu, tiền xử lý, feature engineering, huấn luyện mô hình, đánh giá và triển khai ứng dụng minh họa.</w:t>
       </w:r>
     </w:p>
     <w:p>
@@ -7168,37 +7267,111 @@
       </w:pPr>
       <w:r>
         <w:rPr>
-          <w:rFonts w:ascii="Times New Roman" w:hAnsi="Times New Roman"/>
-          <w:b/>
           <w:sz w:val="28"/>
         </w:rPr>
-        <w:t>1.1. Bối cảnh dự án</w:t>
+        <w:t>1.3. Tầm quan trọng của việc giải quyết bài toán trong ngành AI</w:t>
       </w:r>
     </w:p>
     <w:p>
       <w:pPr>
         <w:spacing w:after="120" w:line="276" w:lineRule="auto"/>
-        <w:jc w:val="both"/>
+      </w:pPr>
+      <w:r>
+        <w:rPr>
+          <w:sz w:val="26"/>
+        </w:rPr>
+        <w:t>AI có thể giúp chuẩn hóa quá trình đánh giá rủi ro tín dụng bằng cách học từ dữ liệu lịch sử và phát hiện các mẫu quan hệ khó quan sát bằng cách thủ công. Trong bối cảnh tài chính, mô hình dự báo không chỉ tạo ra nhãn dự đoán mà còn hỗ trợ phân nhóm rủi ro, tối ưu ngưỡng ra quyết định và giải thích các yếu tố liên quan đến khả năng vỡ nợ.</w:t>
+      </w:r>
+    </w:p>
+    <w:p>
+      <w:pPr>
+        <w:spacing w:after="120" w:line="276" w:lineRule="auto"/>
+      </w:pPr>
+      <w:r>
+        <w:rPr>
+          <w:sz w:val="26"/>
+        </w:rPr>
+        <w:t>Tuy nhiên, đây cũng là bài toán nhạy cảm vì kết quả mô hình có thể ảnh hưởng trực tiếp đến cơ hội tiếp cận vốn của khách hàng. Vì vậy, dự án cần chú trọng chất lượng dữ liệu, tránh rò rỉ dữ liệu, đánh giá bằng chỉ số phù hợp với dữ liệu mất cân bằng và diễn giải kết quả một cách thận trọng.</w:t>
+      </w:r>
+    </w:p>
+    <w:p>
+      <w:pPr>
+        <w:pStyle w:val="Heading2"/>
+        <w:spacing w:before="160" w:after="80"/>
+      </w:pPr>
+      <w:r>
+        <w:rPr>
+          <w:sz w:val="28"/>
+        </w:rPr>
+        <w:lastRenderedPageBreak/>
+        <w:t>1.4. Phân tích mô hình SWOT</w:t>
+      </w:r>
+    </w:p>
+    <w:p>
+      <w:pPr>
+        <w:spacing w:after="120" w:line="276" w:lineRule="auto"/>
+      </w:pPr>
+      <w:r>
+        <w:rPr>
+          <w:sz w:val="26"/>
+        </w:rPr>
+        <w:t>Phân tích SWOT giúp nhóm nhìn rõ thuận lợi, hạn chế và rủi ro khi triển khai dự án trên bộ dữ liệu Home Credit.</w:t>
+      </w:r>
+    </w:p>
+    <w:p>
+      <w:pPr>
+        <w:pStyle w:val="ListParagraph"/>
+        <w:spacing w:after="60"/>
+        <w:ind w:left="480" w:hanging="240"/>
       </w:pPr>
       <w:r>
         <w:rPr>
           <w:rFonts w:ascii="Times New Roman" w:hAnsi="Times New Roman"/>
           <w:sz w:val="26"/>
         </w:rPr>
-        <w:t>Trong lĩnh vực tài chính tiêu dùng, quyết định cho vay cần cân bằng giữa hai mục tiêu: mở rộng khả năng tiếp cận vốn cho khách hàng và kiểm soát rủi ro không trả được nợ. Với số lượng hồ sơ lớn, nhiều nguồn thông tin khác nhau và thời gian xử lý hạn chế, việc đánh giá thủ công dễ thiếu nhất quán và khó mở rộng.</w:t>
-      </w:r>
-    </w:p>
-    <w:p>
-      <w:pPr>
-        <w:spacing w:after="120" w:line="276" w:lineRule="auto"/>
-        <w:jc w:val="both"/>
+        <w:t>• Điểm mạnh: bộ dữ liệu lớn, nhiều bảng và nhiều biến mô tả khách hàng, khoản vay, lịch sử tín dụng và hành vi thanh toán; biến mục tiêu rõ ràng, phù hợp để xây dựng mô hình phân loại.</w:t>
+      </w:r>
+    </w:p>
+    <w:p>
+      <w:pPr>
+        <w:pStyle w:val="ListParagraph"/>
+        <w:spacing w:after="60"/>
+        <w:ind w:left="480" w:hanging="240"/>
       </w:pPr>
       <w:r>
         <w:rPr>
           <w:rFonts w:ascii="Times New Roman" w:hAnsi="Times New Roman"/>
           <w:sz w:val="26"/>
         </w:rPr>
-        <w:t>Dự án lựa chọn bài toán dự báo rủi ro tín dụng của khách hàng vay vốn. Đây là bài toán có ý nghĩa thực tế cao vì kết quả dự báo có thể hỗ trợ tổ chức tài chính phân loại hồ sơ, ưu tiên kiểm tra các trường hợp rủi ro và đưa ra quyết định dựa trên dữ liệu thay vì chỉ dựa vào kinh nghiệm.</w:t>
+        <w:t>• Điểm yếu: dữ liệu có nhiều giá trị thiếu, biến lệch phân phối, outlier và mã đặc biệt như DAYS_EMPLOYED = 365243 hoặc CODE_GENDER = XNA; một số bảng phụ có quan hệ một-nhiều nên cần tổng hợp cẩn thận trước khi nối.</w:t>
+      </w:r>
+    </w:p>
+    <w:p>
+      <w:pPr>
+        <w:pStyle w:val="ListParagraph"/>
+        <w:spacing w:after="60"/>
+        <w:ind w:left="480" w:hanging="240"/>
+      </w:pPr>
+      <w:r>
+        <w:rPr>
+          <w:rFonts w:ascii="Times New Roman" w:hAnsi="Times New Roman"/>
+          <w:sz w:val="26"/>
+        </w:rPr>
+        <w:t>• Cơ hội: mô hình có thể hỗ trợ nhận diện nhóm khách hàng rủi ro cao, tìm hiểu các yếu tố liên quan đến rủi ro tín dụng và xây dựng ứng dụng minh họa để người dùng nhập thông tin và nhận dự báo.</w:t>
+      </w:r>
+    </w:p>
+    <w:p>
+      <w:pPr>
+        <w:pStyle w:val="ListParagraph"/>
+        <w:spacing w:after="60"/>
+        <w:ind w:left="480" w:hanging="240"/>
+      </w:pPr>
+      <w:r>
+        <w:rPr>
+          <w:rFonts w:ascii="Times New Roman" w:hAnsi="Times New Roman"/>
+          <w:sz w:val="26"/>
+        </w:rPr>
+        <w:t>• Thách thức: cần tránh join sai làm tăng số dòng, tránh data leakage, xử lý mất cân bằng lớp và đảm bảo mô hình có khả năng giải thích thay vì chỉ tối ưu điểm số.</w:t>
       </w:r>
     </w:p>
     <w:p>
@@ -7208,30 +7381,51 @@
       </w:pPr>
       <w:r>
         <w:rPr>
-          <w:rFonts w:ascii="Times New Roman" w:hAnsi="Times New Roman"/>
-          <w:b/>
           <w:sz w:val="28"/>
         </w:rPr>
-        <w:t>1.2. Lý do lựa chọn bộ dữ liệu Home Credit</w:t>
+        <w:t>1.5. Mục tiêu nghiên cứu</w:t>
       </w:r>
     </w:p>
     <w:p>
       <w:pPr>
         <w:spacing w:after="120" w:line="276" w:lineRule="auto"/>
-        <w:jc w:val="both"/>
+      </w:pPr>
+      <w:r>
+        <w:rPr>
+          <w:sz w:val="26"/>
+        </w:rPr>
+        <w:t>Mục tiêu tổng quát của dự án là xây dựng một pipeline AI có khả năng dự báo rủi ro khách hàng vay vốn dựa trên dữ liệu Home Credit, đồng thời trình bày rõ quy trình xử lý dữ liệu, lựa chọn biến, huấn luyện mô hình và đánh giá kết quả.</w:t>
+      </w:r>
+    </w:p>
+    <w:p>
+      <w:pPr>
+        <w:spacing w:after="120" w:line="276" w:lineRule="auto"/>
+      </w:pPr>
+      <w:r>
+        <w:rPr>
+          <w:sz w:val="26"/>
+        </w:rPr>
+        <w:t>Các câu hỏi nghiên cứu chính gồm:</w:t>
+      </w:r>
+    </w:p>
+    <w:p>
+      <w:pPr>
+        <w:pStyle w:val="ListParagraph"/>
+        <w:spacing w:after="60"/>
+        <w:ind w:left="480" w:hanging="240"/>
       </w:pPr>
       <w:r>
         <w:rPr>
           <w:rFonts w:ascii="Times New Roman" w:hAnsi="Times New Roman"/>
           <w:sz w:val="26"/>
         </w:rPr>
-        <w:t>Bộ dữ liệu Home Credit Default Risk phù hợp với mục tiêu của môn Dự án 1 vì vừa có bài toán nghiệp vụ rõ ràng, vừa có cấu trúc dữ liệu đủ phức tạp để thực hành quy trình AI từ đầu đến cuối.</w:t>
+        <w:t>• Những nhóm thông tin nào trong hồ sơ khách hàng có khả năng liên quan đến rủi ro tín dụng?</w:t>
       </w:r>
     </w:p>
     <w:p>
       <w:pPr>
         <w:pStyle w:val="ListParagraph"/>
-        <w:spacing w:after="60" w:line="276" w:lineRule="auto"/>
+        <w:spacing w:after="60"/>
         <w:ind w:left="480" w:hanging="240"/>
       </w:pPr>
       <w:r>
@@ -7239,13 +7433,13 @@
           <w:rFonts w:ascii="Times New Roman" w:hAnsi="Times New Roman"/>
           <w:sz w:val="26"/>
         </w:rPr>
-        <w:t>• Bài toán có biến mục tiêu rõ ràng: cột TARGET cho biết khách hàng có gặp khó khăn trong việc thanh toán hay không, phù hợp với bài toán phân loại nhị phân.</w:t>
+        <w:t>• Các biến tài chính, nhân khẩu học, lịch sử tín dụng và điểm EXT_SOURCE có mối quan hệ như thế nào với TARGET?</w:t>
       </w:r>
     </w:p>
     <w:p>
       <w:pPr>
         <w:pStyle w:val="ListParagraph"/>
-        <w:spacing w:after="60" w:line="276" w:lineRule="auto"/>
+        <w:spacing w:after="60"/>
         <w:ind w:left="480" w:hanging="240"/>
       </w:pPr>
       <w:r>
@@ -7253,13 +7447,13 @@
           <w:rFonts w:ascii="Times New Roman" w:hAnsi="Times New Roman"/>
           <w:sz w:val="26"/>
         </w:rPr>
-        <w:t>• Dữ liệu có nhiều nhóm thông tin: hồ sơ hiện tại, lịch sử tín dụng, giao dịch POS, thẻ tín dụng, khoản vay trước đó và lịch thanh toán.</w:t>
+        <w:t>• Cần xử lý missing value, outlier và các giá trị đặc biệt ra sao để dữ liệu sẵn sàng cho mô hình?</w:t>
       </w:r>
     </w:p>
     <w:p>
       <w:pPr>
         <w:pStyle w:val="ListParagraph"/>
-        <w:spacing w:after="60" w:line="276" w:lineRule="auto"/>
+        <w:spacing w:after="60"/>
         <w:ind w:left="480" w:hanging="240"/>
       </w:pPr>
       <w:r>
@@ -7267,13 +7461,13 @@
           <w:rFonts w:ascii="Times New Roman" w:hAnsi="Times New Roman"/>
           <w:sz w:val="26"/>
         </w:rPr>
-        <w:t>• Dữ liệu có tính thực tế: tồn tại missing value, outlier, giá trị đặc biệt và quan hệ một-nhiều giữa các bảng, giúp nhóm rèn luyện kỹ năng xử lý dữ liệu thật.</w:t>
+        <w:t>• Mô hình phân loại nào phù hợp để dự báo khách hàng có rủi ro cao trong bối cảnh dữ liệu mất cân bằng?</w:t>
       </w:r>
     </w:p>
     <w:p>
       <w:pPr>
         <w:pStyle w:val="ListParagraph"/>
-        <w:spacing w:after="60" w:line="276" w:lineRule="auto"/>
+        <w:spacing w:after="60"/>
         <w:ind w:left="480" w:hanging="240"/>
       </w:pPr>
       <w:r>
@@ -7281,7 +7475,7 @@
           <w:rFonts w:ascii="Times New Roman" w:hAnsi="Times New Roman"/>
           <w:sz w:val="26"/>
         </w:rPr>
-        <w:t>• Dữ liệu hỗ trợ nhiều giai đoạn của dự án: khám phá dữ liệu, tiền xử lý, feature engineering, huấn luyện mô hình, đánh giá và triển khai ứng dụng minh họa.</w:t>
+        <w:t>• Kết quả mô hình có thể được trình bày và ứng dụng như thế nào để hỗ trợ quyết định nghiệp vụ?</w:t>
       </w:r>
     </w:p>
     <w:p>
@@ -7291,37 +7485,99 @@
       </w:pPr>
       <w:r>
         <w:rPr>
-          <w:rFonts w:ascii="Times New Roman" w:hAnsi="Times New Roman"/>
-          <w:b/>
           <w:sz w:val="28"/>
         </w:rPr>
-        <w:t>1.3. Tầm quan trọng của việc giải quyết bài toán trong ngành AI</w:t>
+        <w:t>1.6. Giới thiệu dataset</w:t>
       </w:r>
     </w:p>
     <w:p>
       <w:pPr>
         <w:spacing w:after="120" w:line="276" w:lineRule="auto"/>
-        <w:jc w:val="both"/>
+      </w:pPr>
+      <w:r>
+        <w:rPr>
+          <w:sz w:val="26"/>
+        </w:rPr>
+        <w:t>Dataset chính của dự án là Home Credit Default Risk, trong đó bảng application_train.csv chứa hồ sơ vay hiện tại của khách hàng và biến mục tiêu TARGET. Giá trị TARGET = 1 thể hiện khách hàng gặp khó khăn trong thanh toán, còn TARGET = 0 thể hiện khách hàng không gặp khó khăn theo định nghĩa của bộ dữ liệu.</w:t>
+      </w:r>
+    </w:p>
+    <w:p>
+      <w:pPr>
+        <w:spacing w:after="120" w:line="276" w:lineRule="auto"/>
+      </w:pPr>
+      <w:r>
+        <w:rPr>
+          <w:sz w:val="26"/>
+        </w:rPr>
+        <w:t>Ngoài bảng chính, dataset còn có nhiều bảng phụ mô tả lịch sử tín dụng và hành vi thanh toán của khách hàng. Trong giai đoạn Data Understanding, nhóm đã xác định khóa nối quan trọng là SK_ID_CURR và SK_ID_PREV, đồng thời ghi nhận rủi ro row explosion khi nối trực tiếp các bảng quan hệ một-nhiều.</w:t>
+      </w:r>
+    </w:p>
+    <w:p>
+      <w:pPr>
+        <w:pStyle w:val="ListParagraph"/>
+        <w:spacing w:after="60"/>
+        <w:ind w:left="480" w:hanging="240"/>
       </w:pPr>
       <w:r>
         <w:rPr>
           <w:rFonts w:ascii="Times New Roman" w:hAnsi="Times New Roman"/>
           <w:sz w:val="26"/>
         </w:rPr>
-        <w:t>AI có thể giúp chuẩn hóa quá trình đánh giá rủi ro tín dụng bằng cách học từ dữ liệu lịch sử và phát hiện các mẫu quan hệ khó quan sát bằng cách thủ công. Trong bối cảnh tài chính, mô hình dự báo không chỉ tạo ra nhãn dự đoán mà còn hỗ trợ phân nhóm rủi ro, tối ưu ngưỡng ra quyết định và giải thích các yếu tố liên quan đến khả năng vỡ nợ.</w:t>
-      </w:r>
-    </w:p>
-    <w:p>
-      <w:pPr>
-        <w:spacing w:after="120" w:line="276" w:lineRule="auto"/>
-        <w:jc w:val="both"/>
+        <w:lastRenderedPageBreak/>
+        <w:t>• application_train.csv và application_test.csv: thông tin hồ sơ vay hiện tại, thông tin cá nhân, tài chính, hợp đồng và các điểm EXT_SOURCE.</w:t>
+      </w:r>
+    </w:p>
+    <w:p>
+      <w:pPr>
+        <w:pStyle w:val="ListParagraph"/>
+        <w:spacing w:after="60"/>
+        <w:ind w:left="480" w:hanging="240"/>
       </w:pPr>
       <w:r>
         <w:rPr>
           <w:rFonts w:ascii="Times New Roman" w:hAnsi="Times New Roman"/>
           <w:sz w:val="26"/>
         </w:rPr>
-        <w:t>Tuy nhiên, đây cũng là bài toán nhạy cảm vì kết quả mô hình có thể ảnh hưởng trực tiếp đến cơ hội tiếp cận vốn của khách hàng. Vì vậy, dự án cần chú trọng chất lượng dữ liệu, tránh rò rỉ dữ liệu, đánh giá bằng chỉ số phù hợp với dữ liệu mất cân bằng và diễn giải kết quả một cách thận trọng.</w:t>
+        <w:t>• bureau.csv và bureau_balance.csv: lịch sử tín dụng của khách hàng tại các tổ chức khác và trạng thái theo từng tháng.</w:t>
+      </w:r>
+    </w:p>
+    <w:p>
+      <w:pPr>
+        <w:pStyle w:val="ListParagraph"/>
+        <w:spacing w:after="60"/>
+        <w:ind w:left="480" w:hanging="240"/>
+      </w:pPr>
+      <w:r>
+        <w:rPr>
+          <w:rFonts w:ascii="Times New Roman" w:hAnsi="Times New Roman"/>
+          <w:sz w:val="26"/>
+        </w:rPr>
+        <w:t>• previous_application.csv: thông tin các hồ sơ vay trước đó tại Home Credit.</w:t>
+      </w:r>
+    </w:p>
+    <w:p>
+      <w:pPr>
+        <w:pStyle w:val="ListParagraph"/>
+        <w:spacing w:after="60"/>
+        <w:ind w:left="480" w:hanging="240"/>
+      </w:pPr>
+      <w:r>
+        <w:rPr>
+          <w:rFonts w:ascii="Times New Roman" w:hAnsi="Times New Roman"/>
+          <w:sz w:val="26"/>
+        </w:rPr>
+        <w:t>• POS_CASH_balance.csv, credit_card_balance.csv và installments_payments.csv: dữ liệu hành vi thanh toán, dư nợ, giao dịch POS/CASH và trả góp.</w:t>
+      </w:r>
+    </w:p>
+    <w:p>
+      <w:pPr>
+        <w:spacing w:after="120" w:line="276" w:lineRule="auto"/>
+      </w:pPr>
+      <w:r>
+        <w:rPr>
+          <w:sz w:val="26"/>
+        </w:rPr>
+        <w:t>Kết quả khám phá ban đầu cho thấy dữ liệu có nhiều đặc điểm cần chú ý ở các giai đoạn sau: tỷ lệ TARGET mất cân bằng, nhiều cột có missing value cao, một số biến numeric có outlier, và các biến EXT_SOURCE có tương quan đáng chú ý với TARGET.</w:t>
       </w:r>
     </w:p>
     <w:p>
@@ -7331,30 +7587,40 @@
       </w:pPr>
       <w:r>
         <w:rPr>
-          <w:rFonts w:ascii="Times New Roman" w:hAnsi="Times New Roman"/>
-          <w:b/>
           <w:sz w:val="28"/>
         </w:rPr>
-        <w:t>1.4. Phân tích mô hình SWOT</w:t>
+        <w:t>1.7. Giới thiệu công nghệ</w:t>
       </w:r>
     </w:p>
     <w:p>
       <w:pPr>
         <w:spacing w:after="120" w:line="276" w:lineRule="auto"/>
-        <w:jc w:val="both"/>
+      </w:pPr>
+      <w:r>
+        <w:rPr>
+          <w:sz w:val="26"/>
+        </w:rPr>
+        <w:t>Dự án sử dụng các công nghệ quen thuộc trong quy trình AI để đảm bảo có thể xử lý dữ liệu, trực quan hóa, huấn luyện mô hình và triển khai sản phẩm minh họa.</w:t>
+      </w:r>
+    </w:p>
+    <w:p>
+      <w:pPr>
+        <w:pStyle w:val="ListParagraph"/>
+        <w:spacing w:after="60"/>
+        <w:ind w:left="480" w:hanging="240"/>
       </w:pPr>
       <w:r>
         <w:rPr>
           <w:rFonts w:ascii="Times New Roman" w:hAnsi="Times New Roman"/>
           <w:sz w:val="26"/>
         </w:rPr>
-        <w:t>Phân tích SWOT giúp nhóm nhìn rõ thuận lợi, hạn chế và rủi ro khi triển khai dự án trên bộ dữ liệu Home Credit.</w:t>
+        <w:t>• PostgreSQL: lưu trữ dữ liệu dạng bảng, hỗ trợ truy vấn SQL, kiểm tra khóa và chuẩn bị dữ liệu trước khi phân tích.</w:t>
       </w:r>
     </w:p>
     <w:p>
       <w:pPr>
         <w:pStyle w:val="ListParagraph"/>
-        <w:spacing w:after="60" w:line="276" w:lineRule="auto"/>
+        <w:spacing w:after="60"/>
         <w:ind w:left="480" w:hanging="240"/>
       </w:pPr>
       <w:r>
@@ -7362,13 +7628,13 @@
           <w:rFonts w:ascii="Times New Roman" w:hAnsi="Times New Roman"/>
           <w:sz w:val="26"/>
         </w:rPr>
-        <w:t>• Điểm mạnh: bộ dữ liệu lớn, nhiều bảng và nhiều biến mô tả khách hàng, khoản vay, lịch sử tín dụng và hành vi thanh toán; biến mục tiêu rõ ràng, phù hợp để xây dựng mô hình phân loại.</w:t>
+        <w:t>• Python: ngôn ngữ chính để xử lý dữ liệu, phân tích, xây dựng mô hình và tự động hóa quy trình.</w:t>
       </w:r>
     </w:p>
     <w:p>
       <w:pPr>
         <w:pStyle w:val="ListParagraph"/>
-        <w:spacing w:after="60" w:line="276" w:lineRule="auto"/>
+        <w:spacing w:after="60"/>
         <w:ind w:left="480" w:hanging="240"/>
       </w:pPr>
       <w:r>
@@ -7376,13 +7642,13 @@
           <w:rFonts w:ascii="Times New Roman" w:hAnsi="Times New Roman"/>
           <w:sz w:val="26"/>
         </w:rPr>
-        <w:t>• Điểm yếu: dữ liệu có nhiều giá trị thiếu, biến lệch phân phối, outlier và mã đặc biệt như DAYS_EMPLOYED = 365243 hoặc CODE_GENDER = XNA; một số bảng phụ có quan hệ một-nhiều nên cần tổng hợp cẩn thận trước khi nối.</w:t>
+        <w:t>• pandas và NumPy: đọc dữ liệu, thống kê mô tả, xử lý bảng, tính toán biến và chuẩn bị dữ liệu đầu vào cho mô hình.</w:t>
       </w:r>
     </w:p>
     <w:p>
       <w:pPr>
         <w:pStyle w:val="ListParagraph"/>
-        <w:spacing w:after="60" w:line="276" w:lineRule="auto"/>
+        <w:spacing w:after="60"/>
         <w:ind w:left="480" w:hanging="240"/>
       </w:pPr>
       <w:r>
@@ -7390,13 +7656,13 @@
           <w:rFonts w:ascii="Times New Roman" w:hAnsi="Times New Roman"/>
           <w:sz w:val="26"/>
         </w:rPr>
-        <w:t>• Cơ hội: mô hình có thể hỗ trợ nhận diện nhóm khách hàng rủi ro cao, tìm hiểu các yếu tố liên quan đến rủi ro tín dụng và xây dựng ứng dụng minh họa để người dùng nhập thông tin và nhận dự báo.</w:t>
+        <w:t>• matplotlib và seaborn: trực quan hóa phân phối, tỷ lệ missing, tương quan và các mối quan hệ giữa biến đầu vào với TARGET.</w:t>
       </w:r>
     </w:p>
     <w:p>
       <w:pPr>
         <w:pStyle w:val="ListParagraph"/>
-        <w:spacing w:after="60" w:line="276" w:lineRule="auto"/>
+        <w:spacing w:after="60"/>
         <w:ind w:left="480" w:hanging="240"/>
       </w:pPr>
       <w:r>
@@ -7404,7 +7670,35 @@
           <w:rFonts w:ascii="Times New Roman" w:hAnsi="Times New Roman"/>
           <w:sz w:val="26"/>
         </w:rPr>
-        <w:t>• Thách thức: cần tránh join sai làm tăng số dòng, tránh data leakage, xử lý mất cân bằng lớp và đảm bảo mô hình có khả năng giải thích thay vì chỉ tối ưu điểm số.</w:t>
+        <w:t>• scikit-learn: chia dữ liệu, xây dựng pipeline tiền xử lý, huấn luyện mô hình phân loại và đánh giá bằng các chỉ số phù hợp.</w:t>
+      </w:r>
+    </w:p>
+    <w:p>
+      <w:pPr>
+        <w:pStyle w:val="ListParagraph"/>
+        <w:spacing w:after="60"/>
+        <w:ind w:left="480" w:hanging="240"/>
+      </w:pPr>
+      <w:r>
+        <w:rPr>
+          <w:rFonts w:ascii="Times New Roman" w:hAnsi="Times New Roman"/>
+          <w:sz w:val="26"/>
+        </w:rPr>
+        <w:t>• Streamlit: xây dựng giao diện demo để nhập thông tin khách hàng và hiển thị kết quả dự báo rủi ro.</w:t>
+      </w:r>
+    </w:p>
+    <w:p>
+      <w:pPr>
+        <w:pStyle w:val="ListParagraph"/>
+        <w:spacing w:after="60"/>
+        <w:ind w:left="480" w:hanging="240"/>
+      </w:pPr>
+      <w:r>
+        <w:rPr>
+          <w:rFonts w:ascii="Times New Roman" w:hAnsi="Times New Roman"/>
+          <w:sz w:val="26"/>
+        </w:rPr>
+        <w:t>• Git và GitHub: quản lý phiên bản, chia nhánh theo từng giai đoạn, tạo Pull Request và phối hợp nhóm.</w:t>
       </w:r>
     </w:p>
     <w:p>
@@ -7414,627 +7708,287 @@
       </w:pPr>
       <w:r>
         <w:rPr>
-          <w:rFonts w:ascii="Times New Roman" w:hAnsi="Times New Roman"/>
-          <w:b/>
           <w:sz w:val="28"/>
         </w:rPr>
-        <w:t>1.5. Mục tiêu nghiên cứu</w:t>
+        <w:t>1.8. Kết luận chương</w:t>
       </w:r>
     </w:p>
     <w:p>
       <w:pPr>
         <w:spacing w:after="120" w:line="276" w:lineRule="auto"/>
-        <w:jc w:val="both"/>
+      </w:pPr>
+      <w:r>
+        <w:rPr>
+          <w:sz w:val="26"/>
+        </w:rPr>
+        <w:t>Chương 1 đã xác định rõ bài toán nghiên cứu, giá trị thực tế của dự án và nền tảng dữ liệu/công nghệ sẽ sử dụng. Từ các kết quả Business Understanding và Data Understanding, nhóm có cơ sở để bước sang các chương tiếp theo: xây dựng pipeline, làm sạch dữ liệu, khai phá tri thức, tạo đặc trưng và huấn luyện mô hình dự báo rủi ro tín dụng.</w:t>
+      </w:r>
+    </w:p>
+    <w:p>
+      <w:pPr>
+        <w:pStyle w:val="Heading1"/>
+      </w:pPr>
+      <w:bookmarkStart w:id="3" w:name="_Toc235477023"/>
+      <w:r>
+        <w:lastRenderedPageBreak/>
+        <w:t>Chương 2. Xây dựng pipeline và tiền xử lý dữ liệu</w:t>
+      </w:r>
+      <w:bookmarkEnd w:id="3"/>
+    </w:p>
+    <w:p>
+      <w:r>
+        <w:rPr>
+          <w:sz w:val="26"/>
+        </w:rPr>
+        <w:t>Chương này trình bày quy trình đưa dữ liệu Home Credit từ nhiều bảng rời rạc trong PostgreSQL thành một bảng phẳng duy nhất, sau đó làm sạch và kiểm thử để đảm bảo dữ liệu sẵn sàng cho các bước phân tích và huấn luyện mô hình ở các chương sau.</w:t>
+      </w:r>
+    </w:p>
+    <w:p>
+      <w:pPr>
+        <w:pStyle w:val="Heading2"/>
+      </w:pPr>
+      <w:r>
+        <w:rPr>
+          <w:sz w:val="28"/>
+        </w:rPr>
+        <w:t>2.1. Quy trình tích hợp dữ liệu (Merge/Join)</w:t>
+      </w:r>
+    </w:p>
+    <w:p>
+      <w:r>
+        <w:rPr>
+          <w:sz w:val="26"/>
+        </w:rPr>
+        <w:t>Notebook 02 tổ chức dữ liệu gốc trên PostgreSQL và ghép các bảng phụ vào bảng application_train để tạo thành bảng phẳng application_flat, làm đầu vào cho bước làm sạch dữ liệu.</w:t>
+      </w:r>
+    </w:p>
+    <w:p>
+      <w:r>
+        <w:rPr>
+          <w:sz w:val="26"/>
+        </w:rPr>
+        <w:t>Mỗi khách hàng có nhiều dòng ở các bảng phụ như bureau, previous_application hay credit_card_balance, trong khi application_train chỉ có một dòng cho mỗi khách. Nếu join trực tiếp, một khách hàng có thể bị nhân thành nhiều dòng, làm sai lệch thống kê và kết quả huấn luyện mô hình.</w:t>
+      </w:r>
+    </w:p>
+    <w:p>
+      <w:pPr>
+        <w:pStyle w:val="ListParagraph"/>
       </w:pPr>
       <w:r>
         <w:rPr>
           <w:rFonts w:ascii="Times New Roman" w:hAnsi="Times New Roman"/>
           <w:sz w:val="26"/>
         </w:rPr>
-        <w:t>Mục tiêu tổng quát của dự án là xây dựng một pipeline AI có khả năng dự báo rủi ro khách hàng vay vốn dựa trên dữ liệu Home Credit, đồng thời trình bày rõ quy trình xử lý dữ liệu, lựa chọn biến, huấn luyện mô hình và đánh giá kết quả.</w:t>
-      </w:r>
-    </w:p>
-    <w:p>
-      <w:pPr>
-        <w:spacing w:after="120" w:line="276" w:lineRule="auto"/>
-        <w:jc w:val="both"/>
+        <w:t>• Giải pháp row explosion: gom từng bảng phụ về đúng một dòng cho mỗi khách hàng bằng GROUP BY sk_id_curr trước khi join, tạo ra 6 bảng summary trung gian.</w:t>
+      </w:r>
+    </w:p>
+    <w:p>
+      <w:pPr>
+        <w:pStyle w:val="ListParagraph"/>
       </w:pPr>
       <w:r>
         <w:rPr>
           <w:rFonts w:ascii="Times New Roman" w:hAnsi="Times New Roman"/>
           <w:sz w:val="26"/>
         </w:rPr>
-        <w:t>Các câu hỏi nghiên cứu chính gồm:</w:t>
+        <w:t>• Khóa nối: sk_id_curr là khóa chính để join vào bảng trung tâm; riêng bureau_balance phải gom theo sk_id_bureau trước, sau đó mới nối tiếp vào bureau để quy về mức khách hàng.</w:t>
       </w:r>
     </w:p>
     <w:p>
       <w:pPr>
         <w:pStyle w:val="ListParagraph"/>
-        <w:spacing w:after="60" w:line="276" w:lineRule="auto"/>
-        <w:ind w:left="480" w:hanging="240"/>
       </w:pPr>
       <w:r>
         <w:rPr>
           <w:rFonts w:ascii="Times New Roman" w:hAnsi="Times New Roman"/>
           <w:sz w:val="26"/>
         </w:rPr>
-        <w:t>• Những nhóm thông tin nào trong hồ sơ khách hàng có khả năng liên quan đến rủi ro tín dụng?</w:t>
+        <w:t>• Tối ưu bộ nhớ và hiệu năng: toàn bộ thao tác gộp nhóm và join được thực hiện bằng SQL ngay trong PostgreSQL thay vì tải hết dữ liệu vào pandas rồi merge, đồng thời tạo index trên các khóa nối để tăng tốc xử lý trên hàng triệu dòng.</w:t>
+      </w:r>
+    </w:p>
+    <w:p>
+      <w:pPr>
+        <w:rPr>
+          <w:sz w:val="26"/>
+        </w:rPr>
+      </w:pPr>
+      <w:r>
+        <w:rPr>
+          <w:sz w:val="26"/>
+        </w:rPr>
+        <w:t>Kết quả, bảng application_flat đạt 307.511 dòng và 154 cột, giữ nguyên số dòng của application_train và đảm bảo mỗi khách hàng chỉ có đúng một dòng dữ liệu.</w:t>
+      </w:r>
+    </w:p>
+    <w:p>
+      <w:pPr>
+        <w:pStyle w:val="Heading2"/>
+      </w:pPr>
+      <w:r>
+        <w:rPr>
+          <w:sz w:val="28"/>
+        </w:rPr>
+        <w:t>2.</w:t>
+      </w:r>
+      <w:r>
+        <w:rPr>
+          <w:sz w:val="28"/>
+        </w:rPr>
+        <w:t>2</w:t>
+      </w:r>
+      <w:r>
+        <w:rPr>
+          <w:sz w:val="28"/>
+        </w:rPr>
+        <w:t>. Kịch bản kiểm thử dữ liệu (Unit test sau khi Join)</w:t>
+      </w:r>
+    </w:p>
+    <w:p>
+      <w:r>
+        <w:rPr>
+          <w:sz w:val="26"/>
+        </w:rPr>
+        <w:t>Sau khi join, dữ liệu được kiểm tra lại bằng nhiều phép đối chiếu để đảm bảo không có sai lệch nào phát sinh so với dữ liệu gốc.</w:t>
       </w:r>
     </w:p>
     <w:p>
       <w:pPr>
         <w:pStyle w:val="ListParagraph"/>
-        <w:spacing w:after="60" w:line="276" w:lineRule="auto"/>
-        <w:ind w:left="480" w:hanging="240"/>
       </w:pPr>
       <w:r>
         <w:rPr>
           <w:rFonts w:ascii="Times New Roman" w:hAnsi="Times New Roman"/>
           <w:sz w:val="26"/>
         </w:rPr>
-        <w:t>• Các biến tài chính, nhân khẩu học, lịch sử tín dụng và điểm EXT_SOURCE có mối quan hệ như thế nào với TARGET?</w:t>
+        <w:t>• Kiểm tra số dòng và khóa chính: đối chiếu bảng application_flat vẫn giữ đúng 307.511 dòng và số khách hàng riêng biệt cũng bằng đúng con số này, nghĩa là không khách hàng nào bị mất hoặc bị nhân bản.</w:t>
       </w:r>
     </w:p>
     <w:p>
       <w:pPr>
         <w:pStyle w:val="ListParagraph"/>
-        <w:spacing w:after="60" w:line="276" w:lineRule="auto"/>
-        <w:ind w:left="480" w:hanging="240"/>
       </w:pPr>
       <w:r>
         <w:rPr>
           <w:rFonts w:ascii="Times New Roman" w:hAnsi="Times New Roman"/>
           <w:sz w:val="26"/>
         </w:rPr>
-        <w:t>• Cần xử lý missing value, outlier và các giá trị đặc biệt ra sao để dữ liệu sẵn sàng cho mô hình?</w:t>
+        <w:t>• Kiểm tra phân bố TARGET: so sánh số khách hàng TARGET bằng 1 và TARGET bằng 0 giữa bảng gốc và bảng phẳng, hai kết quả phải khớp tuyệt đối.</w:t>
       </w:r>
     </w:p>
     <w:p>
       <w:pPr>
         <w:pStyle w:val="ListParagraph"/>
-        <w:spacing w:after="60" w:line="276" w:lineRule="auto"/>
-        <w:ind w:left="480" w:hanging="240"/>
       </w:pPr>
       <w:r>
         <w:rPr>
           <w:rFonts w:ascii="Times New Roman" w:hAnsi="Times New Roman"/>
           <w:sz w:val="26"/>
         </w:rPr>
-        <w:t>• Mô hình phân loại nào phù hợp để dự báo khách hàng có rủi ro cao trong bối cảnh dữ liệu mất cân bằng?</w:t>
+        <w:t>• Kiểm tra dữ liệu thiếu sau join: đối chiếu số dòng NULL ở từng nhóm cột summary với công thức kỳ vọng, tức là lấy tổng số khách hàng trừ đi số khách hàng thực sự có dữ liệu ở nhóm đó.</w:t>
+      </w:r>
+    </w:p>
+    <w:p>
+      <w:r>
+        <w:rPr>
+          <w:sz w:val="26"/>
+        </w:rPr>
+        <w:lastRenderedPageBreak/>
+        <w:t>Cả ba phép kiểm tra đều trả về kết quả khớp với kỳ vọng, xác nhận LEFT JOIN không làm mất hay nhân bản khách hàng nào.</w:t>
+      </w:r>
+    </w:p>
+    <w:p/>
+    <w:p>
+      <w:pPr>
+        <w:pStyle w:val="Heading2"/>
+      </w:pPr>
+      <w:r>
+        <w:rPr>
+          <w:sz w:val="28"/>
+        </w:rPr>
+        <w:t>2.</w:t>
+      </w:r>
+      <w:r>
+        <w:rPr>
+          <w:sz w:val="28"/>
+        </w:rPr>
+        <w:t>3</w:t>
+      </w:r>
+      <w:r>
+        <w:rPr>
+          <w:sz w:val="28"/>
+        </w:rPr>
+        <w:t>. Làm sạch dữ liệu chuyên sâu</w:t>
+      </w:r>
+    </w:p>
+    <w:p>
+      <w:r>
+        <w:rPr>
+          <w:sz w:val="26"/>
+        </w:rPr>
+        <w:t>Notebook 03 làm sạch bảng application_flat qua các bước xử lý outlier và điền giá trị khuyết, nhằm đưa dữ liệu về trạng thái nhất quán trước khi phân tích.</w:t>
       </w:r>
     </w:p>
     <w:p>
       <w:pPr>
         <w:pStyle w:val="ListParagraph"/>
-        <w:spacing w:after="60" w:line="276" w:lineRule="auto"/>
-        <w:ind w:left="480" w:hanging="240"/>
       </w:pPr>
       <w:r>
         <w:rPr>
           <w:rFonts w:ascii="Times New Roman" w:hAnsi="Times New Roman"/>
           <w:sz w:val="26"/>
         </w:rPr>
-        <w:t>• Kết quả mô hình có thể được trình bày và ứng dụng như thế nào để hỗ trợ quyết định nghiệp vụ?</w:t>
-      </w:r>
-    </w:p>
-    <w:p>
-      <w:pPr>
-        <w:pStyle w:val="Heading2"/>
-        <w:spacing w:before="160" w:after="80"/>
-      </w:pPr>
-      <w:r>
-        <w:rPr>
-          <w:rFonts w:ascii="Times New Roman" w:hAnsi="Times New Roman"/>
-          <w:b/>
-          <w:sz w:val="28"/>
-        </w:rPr>
-        <w:t>1.6. Giới thiệu dataset</w:t>
-      </w:r>
-    </w:p>
-    <w:p>
-      <w:pPr>
-        <w:spacing w:after="120" w:line="276" w:lineRule="auto"/>
-        <w:jc w:val="both"/>
+        <w:t>• Phát hiện outlier: dùng IQR thay vì Z-score, vì IQR dựa trên phân vị nên bền vững hơn khi dữ liệu tài chính bị lệch mạnh.</w:t>
+      </w:r>
+    </w:p>
+    <w:p>
+      <w:pPr>
+        <w:pStyle w:val="ListParagraph"/>
       </w:pPr>
       <w:r>
         <w:rPr>
           <w:rFonts w:ascii="Times New Roman" w:hAnsi="Times New Roman"/>
           <w:sz w:val="26"/>
         </w:rPr>
-        <w:t>Dataset chính của dự án là Home Credit Default Risk, trong đó bảng application_train.csv chứa hồ sơ vay hiện tại của khách hàng và biến mục tiêu TARGET. Giá trị TARGET = 1 thể hiện khách hàng gặp khó khăn trong thanh toán, còn TARGET = 0 thể hiện khách hàng không gặp khó khăn theo định nghĩa của bộ dữ liệu.</w:t>
-      </w:r>
-    </w:p>
-    <w:p>
-      <w:pPr>
-        <w:spacing w:after="120" w:line="276" w:lineRule="auto"/>
-        <w:jc w:val="both"/>
+        <w:t>• Xử lý outlier: áp dụng capping tại phân vị 99% cho 13 cột tiền tệ, nhưng chỉ chặn ngưỡng trên và giữ nguyên toàn bộ số dòng; việc chỉ chặn ngưỡng trên nhằm tránh che lấp các giá trị âm sai logic đang tồn tại ở bureau_sum_debt và credit_card_avg_balance.</w:t>
+      </w:r>
+    </w:p>
+    <w:p>
+      <w:pPr>
+        <w:pStyle w:val="ListParagraph"/>
       </w:pPr>
       <w:r>
         <w:rPr>
           <w:rFonts w:ascii="Times New Roman" w:hAnsi="Times New Roman"/>
           <w:sz w:val="26"/>
         </w:rPr>
-        <w:t>Ngoài bảng chính, dataset còn có nhiều bảng phụ mô tả lịch sử tín dụng và hành vi thanh toán của khách hàng. Trong giai đoạn Data Understanding, nhóm đã xác định khóa nối quan trọng là SK_ID_CURR và SK_ID_PREV, đồng thời ghi nhận rủi ro row explosion khi nối trực tiếp các bảng quan hệ một-nhiều.</w:t>
+        <w:t>• Điền giá trị khuyết: xử lý theo từng nhóm cột, gắn cờ business-null cho các nhóm dữ liệu như has_bureau hay has_previous, điền median cho cột số còn thiếu, điền 'Unknown' cho cột chữ, và xóa dòng đối với các cột chỉ thiếu rất ít.</w:t>
       </w:r>
     </w:p>
     <w:p>
       <w:pPr>
         <w:pStyle w:val="ListParagraph"/>
-        <w:spacing w:after="60" w:line="276" w:lineRule="auto"/>
-        <w:ind w:left="480" w:hanging="240"/>
       </w:pPr>
       <w:r>
         <w:rPr>
           <w:rFonts w:ascii="Times New Roman" w:hAnsi="Times New Roman"/>
           <w:sz w:val="26"/>
         </w:rPr>
-        <w:t>• application_train.csv và application_test.csv: thông tin hồ sơ vay hiện tại, thông tin cá nhân, tài chính, hợp đồng và các điểm EXT_SOURCE.</w:t>
-      </w:r>
-    </w:p>
-    <w:p>
-      <w:pPr>
-        <w:pStyle w:val="ListParagraph"/>
-        <w:spacing w:after="60" w:line="276" w:lineRule="auto"/>
-        <w:ind w:left="480" w:hanging="240"/>
-      </w:pPr>
-      <w:r>
-        <w:rPr>
-          <w:rFonts w:ascii="Times New Roman" w:hAnsi="Times New Roman"/>
-          <w:sz w:val="26"/>
-        </w:rPr>
-        <w:t>• bureau.csv và bureau_balance.csv: lịch sử tín dụng của khách hàng tại các tổ chức khác và trạng thái theo từng tháng.</w:t>
-      </w:r>
-    </w:p>
-    <w:p>
-      <w:pPr>
-        <w:pStyle w:val="ListParagraph"/>
-        <w:spacing w:after="60" w:line="276" w:lineRule="auto"/>
-        <w:ind w:left="480" w:hanging="240"/>
-      </w:pPr>
-      <w:r>
-        <w:rPr>
-          <w:rFonts w:ascii="Times New Roman" w:hAnsi="Times New Roman"/>
-          <w:sz w:val="26"/>
-        </w:rPr>
-        <w:t>• previous_application.csv: thông tin các hồ sơ vay trước đó tại Home Credit.</w:t>
-      </w:r>
-    </w:p>
-    <w:p>
-      <w:pPr>
-        <w:pStyle w:val="ListParagraph"/>
-        <w:spacing w:after="60" w:line="276" w:lineRule="auto"/>
-        <w:ind w:left="480" w:hanging="240"/>
-      </w:pPr>
-      <w:r>
-        <w:rPr>
-          <w:rFonts w:ascii="Times New Roman" w:hAnsi="Times New Roman"/>
-          <w:sz w:val="26"/>
-        </w:rPr>
-        <w:t>• POS_CASH_balance.csv, credit_card_balance.csv và installments_payments.csv: dữ liệu hành vi thanh toán, dư nợ, giao dịch POS/CASH và trả góp.</w:t>
-      </w:r>
-    </w:p>
-    <w:p>
-      <w:pPr>
-        <w:spacing w:after="120" w:line="276" w:lineRule="auto"/>
-        <w:jc w:val="both"/>
-      </w:pPr>
-      <w:r>
-        <w:rPr>
-          <w:rFonts w:ascii="Times New Roman" w:hAnsi="Times New Roman"/>
-          <w:sz w:val="26"/>
-        </w:rPr>
-        <w:t>Kết quả khám phá ban đầu cho thấy dữ liệu có nhiều đặc điểm cần chú ý ở các giai đoạn sau: tỷ lệ TARGET mất cân bằng, nhiều cột có missing value cao, một số biến numeric có outlier, và các biến EXT_SOURCE có tương quan đáng chú ý với TARGET.</w:t>
+        <w:t>• Sửa giá trị sai logic: giá trị âm ở bureau_sum_debt và credit_card_avg_balance được điền lại 0, days_employed bằng 365243 được chuyển thành NaN, và các dòng có code_gender bằng XNA bị loại bỏ.</w:t>
       </w:r>
     </w:p>
     <w:p>
       <w:pPr>
         <w:pStyle w:val="Heading2"/>
-        <w:spacing w:before="160" w:after="80"/>
-      </w:pPr>
-      <w:r>
-        <w:rPr>
-          <w:rFonts w:ascii="Times New Roman" w:hAnsi="Times New Roman"/>
-          <w:b/>
+      </w:pPr>
+      <w:r>
+        <w:rPr>
           <w:sz w:val="28"/>
         </w:rPr>
-        <w:t>1.7. Giới thiệu công nghệ</w:t>
-      </w:r>
-    </w:p>
-    <w:p>
-      <w:pPr>
-        <w:spacing w:after="120" w:line="276" w:lineRule="auto"/>
-        <w:jc w:val="both"/>
-      </w:pPr>
-      <w:r>
-        <w:rPr>
-          <w:rFonts w:ascii="Times New Roman" w:hAnsi="Times New Roman"/>
-          <w:sz w:val="26"/>
-        </w:rPr>
-        <w:t>Dự án sử dụng các công nghệ quen thuộc trong quy trình AI để đảm bảo có thể xử lý dữ liệu, trực quan hóa, huấn luyện mô hình và triển khai sản phẩm minh họa.</w:t>
-      </w:r>
-    </w:p>
-    <w:p>
-      <w:pPr>
-        <w:pStyle w:val="ListParagraph"/>
-        <w:spacing w:after="60" w:line="276" w:lineRule="auto"/>
-        <w:ind w:left="480" w:hanging="240"/>
-      </w:pPr>
-      <w:r>
-        <w:rPr>
-          <w:rFonts w:ascii="Times New Roman" w:hAnsi="Times New Roman"/>
-          <w:sz w:val="26"/>
-        </w:rPr>
-        <w:t>• PostgreSQL: lưu trữ dữ liệu dạng bảng, hỗ trợ truy vấn SQL, kiểm tra khóa và chuẩn bị dữ liệu trước khi phân tích.</w:t>
-      </w:r>
-    </w:p>
-    <w:p>
-      <w:pPr>
-        <w:pStyle w:val="ListParagraph"/>
-        <w:spacing w:after="60" w:line="276" w:lineRule="auto"/>
-        <w:ind w:left="480" w:hanging="240"/>
-      </w:pPr>
-      <w:r>
-        <w:rPr>
-          <w:rFonts w:ascii="Times New Roman" w:hAnsi="Times New Roman"/>
-          <w:sz w:val="26"/>
-        </w:rPr>
-        <w:t>• Python: ngôn ngữ chính để xử lý dữ liệu, phân tích, xây dựng mô hình và tự động hóa quy trình.</w:t>
-      </w:r>
-    </w:p>
-    <w:p>
-      <w:pPr>
-        <w:pStyle w:val="ListParagraph"/>
-        <w:spacing w:after="60" w:line="276" w:lineRule="auto"/>
-        <w:ind w:left="480" w:hanging="240"/>
-      </w:pPr>
-      <w:r>
-        <w:rPr>
-          <w:rFonts w:ascii="Times New Roman" w:hAnsi="Times New Roman"/>
-          <w:sz w:val="26"/>
-        </w:rPr>
-        <w:t>• pandas và NumPy: đọc dữ liệu, thống kê mô tả, xử lý bảng, tính toán biến và chuẩn bị dữ liệu đầu vào cho mô hình.</w:t>
-      </w:r>
-    </w:p>
-    <w:p>
-      <w:pPr>
-        <w:pStyle w:val="ListParagraph"/>
-        <w:spacing w:after="60" w:line="276" w:lineRule="auto"/>
-        <w:ind w:left="480" w:hanging="240"/>
-      </w:pPr>
-      <w:r>
-        <w:rPr>
-          <w:rFonts w:ascii="Times New Roman" w:hAnsi="Times New Roman"/>
-          <w:sz w:val="26"/>
-        </w:rPr>
-        <w:t>• matplotlib và seaborn: trực quan hóa phân phối, tỷ lệ missing, tương quan và các mối quan hệ giữa biến đầu vào với TARGET.</w:t>
-      </w:r>
-    </w:p>
-    <w:p>
-      <w:pPr>
-        <w:pStyle w:val="ListParagraph"/>
-        <w:spacing w:after="60" w:line="276" w:lineRule="auto"/>
-        <w:ind w:left="480" w:hanging="240"/>
-      </w:pPr>
-      <w:r>
-        <w:rPr>
-          <w:rFonts w:ascii="Times New Roman" w:hAnsi="Times New Roman"/>
-          <w:sz w:val="26"/>
-        </w:rPr>
-        <w:t>• scikit-learn: chia dữ liệu, xây dựng pipeline tiền xử lý, huấn luyện mô hình phân loại và đánh giá bằng các chỉ số phù hợp.</w:t>
-      </w:r>
-    </w:p>
-    <w:p>
-      <w:pPr>
-        <w:pStyle w:val="ListParagraph"/>
-        <w:spacing w:after="60" w:line="276" w:lineRule="auto"/>
-        <w:ind w:left="480" w:hanging="240"/>
-      </w:pPr>
-      <w:r>
-        <w:rPr>
-          <w:rFonts w:ascii="Times New Roman" w:hAnsi="Times New Roman"/>
-          <w:sz w:val="26"/>
-        </w:rPr>
-        <w:t>• Streamlit: xây dựng giao diện demo để nhập thông tin khách hàng và hiển thị kết quả dự báo rủi ro.</w:t>
-      </w:r>
-    </w:p>
-    <w:p>
-      <w:pPr>
-        <w:pStyle w:val="ListParagraph"/>
-        <w:spacing w:after="60" w:line="276" w:lineRule="auto"/>
-        <w:ind w:left="480" w:hanging="240"/>
-      </w:pPr>
-      <w:r>
-        <w:rPr>
-          <w:rFonts w:ascii="Times New Roman" w:hAnsi="Times New Roman"/>
-          <w:sz w:val="26"/>
-        </w:rPr>
-        <w:t>• Git và GitHub: quản lý phiên bản, chia nhánh theo từng giai đoạn, tạo Pull Request và phối hợp nhóm.</w:t>
-      </w:r>
-    </w:p>
-    <w:p>
-      <w:pPr>
-        <w:pStyle w:val="Heading2"/>
-        <w:spacing w:before="160" w:after="80"/>
-      </w:pPr>
-      <w:r>
-        <w:rPr>
-          <w:rFonts w:ascii="Times New Roman" w:hAnsi="Times New Roman"/>
-          <w:b/>
-          <w:sz w:val="28"/>
-        </w:rPr>
-        <w:t>1.8. Kết luận chương</w:t>
-      </w:r>
-    </w:p>
-    <w:p>
-      <w:pPr>
-        <w:spacing w:after="120" w:line="276" w:lineRule="auto"/>
-        <w:jc w:val="both"/>
-      </w:pPr>
-      <w:r>
-        <w:rPr>
-          <w:rFonts w:ascii="Times New Roman" w:hAnsi="Times New Roman"/>
-          <w:sz w:val="26"/>
-        </w:rPr>
-        <w:t>Chương 1 đã xác định rõ bài toán nghiên cứu, giá trị thực tế của dự án và nền tảng dữ liệu/công nghệ sẽ sử dụng. Từ các kết quả Business Understanding và Data Understanding, nhóm có cơ sở để bước sang các chương tiếp theo: xây dựng pipeline, làm sạch dữ liệu, khai phá tri thức, tạo đặc trưng và huấn luyện mô hình dự báo rủi ro tín dụng.</w:t>
-      </w:r>
-    </w:p>
-    <w:p>
-      <w:pPr>
-        <w:pStyle w:val="Heading1"/>
-      </w:pPr>
-      <w:bookmarkStart w:id="3" w:name="_Toc235477023"/>
-      <w:r>
-        <w:t>Chương 2. Xây dựng pipeline và tiền xử lý dữ liệu</w:t>
-      </w:r>
-      <w:bookmarkEnd w:id="3"/>
-    </w:p>
-    <w:p>
-      <w:pPr/>
-      <w:r>
-        <w:rPr>
-          <w:rFonts w:ascii="Times New Roman" w:hAnsi="Times New Roman"/>
-          <w:sz w:val="26"/>
-        </w:rPr>
-        <w:t>Chương này trình bày quy trình đưa dữ liệu Home Credit từ nhiều bảng rời rạc trong PostgreSQL thành một bảng phẳng duy nhất, sau đó làm sạch và kiểm thử để đảm bảo dữ liệu sẵn sàng cho các bước phân tích và huấn luyện mô hình ở các chương sau.</w:t>
-      </w:r>
-    </w:p>
-    <w:p>
-      <w:pPr>
-        <w:pStyle w:val="Heading2"/>
-      </w:pPr>
-      <w:r>
-        <w:rPr>
-          <w:rFonts w:ascii="Times New Roman" w:hAnsi="Times New Roman"/>
-          <w:b/>
-          <w:sz w:val="28"/>
-        </w:rPr>
-        <w:t>2.1. Quy trình tích hợp dữ liệu (Merge/Join)</w:t>
-      </w:r>
-    </w:p>
-    <w:p>
-      <w:pPr/>
-      <w:r>
-        <w:rPr>
-          <w:rFonts w:ascii="Times New Roman" w:hAnsi="Times New Roman"/>
-          <w:sz w:val="26"/>
-        </w:rPr>
-        <w:t>Notebook 02 tổ chức dữ liệu gốc trên PostgreSQL và ghép các bảng phụ vào bảng application_train để tạo thành bảng phẳng application_flat, làm đầu vào cho bước làm sạch dữ liệu.</w:t>
-      </w:r>
-    </w:p>
-    <w:p>
-      <w:pPr/>
-      <w:r>
-        <w:rPr>
-          <w:rFonts w:ascii="Times New Roman" w:hAnsi="Times New Roman"/>
-          <w:sz w:val="26"/>
-        </w:rPr>
-        <w:t>Mỗi khách hàng có nhiều dòng ở các bảng phụ như bureau, previous_application hay credit_card_balance, trong khi application_train chỉ có một dòng cho mỗi khách. Nếu join trực tiếp, một khách hàng có thể bị nhân thành nhiều dòng, làm sai lệch thống kê và kết quả huấn luyện mô hình.</w:t>
-      </w:r>
-    </w:p>
-    <w:p>
-      <w:pPr>
-        <w:pStyle w:val="ListParagraph"/>
-      </w:pPr>
-      <w:r>
-        <w:rPr>
-          <w:rFonts w:ascii="Times New Roman" w:hAnsi="Times New Roman"/>
-          <w:sz w:val="26"/>
-        </w:rPr>
-        <w:t>• Giải pháp row explosion: gom từng bảng phụ về đúng một dòng cho mỗi khách hàng bằng GROUP BY sk_id_curr trước khi join, tạo ra 6 bảng summary trung gian.</w:t>
-      </w:r>
-    </w:p>
-    <w:p>
-      <w:pPr>
-        <w:pStyle w:val="ListParagraph"/>
-      </w:pPr>
-      <w:r>
-        <w:rPr>
-          <w:rFonts w:ascii="Times New Roman" w:hAnsi="Times New Roman"/>
-          <w:sz w:val="26"/>
-        </w:rPr>
-        <w:t>• Khóa nối: sk_id_curr là khóa chính để join vào bảng trung tâm; riêng bureau_balance phải gom theo sk_id_bureau trước, sau đó mới nối tiếp vào bureau để quy về mức khách hàng.</w:t>
-      </w:r>
-    </w:p>
-    <w:p>
-      <w:pPr>
-        <w:pStyle w:val="ListParagraph"/>
-      </w:pPr>
-      <w:r>
-        <w:rPr>
-          <w:rFonts w:ascii="Times New Roman" w:hAnsi="Times New Roman"/>
-          <w:sz w:val="26"/>
-        </w:rPr>
-        <w:t>• Tối ưu bộ nhớ và hiệu năng: toàn bộ thao tác gộp nhóm và join được thực hiện bằng SQL ngay trong PostgreSQL thay vì tải hết dữ liệu vào pandas rồi merge, đồng thời tạo index trên các khóa nối để tăng tốc xử lý trên hàng triệu dòng.</w:t>
-      </w:r>
-    </w:p>
-    <w:p>
-      <w:pPr/>
-      <w:r>
-        <w:rPr>
-          <w:rFonts w:ascii="Times New Roman" w:hAnsi="Times New Roman"/>
-          <w:sz w:val="26"/>
-        </w:rPr>
-        <w:t>Kết quả, bảng application_flat đạt 307.511 dòng và 154 cột, giữ nguyên số dòng của application_train và đảm bảo mỗi khách hàng chỉ có đúng một dòng dữ liệu.</w:t>
-      </w:r>
-    </w:p>
-    <w:p>
-      <w:pPr>
-        <w:pStyle w:val="Heading2"/>
-      </w:pPr>
-      <w:r>
-        <w:rPr>
-          <w:rFonts w:ascii="Times New Roman" w:hAnsi="Times New Roman"/>
-          <w:b/>
-          <w:sz w:val="28"/>
-        </w:rPr>
-        <w:t>2.2. Làm sạch dữ liệu chuyên sâu</w:t>
-      </w:r>
-    </w:p>
-    <w:p>
-      <w:pPr/>
-      <w:r>
-        <w:rPr>
-          <w:rFonts w:ascii="Times New Roman" w:hAnsi="Times New Roman"/>
-          <w:sz w:val="26"/>
-        </w:rPr>
-        <w:t>Notebook 03 làm sạch bảng application_flat qua các bước xử lý outlier và điền giá trị khuyết, nhằm đưa dữ liệu về trạng thái nhất quán trước khi phân tích.</w:t>
-      </w:r>
-    </w:p>
-    <w:p>
-      <w:pPr>
-        <w:pStyle w:val="ListParagraph"/>
-      </w:pPr>
-      <w:r>
-        <w:rPr>
-          <w:rFonts w:ascii="Times New Roman" w:hAnsi="Times New Roman"/>
-          <w:sz w:val="26"/>
-        </w:rPr>
-        <w:t>• Phát hiện outlier: dùng IQR thay vì Z-score, vì IQR dựa trên phân vị nên bền vững hơn khi dữ liệu tài chính bị lệch mạnh.</w:t>
-      </w:r>
-    </w:p>
-    <w:p>
-      <w:pPr>
-        <w:pStyle w:val="ListParagraph"/>
-      </w:pPr>
-      <w:r>
-        <w:rPr>
-          <w:rFonts w:ascii="Times New Roman" w:hAnsi="Times New Roman"/>
-          <w:sz w:val="26"/>
-        </w:rPr>
-        <w:t>• Xử lý outlier: áp dụng capping tại phân vị 99% cho 13 cột tiền tệ, nhưng chỉ chặn ngưỡng trên và giữ nguyên toàn bộ số dòng; việc chỉ chặn ngưỡng trên nhằm tránh che lấp các giá trị âm sai logic đang tồn tại ở bureau_sum_debt và credit_card_avg_balance.</w:t>
-      </w:r>
-    </w:p>
-    <w:p>
-      <w:pPr>
-        <w:pStyle w:val="ListParagraph"/>
-      </w:pPr>
-      <w:r>
-        <w:rPr>
-          <w:rFonts w:ascii="Times New Roman" w:hAnsi="Times New Roman"/>
-          <w:sz w:val="26"/>
-        </w:rPr>
-        <w:t>• Điền giá trị khuyết: xử lý theo từng nhóm cột, gắn cờ business-null cho các nhóm dữ liệu như has_bureau hay has_previous, điền median cho cột số còn thiếu, điền 'Unknown' cho cột chữ, và xóa dòng đối với các cột chỉ thiếu rất ít.</w:t>
-      </w:r>
-    </w:p>
-    <w:p>
-      <w:pPr>
-        <w:pStyle w:val="ListParagraph"/>
-      </w:pPr>
-      <w:r>
-        <w:rPr>
-          <w:rFonts w:ascii="Times New Roman" w:hAnsi="Times New Roman"/>
-          <w:sz w:val="26"/>
-        </w:rPr>
-        <w:t>• Sửa giá trị sai logic: giá trị âm ở bureau_sum_debt và credit_card_avg_balance được điền lại 0, days_employed bằng 365243 được chuyển thành NaN, và các dòng có code_gender bằng XNA bị loại bỏ.</w:t>
-      </w:r>
-    </w:p>
-    <w:p>
-      <w:pPr>
-        <w:pStyle w:val="Heading2"/>
-      </w:pPr>
-      <w:r>
-        <w:rPr>
-          <w:rFonts w:ascii="Times New Roman" w:hAnsi="Times New Roman"/>
-          <w:b/>
-          <w:sz w:val="28"/>
-        </w:rPr>
-        <w:t>2.3. Kịch bản kiểm thử dữ liệu (Unit test sau khi Join)</w:t>
-      </w:r>
-    </w:p>
-    <w:p>
-      <w:pPr/>
-      <w:r>
-        <w:rPr>
-          <w:rFonts w:ascii="Times New Roman" w:hAnsi="Times New Roman"/>
-          <w:sz w:val="26"/>
-        </w:rPr>
-        <w:t>Sau khi join, dữ liệu được kiểm tra lại bằng nhiều phép đối chiếu để đảm bảo không có sai lệch nào phát sinh so với dữ liệu gốc.</w:t>
-      </w:r>
-    </w:p>
-    <w:p>
-      <w:pPr>
-        <w:pStyle w:val="ListParagraph"/>
-      </w:pPr>
-      <w:r>
-        <w:rPr>
-          <w:rFonts w:ascii="Times New Roman" w:hAnsi="Times New Roman"/>
-          <w:sz w:val="26"/>
-        </w:rPr>
-        <w:t>• Kiểm tra số dòng và khóa chính: đối chiếu bảng application_flat vẫn giữ đúng 307.511 dòng và số khách hàng riêng biệt cũng bằng đúng con số này, nghĩa là không khách hàng nào bị mất hoặc bị nhân bản.</w:t>
-      </w:r>
-    </w:p>
-    <w:p>
-      <w:pPr>
-        <w:pStyle w:val="ListParagraph"/>
-      </w:pPr>
-      <w:r>
-        <w:rPr>
-          <w:rFonts w:ascii="Times New Roman" w:hAnsi="Times New Roman"/>
-          <w:sz w:val="26"/>
-        </w:rPr>
-        <w:t>• Kiểm tra phân bố TARGET: so sánh số khách hàng TARGET bằng 1 và TARGET bằng 0 giữa bảng gốc và bảng phẳng, hai kết quả phải khớp tuyệt đối.</w:t>
-      </w:r>
-    </w:p>
-    <w:p>
-      <w:pPr>
-        <w:pStyle w:val="ListParagraph"/>
-      </w:pPr>
-      <w:r>
-        <w:rPr>
-          <w:rFonts w:ascii="Times New Roman" w:hAnsi="Times New Roman"/>
-          <w:sz w:val="26"/>
-        </w:rPr>
-        <w:t>• Kiểm tra dữ liệu thiếu sau join: đối chiếu số dòng NULL ở từng nhóm cột summary với công thức kỳ vọng, tức là lấy tổng số khách hàng trừ đi số khách hàng thực sự có dữ liệu ở nhóm đó.</w:t>
-      </w:r>
-    </w:p>
-    <w:p>
-      <w:pPr/>
-      <w:r>
-        <w:rPr>
-          <w:rFonts w:ascii="Times New Roman" w:hAnsi="Times New Roman"/>
-          <w:sz w:val="26"/>
-        </w:rPr>
-        <w:t>Cả ba phép kiểm tra đều trả về kết quả khớp với kỳ vọng, xác nhận LEFT JOIN không làm mất hay nhân bản khách hàng nào.</w:t>
-      </w:r>
-    </w:p>
-    <w:p>
-      <w:pPr>
-        <w:pStyle w:val="Heading2"/>
-      </w:pPr>
-      <w:r>
-        <w:rPr>
-          <w:rFonts w:ascii="Times New Roman" w:hAnsi="Times New Roman"/>
-          <w:b/>
-          <w:sz w:val="28"/>
-        </w:rPr>
         <w:t>2.4. Kết luận chương</w:t>
       </w:r>
     </w:p>
     <w:p>
-      <w:pPr/>
-      <w:r>
-        <w:rPr>
-          <w:rFonts w:ascii="Times New Roman" w:hAnsi="Times New Roman"/>
+      <w:r>
+        <w:rPr>
           <w:sz w:val="26"/>
         </w:rPr>
         <w:t>Chương 2 đã đưa dữ liệu Home Credit từ nhiều file CSV rời rạc thành một bảng phẳng sạch, sẵn sàng cho phân tích. Ở bước tích hợp, các bảng phụ được gom về một dòng cho mỗi khách hàng trước khi join, đồng thời toàn bộ thao tác gộp nhóm và nối bảng thực hiện ngay trong PostgreSQL để xử lý hiệu quả hàng triệu dòng. Ở bước làm sạch, capping bất đối xứng (chỉ chặn ngưỡng trên) và điền khuyết theo từng nhóm cột giúp giữ tối đa thông tin gốc mà vẫn loại bỏ giá trị cực đoan và sai logic. Các bước kiểm thử sau join, gồm đối chiếu số dòng, phân bố TARGET và số lượng NULL, xác nhận dữ liệu không bị sai lệch. Kết quả là bảng dữ liệu sạch, đáng tin cậy, làm nền tảng cho Chương 3.</w:t>
@@ -8116,6 +8070,7 @@
           <w:bCs/>
           <w:szCs w:val="26"/>
         </w:rPr>
+        <w:lastRenderedPageBreak/>
         <w:t>Trực quan hóa Insights: Trình bày các phát hiện quan trọng nhất có tác động đến quyết định kinh doanh.</w:t>
       </w:r>
     </w:p>
@@ -8125,7 +8080,6 @@
       </w:pPr>
       <w:bookmarkStart w:id="5" w:name="_Toc235477025"/>
       <w:r>
-        <w:lastRenderedPageBreak/>
         <w:t>Chương 4. Mô hình hóa và dự báo</w:t>
       </w:r>
       <w:bookmarkEnd w:id="5"/>
@@ -8431,6 +8385,7 @@
           <w:bCs/>
           <w:szCs w:val="26"/>
         </w:rPr>
+        <w:lastRenderedPageBreak/>
         <w:t>Quản lý công việc trên Jira/Trello: Sử dụng bảng Kanban với các cột: To Do, In Progress, Review, Done để theo dõi trạng thái công việc trong thời gian thực.</w:t>
       </w:r>
     </w:p>
@@ -8454,7 +8409,6 @@
           <w:bCs/>
           <w:szCs w:val="26"/>
         </w:rPr>
-        <w:lastRenderedPageBreak/>
         <w:t>Báo cáo tiến độ định kỳ: Ghi chép nhật ký thực hiện dự án, các khó khăn phát sinh và giải pháp đã áp dụng để vượt qua các "nút thắt" kỹ thuật.</w:t>
       </w:r>
     </w:p>
@@ -8775,7 +8729,7 @@
       <mc:AlternateContent>
         <mc:Choice Requires="wps">
           <w:drawing>
-            <wp:anchor distT="0" distB="0" distL="114300" distR="114300" simplePos="0" relativeHeight="251657216" behindDoc="0" locked="0" layoutInCell="1" allowOverlap="1" wp14:anchorId="121A6CE7" wp14:editId="49C9BC7A">
+            <wp:anchor distT="0" distB="0" distL="114300" distR="114300" simplePos="0" relativeHeight="251657216" behindDoc="0" locked="0" layoutInCell="1" allowOverlap="1" wp14:anchorId="43903B40" wp14:editId="0F3DEEDA">
               <wp:simplePos x="0" y="0"/>
               <wp:positionH relativeFrom="margin">
                 <wp:align>right</wp:align>
@@ -8869,7 +8823,7 @@
         </mc:Choice>
         <mc:Fallback>
           <w:pict>
-            <v:shapetype w14:anchorId="121A6CE7" id="_x0000_t202" coordsize="21600,21600" o:spt="202" path="m,l,21600r21600,l21600,xe">
+            <v:shapetype w14:anchorId="43903B40" id="_x0000_t202" coordsize="21600,21600" o:spt="202" path="m,l,21600r21600,l21600,xe">
               <v:stroke joinstyle="miter"/>
               <v:path gradientshapeok="t" o:connecttype="rect"/>
             </v:shapetype>
@@ -8930,7 +8884,7 @@
       <mc:AlternateContent>
         <mc:Choice Requires="wps">
           <w:drawing>
-            <wp:anchor distT="0" distB="0" distL="114300" distR="114300" simplePos="0" relativeHeight="251658240" behindDoc="0" locked="0" layoutInCell="1" allowOverlap="1" wp14:anchorId="1AD08F7F" wp14:editId="22C61842">
+            <wp:anchor distT="0" distB="0" distL="114300" distR="114300" simplePos="0" relativeHeight="251658240" behindDoc="0" locked="0" layoutInCell="1" allowOverlap="1" wp14:anchorId="5600EA8D" wp14:editId="7C32F664">
               <wp:simplePos x="0" y="0"/>
               <wp:positionH relativeFrom="margin">
                 <wp:align>right</wp:align>
@@ -9024,7 +8978,7 @@
         </mc:Choice>
         <mc:Fallback>
           <w:pict>
-            <v:shapetype w14:anchorId="1AD08F7F" id="_x0000_t202" coordsize="21600,21600" o:spt="202" path="m,l,21600r21600,l21600,xe">
+            <v:shapetype w14:anchorId="5600EA8D" id="_x0000_t202" coordsize="21600,21600" o:spt="202" path="m,l,21600r21600,l21600,xe">
               <v:stroke joinstyle="miter"/>
               <v:path gradientshapeok="t" o:connecttype="rect"/>
             </v:shapetype>
@@ -9106,7 +9060,7 @@
         <w:szCs w:val="20"/>
       </w:rPr>
       <w:drawing>
-        <wp:inline distT="0" distB="0" distL="0" distR="0" wp14:anchorId="1C0FC4D2" wp14:editId="093E01D2">
+        <wp:inline distT="0" distB="0" distL="0" distR="0" wp14:anchorId="41186DF3" wp14:editId="613EDC24">
           <wp:extent cx="976630" cy="419100"/>
           <wp:effectExtent l="0" t="0" r="0" b="0"/>
           <wp:docPr id="2" name="Google Shape;19;p15"/>
@@ -9510,7 +9464,7 @@
   <w:style w:type="paragraph" w:default="1" w:styleId="Normal">
     <w:name w:val="Normal"/>
     <w:qFormat/>
-    <w:rsid w:val="00B7442C"/>
+    <w:rsid w:val="00D50C48"/>
     <w:pPr>
       <w:spacing w:line="360" w:lineRule="auto"/>
       <w:jc w:val="both"/>
@@ -9547,6 +9501,7 @@
     <w:name w:val="heading 2"/>
     <w:basedOn w:val="Normal"/>
     <w:next w:val="Normal"/>
+    <w:link w:val="Heading2Char"/>
     <w:autoRedefine/>
     <w:qFormat/>
     <w:rsid w:val="008C40DB"/>
@@ -10000,6 +9955,18 @@
       <w:u w:val="single"/>
     </w:rPr>
   </w:style>
+  <w:style w:type="character" w:customStyle="1" w:styleId="Heading2Char">
+    <w:name w:val="Heading 2 Char"/>
+    <w:basedOn w:val="DefaultParagraphFont"/>
+    <w:link w:val="Heading2"/>
+    <w:rsid w:val="00D50C48"/>
+    <w:rPr>
+      <w:b/>
+      <w:color w:val="0070C0"/>
+      <w:sz w:val="30"/>
+      <w:szCs w:val="24"/>
+    </w:rPr>
+  </w:style>
 </w:styles>
 </file>
 

</xml_diff>

<commit_message>
docs: viet Chuong 3 EDA va Feature Engineering (NB04, NB05)
Viet noi dung that cho Chuong 3 "Khai pha tri thuc va ky thuat tinh
nang" trong docs/2. Mau tai lieu.docx, thay khung suon goi y chung
chung bang noi dung dua sat NB04 (EDA) va NB05 (Feature Engineering),
gom bang 9 nhom bien theo y nghia nghiep vu va bo sung insight ve co
has_bureau sau khi ra soat lai voi notebook goc.
</commit_message>
<xml_diff>
--- a/docs/2. Mau tai lieu.docx
+++ b/docs/2. Mau tai lieu.docx
@@ -8006,72 +8006,1167 @@
     </w:p>
     <w:p>
       <w:pPr>
-        <w:numPr>
-          <w:ilvl w:val="0"/>
-          <w:numId w:val="1"/>
-        </w:numPr>
-        <w:tabs>
-          <w:tab w:val="clear" w:pos="420"/>
-        </w:tabs>
-        <w:ind w:right="-285"/>
-        <w:rPr>
-          <w:bCs/>
-          <w:szCs w:val="26"/>
-        </w:rPr>
-      </w:pPr>
-      <w:r>
-        <w:rPr>
-          <w:bCs/>
-          <w:szCs w:val="26"/>
-        </w:rPr>
-        <w:t xml:space="preserve">Phân tích khám phá (EDA): Sử dụng biểu đồ để tìm ra các tương quan ẩn; chứng minh các giả thuyết bằng thống kê. </w:t>
-      </w:r>
-    </w:p>
-    <w:p>
-      <w:pPr>
-        <w:numPr>
-          <w:ilvl w:val="0"/>
-          <w:numId w:val="1"/>
-        </w:numPr>
-        <w:tabs>
-          <w:tab w:val="clear" w:pos="420"/>
-        </w:tabs>
-        <w:ind w:right="-285"/>
-        <w:rPr>
-          <w:bCs/>
-          <w:szCs w:val="26"/>
-        </w:rPr>
-      </w:pPr>
-      <w:r>
-        <w:rPr>
-          <w:bCs/>
-          <w:szCs w:val="26"/>
-        </w:rPr>
-        <w:t xml:space="preserve">Xây dựng biến phái sinh (Feature engineering): Mô tả cách tạo ra ít nhất 10 biến mới từ các bảng quan hệ (ví dụ: Tính tổng chi tiêu của khách hàng từ bảng lịch sử giao dịch). </w:t>
-      </w:r>
-    </w:p>
-    <w:p>
-      <w:pPr>
-        <w:numPr>
-          <w:ilvl w:val="0"/>
-          <w:numId w:val="1"/>
-        </w:numPr>
-        <w:tabs>
-          <w:tab w:val="clear" w:pos="420"/>
-        </w:tabs>
-        <w:ind w:right="-285"/>
-        <w:rPr>
-          <w:bCs/>
-          <w:szCs w:val="26"/>
-        </w:rPr>
-      </w:pPr>
-      <w:r>
-        <w:rPr>
-          <w:bCs/>
-          <w:szCs w:val="26"/>
-        </w:rPr>
-        <w:lastRenderedPageBreak/>
-        <w:t>Trực quan hóa Insights: Trình bày các phát hiện quan trọng nhất có tác động đến quyết định kinh doanh.</w:t>
+        <w:pStyle w:val="Heading2"/>
+        <w:spacing w:before="160" w:after="80"/>
+      </w:pPr>
+      <w:r>
+        <w:rPr>
+          <w:sz w:val="28"/>
+        </w:rPr>
+        <w:t>3.1. Mục tiêu và phạm vi phân tích khám phá dữ liệu</w:t>
+      </w:r>
+    </w:p>
+    <w:p>
+      <w:pPr>
+        <w:spacing w:after="120" w:line="276" w:lineRule="auto"/>
+      </w:pPr>
+      <w:r>
+        <w:rPr>
+          <w:sz w:val="26"/>
+        </w:rPr>
+        <w:t>Chương này trình bày kết quả phân tích khám phá dữ liệu (EDA) thực hiện ở Notebook 04 và kết quả xây dựng đặc trưng thực hiện ở Notebook 05, trên bảng application_flat_cleaned đã được làm sạch ở Chương 2. Mục tiêu chung là tìm hiểu chân dung tổng quan của khách hàng vay vốn, xác định các yếu tố có liên hệ với biến mục tiêu target (bằng 1 là khách gặp khó khăn trong thanh toán, bằng 0 là khách trả nợ đúng hạn), từ đó định hướng xây dựng các đặc trưng phục vụ cho bước huấn luyện mô hình ở Chương 4.</w:t>
+      </w:r>
+    </w:p>
+    <w:p>
+      <w:pPr>
+        <w:spacing w:after="120" w:line="276" w:lineRule="auto"/>
+      </w:pPr>
+      <w:r>
+        <w:rPr>
+          <w:sz w:val="26"/>
+        </w:rPr>
+        <w:t>Ba mục tiêu cụ thể của bước khám phá dữ liệu gồm: khám phá phân phối dữ liệu để hiểu chân dung tổng quan của tệp khách hàng đăng ký vay vốn tại Home Credit; xác định các yếu tố rủi ro then chốt bằng cách phân tích mức độ liên hệ của từng biến với khả năng vỡ nợ; và định hướng xây dựng đặc trưng bằng cách đề xuất ý tưởng kết hợp các biến để tạo ra các biến phái sinh phục vụ mô hình hóa ở bước tiếp theo.</w:t>
+      </w:r>
+    </w:p>
+    <w:p>
+      <w:pPr>
+        <w:pStyle w:val="Heading2"/>
+        <w:spacing w:before="160" w:after="80"/>
+      </w:pPr>
+      <w:r>
+        <w:rPr>
+          <w:sz w:val="28"/>
+        </w:rPr>
+        <w:t>3.2. Phân chia biến theo nhóm ý nghĩa nghiệp vụ</w:t>
+      </w:r>
+    </w:p>
+    <w:p>
+      <w:pPr>
+        <w:spacing w:after="120" w:line="276" w:lineRule="auto"/>
+      </w:pPr>
+      <w:r>
+        <w:rPr>
+          <w:sz w:val="26"/>
+        </w:rPr>
+        <w:t>Trước khi phân tích chi tiết, toàn bộ các cột trong bảng application_flat_cleaned được chia thành 9 nhóm biến theo ý nghĩa nghiệp vụ. Cách chia này giúp việc phân tích được triển khai theo từng góc nhìn rõ ràng, dễ so sánh mức độ liên quan của từng nhóm biến với target và thuận tiện khi tổng hợp insight cho bước xây dựng đặc trưng ở phần sau. Bảng 3.1 trình bày 9 nhóm biến cùng câu hỏi phân tích tương ứng của từng nhóm.</w:t>
+      </w:r>
+    </w:p>
+    <w:tbl>
+      <w:tblPr>
+        <w:tblStyle w:val="TableGrid"/>
+        <w:tblW w:type="auto" w:w="0"/>
+        <w:jc w:val="center"/>
+        <w:tblLook w:firstColumn="1" w:firstRow="1" w:lastColumn="0" w:lastRow="0" w:noHBand="0" w:noVBand="1" w:val="04A0"/>
+      </w:tblPr>
+      <w:tblGrid>
+        <w:gridCol w:w="2545"/>
+        <w:gridCol w:w="2545"/>
+        <w:gridCol w:w="2545"/>
+        <w:gridCol w:w="2545"/>
+      </w:tblGrid>
+      <w:tr>
+        <w:tc>
+          <w:tcPr>
+            <w:tcW w:type="dxa" w:w="700"/>
+          </w:tcPr>
+          <w:p>
+            <w:r/>
+            <w:r>
+              <w:rPr>
+                <w:rFonts w:ascii="Times New Roman" w:hAnsi="Times New Roman"/>
+                <w:b/>
+                <w:sz w:val="22"/>
+              </w:rPr>
+              <w:t>Nhóm</w:t>
+            </w:r>
+          </w:p>
+        </w:tc>
+        <w:tc>
+          <w:tcPr>
+            <w:tcW w:type="dxa" w:w="2300"/>
+          </w:tcPr>
+          <w:p>
+            <w:r/>
+            <w:r>
+              <w:rPr>
+                <w:rFonts w:ascii="Times New Roman" w:hAnsi="Times New Roman"/>
+                <w:b/>
+                <w:sz w:val="22"/>
+              </w:rPr>
+              <w:t>Tên nhóm biến</w:t>
+            </w:r>
+          </w:p>
+        </w:tc>
+        <w:tc>
+          <w:tcPr>
+            <w:tcW w:type="dxa" w:w="4400"/>
+          </w:tcPr>
+          <w:p>
+            <w:r/>
+            <w:r>
+              <w:rPr>
+                <w:rFonts w:ascii="Times New Roman" w:hAnsi="Times New Roman"/>
+                <w:b/>
+                <w:sz w:val="22"/>
+              </w:rPr>
+              <w:t>Các cột chính trong nhóm</w:t>
+            </w:r>
+          </w:p>
+        </w:tc>
+        <w:tc>
+          <w:tcPr>
+            <w:tcW w:type="dxa" w:w="3000"/>
+          </w:tcPr>
+          <w:p>
+            <w:r/>
+            <w:r>
+              <w:rPr>
+                <w:rFonts w:ascii="Times New Roman" w:hAnsi="Times New Roman"/>
+                <w:b/>
+                <w:sz w:val="22"/>
+              </w:rPr>
+              <w:t>Câu hỏi phân tích</w:t>
+            </w:r>
+          </w:p>
+        </w:tc>
+      </w:tr>
+      <w:tr>
+        <w:tc>
+          <w:tcPr>
+            <w:tcW w:type="dxa" w:w="700"/>
+          </w:tcPr>
+          <w:p>
+            <w:r/>
+            <w:r>
+              <w:rPr>
+                <w:rFonts w:ascii="Times New Roman" w:hAnsi="Times New Roman"/>
+                <w:sz w:val="22"/>
+              </w:rPr>
+              <w:t>1</w:t>
+            </w:r>
+          </w:p>
+        </w:tc>
+        <w:tc>
+          <w:tcPr>
+            <w:tcW w:type="dxa" w:w="2300"/>
+          </w:tcPr>
+          <w:p>
+            <w:r/>
+            <w:r>
+              <w:rPr>
+                <w:rFonts w:ascii="Times New Roman" w:hAnsi="Times New Roman"/>
+                <w:sz w:val="22"/>
+              </w:rPr>
+              <w:t>Nhân khẩu học, gia đình và công việc</w:t>
+            </w:r>
+          </w:p>
+        </w:tc>
+        <w:tc>
+          <w:tcPr>
+            <w:tcW w:type="dxa" w:w="4400"/>
+          </w:tcPr>
+          <w:p>
+            <w:r/>
+            <w:r>
+              <w:rPr>
+                <w:rFonts w:ascii="Times New Roman" w:hAnsi="Times New Roman"/>
+                <w:sz w:val="22"/>
+              </w:rPr>
+              <w:t>Giới tính, số con, quy mô gia đình, tình trạng hôn nhân, học vấn, loại thu nhập, nghề nghiệp, tổ chức làm việc, ngày sinh, thời gian làm việc</w:t>
+            </w:r>
+          </w:p>
+        </w:tc>
+        <w:tc>
+          <w:tcPr>
+            <w:tcW w:type="dxa" w:w="3000"/>
+          </w:tcPr>
+          <w:p>
+            <w:r/>
+            <w:r>
+              <w:rPr>
+                <w:rFonts w:ascii="Times New Roman" w:hAnsi="Times New Roman"/>
+                <w:sz w:val="22"/>
+              </w:rPr>
+              <w:t>Đặc điểm khách hàng và hoàn cảnh gia đình nào liên quan đến rủi ro</w:t>
+            </w:r>
+          </w:p>
+        </w:tc>
+      </w:tr>
+      <w:tr>
+        <w:tc>
+          <w:tcPr>
+            <w:tcW w:type="dxa" w:w="700"/>
+          </w:tcPr>
+          <w:p>
+            <w:r/>
+            <w:r>
+              <w:rPr>
+                <w:rFonts w:ascii="Times New Roman" w:hAnsi="Times New Roman"/>
+                <w:sz w:val="22"/>
+              </w:rPr>
+              <w:t>2</w:t>
+            </w:r>
+          </w:p>
+        </w:tc>
+        <w:tc>
+          <w:tcPr>
+            <w:tcW w:type="dxa" w:w="2300"/>
+          </w:tcPr>
+          <w:p>
+            <w:r/>
+            <w:r>
+              <w:rPr>
+                <w:rFonts w:ascii="Times New Roman" w:hAnsi="Times New Roman"/>
+                <w:sz w:val="22"/>
+              </w:rPr>
+              <w:t>Tài chính và khoản vay</w:t>
+            </w:r>
+          </w:p>
+        </w:tc>
+        <w:tc>
+          <w:tcPr>
+            <w:tcW w:type="dxa" w:w="4400"/>
+          </w:tcPr>
+          <w:p>
+            <w:r/>
+            <w:r>
+              <w:rPr>
+                <w:rFonts w:ascii="Times New Roman" w:hAnsi="Times New Roman"/>
+                <w:sz w:val="22"/>
+              </w:rPr>
+              <w:t>Tổng thu nhập, khoản vay, tiền trả góp, giá trị tài sản mua</w:t>
+            </w:r>
+          </w:p>
+        </w:tc>
+        <w:tc>
+          <w:tcPr>
+            <w:tcW w:type="dxa" w:w="3000"/>
+          </w:tcPr>
+          <w:p>
+            <w:r/>
+            <w:r>
+              <w:rPr>
+                <w:rFonts w:ascii="Times New Roman" w:hAnsi="Times New Roman"/>
+                <w:sz w:val="22"/>
+              </w:rPr>
+              <w:t>Năng lực tài chính và áp lực khoản vay ảnh hưởng đến rủi ro như thế nào</w:t>
+            </w:r>
+          </w:p>
+        </w:tc>
+      </w:tr>
+      <w:tr>
+        <w:tc>
+          <w:tcPr>
+            <w:tcW w:type="dxa" w:w="700"/>
+          </w:tcPr>
+          <w:p>
+            <w:r/>
+            <w:r>
+              <w:rPr>
+                <w:rFonts w:ascii="Times New Roman" w:hAnsi="Times New Roman"/>
+                <w:sz w:val="22"/>
+              </w:rPr>
+              <w:t>3</w:t>
+            </w:r>
+          </w:p>
+        </w:tc>
+        <w:tc>
+          <w:tcPr>
+            <w:tcW w:type="dxa" w:w="2300"/>
+          </w:tcPr>
+          <w:p>
+            <w:r/>
+            <w:r>
+              <w:rPr>
+                <w:rFonts w:ascii="Times New Roman" w:hAnsi="Times New Roman"/>
+                <w:sz w:val="22"/>
+              </w:rPr>
+              <w:t>Lịch sử tín dụng từ bảng phụ</w:t>
+            </w:r>
+          </w:p>
+        </w:tc>
+        <w:tc>
+          <w:tcPr>
+            <w:tcW w:type="dxa" w:w="4400"/>
+          </w:tcPr>
+          <w:p>
+            <w:r/>
+            <w:r>
+              <w:rPr>
+                <w:rFonts w:ascii="Times New Roman" w:hAnsi="Times New Roman"/>
+                <w:sz w:val="22"/>
+              </w:rPr>
+              <w:t>Các cột tổng hợp từ Bureau, khoản vay trước, trả góp, giao dịch POS và thẻ tín dụng</w:t>
+            </w:r>
+          </w:p>
+        </w:tc>
+        <w:tc>
+          <w:tcPr>
+            <w:tcW w:type="dxa" w:w="3000"/>
+          </w:tcPr>
+          <w:p>
+            <w:r/>
+            <w:r>
+              <w:rPr>
+                <w:rFonts w:ascii="Times New Roman" w:hAnsi="Times New Roman"/>
+                <w:sz w:val="22"/>
+              </w:rPr>
+              <w:t>Lịch sử vay và hành vi thanh toán trước đây dự báo rủi ro hiện tại ra sao</w:t>
+            </w:r>
+          </w:p>
+        </w:tc>
+      </w:tr>
+      <w:tr>
+        <w:tc>
+          <w:tcPr>
+            <w:tcW w:type="dxa" w:w="700"/>
+          </w:tcPr>
+          <w:p>
+            <w:r/>
+            <w:r>
+              <w:rPr>
+                <w:rFonts w:ascii="Times New Roman" w:hAnsi="Times New Roman"/>
+                <w:sz w:val="22"/>
+              </w:rPr>
+              <w:t>4</w:t>
+            </w:r>
+          </w:p>
+        </w:tc>
+        <w:tc>
+          <w:tcPr>
+            <w:tcW w:type="dxa" w:w="2300"/>
+          </w:tcPr>
+          <w:p>
+            <w:r/>
+            <w:r>
+              <w:rPr>
+                <w:rFonts w:ascii="Times New Roman" w:hAnsi="Times New Roman"/>
+                <w:sz w:val="22"/>
+              </w:rPr>
+              <w:t>Nhà ở và tài sản</w:t>
+            </w:r>
+          </w:p>
+        </w:tc>
+        <w:tc>
+          <w:tcPr>
+            <w:tcW w:type="dxa" w:w="4400"/>
+          </w:tcPr>
+          <w:p>
+            <w:r/>
+            <w:r>
+              <w:rPr>
+                <w:rFonts w:ascii="Times New Roman" w:hAnsi="Times New Roman"/>
+                <w:sz w:val="22"/>
+              </w:rPr>
+              <w:t>Loại nhà, sở hữu xe, sở hữu bất động sản và các chỉ số đặc điểm nhà ở</w:t>
+            </w:r>
+          </w:p>
+        </w:tc>
+        <w:tc>
+          <w:tcPr>
+            <w:tcW w:type="dxa" w:w="3000"/>
+          </w:tcPr>
+          <w:p>
+            <w:r/>
+            <w:r>
+              <w:rPr>
+                <w:rFonts w:ascii="Times New Roman" w:hAnsi="Times New Roman"/>
+                <w:sz w:val="22"/>
+              </w:rPr>
+              <w:t>Điều kiện nhà ở và tài sản sở hữu có liên hệ với rủi ro không</w:t>
+            </w:r>
+          </w:p>
+        </w:tc>
+      </w:tr>
+      <w:tr>
+        <w:tc>
+          <w:tcPr>
+            <w:tcW w:type="dxa" w:w="700"/>
+          </w:tcPr>
+          <w:p>
+            <w:r/>
+            <w:r>
+              <w:rPr>
+                <w:rFonts w:ascii="Times New Roman" w:hAnsi="Times New Roman"/>
+                <w:sz w:val="22"/>
+              </w:rPr>
+              <w:t>5</w:t>
+            </w:r>
+          </w:p>
+        </w:tc>
+        <w:tc>
+          <w:tcPr>
+            <w:tcW w:type="dxa" w:w="2300"/>
+          </w:tcPr>
+          <w:p>
+            <w:r/>
+            <w:r>
+              <w:rPr>
+                <w:rFonts w:ascii="Times New Roman" w:hAnsi="Times New Roman"/>
+                <w:sz w:val="22"/>
+              </w:rPr>
+              <w:t>Hồ sơ đăng ký vay</w:t>
+            </w:r>
+          </w:p>
+        </w:tc>
+        <w:tc>
+          <w:tcPr>
+            <w:tcW w:type="dxa" w:w="4400"/>
+          </w:tcPr>
+          <w:p>
+            <w:r/>
+            <w:r>
+              <w:rPr>
+                <w:rFonts w:ascii="Times New Roman" w:hAnsi="Times New Roman"/>
+                <w:sz w:val="22"/>
+              </w:rPr>
+              <w:t>Loại hợp đồng, người đi cùng, thứ và giờ đăng ký, thời gian đăng ký, ngày cấp giấy tờ</w:t>
+            </w:r>
+          </w:p>
+        </w:tc>
+        <w:tc>
+          <w:tcPr>
+            <w:tcW w:type="dxa" w:w="3000"/>
+          </w:tcPr>
+          <w:p>
+            <w:r/>
+            <w:r>
+              <w:rPr>
+                <w:rFonts w:ascii="Times New Roman" w:hAnsi="Times New Roman"/>
+                <w:sz w:val="22"/>
+              </w:rPr>
+              <w:t>Đặc điểm của thời điểm và hình thức đăng ký vay có tạo khác biệt rủi ro không</w:t>
+            </w:r>
+          </w:p>
+        </w:tc>
+      </w:tr>
+      <w:tr>
+        <w:tc>
+          <w:tcPr>
+            <w:tcW w:type="dxa" w:w="700"/>
+          </w:tcPr>
+          <w:p>
+            <w:r/>
+            <w:r>
+              <w:rPr>
+                <w:rFonts w:ascii="Times New Roman" w:hAnsi="Times New Roman"/>
+                <w:sz w:val="22"/>
+              </w:rPr>
+              <w:t>6</w:t>
+            </w:r>
+          </w:p>
+        </w:tc>
+        <w:tc>
+          <w:tcPr>
+            <w:tcW w:type="dxa" w:w="2300"/>
+          </w:tcPr>
+          <w:p>
+            <w:r/>
+            <w:r>
+              <w:rPr>
+                <w:rFonts w:ascii="Times New Roman" w:hAnsi="Times New Roman"/>
+                <w:sz w:val="22"/>
+              </w:rPr>
+              <w:t>Khu vực và quan hệ xã hội</w:t>
+            </w:r>
+          </w:p>
+        </w:tc>
+        <w:tc>
+          <w:tcPr>
+            <w:tcW w:type="dxa" w:w="4400"/>
+          </w:tcPr>
+          <w:p>
+            <w:r/>
+            <w:r>
+              <w:rPr>
+                <w:rFonts w:ascii="Times New Roman" w:hAnsi="Times New Roman"/>
+                <w:sz w:val="22"/>
+              </w:rPr>
+              <w:t>Mật độ dân số, xếp hạng khu vực, khác biệt giữa nơi ở và nơi làm việc, quan hệ xã hội</w:t>
+            </w:r>
+          </w:p>
+        </w:tc>
+        <w:tc>
+          <w:tcPr>
+            <w:tcW w:type="dxa" w:w="3000"/>
+          </w:tcPr>
+          <w:p>
+            <w:r/>
+            <w:r>
+              <w:rPr>
+                <w:rFonts w:ascii="Times New Roman" w:hAnsi="Times New Roman"/>
+                <w:sz w:val="22"/>
+              </w:rPr>
+              <w:t>Khu vực sinh sống, làm việc và môi trường xã hội ảnh hưởng thế nào</w:t>
+            </w:r>
+          </w:p>
+        </w:tc>
+      </w:tr>
+      <w:tr>
+        <w:tc>
+          <w:tcPr>
+            <w:tcW w:type="dxa" w:w="700"/>
+          </w:tcPr>
+          <w:p>
+            <w:r/>
+            <w:r>
+              <w:rPr>
+                <w:rFonts w:ascii="Times New Roman" w:hAnsi="Times New Roman"/>
+                <w:sz w:val="22"/>
+              </w:rPr>
+              <w:t>7</w:t>
+            </w:r>
+          </w:p>
+        </w:tc>
+        <w:tc>
+          <w:tcPr>
+            <w:tcW w:type="dxa" w:w="2300"/>
+          </w:tcPr>
+          <w:p>
+            <w:r/>
+            <w:r>
+              <w:rPr>
+                <w:rFonts w:ascii="Times New Roman" w:hAnsi="Times New Roman"/>
+                <w:sz w:val="22"/>
+              </w:rPr>
+              <w:t>Liên lạc và giấy tờ</w:t>
+            </w:r>
+          </w:p>
+        </w:tc>
+        <w:tc>
+          <w:tcPr>
+            <w:tcW w:type="dxa" w:w="4400"/>
+          </w:tcPr>
+          <w:p>
+            <w:r/>
+            <w:r>
+              <w:rPr>
+                <w:rFonts w:ascii="Times New Roman" w:hAnsi="Times New Roman"/>
+                <w:sz w:val="22"/>
+              </w:rPr>
+              <w:t>Các kênh liên lạc, thời điểm đổi số điện thoại, số lượng giấy tờ cung cấp</w:t>
+            </w:r>
+          </w:p>
+        </w:tc>
+        <w:tc>
+          <w:tcPr>
+            <w:tcW w:type="dxa" w:w="3000"/>
+          </w:tcPr>
+          <w:p>
+            <w:r/>
+            <w:r>
+              <w:rPr>
+                <w:rFonts w:ascii="Times New Roman" w:hAnsi="Times New Roman"/>
+                <w:sz w:val="22"/>
+              </w:rPr>
+              <w:t>Thông tin liên lạc, giấy tờ và mức độ ổn định của thông tin có liên hệ với rủi ro không</w:t>
+            </w:r>
+          </w:p>
+        </w:tc>
+      </w:tr>
+      <w:tr>
+        <w:tc>
+          <w:tcPr>
+            <w:tcW w:type="dxa" w:w="700"/>
+          </w:tcPr>
+          <w:p>
+            <w:r/>
+            <w:r>
+              <w:rPr>
+                <w:rFonts w:ascii="Times New Roman" w:hAnsi="Times New Roman"/>
+                <w:sz w:val="22"/>
+              </w:rPr>
+              <w:t>8</w:t>
+            </w:r>
+          </w:p>
+        </w:tc>
+        <w:tc>
+          <w:tcPr>
+            <w:tcW w:type="dxa" w:w="2300"/>
+          </w:tcPr>
+          <w:p>
+            <w:r/>
+            <w:r>
+              <w:rPr>
+                <w:rFonts w:ascii="Times New Roman" w:hAnsi="Times New Roman"/>
+                <w:sz w:val="22"/>
+              </w:rPr>
+              <w:t>Điểm đánh giá bên ngoài</w:t>
+            </w:r>
+          </w:p>
+        </w:tc>
+        <w:tc>
+          <w:tcPr>
+            <w:tcW w:type="dxa" w:w="4400"/>
+          </w:tcPr>
+          <w:p>
+            <w:r/>
+            <w:r>
+              <w:rPr>
+                <w:rFonts w:ascii="Times New Roman" w:hAnsi="Times New Roman"/>
+                <w:sz w:val="22"/>
+              </w:rPr>
+              <w:t>Ba điểm đánh giá bên ngoài: ext_source_1, ext_source_2, ext_source_3</w:t>
+            </w:r>
+          </w:p>
+        </w:tc>
+        <w:tc>
+          <w:tcPr>
+            <w:tcW w:type="dxa" w:w="3000"/>
+          </w:tcPr>
+          <w:p>
+            <w:r/>
+            <w:r>
+              <w:rPr>
+                <w:rFonts w:ascii="Times New Roman" w:hAnsi="Times New Roman"/>
+                <w:sz w:val="22"/>
+              </w:rPr>
+              <w:t>Các điểm đánh giá bên ngoài phân tách rủi ro tốt đến đâu</w:t>
+            </w:r>
+          </w:p>
+        </w:tc>
+      </w:tr>
+      <w:tr>
+        <w:tc>
+          <w:tcPr>
+            <w:tcW w:type="dxa" w:w="700"/>
+          </w:tcPr>
+          <w:p>
+            <w:r/>
+            <w:r>
+              <w:rPr>
+                <w:rFonts w:ascii="Times New Roman" w:hAnsi="Times New Roman"/>
+                <w:sz w:val="22"/>
+              </w:rPr>
+              <w:t>9</w:t>
+            </w:r>
+          </w:p>
+        </w:tc>
+        <w:tc>
+          <w:tcPr>
+            <w:tcW w:type="dxa" w:w="2300"/>
+          </w:tcPr>
+          <w:p>
+            <w:r/>
+            <w:r>
+              <w:rPr>
+                <w:rFonts w:ascii="Times New Roman" w:hAnsi="Times New Roman"/>
+                <w:sz w:val="22"/>
+              </w:rPr>
+              <w:t>Lần tra cứu tín dụng gần đây</w:t>
+            </w:r>
+          </w:p>
+        </w:tc>
+        <w:tc>
+          <w:tcPr>
+            <w:tcW w:type="dxa" w:w="4400"/>
+          </w:tcPr>
+          <w:p>
+            <w:r/>
+            <w:r>
+              <w:rPr>
+                <w:rFonts w:ascii="Times New Roman" w:hAnsi="Times New Roman"/>
+                <w:sz w:val="22"/>
+              </w:rPr>
+              <w:t>Số lần tra cứu tín dụng theo các mốc thời gian gần đây</w:t>
+            </w:r>
+          </w:p>
+        </w:tc>
+        <w:tc>
+          <w:tcPr>
+            <w:tcW w:type="dxa" w:w="3000"/>
+          </w:tcPr>
+          <w:p>
+            <w:r/>
+            <w:r>
+              <w:rPr>
+                <w:rFonts w:ascii="Times New Roman" w:hAnsi="Times New Roman"/>
+                <w:sz w:val="22"/>
+              </w:rPr>
+              <w:t>Tần suất tra cứu tín dụng gần đây có liên hệ với rủi ro không</w:t>
+            </w:r>
+          </w:p>
+        </w:tc>
+      </w:tr>
+    </w:tbl>
+    <w:p>
+      <w:pPr>
+        <w:pStyle w:val="Heading2"/>
+        <w:spacing w:before="160" w:after="80"/>
+      </w:pPr>
+      <w:r>
+        <w:rPr>
+          <w:sz w:val="28"/>
+        </w:rPr>
+        <w:t>3.3. Kết quả phân tích theo từng nhóm biến</w:t>
+      </w:r>
+    </w:p>
+    <w:p>
+      <w:pPr>
+        <w:spacing w:after="120" w:line="276" w:lineRule="auto"/>
+      </w:pPr>
+      <w:r>
+        <w:rPr>
+          <w:sz w:val="26"/>
+        </w:rPr>
+        <w:t>Phần dưới đây tóm tắt kết quả phân tích của từng nhóm biến trong Bảng 3.1, mỗi nhóm gắn liền với câu hỏi phân tích tương ứng và định hướng sử dụng cho bước xây dựng đặc trưng.</w:t>
+      </w:r>
+    </w:p>
+    <w:p>
+      <w:pPr>
+        <w:pStyle w:val="ListParagraph"/>
+        <w:spacing w:after="60"/>
+        <w:ind w:left="480" w:hanging="240"/>
+      </w:pPr>
+      <w:r>
+        <w:rPr>
+          <w:rFonts w:ascii="Times New Roman" w:hAnsi="Times New Roman"/>
+          <w:sz w:val="26"/>
+        </w:rPr>
+        <w:t>• Nhóm 1, Nhân khẩu học, gia đình và công việc: tuổi là tín hiệu rõ nhất, tỷ lệ vỡ nợ giảm dần từ hơn 12% ở nhóm dưới 25 tuổi xuống 5,22% ở nhóm từ 55 tuổi trở lên; nam giới có tỷ lệ vỡ nợ hơn 10%, cao hơn nữ giới. Tình trạng hôn nhân, số con và quy mô gia đình có liên hệ với rủi ro nhưng không hoàn toàn theo một chiều, cần kết hợp thêm thu nhập để đánh giá đầy đủ hơn. Học vấn càng cao thì rủi ro càng thấp, trong khi nhóm thất nghiệp và nghỉ thai sản có tỷ lệ vỡ nợ rất cao, khoảng 40 đến 42%. Nghề nghiệp và loại tổ chức làm việc cũng phân tách khá rõ, ví dụ lao động tay nghề thấp có tỷ lệ vỡ nợ khoảng 17,2%. Thời gian làm việc càng dài thì rủi ro càng thấp, và nhóm có mã thời gian làm việc đặc biệt 365243 ngày phát hiện từ Chương 2 lại có tỷ lệ vỡ nợ thấp hơn nhóm bình thường.</w:t>
+      </w:r>
+    </w:p>
+    <w:p>
+      <w:pPr>
+        <w:pStyle w:val="ListParagraph"/>
+        <w:spacing w:after="60"/>
+        <w:ind w:left="480" w:hanging="240"/>
+      </w:pPr>
+      <w:r>
+        <w:rPr>
+          <w:rFonts w:ascii="Times New Roman" w:hAnsi="Times New Roman"/>
+          <w:sz w:val="26"/>
+        </w:rPr>
+        <w:t>• Nhóm 2, Tài chính và khoản vay: tổng thu nhập, khoản vay, tiền trả góp và giá trị tài sản mua đều có liên hệ với rủi ro nhưng không theo một chiều khi xét riêng từng biến; nhóm thu nhập rất cao có tỷ lệ vỡ nợ thấp nhất, khoảng 6,5%. Hai tỷ số tài chính được tính thêm là DTI, tỷ lệ trả góp trên thu nhập, và LTV, tỷ lệ khoản vay trên giá trị tài sản, cho tín hiệu rõ hơn: tỷ lệ vỡ nợ tăng từ khoảng 7,2% ở nhóm DTI thấp nhất lên 8,6% ở nhóm cao nhất, còn với LTV thì tăng mạnh hơn, lên đến 11,5% ở nhóm cao nhất. Khi cả DTI và LTV đều cao, tỷ lệ vỡ nợ đạt mức cao nhất, khoảng 13,3%.</w:t>
+      </w:r>
+    </w:p>
+    <w:p>
+      <w:pPr>
+        <w:pStyle w:val="ListParagraph"/>
+        <w:spacing w:after="60"/>
+        <w:ind w:left="480" w:hanging="240"/>
+      </w:pPr>
+      <w:r>
+        <w:rPr>
+          <w:rFonts w:ascii="Times New Roman" w:hAnsi="Times New Roman"/>
+          <w:sz w:val="26"/>
+        </w:rPr>
+        <w:t>• Nhóm 3, Lịch sử tín dụng từ bảng phụ: lịch sử tín dụng tại tổ chức khác, gọi tắt là Bureau, và lịch sử vay tại Home Credit cho tín hiệu ngược chiều nhau nên được giữ riêng thành hai cờ thay vì gộp chung. Dư nợ còn lại là tín hiệu rõ nhất: khách không còn dư nợ có tỷ lệ vỡ nợ chỉ khoảng 5,59%, trong khi nhóm dư nợ cao khoảng 9,05%. Khách từng chậm thanh toán ở Bureau, khoản vay trước hoặc giao dịch POS và Cash thường có tỷ lệ vỡ nợ cao hơn. Khoản vay Bureau càng gần đây thì rủi ro càng cao, khoảng 10,2% trong 6 tháng gần nhất và giảm còn 5,5% khi đã quá 2 năm.</w:t>
+      </w:r>
+    </w:p>
+    <w:p>
+      <w:pPr>
+        <w:pStyle w:val="ListParagraph"/>
+        <w:spacing w:after="60"/>
+        <w:ind w:left="480" w:hanging="240"/>
+      </w:pPr>
+      <w:r>
+        <w:rPr>
+          <w:rFonts w:ascii="Times New Roman" w:hAnsi="Times New Roman"/>
+          <w:sz w:val="26"/>
+        </w:rPr>
+        <w:t>• Nhóm 4, Nhà ở và tài sản: khách thuê nhà có tỷ lệ vỡ nợ 12,3% và khách ở cùng bố mẹ 11,8%, đều cao hơn khách sở hữu nhà chính chủ chỉ 7,82%. Sở hữu ô tô phân tách rủi ro rõ hơn sở hữu bất động sản. Trong nhóm khách có xe, xe từ 7 năm tuổi trở lên có rủi ro cao hơn xe mới. Vật liệu tường nhà và việc có hay không có dữ liệu khảo sát nhà ở cũng cho tín hiệu, nhưng phần lớn giá trị thiếu ở nhóm này phản ánh việc khảo sát không phủ hết khách hàng chứ không phải khách không sở hữu nhà. Riêng các chỉ số định lượng về diện tích và kết cấu nhà ở có tương quan rất yếu với rủi ro nên không được ưu tiên sử dụng.</w:t>
+      </w:r>
+    </w:p>
+    <w:p>
+      <w:pPr>
+        <w:pStyle w:val="ListParagraph"/>
+        <w:spacing w:after="60"/>
+        <w:ind w:left="480" w:hanging="240"/>
+      </w:pPr>
+      <w:r>
+        <w:rPr>
+          <w:rFonts w:ascii="Times New Roman" w:hAnsi="Times New Roman"/>
+          <w:sz w:val="26"/>
+        </w:rPr>
+        <w:t>• Nhóm 5, Hồ sơ đăng ký vay: ba tín hiệu mạnh nhất của nhóm này là độ mới của giấy tờ tùy thân, với tỷ lệ vỡ nợ giảm từ 10,22% xuống 6,72% khi giấy tờ càng cũ; thời điểm trung bình của lịch sử vay trước, giảm từ 10,95% xuống 6,51%; và thời gian từ lần đăng ký thường trú gần nhất. Loại hợp đồng vay cũng có khác biệt, nhưng chênh lệch giữa vay hạn mức quay vòng và vay tiền mặt chủ yếu đến từ quy mô khoản vay chứ không phải bản chất sản phẩm. Giờ nộp hồ sơ vào sáng sớm có rủi ro cao hơn rõ so với nộp vào chiều tối. Thứ trong tuần nộp hồ sơ và người đi cùng khi nộp hồ sơ có tín hiệu rất yếu nên không được ưu tiên sử dụng.</w:t>
+      </w:r>
+    </w:p>
+    <w:p>
+      <w:pPr>
+        <w:pStyle w:val="ListParagraph"/>
+        <w:spacing w:after="60"/>
+        <w:ind w:left="480" w:hanging="240"/>
+      </w:pPr>
+      <w:r>
+        <w:rPr>
+          <w:rFonts w:ascii="Times New Roman" w:hAnsi="Times New Roman"/>
+          <w:sz w:val="26"/>
+        </w:rPr>
+        <w:t>• Nhóm 6, Khu vực và quan hệ xã hội: xếp hạng khu vực sinh sống có liên hệ rõ với rủi ro, tăng từ khoảng 4,9% ở mức 1 lên 11,1% ở mức 3; mật độ dân số có tín hiệu yếu hơn. Sự khác biệt giữa nơi đăng ký, nơi ở và nơi làm việc ở cấp thành phố cho tín hiệu rõ hơn cấp khu vực, ví dụ khác thành phố giữa đăng ký và nơi ở làm rủi ro tăng từ 7,7% lên 12,3%. Số người quen từng vỡ nợ cũng là tín hiệu đáng chú ý, rủi ro tăng dần từ 7,8% khi không có ai đến 12,7% khi có từ 2 người trở lên.</w:t>
+      </w:r>
+    </w:p>
+    <w:p>
+      <w:pPr>
+        <w:pStyle w:val="ListParagraph"/>
+        <w:spacing w:after="60"/>
+        <w:ind w:left="480" w:hanging="240"/>
+      </w:pPr>
+      <w:r>
+        <w:rPr>
+          <w:rFonts w:ascii="Times New Roman" w:hAnsi="Times New Roman"/>
+          <w:sz w:val="26"/>
+        </w:rPr>
+        <w:t>• Nhóm 7, Liên lạc và giấy tờ: khách có điện thoại cơ quan hoặc số điện thoại nơi làm việc có tỷ lệ vỡ nợ cao hơn nhóm không có, trong khi khách có số điện thoại cố định lại có rủi ro thấp hơn. Khách mới đổi số điện thoại trong vòng 1 năm có tỷ lệ vỡ nợ khoảng 9,4 đến 10,1%, cao hơn nhóm giữ số lâu hơn 1 năm chỉ khoảng 7,4%. Số lượng giấy tờ cung cấp cũng có tín hiệu nhưng không tăng đều theo số lượng.</w:t>
+      </w:r>
+    </w:p>
+    <w:p>
+      <w:pPr>
+        <w:pStyle w:val="ListParagraph"/>
+        <w:spacing w:after="60"/>
+        <w:ind w:left="480" w:hanging="240"/>
+      </w:pPr>
+      <w:r>
+        <w:rPr>
+          <w:rFonts w:ascii="Times New Roman" w:hAnsi="Times New Roman"/>
+          <w:sz w:val="26"/>
+        </w:rPr>
+        <w:t>• Nhóm 8, Điểm đánh giá bên ngoài: đây là nhóm biến có khả năng phân tách rủi ro mạnh nhất trong toàn bộ dữ liệu. Cả ba điểm ext_source_1, ext_source_2, ext_source_3 đều cho thấy điểm càng cao thì rủi ro càng thấp; nhóm điểm từ 0,30 trở xuống có tỷ lệ vỡ nợ khoảng 14,5 đến 17,5%, trong khi nhóm điểm trên 0,70 chỉ khoảng 3,0 đến 3,3%. Khi tính điểm trung bình của cả ba nguồn, mức phân tách còn rõ hơn nữa, giảm từ khoảng 28,7% ở nhóm điểm thấp nhất xuống chỉ 1,2% ở nhóm điểm cao nhất.</w:t>
+      </w:r>
+    </w:p>
+    <w:p>
+      <w:pPr>
+        <w:pStyle w:val="ListParagraph"/>
+        <w:spacing w:after="60"/>
+        <w:ind w:left="480" w:hanging="240"/>
+      </w:pPr>
+      <w:r>
+        <w:rPr>
+          <w:rFonts w:ascii="Times New Roman" w:hAnsi="Times New Roman"/>
+          <w:sz w:val="26"/>
+        </w:rPr>
+        <w:t>• Nhóm 9, Lần tra cứu tín dụng gần đây: số lần tra cứu tín dụng trong 1 giờ, 1 ngày và 1 tuần gần nhất có tín hiệu rủi ro nhẹ, trong khi số lần tra cứu theo tháng, quý hoặc năm có tín hiệu yếu hơn và không nhất quán. Các nhóm ít khách trong từng mốc tra cứu cần được xem thêm về quy mô mẫu trước khi kết luận chắc chắn.</w:t>
+      </w:r>
+    </w:p>
+    <w:p>
+      <w:pPr>
+        <w:pStyle w:val="Heading2"/>
+        <w:spacing w:before="160" w:after="80"/>
+      </w:pPr>
+      <w:r>
+        <w:rPr>
+          <w:sz w:val="28"/>
+        </w:rPr>
+        <w:t>3.4. Phân tích đa biến và các insight nổi bật</w:t>
+      </w:r>
+    </w:p>
+    <w:p>
+      <w:pPr>
+        <w:spacing w:after="120" w:line="276" w:lineRule="auto"/>
+      </w:pPr>
+      <w:r>
+        <w:rPr>
+          <w:sz w:val="26"/>
+        </w:rPr>
+        <w:t>Ngoài phân tích từng nhóm biến riêng lẻ, nhóm còn thực hiện phân tích đa biến để kiểm tra ba mối quan hệ có khả năng ảnh hưởng lẫn nhau đến rủi ro vỡ nợ.</w:t>
+      </w:r>
+    </w:p>
+    <w:p>
+      <w:pPr>
+        <w:pStyle w:val="ListParagraph"/>
+        <w:spacing w:after="60"/>
+        <w:ind w:left="480" w:hanging="240"/>
+      </w:pPr>
+      <w:r>
+        <w:rPr>
+          <w:rFonts w:ascii="Times New Roman" w:hAnsi="Times New Roman"/>
+          <w:sz w:val="26"/>
+        </w:rPr>
+        <w:t>• Tuổi kết hợp với thu nhập: ở mọi mức thu nhập, khách dưới 25 tuổi luôn có tỷ lệ vỡ nợ cao nhất, từ 9,0% đến 13,3%, trong khi nhóm từ 55 tuổi trở lên chỉ khoảng 4,6 đến 5,4%. Thu nhập cao giúp giảm rủi ro trong từng nhóm tuổi, nhưng tuổi vẫn là tín hiệu mạnh hơn: khách trẻ có thu nhập rất cao vẫn rủi ro hơn khách lớn tuổi có thu nhập rất thấp.</w:t>
+      </w:r>
+    </w:p>
+    <w:p>
+      <w:pPr>
+        <w:pStyle w:val="ListParagraph"/>
+        <w:spacing w:after="60"/>
+        <w:ind w:left="480" w:hanging="240"/>
+      </w:pPr>
+      <w:r>
+        <w:rPr>
+          <w:rFonts w:ascii="Times New Roman" w:hAnsi="Times New Roman"/>
+          <w:sz w:val="26"/>
+        </w:rPr>
+        <w:t>• Lịch sử chậm trả kết hợp với dư nợ còn lại: khi không ghi nhận chậm trả, rủi ro chỉ từ 4,4 đến 7,5%, thấp hơn mức nền chung là 8,1%, kể cả ở nhóm dư nợ cao. Khi từng chậm trả ở ít nhất một nguồn, rủi ro tăng rõ ở mọi mức dư nợ, cao nhất khoảng 10,4 đến 10,5% ở nhóm vừa từng chậm trả vừa còn dư nợ cao hoặc rất cao.</w:t>
+      </w:r>
+    </w:p>
+    <w:p>
+      <w:pPr>
+        <w:pStyle w:val="ListParagraph"/>
+        <w:spacing w:after="60"/>
+        <w:ind w:left="480" w:hanging="240"/>
+      </w:pPr>
+      <w:r>
+        <w:rPr>
+          <w:rFonts w:ascii="Times New Roman" w:hAnsi="Times New Roman"/>
+          <w:sz w:val="26"/>
+        </w:rPr>
+        <w:t>• Điểm đánh giá bên ngoài kết hợp với tỷ lệ khoản vay trên tài sản, gọi tắt là LTV: đây là tổ hợp rủi ro rõ nhất trong toàn bộ phân tích. Khách có điểm đánh giá thấp và LTV cao có tỷ lệ vỡ nợ lên đến 33,1 đến 33,3%, trong khi khách có điểm đánh giá cao vẫn giữ rủi ro rất thấp dù LTV ở mức cao nhất, chỉ khoảng 2,2%.</w:t>
+      </w:r>
+    </w:p>
+    <w:p>
+      <w:pPr>
+        <w:spacing w:after="120" w:line="276" w:lineRule="auto"/>
+      </w:pPr>
+      <w:r>
+        <w:rPr>
+          <w:sz w:val="26"/>
+        </w:rPr>
+        <w:t>Những kết quả phân tích đa biến này cho thấy nhiều biến không nên chỉ được xem xét độc lập mà cần kết hợp với nhau khi xây dựng đặc trưng; đây cũng là cơ sở trực tiếp cho các đặc trưng tương tác được xây dựng ở phần tiếp theo.</w:t>
+      </w:r>
+    </w:p>
+    <w:p>
+      <w:pPr>
+        <w:pStyle w:val="Heading2"/>
+        <w:spacing w:before="160" w:after="80"/>
+      </w:pPr>
+      <w:r>
+        <w:rPr>
+          <w:sz w:val="28"/>
+        </w:rPr>
+        <w:t>3.5. Xây dựng đặc trưng: mục tiêu và định hướng</w:t>
+      </w:r>
+    </w:p>
+    <w:p>
+      <w:pPr>
+        <w:spacing w:after="120" w:line="276" w:lineRule="auto"/>
+      </w:pPr>
+      <w:r>
+        <w:rPr>
+          <w:sz w:val="26"/>
+        </w:rPr>
+        <w:t>Bước xây dựng đặc trưng, còn gọi là Feature Engineering, được thực hiện ở Notebook 05, sử dụng lại bảng application_flat_cleaned cùng toàn bộ insight đã tổng hợp từ bước khám phá dữ liệu ở trên. Mục tiêu của bước này là chuyển các phát hiện từ Chương 2 và các insight của EDA thành những đặc trưng có ý nghĩa nghiệp vụ cho bài toán dự báo rủi ro vỡ nợ, cụ thể là tạo tối thiểu 10 biến phái sinh, kiểm tra chất lượng và tín hiệu ban đầu của các biến này với target, sau đó lưu bộ đặc trưng được lựa chọn vào PostgreSQL để dùng cho bước xây dựng mô hình ở Chương 4.</w:t>
+      </w:r>
+    </w:p>
+    <w:p>
+      <w:pPr>
+        <w:spacing w:after="120" w:line="276" w:lineRule="auto"/>
+      </w:pPr>
+      <w:r>
+        <w:rPr>
+          <w:sz w:val="26"/>
+        </w:rPr>
+        <w:t>Mỗi đặc trưng mới được yêu cầu có công thức rõ ràng, không làm phát sinh thêm dòng khách hàng và có thể giải thích được ý nghĩa đối với rủi ro tín dụng. Việc xây dựng đặc trưng dựa trên hai nguồn định hướng chính.</w:t>
+      </w:r>
+    </w:p>
+    <w:p>
+      <w:pPr>
+        <w:pStyle w:val="ListParagraph"/>
+        <w:spacing w:after="60"/>
+        <w:ind w:left="480" w:hanging="240"/>
+      </w:pPr>
+      <w:r>
+        <w:rPr>
+          <w:rFonts w:ascii="Times New Roman" w:hAnsi="Times New Roman"/>
+          <w:sz w:val="26"/>
+        </w:rPr>
+        <w:t>• Từ Chương 2, làm sạch dữ liệu: các giá trị thiếu ở nhóm cột tổng hợp từ Bureau, khoản vay trước, trả góp, POS/Cash và thẻ tín dụng mang ý nghĩa chưa có lịch sử tương ứng chứ không phải lỗi dữ liệu. Vì vậy, các đặc trưng mới giữ nguyên ý nghĩa này bằng cách tạo cờ có hoặc không có lịch sử, thay vì điền giá trị 0 một cách máy móc cho toàn bộ nhóm cột.</w:t>
+      </w:r>
+    </w:p>
+    <w:p>
+      <w:pPr>
+        <w:pStyle w:val="ListParagraph"/>
+        <w:spacing w:after="60"/>
+        <w:ind w:left="480" w:hanging="240"/>
+      </w:pPr>
+      <w:r>
+        <w:rPr>
+          <w:rFonts w:ascii="Times New Roman" w:hAnsi="Times New Roman"/>
+          <w:sz w:val="26"/>
+        </w:rPr>
+        <w:t>• Từ kết quả khám phá dữ liệu ở trên: năm hướng đặc trưng được ưu tiên thử nghiệm là khả năng chi trả, thể hiện qua các tỷ số tài chính như LTV và DTI; lịch sử tín dụng, thể hiện qua dư nợ, chậm trả và độ gần đây theo từng nguồn; độ ổn định của khách hàng, thể hiện qua tuổi, thời gian làm việc, hồ sơ, nhà ở, khu vực và liên lạc; điểm đánh giá bên ngoài, gồm ba điểm ext_source và điểm trung bình; và các đặc trưng tương tác giữa tuổi với thu nhập, giữa chậm trả với dư nợ, và giữa điểm đánh giá ngoài với LTV.</w:t>
+      </w:r>
+    </w:p>
+    <w:p>
+      <w:pPr>
+        <w:pStyle w:val="Heading2"/>
+        <w:spacing w:before="160" w:after="80"/>
+      </w:pPr>
+      <w:r>
+        <w:rPr>
+          <w:sz w:val="28"/>
+        </w:rPr>
+        <w:t>3.6. Kết quả xây dựng đặc trưng mới</w:t>
+      </w:r>
+    </w:p>
+    <w:p>
+      <w:pPr>
+        <w:spacing w:after="120" w:line="276" w:lineRule="auto"/>
+      </w:pPr>
+      <w:r>
+        <w:rPr>
+          <w:sz w:val="26"/>
+        </w:rPr>
+        <w:t>Từ 127 cột gốc trong bảng application_flat_cleaned, Notebook 05 đã xây dựng thêm 30 đặc trưng mới, nâng tổng số cột lên 157. Các đặc trưng mới được chia thành 5 nhóm chính như sau.</w:t>
+      </w:r>
+    </w:p>
+    <w:p>
+      <w:pPr>
+        <w:pStyle w:val="ListParagraph"/>
+        <w:spacing w:after="60"/>
+        <w:ind w:left="480" w:hanging="240"/>
+      </w:pPr>
+      <w:r>
+        <w:rPr>
+          <w:rFonts w:ascii="Times New Roman" w:hAnsi="Times New Roman"/>
+          <w:sz w:val="26"/>
+        </w:rPr>
+        <w:t>• Tỷ số tài chính: gồm credit_to_income, tỷ lệ khoản vay trên thu nhập; dti, tỷ lệ trả góp trên thu nhập; ltv, tỷ lệ khoản vay trên giá trị tài sản; credit_term, tỷ lệ khoản vay trên trả góp, đại diện gần đúng cho số kỳ trả; và income_per_person, thu nhập chia cho số thành viên gia đình.</w:t>
+      </w:r>
+    </w:p>
+    <w:p>
+      <w:pPr>
+        <w:pStyle w:val="ListParagraph"/>
+        <w:spacing w:after="60"/>
+        <w:ind w:left="480" w:hanging="240"/>
+      </w:pPr>
+      <w:r>
+        <w:rPr>
+          <w:rFonts w:ascii="Times New Roman" w:hAnsi="Times New Roman"/>
+          <w:sz w:val="26"/>
+        </w:rPr>
+        <w:t>• Đặc điểm khách hàng và hồ sơ: gồm age_years và employment_years, đổi số ngày âm sang đơn vị năm để dễ diễn giải; employment_age_ratio, tỷ lệ thời gian làm việc trên tuổi; id_publish_years, độ mới của giấy tờ tùy thân theo năm; và application_hour_group, nhóm giờ nộp hồ sơ thành ba khung sáng sớm, hành chính và chiều tối.</w:t>
+      </w:r>
+    </w:p>
+    <w:p>
+      <w:pPr>
+        <w:pStyle w:val="ListParagraph"/>
+        <w:spacing w:after="60"/>
+        <w:ind w:left="480" w:hanging="240"/>
+      </w:pPr>
+      <w:r>
+        <w:rPr>
+          <w:rFonts w:ascii="Times New Roman" w:hAnsi="Times New Roman"/>
+          <w:sz w:val="26"/>
+        </w:rPr>
+        <w:t>• Điểm đánh giá bên ngoài: gồm ext_sources_mean, điểm trung bình; ext_sources_min, điểm thấp nhất; và ext_sources_std, độ lệch chuẩn, được tính từ ba điểm ext_source_1, ext_source_2 và ext_source_3.</w:t>
+      </w:r>
+    </w:p>
+    <w:p>
+      <w:pPr>
+        <w:pStyle w:val="ListParagraph"/>
+        <w:spacing w:after="60"/>
+        <w:ind w:left="480" w:hanging="240"/>
+      </w:pPr>
+      <w:r>
+        <w:rPr>
+          <w:rFonts w:ascii="Times New Roman" w:hAnsi="Times New Roman"/>
+          <w:sz w:val="26"/>
+        </w:rPr>
+        <w:t>• Lịch sử tín dụng theo từng nguồn: gồm các cờ has_bureau, has_previous, has_installments, has_pos_cash, has_credit_card cho biết khách có lịch sử tương ứng hay không; các đặc trưng về dư nợ và quá hạn tại Bureau là bureau_debt_ratio, has_bureau_overdue, bureau_recency_days; đặc trưng so sánh khoản vay hiện tại với lịch sử vay trước tại Home Credit là previous_credit_to_current và previous_recency_days; tỷ lệ thanh toán và cờ chậm trả ở lịch sử trả góp là installments_payment_ratio và has_installments_late; cùng các đặc trưng về POS/Cash và thẻ tín dụng là has_pos_cash_dpd và credit_card_utilization.</w:t>
+      </w:r>
+    </w:p>
+    <w:p>
+      <w:pPr>
+        <w:pStyle w:val="ListParagraph"/>
+        <w:spacing w:after="60"/>
+        <w:ind w:left="480" w:hanging="240"/>
+      </w:pPr>
+      <w:r>
+        <w:rPr>
+          <w:rFonts w:ascii="Times New Roman" w:hAnsi="Times New Roman"/>
+          <w:sz w:val="26"/>
+        </w:rPr>
+        <w:t>• Đặc trưng tương tác: gồm age_income_interaction, kết hợp nhóm tuổi và nhóm thu nhập; late_debt_interaction, kết hợp cờ từng chậm trả và nhóm dư nợ; và ext_ltv_interaction, kết hợp điểm đánh giá ngoài trung bình với tỷ lệ LTV. Quy ước chung cho mọi đặc trưng dạng tỷ số là chỉ thực hiện phép chia khi mẫu số khác 0, các trường hợp còn lại được chuyển thành giá trị thiếu để tránh sinh ra giá trị vô cực.</w:t>
+      </w:r>
+    </w:p>
+    <w:p>
+      <w:pPr>
+        <w:spacing w:after="120" w:line="276" w:lineRule="auto"/>
+      </w:pPr>
+      <w:r>
+        <w:rPr>
+          <w:sz w:val="26"/>
+        </w:rPr>
+        <w:t>Sau khi tạo xong bộ đặc trưng, nhóm kiểm tra lại toàn bộ dữ liệu và không phát hiện giá trị vô cực nào, vì mọi phép chia có mẫu số bằng 0 đều đã được chuyển thành giá trị thiếu trước đó. Một số tỷ số như ltv và credit_to_income vẫn có giá trị lớn bất thường so với phân vị 99%, cần được xem xét thêm ở bước huấn luyện mô hình. Giá trị thiếu còn lại tập trung ở các đặc trưng cần dữ liệu lịch sử tín dụng, ví dụ credit_card_utilization thiếu nhiều vì phần lớn khách hàng không có lịch sử thẻ tín dụng; đây là giá trị thiếu có ý nghĩa nghiệp vụ nên không được điền bằng 0 ở bước này.</w:t>
+      </w:r>
+    </w:p>
+    <w:p>
+      <w:pPr>
+        <w:pStyle w:val="Heading2"/>
+        <w:spacing w:before="160" w:after="80"/>
+      </w:pPr>
+      <w:r>
+        <w:rPr>
+          <w:sz w:val="28"/>
+        </w:rPr>
+        <w:t>3.7. Đánh giá và lựa chọn đặc trưng cho mô hình</w:t>
+      </w:r>
+    </w:p>
+    <w:p>
+      <w:pPr>
+        <w:spacing w:after="120" w:line="276" w:lineRule="auto"/>
+      </w:pPr>
+      <w:r>
+        <w:rPr>
+          <w:sz w:val="26"/>
+        </w:rPr>
+        <w:t>Nhóm đã kiểm tra mối liên hệ ban đầu giữa các đặc trưng mới với target để có cơ sở ưu tiên. Kết quả cho thấy ext_ltv_interaction có tương quan dương mạnh nhất với target, khoảng 0,23, cho thấy rủi ro tăng khi khách vừa có điểm đánh giá ngoài thấp vừa có LTV cao; ngược lại ext_sources_mean và ext_sources_min có tương quan âm rõ nhất. Các cờ ghi nhận quá hạn cũng cho khác biệt rõ, ví dụ khách từng quá hạn tại Bureau, tức has_bureau_overdue bằng 1, có tỷ lệ vỡ nợ gần 16%, cao hơn hẳn nhóm không ghi nhận quá hạn. Ngược lại, các cờ có lịch sử trả góp, POS/Cash, thẻ tín dụng hoặc hồ sơ vay trước thường đi kèm tỷ lệ vỡ nợ cao hơn nhóm không có lịch sử tương ứng; riêng has_bureau lại theo chiều ngược lại, khách có lịch sử Bureau có tỷ lệ vỡ nợ thấp hơn, cho thấy việc không có lịch sử tín dụng tại tổ chức khác cũng là một tín hiệu rủi ro cần giữ lại. Nhóm khách nộp hồ sơ vào sáng sớm có tỷ lệ vỡ nợ khoảng 10%, trong khi nhóm nộp buổi chiều tối chỉ khoảng 7%, phù hợp với kết quả khám phá dữ liệu ở phần trước.</w:t>
+      </w:r>
+    </w:p>
+    <w:p>
+      <w:pPr>
+        <w:spacing w:after="120" w:line="276" w:lineRule="auto"/>
+      </w:pPr>
+      <w:r>
+        <w:rPr>
+          <w:sz w:val="26"/>
+        </w:rPr>
+        <w:t>Việc lựa chọn giữ hay loại một đặc trưng dựa trên sáu tiêu chí: có ý nghĩa nghiệp vụ rõ ràng; không gây rò rỉ dữ liệu, tức chỉ dùng thông tin có trước thời điểm khách nộp hồ sơ; đảm bảo chất lượng dữ liệu, tức không có giá trị vô cực và giá trị thiếu có cách xử lý rõ ràng; không trùng lặp thông tin với đặc trưng khác; có tín hiệu ban đầu với target; và cuối cùng được xác nhận bằng kết quả mô hình ở bước tiếp theo. Notebook 05 chỉ đưa ra danh sách đặc trưng để thử nghiệm; quyết định giữ hay loại cuối cùng sẽ dựa trên kết quả huấn luyện mô hình ở Chương 4.</w:t>
+      </w:r>
+    </w:p>
+    <w:p>
+      <w:pPr>
+        <w:spacing w:after="120" w:line="276" w:lineRule="auto"/>
+      </w:pPr>
+      <w:r>
+        <w:rPr>
+          <w:sz w:val="26"/>
+        </w:rPr>
+        <w:t>Về rò rỉ dữ liệu, hai đặc trưng age_income_interaction và late_debt_interaction chỉ được dùng để phục vụ phân tích khám phá vì chúng được tính từ phân vị của toàn bộ dữ liệu. Ở bước huấn luyện mô hình, hai đặc trưng tương tác này phải được tính lại riêng cho tập huấn luyện sau khi đã chia tập train và test, tránh việc dùng thông tin của tập kiểm tra khi xây dựng đặc trưng.</w:t>
+      </w:r>
+    </w:p>
+    <w:p>
+      <w:pPr>
+        <w:spacing w:after="120" w:line="276" w:lineRule="auto"/>
+      </w:pPr>
+      <w:r>
+        <w:rPr>
+          <w:sz w:val="26"/>
+        </w:rPr>
+        <w:t>Toàn bộ các cột gốc đã làm sạch cùng các đặc trưng mới được lựa chọn để thử nghiệm đã được lưu vào bảng application_features trong PostgreSQL, làm đầu vào cho bước xây dựng và đánh giá mô hình ở Chương 4. Trong đó, sk_id_curr chỉ dùng để đối chiếu khách hàng và target là nhãn dự báo, cả hai đều không được đưa vào tập biến đầu vào của mô hình.</w:t>
+      </w:r>
+    </w:p>
+    <w:p>
+      <w:pPr>
+        <w:pStyle w:val="Heading2"/>
+        <w:spacing w:before="160" w:after="80"/>
+      </w:pPr>
+      <w:r>
+        <w:rPr>
+          <w:sz w:val="28"/>
+        </w:rPr>
+        <w:t>3.8. Kết luận chương</w:t>
+      </w:r>
+    </w:p>
+    <w:p>
+      <w:pPr>
+        <w:spacing w:after="120" w:line="276" w:lineRule="auto"/>
+      </w:pPr>
+      <w:r>
+        <w:rPr>
+          <w:sz w:val="26"/>
+        </w:rPr>
+        <w:t>Chương 3 đã trình bày kết quả phân tích khám phá dữ liệu trên 9 nhóm biến theo ý nghĩa nghiệp vụ và kết quả xây dựng 30 đặc trưng mới từ những insight thu được. Ba nhóm biến có tín hiệu mạnh nhất với rủi ro vỡ nợ là điểm đánh giá bên ngoài, các tỷ số tài chính LTV và DTI, cùng các biến phản ánh lịch sử chậm trả và dư nợ còn lại; đây cũng là nền tảng cho các đặc trưng tương tác được xây dựng ở bước xử lý tiếp theo. Bảng application_features trong PostgreSQL, gồm các cột gốc đã làm sạch và các đặc trưng mới được lựa chọn để thử nghiệm, là đầu vào cho Chương 4, nơi các đặc trưng này sẽ được mã hóa, xử lý giá trị thiếu và đánh giá mức đóng góp cuối cùng thông qua kết quả huấn luyện mô hình.</w:t>
       </w:r>
     </w:p>
     <w:p>

</xml_diff>

<commit_message>
fix: sua so lieu Chuong 2 cho khop voi NB02 va NB03 that
Sua loi "dien Unknown cho cot chu" thanh dung nhan "Missing", bo sung
buoc loai 28 cot _mode/_medi trung lap con thieu trong muc 2.3. Phat
hien va sua lai so cot cuoi cung cua application_flat_cleaned la 127
(khong phai 131 nhu markdown cu trong NB03 ghi nham), doi chieu truc
tiep voi ket qua code da chay thay vi chi doc mo ta chu. Bo sung them
so lieu that cho muc 2.1/2.2 (NB02), doi chieu bang anh chup ket qua
truy van SQL dinh kem trong notebook.
</commit_message>
<xml_diff>
--- a/docs/2. Mau tai lieu.docx
+++ b/docs/2. Mau tai lieu.docx
@@ -7803,7 +7803,7 @@
           <w:rFonts w:ascii="Times New Roman" w:hAnsi="Times New Roman"/>
           <w:sz w:val="26"/>
         </w:rPr>
-        <w:t>• Tối ưu bộ nhớ và hiệu năng: toàn bộ thao tác gộp nhóm và join được thực hiện bằng SQL ngay trong PostgreSQL thay vì tải hết dữ liệu vào pandas rồi merge, đồng thời tạo index trên các khóa nối để tăng tốc xử lý trên hàng triệu dòng.</w:t>
+        <w:t>• Tối ưu bộ nhớ và hiệu năng: toàn bộ thao tác gộp nhóm và join được thực hiện bằng SQL ngay trong PostgreSQL thay vì tải hết dữ liệu vào pandas rồi merge, đồng thời tạo index trên các khóa nối để tăng tốc xử lý. Việc này thực sự cần thiết vì một số bảng phụ có quy mô rất lớn trước khi gộp nhóm: bureau_balance có 27.299.925 dòng, installments_payments có 13.605.401 dòng, pos_cash_balance có 10.001.358 dòng và credit_card_balance có 3.840.312 dòng.</w:t>
       </w:r>
     </w:p>
     <w:p>
@@ -7821,45 +7821,47 @@
     </w:p>
     <w:p>
       <w:pPr>
-        <w:pStyle w:val="Heading2"/>
-      </w:pPr>
-      <w:r>
-        <w:rPr>
-          <w:sz w:val="28"/>
-        </w:rPr>
-        <w:t>2.</w:t>
-      </w:r>
-      <w:r>
-        <w:rPr>
-          <w:sz w:val="28"/>
-        </w:rPr>
-        <w:t>2</w:t>
-      </w:r>
-      <w:r>
-        <w:rPr>
-          <w:sz w:val="28"/>
-        </w:rPr>
-        <w:t>. Kịch bản kiểm thử dữ liệu (Unit test sau khi Join)</w:t>
-      </w:r>
-    </w:p>
-    <w:p>
-      <w:r>
-        <w:rPr>
-          <w:sz w:val="26"/>
-        </w:rPr>
-        <w:t>Sau khi join, dữ liệu được kiểm tra lại bằng nhiều phép đối chiếu để đảm bảo không có sai lệch nào phát sinh so với dữ liệu gốc.</w:t>
-      </w:r>
-    </w:p>
-    <w:p>
-      <w:pPr>
         <w:pStyle w:val="ListParagraph"/>
+        <w:spacing w:after="60"/>
+        <w:ind w:left="480" w:hanging="240"/>
       </w:pPr>
       <w:r>
         <w:rPr>
           <w:rFonts w:ascii="Times New Roman" w:hAnsi="Times New Roman"/>
           <w:sz w:val="26"/>
         </w:rPr>
-        <w:t>• Kiểm tra số dòng và khóa chính: đối chiếu bảng application_flat vẫn giữ đúng 307.511 dòng và số khách hàng riêng biệt cũng bằng đúng con số này, nghĩa là không khách hàng nào bị mất hoặc bị nhân bản.</w:t>
+        <w:t>• Kiểm tra kiểu dữ liệu sau import: vì lệnh COPY nạp dữ liệu theo vị trí cột chứ không theo tên cột, nhóm đối chiếu lại toàn bộ 339 cột của 8 bảng raw với thiết kế ban đầu và phát hiện ba lỗi kiểu dữ liệu: flag_own_car và flag_own_realty chứa giá trị Y/N nhưng khai báo SMALLINT, nflag_insured_on_approval chứa giá trị dạng 0.0 nhưng khai báo SMALLINT, và credit_day_overdue chứa số nguyên nhưng khai báo TEXT. Lỗi thứ ba nguy hiểm nhất vì không làm import thất bại: nếu để kiểu TEXT, hàm MAX sẽ so sánh theo thứ tự bảng chữ cái nên giá trị 9 bị coi là lớn hơn 2792, khiến số ngày trễ hạn lớn nhất của khách hàng bị tính sai ở bước tạo bảng summary. Cả ba lỗi đã được sửa trước khi tạo index và bảng summary.</w:t>
+      </w:r>
+    </w:p>
+    <w:p>
+      <w:pPr>
+        <w:pStyle w:val="Heading2"/>
+      </w:pPr>
+      <w:r>
+        <w:rPr>
+          <w:sz w:val="28"/>
+        </w:rPr>
+        <w:t>2.</w:t>
+      </w:r>
+      <w:r>
+        <w:rPr>
+          <w:sz w:val="28"/>
+        </w:rPr>
+        <w:t>2</w:t>
+      </w:r>
+      <w:r>
+        <w:rPr>
+          <w:sz w:val="28"/>
+        </w:rPr>
+        <w:t>. Kịch bản kiểm thử dữ liệu (Unit test sau khi Join)</w:t>
+      </w:r>
+    </w:p>
+    <w:p>
+      <w:r>
+        <w:rPr>
+          <w:sz w:val="26"/>
+        </w:rPr>
+        <w:t>Sau khi join, dữ liệu được kiểm tra lại bằng nhiều phép đối chiếu để đảm bảo không có sai lệch nào phát sinh so với dữ liệu gốc.</w:t>
       </w:r>
     </w:p>
     <w:p>
@@ -7871,7 +7873,7 @@
           <w:rFonts w:ascii="Times New Roman" w:hAnsi="Times New Roman"/>
           <w:sz w:val="26"/>
         </w:rPr>
-        <w:t>• Kiểm tra phân bố TARGET: so sánh số khách hàng TARGET bằng 1 và TARGET bằng 0 giữa bảng gốc và bảng phẳng, hai kết quả phải khớp tuyệt đối.</w:t>
+        <w:t>• Kiểm tra số dòng và khóa chính: đối chiếu bảng application_flat vẫn giữ đúng 307.511 dòng và số khách hàng riêng biệt cũng bằng đúng con số này, nghĩa là không khách hàng nào bị mất hoặc bị nhân bản.</w:t>
       </w:r>
     </w:p>
     <w:p>
@@ -7883,7 +7885,19 @@
           <w:rFonts w:ascii="Times New Roman" w:hAnsi="Times New Roman"/>
           <w:sz w:val="26"/>
         </w:rPr>
-        <w:t>• Kiểm tra dữ liệu thiếu sau join: đối chiếu số dòng NULL ở từng nhóm cột summary với công thức kỳ vọng, tức là lấy tổng số khách hàng trừ đi số khách hàng thực sự có dữ liệu ở nhóm đó.</w:t>
+        <w:t>• Kiểm tra phân bố TARGET: so sánh số khách hàng TARGET bằng 1 và TARGET bằng 0 giữa bảng gốc và bảng phẳng, hai kết quả phải khớp tuyệt đối. Kết quả thực tế: cả hai bảng đều có 307.511 khách hàng, trong đó 24.825 khách có TARGET bằng 1 và 282.686 khách có TARGET bằng 0, tương ứng tỷ lệ vỡ nợ 8,073%, hoàn toàn khớp giữa hai bảng.</w:t>
+      </w:r>
+    </w:p>
+    <w:p>
+      <w:pPr>
+        <w:pStyle w:val="ListParagraph"/>
+      </w:pPr>
+      <w:r>
+        <w:rPr>
+          <w:rFonts w:ascii="Times New Roman" w:hAnsi="Times New Roman"/>
+          <w:sz w:val="26"/>
+        </w:rPr>
+        <w:t>• Kiểm tra dữ liệu thiếu sau join: đối chiếu số dòng NULL ở từng nhóm cột summary với công thức kỳ vọng, tức là lấy tổng số khách hàng trừ đi số khách hàng thực sự có dữ liệu ở nhóm đó. Kết quả khớp đúng ở cả năm nhóm: bureau thiếu 44.020 dòng, credit_card_balance thiếu 220.606 dòng, installments_payments thiếu 15.868 dòng, pos_cash_balance thiếu 18.067 dòng và previous_application thiếu 16.454 dòng. Riêng nhóm credit_card_balance có tỷ lệ thiếu cao nhất, vì chỉ khoảng 29% khách hàng từng dùng thẻ tín dụng tại Home Credit; đây là tín hiệu nghiệp vụ chứ không phải lỗi dữ liệu, cần lưu ý khi xử lý ở Chương 3.</w:t>
       </w:r>
     </w:p>
     <w:p>
@@ -7920,59 +7934,123 @@
       </w:r>
     </w:p>
     <w:p>
+      <w:pPr>
+        <w:spacing w:after="120" w:line="276" w:lineRule="auto"/>
+      </w:pPr>
       <w:r>
         <w:rPr>
           <w:sz w:val="26"/>
         </w:rPr>
-        <w:t>Notebook 03 làm sạch bảng application_flat qua các bước xử lý outlier và điền giá trị khuyết, nhằm đưa dữ liệu về trạng thái nhất quán trước khi phân tích.</w:t>
+        <w:t>Notebook 03 làm sạch bảng application_flat, gồm 307.511 dòng và 154 cột (104 cột số thực, 34 cột số nguyên, 16 cột chữ, dung lượng khoảng 400,3 MB), qua năm bước chính: xử lý giá trị thiếu, kiểm tra dòng trùng lặp, xử lý outlier, sửa giá trị sai logic và loại bỏ các cột trùng lặp thông tin, nhằm đưa dữ liệu về trạng thái nhất quán trước khi phân tích ở Chương 3. Nhóm không làm sạch từng bảng gốc riêng lẻ trước khi gộp bảng, mà chọn làm sạch trực tiếp trên bảng phẳng application_flat cho phù hợp với quỹ thời gian và kinh nghiệm hiện tại của nhóm; hạn chế của cách làm này là chỉ xử lý được các giá trị đã tổng hợp, không sửa được lỗi ở từng dòng dữ liệu gốc của các bảng phụ.</w:t>
       </w:r>
     </w:p>
     <w:p>
       <w:pPr>
         <w:pStyle w:val="ListParagraph"/>
+        <w:spacing w:after="60"/>
+        <w:ind w:left="480" w:hanging="240"/>
       </w:pPr>
       <w:r>
         <w:rPr>
           <w:rFonts w:ascii="Times New Roman" w:hAnsi="Times New Roman"/>
           <w:sz w:val="26"/>
         </w:rPr>
-        <w:t>• Phát hiện outlier: dùng IQR thay vì Z-score, vì IQR dựa trên phân vị nên bền vững hơn khi dữ liệu tài chính bị lệch mạnh.</w:t>
+        <w:t>• Xử lý giá trị thiếu: mỗi nhóm cột được xử lý theo đúng ý nghĩa nghiệp vụ thay vì áp dụng chung một cách xử lý cho toàn bộ bảng. Nhóm cột tổng hợp từ các bảng phụ, gồm bureau_*, previous_*, installments_*, pos_cash_*, credit_card_* và nhóm cột amt_req_credit_bureau_*, được giữ nguyên giá trị thiếu; các cờ có sẵn từ trước là has_bureau, has_previous, has_installments, has_pos_cash, has_credit_card tiếp tục được dùng để phân biệt khách không có lịch sử tương ứng với khách có giá trị bằng 0, thay vì điền một cách máy móc; own_car_age cũng được giữ nguyên giá trị thiếu cho khách không sở hữu xe. Các cột số còn thiếu, gồm ba điểm ext_source_1, ext_source_2, ext_source_3 và 43 cột chỉ số nhà ở dạng số có hậu tố _avg, _mode, _medi (tổng cộng 46 cột), được điền bằng giá trị trung vị của chính cột đó. Các cột phân loại còn thiếu, gồm occupation_type và bốn cột nhà ở dạng chữ là fondkapremont_mode, housetype_mode, wallsmaterial_mode, emergencystate_mode, được điền nhãn Missing. Các cột chỉ thiếu ở tỷ lệ rất thấp, gồm name_type_suite, bốn cột quan hệ xã hội obs_30_cnt_social_circle, def_30_cnt_social_circle, obs_60_cnt_social_circle, def_60_cnt_social_circle, cùng amt_goods_price, amt_annuity, cnt_fam_members và days_last_phone_change, được xử lý bằng cách xóa dòng thay vì điền giá trị; bước này làm mất 2.326 dòng, đưa bảng còn lại 305.185 dòng.</w:t>
       </w:r>
     </w:p>
     <w:p>
       <w:pPr>
         <w:pStyle w:val="ListParagraph"/>
+        <w:spacing w:after="60"/>
+        <w:ind w:left="480" w:hanging="240"/>
       </w:pPr>
       <w:r>
         <w:rPr>
           <w:rFonts w:ascii="Times New Roman" w:hAnsi="Times New Roman"/>
           <w:sz w:val="26"/>
         </w:rPr>
-        <w:t>• Xử lý outlier: áp dụng capping tại phân vị 99% cho 13 cột tiền tệ, nhưng chỉ chặn ngưỡng trên và giữ nguyên toàn bộ số dòng; việc chỉ chặn ngưỡng trên nhằm tránh che lấp các giá trị âm sai logic đang tồn tại ở bureau_sum_debt và credit_card_avg_balance.</w:t>
+        <w:t>• Kiểm tra dòng trùng lặp: sau khi rà soát toàn bộ bảng, không phát hiện dòng nào trùng lặp hoàn toàn và cũng không có sk_id_curr nào bị trùng, nên bước này không làm mất thêm dòng nào.</w:t>
       </w:r>
     </w:p>
     <w:p>
       <w:pPr>
         <w:pStyle w:val="ListParagraph"/>
+        <w:spacing w:after="60"/>
+        <w:ind w:left="480" w:hanging="240"/>
       </w:pPr>
       <w:r>
         <w:rPr>
           <w:rFonts w:ascii="Times New Roman" w:hAnsi="Times New Roman"/>
           <w:sz w:val="26"/>
         </w:rPr>
-        <w:t>• Điền giá trị khuyết: xử lý theo từng nhóm cột, gắn cờ business-null cho các nhóm dữ liệu như has_bureau hay has_previous, điền median cho cột số còn thiếu, điền 'Unknown' cho cột chữ, và xóa dòng đối với các cột chỉ thiếu rất ít.</w:t>
+        <w:t>• Phát hiện outlier: chỉ kiểm tra trên 13 cột tiền tệ và dư nợ có ý nghĩa nghiệp vụ (gồm amt_income_total, amt_credit, amt_annuity, amt_goods_price, bureau_sum_credit, bureau_sum_debt, previous_sum_credit, previous_avg_credit, installments_sum_due, installments_sum_paid, credit_card_avg_balance, credit_card_max_balance, credit_card_avg_limit), các cột còn lại là mã định danh, cờ nhị phân, biến đếm, biến ngày hoặc có miền giá trị giới hạn nên không áp dụng capping tự động. Nhóm dùng phương pháp IQR, tức từ Q1 trừ 1,5 lần khoảng tứ phân vị đến Q3 cộng 1,5 lần khoảng tứ phân vị, thay vì Z-score, vì Z-score phụ thuộc vào trung bình và độ lệch chuẩn nên dễ tính sai ngưỡng khi dữ liệu tín dụng bị lệch mạnh, còn IQR dựa trên phân vị nên bền vững hơn. Kết quả khảo sát cho thấy độ lệch, tức skewness, của 13 cột này dao động rất rộng, từ 1,23 đến 391,84, trong đó amt_income_total lệch mạnh nhất; tỷ lệ outlier theo IQR ở các cột dao động từ 2,12 phần trăm đến 9,49 phần trăm dữ liệu.</w:t>
       </w:r>
     </w:p>
     <w:p>
       <w:pPr>
         <w:pStyle w:val="ListParagraph"/>
+        <w:spacing w:after="60"/>
+        <w:ind w:left="480" w:hanging="240"/>
       </w:pPr>
       <w:r>
         <w:rPr>
           <w:rFonts w:ascii="Times New Roman" w:hAnsi="Times New Roman"/>
           <w:sz w:val="26"/>
         </w:rPr>
-        <w:t>• Sửa giá trị sai logic: giá trị âm ở bureau_sum_debt và credit_card_avg_balance được điền lại 0, days_employed bằng 365243 được chuyển thành NaN, và các dòng có code_gender bằng XNA bị loại bỏ.</w:t>
+        <w:t>• Xử lý outlier bằng capping: áp dụng capping tại phân vị 99, gọi tắt là P99, cho 13 cột tiền tệ và dư nợ, nhưng chỉ chặn ngưỡng trên và giữ nguyên toàn bộ số dòng; việc chỉ chặn ngưỡng trên nhằm tránh che lấp các giá trị âm sai logic đang tồn tại ở bureau_sum_debt và credit_card_avg_balance, đồng thời không hạ các khách hàng có giá trị cao về mức trung vị mà vẫn giữ được tín hiệu của nhóm khách hàng giá trị cao. Tổng cộng có 29.034 giá trị trên cả 13 cột bị điều chỉnh về ngưỡng P99. Sau khi cap, độ lệch giảm rõ rệt ở các cột lệch mạnh nhất, ví dụ amt_income_total giảm từ 391,84 xuống còn khoảng 1,3, hai cột bureau_sum_credit và bureau_sum_debt giảm từ 76,57 và 38,94 xuống còn khoảng 2,64 và 3,46; số lượng outlier theo IQR gần như không đổi vì ngưỡng IQR vốn đã thấp hơn ngưỡng P99, nên các giá trị bị cap về P99 vẫn nằm ngoài phạm vi IQR.</w:t>
+      </w:r>
+    </w:p>
+    <w:p>
+      <w:pPr>
+        <w:pStyle w:val="ListParagraph"/>
+        <w:spacing w:after="60"/>
+        <w:ind w:left="480" w:hanging="240"/>
+      </w:pPr>
+      <w:r>
+        <w:rPr>
+          <w:rFonts w:ascii="Times New Roman" w:hAnsi="Times New Roman"/>
+          <w:sz w:val="26"/>
+        </w:rPr>
+        <w:t>• Sửa giá trị sai logic: giá trị âm ở bureau_sum_debt, chiếm 1.282 dòng tại thời điểm xử lý, và ở credit_card_avg_balance, chiếm 28 dòng, được điền lại bằng 0 vì dư nợ và số dư thẻ không thể âm. Giá trị days_employed bằng 365243, tương đương khoảng 1.000 năm làm việc nên không hợp lý, xuất hiện ở 55.006 dòng tại thời điểm xử lý; các dòng này được đánh dấu bằng cờ mới is_days_employed_special trước khi chuyển days_employed thành giá trị thiếu và điền lại bằng trung vị. Các dòng có code_gender bằng XNA, chiếm 4 dòng, bị loại bỏ vì giới tính là thuộc tính quan trọng cần có giá trị hợp lệ. Ngoài ra, nhóm còn rà soát thêm ba trường hợp và xác nhận đều hợp lệ, không cần xử lý: tuổi khách hàng tính từ days_birth nằm trong khoảng 20,5 đến 69,1 tuổi, số con không vượt quá số thành viên gia đình ở bất kỳ dòng nào, và giờ nộp hồ sơ hour_appr_process_start đều nằm trong khoảng hợp lệ từ 0 đến 23 giờ. Sau bước này, bảng còn lại 305.181 dòng và 155 cột, tăng đúng 1 cột mới là is_days_employed_special so với 154 cột ban đầu.</w:t>
+      </w:r>
+    </w:p>
+    <w:p>
+      <w:pPr>
+        <w:pStyle w:val="ListParagraph"/>
+        <w:spacing w:after="60"/>
+        <w:ind w:left="480" w:hanging="240"/>
+      </w:pPr>
+      <w:r>
+        <w:rPr>
+          <w:rFonts w:ascii="Times New Roman" w:hAnsi="Times New Roman"/>
+          <w:sz w:val="26"/>
+        </w:rPr>
+        <w:t>• Loại bỏ cột trùng lặp thông tin: với mỗi nhóm cột đo đặc điểm nhà ở có ba biến thể tổng hợp khác nhau, tức cùng một chỉ số nhưng có hậu tố _avg, _mode và _medi, nhóm tính tương quan giữa từng cặp biến thể trong cùng một nhóm, trên tổng cộng 14 nhóm tương ứng 28 cột _mode/_medi cần đánh giá. Chỉ những nhóm có cả ba hệ số tương quan từ 0,95 trở lên mới được xem là đủ tương tự để giảm bớt cột; kết quả cho thấy cả 14 nhóm đều đạt điều kiện này, với hệ số tương quan giữa các biến thể dao động từ 0,964 đến 0,998. Do đó, toàn bộ 28 cột dạng _mode và _medi bị loại bỏ, cột _avg được giữ lại làm đại diện cho từng nhóm; các cột này không có giá trị thiếu, vì đã được điền trung vị ở bước xử lý giá trị thiếu, nên việc loại bỏ không ảnh hưởng đến thống kê giá trị thiếu chung của bảng và cũng không trùng với 13 cột đã xử lý outlier. Sau bước này, số cột giảm từ 155 xuống còn 127.</w:t>
+      </w:r>
+    </w:p>
+    <w:p>
+      <w:pPr>
+        <w:pStyle w:val="ListParagraph"/>
+        <w:spacing w:after="60"/>
+        <w:ind w:left="480" w:hanging="240"/>
+      </w:pPr>
+      <w:r>
+        <w:rPr>
+          <w:rFonts w:ascii="Times New Roman" w:hAnsi="Times New Roman"/>
+          <w:sz w:val="26"/>
+        </w:rPr>
+        <w:t>• Đánh giá tổng thể trước và sau làm sạch: so với bảng application_flat ban đầu, tổng số ô giá trị thiếu giảm từ 11.043.065 xuống còn 2.313.432, số cột còn giá trị thiếu giảm từ 99 xuống còn 39 cột, toàn bộ 56.702 trường hợp giá trị sai logic (gồm giá trị âm, mã ngày làm việc đặc biệt và giới tính không xác định) đều được xử lý về 0, và dung lượng bộ nhớ giảm từ 400,3 MB xuống còn 337,8 MB. Các giá trị thiếu còn lại sau cùng đều là giá trị thiếu mang ý nghĩa nghiệp vụ, ví dụ chưa có lịch sử tín dụng hoặc chưa dùng thẻ tín dụng, không phải lỗi dữ liệu.</w:t>
+      </w:r>
+    </w:p>
+    <w:p>
+      <w:pPr>
+        <w:spacing w:after="120" w:line="276" w:lineRule="auto"/>
+      </w:pPr>
+      <w:r>
+        <w:rPr>
+          <w:sz w:val="26"/>
+        </w:rPr>
+        <w:t>Kết quả cuối cùng, bảng application_flat_cleaned đạt 305.181 dòng và 127 cột, giảm 2.330 dòng, tức 2.326 dòng do xử lý giá trị thiếu cộng 4 dòng do code_gender bằng XNA, và giảm 27 cột so với 154 cột ban đầu của application_flat, tức tăng 1 cột mới là is_days_employed_special rồi giảm 28 cột trùng lặp thông tin. Toàn bộ dữ liệu sau cùng được lưu vào PostgreSQL với tên bảng application_flat_cleaned và được đọc lại để xác nhận khớp đúng số dòng, số cột và tổng số ô giá trị thiếu với DataFrame cuối cùng trong notebook, sẵn sàng cho Chương 3.</w:t>
       </w:r>
     </w:p>
     <w:p>
@@ -7991,7 +8069,7 @@
         <w:rPr>
           <w:sz w:val="26"/>
         </w:rPr>
-        <w:t>Chương 2 đã đưa dữ liệu Home Credit từ nhiều file CSV rời rạc thành một bảng phẳng sạch, sẵn sàng cho phân tích. Ở bước tích hợp, các bảng phụ được gom về một dòng cho mỗi khách hàng trước khi join, đồng thời toàn bộ thao tác gộp nhóm và nối bảng thực hiện ngay trong PostgreSQL để xử lý hiệu quả hàng triệu dòng. Ở bước làm sạch, capping bất đối xứng (chỉ chặn ngưỡng trên) và điền khuyết theo từng nhóm cột giúp giữ tối đa thông tin gốc mà vẫn loại bỏ giá trị cực đoan và sai logic. Các bước kiểm thử sau join, gồm đối chiếu số dòng, phân bố TARGET và số lượng NULL, xác nhận dữ liệu không bị sai lệch. Kết quả là bảng dữ liệu sạch, đáng tin cậy, làm nền tảng cho Chương 3.</w:t>
+        <w:t>Chương 2 đã đưa dữ liệu Home Credit từ nhiều file CSV rời rạc thành một bảng phẳng sạch, sẵn sàng cho phân tích. Ở bước tích hợp, các bảng phụ được gom về một dòng cho mỗi khách hàng trước khi join, đồng thời toàn bộ thao tác gộp nhóm và nối bảng thực hiện ngay trong PostgreSQL để xử lý hiệu quả hàng triệu dòng, cho ra bảng application_flat với 307.511 dòng và 154 cột. Ở bước làm sạch, capping bất đối xứng, tức chỉ chặn ngưỡng trên, và điền khuyết theo từng nhóm cột giúp giữ tối đa thông tin gốc mà vẫn loại bỏ giá trị cực đoan và sai logic; nhờ đó tổng số ô giá trị thiếu giảm từ hơn 11 triệu xuống còn khoảng 2,3 triệu và toàn bộ 56.702 trường hợp giá trị sai logic đều được xử lý về 0. Bước loại cột trùng lặp thông tin ở cuối cùng loại bỏ thêm 28 cột có tương quan rất cao với cột đại diện, giúp bảng gọn hơn mà không mất thông tin. Các bước kiểm thử sau join, gồm đối chiếu số dòng, phân bố TARGET và số lượng NULL, xác nhận dữ liệu không bị sai lệch. Kết quả cuối cùng là bảng application_flat_cleaned với 305.181 dòng và 127 cột, sạch và đáng tin cậy, làm nền tảng cho Chương 3.</w:t>
       </w:r>
     </w:p>
     <w:p>

</xml_diff>